<commit_message>
Carga de 13 incidentes, evaluación por tipo de actor y período extendido
- datos/incidentes_historicos.csv: 13 incidentes (no verificados) con tipo_actor y fecha_precision
- monitor/evaluacion.py: dentro/fuera de ventanas, cobertura, razón y anticipación por
  tipo de actor, para ventanas de 3, 7, 14 y 21 días
- Incidentes sin fecha conocida: se listan pero no entran al cálculo
- Período histórico extendido a 01/08/2023 - 11/10/2026; la descarga de GDELT conserva
  lo ya descargado
- Web: sección 'Evaluación del modelo' y botones de período
- 15 pruebas; README, decisiones técnicas (D26-D28) y memoria v0.3

Co-Authored-By: Claude Opus 5.5 <noreply@anthropic.com>
Claude-Session: https://claude.ai/code/session_011eMYWh6VDWd8LKxBrkPUCG
</commit_message>
<xml_diff>
--- a/memoria/Memoria_TFM.docx
+++ b/memoria/Memoria_TFM.docx
@@ -145,7 +145,7 @@
           <w:sz w:val="20"/>
           <w:szCs w:val="20"/>
         </w:rPr>
-        <w:t>Versión 0.2 · 14/10/2026</w:t>
+        <w:t>Versión 0.3 · 14/10/2026</w:t>
       </w:r>
     </w:p>
     <w:p>
@@ -540,6 +540,84 @@
                 <w:szCs w:val="19"/>
               </w:rPr>
               <w:t>Búsqueda inicial de incidentes candidatos (13) y propuesta metodológica de grupo de comparación (hacktivistas vs. cibercriminales).</w:t>
+            </w:r>
+          </w:p>
+        </w:tc>
+      </w:tr>
+      <w:tr>
+        <w:trPr/>
+        <w:tc>
+          <w:tcPr>
+            <w:tcW w:w="1099" w:type="dxa"/>
+            <w:tcBorders>
+              <w:top w:val="single" w:sz="4" w:space="0" w:color="BFBFBF"/>
+              <w:left w:val="single" w:sz="4" w:space="0" w:color="BFBFBF"/>
+              <w:bottom w:val="single" w:sz="4" w:space="0" w:color="BFBFBF"/>
+              <w:right w:val="single" w:sz="4" w:space="0" w:color="BFBFBF"/>
+            </w:tcBorders>
+          </w:tcPr>
+          <w:p>
+            <w:pPr>
+              <w:pStyle w:val="Normal"/>
+              <w:spacing w:before="0" w:after="20"/>
+              <w:rPr/>
+            </w:pPr>
+            <w:r>
+              <w:rPr>
+                <w:sz w:val="19"/>
+                <w:szCs w:val="19"/>
+              </w:rPr>
+              <w:t>0.3</w:t>
+            </w:r>
+          </w:p>
+        </w:tc>
+        <w:tc>
+          <w:tcPr>
+            <w:tcW w:w="1401" w:type="dxa"/>
+            <w:tcBorders>
+              <w:top w:val="single" w:sz="4" w:space="0" w:color="BFBFBF"/>
+              <w:left w:val="single" w:sz="4" w:space="0" w:color="BFBFBF"/>
+              <w:bottom w:val="single" w:sz="4" w:space="0" w:color="BFBFBF"/>
+              <w:right w:val="single" w:sz="4" w:space="0" w:color="BFBFBF"/>
+            </w:tcBorders>
+          </w:tcPr>
+          <w:p>
+            <w:pPr>
+              <w:pStyle w:val="Normal"/>
+              <w:spacing w:before="0" w:after="20"/>
+              <w:rPr/>
+            </w:pPr>
+            <w:r>
+              <w:rPr>
+                <w:sz w:val="19"/>
+                <w:szCs w:val="19"/>
+              </w:rPr>
+              <w:t>14/10/2026</w:t>
+            </w:r>
+          </w:p>
+        </w:tc>
+        <w:tc>
+          <w:tcPr>
+            <w:tcW w:w="7138" w:type="dxa"/>
+            <w:tcBorders>
+              <w:top w:val="single" w:sz="4" w:space="0" w:color="BFBFBF"/>
+              <w:left w:val="single" w:sz="4" w:space="0" w:color="BFBFBF"/>
+              <w:bottom w:val="single" w:sz="4" w:space="0" w:color="BFBFBF"/>
+              <w:right w:val="single" w:sz="4" w:space="0" w:color="BFBFBF"/>
+            </w:tcBorders>
+          </w:tcPr>
+          <w:p>
+            <w:pPr>
+              <w:pStyle w:val="Normal"/>
+              <w:spacing w:before="0" w:after="20"/>
+              <w:rPr/>
+            </w:pPr>
+            <w:r>
+              <w:rPr>
+                <w:sz w:val="19"/>
+                <w:szCs w:val="19"/>
+              </w:rPr>
+              <w:t>Carga de los 13 incidentes, columna de tipo de actor, evaluación del modelo con análisis de sensibilidad y extensión del período hasta la actualidad.</w:t>
             </w:r>
           </w:p>
         </w:tc>
@@ -630,14 +708,14 @@
             </w:rPr>
             <w:fldChar w:fldCharType="separate"/>
           </w:r>
-          <w:hyperlink w:anchor="__RefHeading___Toc2001_2511961668">
+          <w:hyperlink w:anchor="__RefHeading___Toc2247_2490839014">
             <w:r>
               <w:rPr>
                 <w:rStyle w:val="IndexLink"/>
               </w:rPr>
               <w:t>1. Introducción</w:t>
               <w:tab/>
-              <w:t>4</w:t>
+              <w:t>5</w:t>
             </w:r>
           </w:hyperlink>
         </w:p>
@@ -650,14 +728,14 @@
             </w:tabs>
             <w:rPr/>
           </w:pPr>
-          <w:hyperlink w:anchor="__RefHeading___Toc2003_2511961668">
+          <w:hyperlink w:anchor="__RefHeading___Toc2249_2490839014">
             <w:r>
               <w:rPr>
                 <w:rStyle w:val="IndexLink"/>
               </w:rPr>
               <w:t>1.1. Contexto</w:t>
               <w:tab/>
-              <w:t>4</w:t>
+              <w:t>5</w:t>
             </w:r>
           </w:hyperlink>
         </w:p>
@@ -670,14 +748,14 @@
             </w:tabs>
             <w:rPr/>
           </w:pPr>
-          <w:hyperlink w:anchor="__RefHeading___Toc2005_2511961668">
+          <w:hyperlink w:anchor="__RefHeading___Toc2251_2490839014">
             <w:r>
               <w:rPr>
                 <w:rStyle w:val="IndexLink"/>
               </w:rPr>
               <w:t>1.2. Objetivos</w:t>
               <w:tab/>
-              <w:t>4</w:t>
+              <w:t>5</w:t>
             </w:r>
           </w:hyperlink>
         </w:p>
@@ -690,14 +768,14 @@
             </w:tabs>
             <w:rPr/>
           </w:pPr>
-          <w:hyperlink w:anchor="__RefHeading___Toc2007_2511961668">
+          <w:hyperlink w:anchor="__RefHeading___Toc2253_2490839014">
             <w:r>
               <w:rPr>
                 <w:rStyle w:val="IndexLink"/>
               </w:rPr>
               <w:t>1.3. Alcance de esta memoria</w:t>
               <w:tab/>
-              <w:t>4</w:t>
+              <w:t>5</w:t>
             </w:r>
           </w:hyperlink>
         </w:p>
@@ -710,14 +788,14 @@
             </w:tabs>
             <w:rPr/>
           </w:pPr>
-          <w:hyperlink w:anchor="__RefHeading___Toc2009_2511961668">
+          <w:hyperlink w:anchor="__RefHeading___Toc2255_2490839014">
             <w:r>
               <w:rPr>
                 <w:rStyle w:val="IndexLink"/>
               </w:rPr>
               <w:t>2. Metodología de trabajo</w:t>
               <w:tab/>
-              <w:t>5</w:t>
+              <w:t>6</w:t>
             </w:r>
           </w:hyperlink>
         </w:p>
@@ -730,14 +808,14 @@
             </w:tabs>
             <w:rPr/>
           </w:pPr>
-          <w:hyperlink w:anchor="__RefHeading___Toc2011_2511961668">
+          <w:hyperlink w:anchor="__RefHeading___Toc2257_2490839014">
             <w:r>
               <w:rPr>
                 <w:rStyle w:val="IndexLink"/>
               </w:rPr>
               <w:t>2.1. Enfoque</w:t>
               <w:tab/>
-              <w:t>5</w:t>
+              <w:t>6</w:t>
             </w:r>
           </w:hyperlink>
         </w:p>
@@ -750,14 +828,14 @@
             </w:tabs>
             <w:rPr/>
           </w:pPr>
-          <w:hyperlink w:anchor="__RefHeading___Toc2013_2511961668">
+          <w:hyperlink w:anchor="__RefHeading___Toc2259_2490839014">
             <w:r>
               <w:rPr>
                 <w:rStyle w:val="IndexLink"/>
               </w:rPr>
               <w:t>2.2. Desarrollo asistido por inteligencia artificial</w:t>
               <w:tab/>
-              <w:t>5</w:t>
+              <w:t>6</w:t>
             </w:r>
           </w:hyperlink>
         </w:p>
@@ -770,14 +848,14 @@
             </w:tabs>
             <w:rPr/>
           </w:pPr>
-          <w:hyperlink w:anchor="__RefHeading___Toc2015_2511961668">
+          <w:hyperlink w:anchor="__RefHeading___Toc2261_2490839014">
             <w:r>
               <w:rPr>
                 <w:rStyle w:val="IndexLink"/>
               </w:rPr>
               <w:t>2.3. Herramientas</w:t>
               <w:tab/>
-              <w:t>5</w:t>
+              <w:t>6</w:t>
             </w:r>
           </w:hyperlink>
         </w:p>
@@ -790,14 +868,14 @@
             </w:tabs>
             <w:rPr/>
           </w:pPr>
-          <w:hyperlink w:anchor="__RefHeading___Toc2017_2511961668">
+          <w:hyperlink w:anchor="__RefHeading___Toc2263_2490839014">
             <w:r>
               <w:rPr>
                 <w:rStyle w:val="IndexLink"/>
               </w:rPr>
               <w:t>3. Requisitos de la plataforma</w:t>
               <w:tab/>
-              <w:t>6</w:t>
+              <w:t>7</w:t>
             </w:r>
           </w:hyperlink>
         </w:p>
@@ -810,14 +888,14 @@
             </w:tabs>
             <w:rPr/>
           </w:pPr>
-          <w:hyperlink w:anchor="__RefHeading___Toc2019_2511961668">
+          <w:hyperlink w:anchor="__RefHeading___Toc2265_2490839014">
             <w:r>
               <w:rPr>
                 <w:rStyle w:val="IndexLink"/>
               </w:rPr>
               <w:t>4. Arquitectura</w:t>
               <w:tab/>
-              <w:t>7</w:t>
+              <w:t>8</w:t>
             </w:r>
           </w:hyperlink>
         </w:p>
@@ -830,14 +908,14 @@
             </w:tabs>
             <w:rPr/>
           </w:pPr>
-          <w:hyperlink w:anchor="__RefHeading___Toc2021_2511961668">
+          <w:hyperlink w:anchor="__RefHeading___Toc2267_2490839014">
             <w:r>
               <w:rPr>
                 <w:rStyle w:val="IndexLink"/>
               </w:rPr>
               <w:t>4.1. Organización del repositorio</w:t>
               <w:tab/>
-              <w:t>7</w:t>
+              <w:t>8</w:t>
             </w:r>
           </w:hyperlink>
         </w:p>
@@ -850,14 +928,14 @@
             </w:tabs>
             <w:rPr/>
           </w:pPr>
-          <w:hyperlink w:anchor="__RefHeading___Toc2023_2511961668">
+          <w:hyperlink w:anchor="__RefHeading___Toc2269_2490839014">
             <w:r>
               <w:rPr>
                 <w:rStyle w:val="IndexLink"/>
               </w:rPr>
               <w:t>5. Fuentes de datos</w:t>
               <w:tab/>
-              <w:t>8</w:t>
+              <w:t>9</w:t>
             </w:r>
           </w:hyperlink>
         </w:p>
@@ -870,14 +948,14 @@
             </w:tabs>
             <w:rPr/>
           </w:pPr>
-          <w:hyperlink w:anchor="__RefHeading___Toc2025_2511961668">
+          <w:hyperlink w:anchor="__RefHeading___Toc2271_2490839014">
             <w:r>
               <w:rPr>
                 <w:rStyle w:val="IndexLink"/>
               </w:rPr>
               <w:t>5.1. Validación de las fuentes</w:t>
               <w:tab/>
-              <w:t>8</w:t>
+              <w:t>9</w:t>
             </w:r>
           </w:hyperlink>
         </w:p>
@@ -890,14 +968,14 @@
             </w:tabs>
             <w:rPr/>
           </w:pPr>
-          <w:hyperlink w:anchor="__RefHeading___Toc2027_2511961668">
+          <w:hyperlink w:anchor="__RefHeading___Toc2273_2490839014">
             <w:r>
               <w:rPr>
                 <w:rStyle w:val="IndexLink"/>
               </w:rPr>
               <w:t>5.2. GDELT: el principal desafío técnico</w:t>
               <w:tab/>
-              <w:t>8</w:t>
+              <w:t>9</w:t>
             </w:r>
           </w:hyperlink>
         </w:p>
@@ -910,14 +988,14 @@
             </w:tabs>
             <w:rPr/>
           </w:pPr>
-          <w:hyperlink w:anchor="__RefHeading___Toc2029_2511961668">
+          <w:hyperlink w:anchor="__RefHeading___Toc2275_2490839014">
             <w:r>
               <w:rPr>
                 <w:rStyle w:val="IndexLink"/>
               </w:rPr>
               <w:t>5.3. Archivos de carga manual</w:t>
               <w:tab/>
-              <w:t>8</w:t>
+              <w:t>9</w:t>
             </w:r>
           </w:hyperlink>
         </w:p>
@@ -930,14 +1008,14 @@
             </w:tabs>
             <w:rPr/>
           </w:pPr>
-          <w:hyperlink w:anchor="__RefHeading___Toc2031_2511961668">
+          <w:hyperlink w:anchor="__RefHeading___Toc2277_2490839014">
             <w:r>
               <w:rPr>
                 <w:rStyle w:val="IndexLink"/>
               </w:rPr>
               <w:t>5.4. Búsqueda inicial de incidentes (pendiente de validación)</w:t>
               <w:tab/>
-              <w:t>9</w:t>
+              <w:t>10</w:t>
             </w:r>
           </w:hyperlink>
         </w:p>
@@ -950,14 +1028,14 @@
             </w:tabs>
             <w:rPr/>
           </w:pPr>
-          <w:hyperlink w:anchor="__RefHeading___Toc2033_2511961668">
+          <w:hyperlink w:anchor="__RefHeading___Toc2279_2490839014">
             <w:r>
               <w:rPr>
                 <w:rStyle w:val="IndexLink"/>
               </w:rPr>
               <w:t>6. Clasificación por reglas (Fase 1)</w:t>
               <w:tab/>
-              <w:t>11</w:t>
+              <w:t>12</w:t>
             </w:r>
           </w:hyperlink>
         </w:p>
@@ -970,14 +1048,14 @@
             </w:tabs>
             <w:rPr/>
           </w:pPr>
-          <w:hyperlink w:anchor="__RefHeading___Toc2035_2511961668">
+          <w:hyperlink w:anchor="__RefHeading___Toc2281_2490839014">
             <w:r>
               <w:rPr>
                 <w:rStyle w:val="IndexLink"/>
               </w:rPr>
               <w:t>6.1. Noticias geopolíticas</w:t>
               <w:tab/>
-              <w:t>11</w:t>
+              <w:t>12</w:t>
             </w:r>
           </w:hyperlink>
         </w:p>
@@ -990,14 +1068,14 @@
             </w:tabs>
             <w:rPr/>
           </w:pPr>
-          <w:hyperlink w:anchor="__RefHeading___Toc2037_2511961668">
+          <w:hyperlink w:anchor="__RefHeading___Toc2283_2490839014">
             <w:r>
               <w:rPr>
                 <w:rStyle w:val="IndexLink"/>
               </w:rPr>
               <w:t>6.2. Noticias de ataque</w:t>
               <w:tab/>
-              <w:t>11</w:t>
+              <w:t>12</w:t>
             </w:r>
           </w:hyperlink>
         </w:p>
@@ -1010,14 +1088,14 @@
             </w:tabs>
             <w:rPr/>
           </w:pPr>
-          <w:hyperlink w:anchor="__RefHeading___Toc2039_2511961668">
+          <w:hyperlink w:anchor="__RefHeading___Toc2285_2490839014">
             <w:r>
               <w:rPr>
                 <w:rStyle w:val="IndexLink"/>
               </w:rPr>
               <w:t>6.3. Mapeo a MITRE ATT&amp;CK</w:t>
               <w:tab/>
-              <w:t>11</w:t>
+              <w:t>12</w:t>
             </w:r>
           </w:hyperlink>
         </w:p>
@@ -1030,14 +1108,14 @@
             </w:tabs>
             <w:rPr/>
           </w:pPr>
-          <w:hyperlink w:anchor="__RefHeading___Toc2041_2511961668">
+          <w:hyperlink w:anchor="__RefHeading___Toc2287_2490839014">
             <w:r>
               <w:rPr>
                 <w:rStyle w:val="IndexLink"/>
               </w:rPr>
               <w:t>7. El semáforo de alertas</w:t>
               <w:tab/>
-              <w:t>12</w:t>
+              <w:t>13</w:t>
             </w:r>
           </w:hyperlink>
         </w:p>
@@ -1050,14 +1128,14 @@
             </w:tabs>
             <w:rPr/>
           </w:pPr>
-          <w:hyperlink w:anchor="__RefHeading___Toc2043_2511961668">
+          <w:hyperlink w:anchor="__RefHeading___Toc2289_2490839014">
             <w:r>
               <w:rPr>
                 <w:rStyle w:val="IndexLink"/>
               </w:rPr>
               <w:t>7.1. Reglas</w:t>
               <w:tab/>
-              <w:t>12</w:t>
+              <w:t>13</w:t>
             </w:r>
           </w:hyperlink>
         </w:p>
@@ -1070,14 +1148,14 @@
             </w:tabs>
             <w:rPr/>
           </w:pPr>
-          <w:hyperlink w:anchor="__RefHeading___Toc2045_2511961668">
+          <w:hyperlink w:anchor="__RefHeading___Toc2291_2490839014">
             <w:r>
               <w:rPr>
                 <w:rStyle w:val="IndexLink"/>
               </w:rPr>
               <w:t>7.2. Ejemplo</w:t>
               <w:tab/>
-              <w:t>12</w:t>
+              <w:t>13</w:t>
             </w:r>
           </w:hyperlink>
         </w:p>
@@ -1090,14 +1168,14 @@
             </w:tabs>
             <w:rPr/>
           </w:pPr>
-          <w:hyperlink w:anchor="__RefHeading___Toc2047_2511961668">
+          <w:hyperlink w:anchor="__RefHeading___Toc2293_2490839014">
             <w:r>
               <w:rPr>
                 <w:rStyle w:val="IndexLink"/>
               </w:rPr>
               <w:t>7.3. Parámetros configurables</w:t>
               <w:tab/>
-              <w:t>12</w:t>
+              <w:t>13</w:t>
             </w:r>
           </w:hyperlink>
         </w:p>
@@ -1110,14 +1188,14 @@
             </w:tabs>
             <w:rPr/>
           </w:pPr>
-          <w:hyperlink w:anchor="__RefHeading___Toc2049_2511961668">
+          <w:hyperlink w:anchor="__RefHeading___Toc2295_2490839014">
             <w:r>
               <w:rPr>
                 <w:rStyle w:val="IndexLink"/>
               </w:rPr>
               <w:t>8. La página web</w:t>
               <w:tab/>
-              <w:t>13</w:t>
+              <w:t>14</w:t>
             </w:r>
           </w:hyperlink>
         </w:p>
@@ -1130,14 +1208,14 @@
             </w:tabs>
             <w:rPr/>
           </w:pPr>
-          <w:hyperlink w:anchor="__RefHeading___Toc2051_2511961668">
+          <w:hyperlink w:anchor="__RefHeading___Toc2297_2490839014">
             <w:r>
               <w:rPr>
                 <w:rStyle w:val="IndexLink"/>
               </w:rPr>
               <w:t>8.1. Componentes</w:t>
               <w:tab/>
-              <w:t>13</w:t>
+              <w:t>14</w:t>
             </w:r>
           </w:hyperlink>
         </w:p>
@@ -1150,14 +1228,14 @@
             </w:tabs>
             <w:rPr/>
           </w:pPr>
-          <w:hyperlink w:anchor="__RefHeading___Toc2053_2511961668">
+          <w:hyperlink w:anchor="__RefHeading___Toc2299_2490839014">
             <w:r>
               <w:rPr>
                 <w:rStyle w:val="IndexLink"/>
               </w:rPr>
               <w:t>9. Automatización y puesta en marcha</w:t>
               <w:tab/>
-              <w:t>17</w:t>
+              <w:t>18</w:t>
             </w:r>
           </w:hyperlink>
         </w:p>
@@ -1170,14 +1248,14 @@
             </w:tabs>
             <w:rPr/>
           </w:pPr>
-          <w:hyperlink w:anchor="__RefHeading___Toc2055_2511961668">
+          <w:hyperlink w:anchor="__RefHeading___Toc2301_2490839014">
             <w:r>
               <w:rPr>
                 <w:rStyle w:val="IndexLink"/>
               </w:rPr>
               <w:t>9.1. Workflows de GitHub Actions</w:t>
               <w:tab/>
-              <w:t>17</w:t>
+              <w:t>18</w:t>
             </w:r>
           </w:hyperlink>
         </w:p>
@@ -1190,14 +1268,14 @@
             </w:tabs>
             <w:rPr/>
           </w:pPr>
-          <w:hyperlink w:anchor="__RefHeading___Toc2057_2511961668">
+          <w:hyperlink w:anchor="__RefHeading___Toc2303_2490839014">
             <w:r>
               <w:rPr>
                 <w:rStyle w:val="IndexLink"/>
               </w:rPr>
               <w:t>9.2. Configuración realizada por el autor</w:t>
               <w:tab/>
-              <w:t>17</w:t>
+              <w:t>18</w:t>
             </w:r>
           </w:hyperlink>
         </w:p>
@@ -1210,14 +1288,14 @@
             </w:tabs>
             <w:rPr/>
           </w:pPr>
-          <w:hyperlink w:anchor="__RefHeading___Toc2059_2511961668">
+          <w:hyperlink w:anchor="__RefHeading___Toc2305_2490839014">
             <w:r>
               <w:rPr>
                 <w:rStyle w:val="IndexLink"/>
               </w:rPr>
               <w:t>9.3. Flujo de cambios con Pull Requests</w:t>
               <w:tab/>
-              <w:t>18</w:t>
+              <w:t>19</w:t>
             </w:r>
           </w:hyperlink>
         </w:p>
@@ -1230,14 +1308,14 @@
             </w:tabs>
             <w:rPr/>
           </w:pPr>
-          <w:hyperlink w:anchor="__RefHeading___Toc2061_2511961668">
+          <w:hyperlink w:anchor="__RefHeading___Toc2307_2490839014">
             <w:r>
               <w:rPr>
                 <w:rStyle w:val="IndexLink"/>
               </w:rPr>
               <w:t>10. Pruebas y verificación</w:t>
               <w:tab/>
-              <w:t>19</w:t>
+              <w:t>20</w:t>
             </w:r>
           </w:hyperlink>
         </w:p>
@@ -1250,14 +1328,14 @@
             </w:tabs>
             <w:rPr/>
           </w:pPr>
-          <w:hyperlink w:anchor="__RefHeading___Toc2063_2511961668">
+          <w:hyperlink w:anchor="__RefHeading___Toc2309_2490839014">
             <w:r>
               <w:rPr>
                 <w:rStyle w:val="IndexLink"/>
               </w:rPr>
               <w:t>10.1. Pruebas automáticas</w:t>
               <w:tab/>
-              <w:t>19</w:t>
+              <w:t>20</w:t>
             </w:r>
           </w:hyperlink>
         </w:p>
@@ -1270,14 +1348,14 @@
             </w:tabs>
             <w:rPr/>
           </w:pPr>
-          <w:hyperlink w:anchor="__RefHeading___Toc2065_2511961668">
+          <w:hyperlink w:anchor="__RefHeading___Toc2311_2490839014">
             <w:r>
               <w:rPr>
                 <w:rStyle w:val="IndexLink"/>
               </w:rPr>
               <w:t>10.2. Verificaciones con datos reales</w:t>
               <w:tab/>
-              <w:t>19</w:t>
+              <w:t>20</w:t>
             </w:r>
           </w:hyperlink>
         </w:p>
@@ -1290,14 +1368,14 @@
             </w:tabs>
             <w:rPr/>
           </w:pPr>
-          <w:hyperlink w:anchor="__RefHeading___Toc2067_2511961668">
+          <w:hyperlink w:anchor="__RefHeading___Toc2313_2490839014">
             <w:r>
               <w:rPr>
                 <w:rStyle w:val="IndexLink"/>
               </w:rPr>
               <w:t>11. Problemas encontrados y soluciones</w:t>
               <w:tab/>
-              <w:t>20</w:t>
+              <w:t>21</w:t>
             </w:r>
           </w:hyperlink>
         </w:p>
@@ -1310,14 +1388,14 @@
             </w:tabs>
             <w:rPr/>
           </w:pPr>
-          <w:hyperlink w:anchor="__RefHeading___Toc2069_2511961668">
+          <w:hyperlink w:anchor="__RefHeading___Toc2315_2490839014">
             <w:r>
               <w:rPr>
                 <w:rStyle w:val="IndexLink"/>
               </w:rPr>
               <w:t>12. Decisiones técnicas</w:t>
               <w:tab/>
-              <w:t>21</w:t>
+              <w:t>22</w:t>
             </w:r>
           </w:hyperlink>
         </w:p>
@@ -1330,14 +1408,14 @@
             </w:tabs>
             <w:rPr/>
           </w:pPr>
-          <w:hyperlink w:anchor="__RefHeading___Toc2071_2511961668">
+          <w:hyperlink w:anchor="__RefHeading___Toc2317_2490839014">
             <w:r>
               <w:rPr>
                 <w:rStyle w:val="IndexLink"/>
               </w:rPr>
               <w:t>13. Estado actual y próximos pasos</w:t>
               <w:tab/>
-              <w:t>22</w:t>
+              <w:t>23</w:t>
             </w:r>
           </w:hyperlink>
         </w:p>
@@ -1350,14 +1428,14 @@
             </w:tabs>
             <w:rPr/>
           </w:pPr>
-          <w:hyperlink w:anchor="__RefHeading___Toc2073_2511961668">
+          <w:hyperlink w:anchor="__RefHeading___Toc2319_2490839014">
             <w:r>
               <w:rPr>
                 <w:rStyle w:val="IndexLink"/>
               </w:rPr>
               <w:t>13.1. Estado</w:t>
               <w:tab/>
-              <w:t>22</w:t>
+              <w:t>23</w:t>
             </w:r>
           </w:hyperlink>
         </w:p>
@@ -1370,14 +1448,14 @@
             </w:tabs>
             <w:rPr/>
           </w:pPr>
-          <w:hyperlink w:anchor="__RefHeading___Toc2075_2511961668">
+          <w:hyperlink w:anchor="__RefHeading___Toc2321_2490839014">
             <w:r>
               <w:rPr>
                 <w:rStyle w:val="IndexLink"/>
               </w:rPr>
               <w:t>13.2. Tareas pendientes del autor</w:t>
               <w:tab/>
-              <w:t>22</w:t>
+              <w:t>23</w:t>
             </w:r>
           </w:hyperlink>
         </w:p>
@@ -1390,14 +1468,14 @@
             </w:tabs>
             <w:rPr/>
           </w:pPr>
-          <w:hyperlink w:anchor="__RefHeading___Toc2077_2511961668">
+          <w:hyperlink w:anchor="__RefHeading___Toc2323_2490839014">
             <w:r>
               <w:rPr>
                 <w:rStyle w:val="IndexLink"/>
               </w:rPr>
               <w:t>13.3. Próximos pasos propuestos</w:t>
               <w:tab/>
-              <w:t>22</w:t>
+              <w:t>23</w:t>
             </w:r>
           </w:hyperlink>
         </w:p>
@@ -1410,14 +1488,14 @@
             </w:tabs>
             <w:rPr/>
           </w:pPr>
-          <w:hyperlink w:anchor="__RefHeading___Toc2079_2511961668">
+          <w:hyperlink w:anchor="__RefHeading___Toc2325_2490839014">
             <w:r>
               <w:rPr>
                 <w:rStyle w:val="IndexLink"/>
               </w:rPr>
               <w:t>14. Búsqueda de incidentes y diseño de la evaluación</w:t>
               <w:tab/>
-              <w:t>23</w:t>
+              <w:t>24</w:t>
             </w:r>
           </w:hyperlink>
         </w:p>
@@ -1430,14 +1508,14 @@
             </w:tabs>
             <w:rPr/>
           </w:pPr>
-          <w:hyperlink w:anchor="__RefHeading___Toc2081_2511961668">
+          <w:hyperlink w:anchor="__RefHeading___Toc2327_2490839014">
             <w:r>
               <w:rPr>
                 <w:rStyle w:val="IndexLink"/>
               </w:rPr>
               <w:t>14.1. Por qué hace falta cargar incidentes</w:t>
               <w:tab/>
-              <w:t>23</w:t>
+              <w:t>24</w:t>
             </w:r>
           </w:hyperlink>
         </w:p>
@@ -1450,14 +1528,14 @@
             </w:tabs>
             <w:rPr/>
           </w:pPr>
-          <w:hyperlink w:anchor="__RefHeading___Toc2083_2511961668">
+          <w:hyperlink w:anchor="__RefHeading___Toc2329_2490839014">
             <w:r>
               <w:rPr>
                 <w:rStyle w:val="IndexLink"/>
               </w:rPr>
               <w:t>14.2. Grupo de comparación</w:t>
               <w:tab/>
-              <w:t>23</w:t>
+              <w:t>24</w:t>
             </w:r>
           </w:hyperlink>
         </w:p>
@@ -1470,14 +1548,14 @@
             </w:tabs>
             <w:rPr/>
           </w:pPr>
-          <w:hyperlink w:anchor="__RefHeading___Toc2085_2511961668">
+          <w:hyperlink w:anchor="__RefHeading___Toc2331_2490839014">
             <w:r>
               <w:rPr>
                 <w:rStyle w:val="IndexLink"/>
               </w:rPr>
-              <w:t>14.3. Candidatos encontrados (pendientes de validación)</w:t>
+              <w:t>14.3. Incidentes cargados</w:t>
               <w:tab/>
-              <w:t>23</w:t>
+              <w:t>24</w:t>
             </w:r>
           </w:hyperlink>
         </w:p>
@@ -1490,14 +1568,14 @@
             </w:tabs>
             <w:rPr/>
           </w:pPr>
-          <w:hyperlink w:anchor="__RefHeading___Toc2087_2511961668">
+          <w:hyperlink w:anchor="__RefHeading___Toc2333_2490839014">
             <w:r>
               <w:rPr>
                 <w:rStyle w:val="IndexLink"/>
               </w:rPr>
               <w:t>14.4. Primeras observaciones</w:t>
               <w:tab/>
-              <w:t>24</w:t>
+              <w:t>25</w:t>
             </w:r>
           </w:hyperlink>
         </w:p>
@@ -1510,14 +1588,94 @@
             </w:tabs>
             <w:rPr/>
           </w:pPr>
-          <w:hyperlink w:anchor="__RefHeading___Toc2089_2511961668">
+          <w:hyperlink w:anchor="__RefHeading___Toc2335_2490839014">
             <w:r>
               <w:rPr>
                 <w:rStyle w:val="IndexLink"/>
               </w:rPr>
-              <w:t>Anexo A. Bitácora del proyecto</w:t>
+              <w:t>15. Evaluación del modelo</w:t>
               <w:tab/>
-              <w:t>25</w:t>
+              <w:t>26</w:t>
+            </w:r>
+          </w:hyperlink>
+        </w:p>
+        <w:p>
+          <w:pPr>
+            <w:pStyle w:val="TOC2"/>
+            <w:tabs>
+              <w:tab w:val="clear" w:pos="9355"/>
+              <w:tab w:val="right" w:pos="9637" w:leader="dot"/>
+            </w:tabs>
+            <w:rPr/>
+          </w:pPr>
+          <w:hyperlink w:anchor="__RefHeading___Toc2337_2490839014">
+            <w:r>
+              <w:rPr>
+                <w:rStyle w:val="IndexLink"/>
+              </w:rPr>
+              <w:t>15.1. Método</w:t>
+              <w:tab/>
+              <w:t>26</w:t>
+            </w:r>
+          </w:hyperlink>
+        </w:p>
+        <w:p>
+          <w:pPr>
+            <w:pStyle w:val="TOC2"/>
+            <w:tabs>
+              <w:tab w:val="clear" w:pos="9355"/>
+              <w:tab w:val="right" w:pos="9637" w:leader="dot"/>
+            </w:tabs>
+            <w:rPr/>
+          </w:pPr>
+          <w:hyperlink w:anchor="__RefHeading___Toc2339_2490839014">
+            <w:r>
+              <w:rPr>
+                <w:rStyle w:val="IndexLink"/>
+              </w:rPr>
+              <w:t>15.2. Resultados preliminares</w:t>
+              <w:tab/>
+              <w:t>26</w:t>
+            </w:r>
+          </w:hyperlink>
+        </w:p>
+        <w:p>
+          <w:pPr>
+            <w:pStyle w:val="TOC2"/>
+            <w:tabs>
+              <w:tab w:val="clear" w:pos="9355"/>
+              <w:tab w:val="right" w:pos="9637" w:leader="dot"/>
+            </w:tabs>
+            <w:rPr/>
+          </w:pPr>
+          <w:hyperlink w:anchor="__RefHeading___Toc2341_2490839014">
+            <w:r>
+              <w:rPr>
+                <w:rStyle w:val="IndexLink"/>
+              </w:rPr>
+              <w:t>15.3. Lectura de los resultados</w:t>
+              <w:tab/>
+              <w:t>27</w:t>
+            </w:r>
+          </w:hyperlink>
+        </w:p>
+        <w:p>
+          <w:pPr>
+            <w:pStyle w:val="TOC2"/>
+            <w:tabs>
+              <w:tab w:val="clear" w:pos="9355"/>
+              <w:tab w:val="right" w:pos="9637" w:leader="dot"/>
+            </w:tabs>
+            <w:rPr/>
+          </w:pPr>
+          <w:hyperlink w:anchor="__RefHeading___Toc2343_2490839014">
+            <w:r>
+              <w:rPr>
+                <w:rStyle w:val="IndexLink"/>
+              </w:rPr>
+              <w:t>15.4. Extensión del período hasta la actualidad</w:t>
+              <w:tab/>
+              <w:t>27</w:t>
             </w:r>
           </w:hyperlink>
         </w:p>
@@ -1530,14 +1688,34 @@
             </w:tabs>
             <w:rPr/>
           </w:pPr>
-          <w:hyperlink w:anchor="__RefHeading___Toc2091_2511961668">
+          <w:hyperlink w:anchor="__RefHeading___Toc2345_2490839014">
+            <w:r>
+              <w:rPr>
+                <w:rStyle w:val="IndexLink"/>
+              </w:rPr>
+              <w:t>Anexo A. Bitácora del proyecto</w:t>
+              <w:tab/>
+              <w:t>29</w:t>
+            </w:r>
+          </w:hyperlink>
+        </w:p>
+        <w:p>
+          <w:pPr>
+            <w:pStyle w:val="TOC1"/>
+            <w:tabs>
+              <w:tab w:val="clear" w:pos="9638"/>
+              <w:tab w:val="right" w:pos="9637" w:leader="dot"/>
+            </w:tabs>
+            <w:rPr/>
+          </w:pPr>
+          <w:hyperlink w:anchor="__RefHeading___Toc2347_2490839014">
             <w:r>
               <w:rPr>
                 <w:rStyle w:val="IndexLink"/>
               </w:rPr>
               <w:t>Anexo B. Glosario</w:t>
               <w:tab/>
-              <w:t>27</w:t>
+              <w:t>32</w:t>
             </w:r>
           </w:hyperlink>
           <w:r>
@@ -1566,7 +1744,7 @@
         <w:pStyle w:val="Heading1"/>
         <w:rPr/>
       </w:pPr>
-      <w:bookmarkStart w:id="0" w:name="__RefHeading___Toc2001_2511961668"/>
+      <w:bookmarkStart w:id="0" w:name="__RefHeading___Toc2247_2490839014"/>
       <w:bookmarkEnd w:id="0"/>
       <w:r>
         <w:rPr/>
@@ -1578,7 +1756,7 @@
         <w:pStyle w:val="Heading2"/>
         <w:rPr/>
       </w:pPr>
-      <w:bookmarkStart w:id="1" w:name="__RefHeading___Toc2003_2511961668"/>
+      <w:bookmarkStart w:id="1" w:name="__RefHeading___Toc2249_2490839014"/>
       <w:bookmarkEnd w:id="1"/>
       <w:r>
         <w:rPr/>
@@ -1634,7 +1812,7 @@
         <w:pStyle w:val="Heading2"/>
         <w:rPr/>
       </w:pPr>
-      <w:bookmarkStart w:id="2" w:name="__RefHeading___Toc2005_2511961668"/>
+      <w:bookmarkStart w:id="2" w:name="__RefHeading___Toc2251_2490839014"/>
       <w:bookmarkEnd w:id="2"/>
       <w:r>
         <w:rPr/>
@@ -1736,7 +1914,7 @@
         <w:pStyle w:val="Heading2"/>
         <w:rPr/>
       </w:pPr>
-      <w:bookmarkStart w:id="3" w:name="__RefHeading___Toc2007_2511961668"/>
+      <w:bookmarkStart w:id="3" w:name="__RefHeading___Toc2253_2490839014"/>
       <w:bookmarkEnd w:id="3"/>
       <w:r>
         <w:rPr/>
@@ -1773,7 +1951,7 @@
         <w:pStyle w:val="Heading1"/>
         <w:rPr/>
       </w:pPr>
-      <w:bookmarkStart w:id="4" w:name="__RefHeading___Toc2009_2511961668"/>
+      <w:bookmarkStart w:id="4" w:name="__RefHeading___Toc2255_2490839014"/>
       <w:bookmarkEnd w:id="4"/>
       <w:r>
         <w:rPr/>
@@ -1785,7 +1963,7 @@
         <w:pStyle w:val="Heading2"/>
         <w:rPr/>
       </w:pPr>
-      <w:bookmarkStart w:id="5" w:name="__RefHeading___Toc2011_2511961668"/>
+      <w:bookmarkStart w:id="5" w:name="__RefHeading___Toc2257_2490839014"/>
       <w:bookmarkEnd w:id="5"/>
       <w:r>
         <w:rPr/>
@@ -1819,7 +1997,7 @@
         <w:pStyle w:val="Heading2"/>
         <w:rPr/>
       </w:pPr>
-      <w:bookmarkStart w:id="6" w:name="__RefHeading___Toc2013_2511961668"/>
+      <w:bookmarkStart w:id="6" w:name="__RefHeading___Toc2259_2490839014"/>
       <w:bookmarkEnd w:id="6"/>
       <w:r>
         <w:rPr/>
@@ -2083,7 +2261,7 @@
         <w:pStyle w:val="Heading2"/>
         <w:rPr/>
       </w:pPr>
-      <w:bookmarkStart w:id="7" w:name="__RefHeading___Toc2015_2511961668"/>
+      <w:bookmarkStart w:id="7" w:name="__RefHeading___Toc2261_2490839014"/>
       <w:bookmarkEnd w:id="7"/>
       <w:r>
         <w:rPr/>
@@ -2497,7 +2675,7 @@
       <w:r>
         <w:br w:type="page"/>
       </w:r>
-      <w:bookmarkStart w:id="8" w:name="__RefHeading___Toc2017_2511961668"/>
+      <w:bookmarkStart w:id="8" w:name="__RefHeading___Toc2263_2490839014"/>
       <w:bookmarkEnd w:id="8"/>
       <w:r>
         <w:rPr/>
@@ -3081,7 +3259,7 @@
       <w:r>
         <w:br w:type="page"/>
       </w:r>
-      <w:bookmarkStart w:id="9" w:name="__RefHeading___Toc2019_2511961668"/>
+      <w:bookmarkStart w:id="9" w:name="__RefHeading___Toc2265_2490839014"/>
       <w:bookmarkEnd w:id="9"/>
       <w:r>
         <w:rPr/>
@@ -3315,7 +3493,7 @@
         <w:pStyle w:val="Heading2"/>
         <w:rPr/>
       </w:pPr>
-      <w:bookmarkStart w:id="10" w:name="__RefHeading___Toc2021_2511961668"/>
+      <w:bookmarkStart w:id="10" w:name="__RefHeading___Toc2267_2490839014"/>
       <w:bookmarkEnd w:id="10"/>
       <w:r>
         <w:rPr/>
@@ -3622,7 +3800,7 @@
         <w:pStyle w:val="Heading1"/>
         <w:rPr/>
       </w:pPr>
-      <w:bookmarkStart w:id="11" w:name="__RefHeading___Toc2023_2511961668"/>
+      <w:bookmarkStart w:id="11" w:name="__RefHeading___Toc2269_2490839014"/>
       <w:bookmarkEnd w:id="11"/>
       <w:r>
         <w:rPr/>
@@ -3634,7 +3812,7 @@
         <w:pStyle w:val="Heading2"/>
         <w:rPr/>
       </w:pPr>
-      <w:bookmarkStart w:id="12" w:name="__RefHeading___Toc2025_2511961668"/>
+      <w:bookmarkStart w:id="12" w:name="__RefHeading___Toc2271_2490839014"/>
       <w:bookmarkEnd w:id="12"/>
       <w:r>
         <w:rPr/>
@@ -4424,7 +4602,7 @@
         <w:pStyle w:val="Heading2"/>
         <w:rPr/>
       </w:pPr>
-      <w:bookmarkStart w:id="13" w:name="__RefHeading___Toc2027_2511961668"/>
+      <w:bookmarkStart w:id="13" w:name="__RefHeading___Toc2273_2490839014"/>
       <w:bookmarkEnd w:id="13"/>
       <w:r>
         <w:rPr/>
@@ -4602,7 +4780,7 @@
         <w:pStyle w:val="Heading2"/>
         <w:rPr/>
       </w:pPr>
-      <w:bookmarkStart w:id="14" w:name="__RefHeading___Toc2029_2511961668"/>
+      <w:bookmarkStart w:id="14" w:name="__RefHeading___Toc2275_2490839014"/>
       <w:bookmarkEnd w:id="14"/>
       <w:r>
         <w:rPr/>
@@ -5092,7 +5270,7 @@
         <w:pStyle w:val="Heading2"/>
         <w:rPr/>
       </w:pPr>
-      <w:bookmarkStart w:id="15" w:name="__RefHeading___Toc2031_2511961668"/>
+      <w:bookmarkStart w:id="15" w:name="__RefHeading___Toc2277_2490839014"/>
       <w:bookmarkEnd w:id="15"/>
       <w:r>
         <w:rPr/>
@@ -6087,7 +6265,7 @@
         <w:pStyle w:val="Heading1"/>
         <w:rPr/>
       </w:pPr>
-      <w:bookmarkStart w:id="16" w:name="__RefHeading___Toc2033_2511961668"/>
+      <w:bookmarkStart w:id="16" w:name="__RefHeading___Toc2279_2490839014"/>
       <w:bookmarkEnd w:id="16"/>
       <w:r>
         <w:rPr/>
@@ -6099,7 +6277,7 @@
         <w:pStyle w:val="Heading2"/>
         <w:rPr/>
       </w:pPr>
-      <w:bookmarkStart w:id="17" w:name="__RefHeading___Toc2035_2511961668"/>
+      <w:bookmarkStart w:id="17" w:name="__RefHeading___Toc2281_2490839014"/>
       <w:bookmarkEnd w:id="17"/>
       <w:r>
         <w:rPr/>
@@ -6374,7 +6552,7 @@
         <w:pStyle w:val="Heading2"/>
         <w:rPr/>
       </w:pPr>
-      <w:bookmarkStart w:id="18" w:name="__RefHeading___Toc2037_2511961668"/>
+      <w:bookmarkStart w:id="18" w:name="__RefHeading___Toc2283_2490839014"/>
       <w:bookmarkEnd w:id="18"/>
       <w:r>
         <w:rPr/>
@@ -6472,7 +6650,7 @@
         <w:pStyle w:val="Heading2"/>
         <w:rPr/>
       </w:pPr>
-      <w:bookmarkStart w:id="19" w:name="__RefHeading___Toc2039_2511961668"/>
+      <w:bookmarkStart w:id="19" w:name="__RefHeading___Toc2285_2490839014"/>
       <w:bookmarkEnd w:id="19"/>
       <w:r>
         <w:rPr/>
@@ -6978,7 +7156,7 @@
       <w:r>
         <w:br w:type="page"/>
       </w:r>
-      <w:bookmarkStart w:id="20" w:name="__RefHeading___Toc2041_2511961668"/>
+      <w:bookmarkStart w:id="20" w:name="__RefHeading___Toc2287_2490839014"/>
       <w:bookmarkEnd w:id="20"/>
       <w:r>
         <w:rPr/>
@@ -6990,7 +7168,7 @@
         <w:pStyle w:val="Heading2"/>
         <w:rPr/>
       </w:pPr>
-      <w:bookmarkStart w:id="21" w:name="__RefHeading___Toc2043_2511961668"/>
+      <w:bookmarkStart w:id="21" w:name="__RefHeading___Toc2289_2490839014"/>
       <w:bookmarkEnd w:id="21"/>
       <w:r>
         <w:rPr/>
@@ -7156,7 +7334,7 @@
         <w:pStyle w:val="Heading2"/>
         <w:rPr/>
       </w:pPr>
-      <w:bookmarkStart w:id="22" w:name="__RefHeading___Toc2045_2511961668"/>
+      <w:bookmarkStart w:id="22" w:name="__RefHeading___Toc2291_2490839014"/>
       <w:bookmarkEnd w:id="22"/>
       <w:r>
         <w:rPr/>
@@ -7690,7 +7868,7 @@
         <w:pStyle w:val="Heading2"/>
         <w:rPr/>
       </w:pPr>
-      <w:bookmarkStart w:id="23" w:name="__RefHeading___Toc2047_2511961668"/>
+      <w:bookmarkStart w:id="23" w:name="__RefHeading___Toc2293_2490839014"/>
       <w:bookmarkEnd w:id="23"/>
       <w:r>
         <w:rPr/>
@@ -8128,7 +8306,7 @@
       <w:r>
         <w:br w:type="page"/>
       </w:r>
-      <w:bookmarkStart w:id="24" w:name="__RefHeading___Toc2049_2511961668"/>
+      <w:bookmarkStart w:id="24" w:name="__RefHeading___Toc2295_2490839014"/>
       <w:bookmarkEnd w:id="24"/>
       <w:r>
         <w:rPr/>
@@ -8228,7 +8406,7 @@
         <w:pStyle w:val="Heading2"/>
         <w:rPr/>
       </w:pPr>
-      <w:bookmarkStart w:id="25" w:name="__RefHeading___Toc2051_2511961668"/>
+      <w:bookmarkStart w:id="25" w:name="__RefHeading___Toc2297_2490839014"/>
       <w:bookmarkEnd w:id="25"/>
       <w:r>
         <w:rPr/>
@@ -8320,7 +8498,29 @@
       </w:r>
       <w:r>
         <w:rPr/>
-        <w:t xml:space="preserve"> permite pasar del modo en vivo al histórico; el botón «Caso de estudio» carga agosto 2023 – julio 2024.</w:t>
+        <w:t xml:space="preserve"> permite pasar del modo en vivo al histórico; dos botones cargan el caso de estudio (ago 2023 – jul 2024) y el período completo (ago 2023 – hoy).</w:t>
+      </w:r>
+    </w:p>
+    <w:p>
+      <w:pPr>
+        <w:pStyle w:val="ListParagraph"/>
+        <w:numPr>
+          <w:ilvl w:val="0"/>
+          <w:numId w:val="3"/>
+        </w:numPr>
+        <w:spacing w:before="0" w:after="60"/>
+        <w:rPr/>
+      </w:pPr>
+      <w:r>
+        <w:rPr>
+          <w:b/>
+          <w:bCs/>
+        </w:rPr>
+        <w:t>Evaluación del modelo:</w:t>
+      </w:r>
+      <w:r>
+        <w:rPr/>
+        <w:t xml:space="preserve"> tabla por tipo de actor y tamaño de ventana (capítulo 15).</w:t>
       </w:r>
     </w:p>
     <w:p>
@@ -8672,7 +8872,7 @@
         <w:pStyle w:val="Heading1"/>
         <w:rPr/>
       </w:pPr>
-      <w:bookmarkStart w:id="26" w:name="__RefHeading___Toc2053_2511961668"/>
+      <w:bookmarkStart w:id="26" w:name="__RefHeading___Toc2299_2490839014"/>
       <w:bookmarkEnd w:id="26"/>
       <w:r>
         <w:rPr/>
@@ -8684,7 +8884,7 @@
         <w:pStyle w:val="Heading2"/>
         <w:rPr/>
       </w:pPr>
-      <w:bookmarkStart w:id="27" w:name="__RefHeading___Toc2055_2511961668"/>
+      <w:bookmarkStart w:id="27" w:name="__RefHeading___Toc2301_2490839014"/>
       <w:bookmarkEnd w:id="27"/>
       <w:r>
         <w:rPr/>
@@ -9041,7 +9241,7 @@
         <w:pStyle w:val="Heading2"/>
         <w:rPr/>
       </w:pPr>
-      <w:bookmarkStart w:id="28" w:name="__RefHeading___Toc2057_2511961668"/>
+      <w:bookmarkStart w:id="28" w:name="__RefHeading___Toc2303_2490839014"/>
       <w:bookmarkEnd w:id="28"/>
       <w:r>
         <w:rPr/>
@@ -9329,7 +9529,7 @@
         <w:pStyle w:val="Heading2"/>
         <w:rPr/>
       </w:pPr>
-      <w:bookmarkStart w:id="29" w:name="__RefHeading___Toc2059_2511961668"/>
+      <w:bookmarkStart w:id="29" w:name="__RefHeading___Toc2305_2490839014"/>
       <w:bookmarkEnd w:id="29"/>
       <w:r>
         <w:rPr/>
@@ -9532,7 +9732,7 @@
         <w:pStyle w:val="Heading1"/>
         <w:rPr/>
       </w:pPr>
-      <w:bookmarkStart w:id="30" w:name="__RefHeading___Toc2061_2511961668"/>
+      <w:bookmarkStart w:id="30" w:name="__RefHeading___Toc2307_2490839014"/>
       <w:bookmarkEnd w:id="30"/>
       <w:r>
         <w:rPr/>
@@ -9544,7 +9744,7 @@
         <w:pStyle w:val="Heading2"/>
         <w:rPr/>
       </w:pPr>
-      <w:bookmarkStart w:id="31" w:name="__RefHeading___Toc2063_2511961668"/>
+      <w:bookmarkStart w:id="31" w:name="__RefHeading___Toc2309_2490839014"/>
       <w:bookmarkEnd w:id="31"/>
       <w:r>
         <w:rPr/>
@@ -9571,7 +9771,7 @@
       </w:r>
       <w:r>
         <w:rPr/>
-        <w:t xml:space="preserve"> contiene 13 pruebas que se ejecutan antes de cada revisión. Si alguna falla, la revisión se detiene y la web publicada no cambia.</w:t>
+        <w:t xml:space="preserve"> contiene 15 pruebas que se ejecutan antes de cada revisión. Si alguna falla, la revisión se detiene y la web publicada no cambia.</w:t>
       </w:r>
     </w:p>
     <w:tbl>
@@ -10343,13 +10543,119 @@
           </w:p>
         </w:tc>
       </w:tr>
+      <w:tr>
+        <w:trPr/>
+        <w:tc>
+          <w:tcPr>
+            <w:tcW w:w="2600" w:type="dxa"/>
+            <w:tcBorders>
+              <w:top w:val="single" w:sz="4" w:space="0" w:color="BFBFBF"/>
+              <w:left w:val="single" w:sz="4" w:space="0" w:color="BFBFBF"/>
+              <w:bottom w:val="single" w:sz="4" w:space="0" w:color="BFBFBF"/>
+              <w:right w:val="single" w:sz="4" w:space="0" w:color="BFBFBF"/>
+            </w:tcBorders>
+          </w:tcPr>
+          <w:p>
+            <w:pPr>
+              <w:pStyle w:val="Normal"/>
+              <w:spacing w:before="0" w:after="20"/>
+              <w:rPr/>
+            </w:pPr>
+            <w:r>
+              <w:rPr>
+                <w:sz w:val="19"/>
+                <w:szCs w:val="19"/>
+              </w:rPr>
+              <w:t>Evaluación</w:t>
+            </w:r>
+          </w:p>
+        </w:tc>
+        <w:tc>
+          <w:tcPr>
+            <w:tcW w:w="7037" w:type="dxa"/>
+            <w:tcBorders>
+              <w:top w:val="single" w:sz="4" w:space="0" w:color="BFBFBF"/>
+              <w:left w:val="single" w:sz="4" w:space="0" w:color="BFBFBF"/>
+              <w:bottom w:val="single" w:sz="4" w:space="0" w:color="BFBFBF"/>
+              <w:right w:val="single" w:sz="4" w:space="0" w:color="BFBFBF"/>
+            </w:tcBorders>
+          </w:tcPr>
+          <w:p>
+            <w:pPr>
+              <w:pStyle w:val="Normal"/>
+              <w:spacing w:before="0" w:after="20"/>
+              <w:rPr/>
+            </w:pPr>
+            <w:r>
+              <w:rPr>
+                <w:sz w:val="19"/>
+                <w:szCs w:val="19"/>
+              </w:rPr>
+              <w:t>Cálculo de cobertura, razón y anticipación por tipo de actor</w:t>
+            </w:r>
+          </w:p>
+        </w:tc>
+      </w:tr>
+      <w:tr>
+        <w:trPr/>
+        <w:tc>
+          <w:tcPr>
+            <w:tcW w:w="2600" w:type="dxa"/>
+            <w:tcBorders>
+              <w:top w:val="single" w:sz="4" w:space="0" w:color="BFBFBF"/>
+              <w:left w:val="single" w:sz="4" w:space="0" w:color="BFBFBF"/>
+              <w:bottom w:val="single" w:sz="4" w:space="0" w:color="BFBFBF"/>
+              <w:right w:val="single" w:sz="4" w:space="0" w:color="BFBFBF"/>
+            </w:tcBorders>
+          </w:tcPr>
+          <w:p>
+            <w:pPr>
+              <w:pStyle w:val="Normal"/>
+              <w:spacing w:before="0" w:after="20"/>
+              <w:rPr/>
+            </w:pPr>
+            <w:r>
+              <w:rPr>
+                <w:sz w:val="19"/>
+                <w:szCs w:val="19"/>
+              </w:rPr>
+              <w:t>Incidentes sin fecha</w:t>
+            </w:r>
+          </w:p>
+        </w:tc>
+        <w:tc>
+          <w:tcPr>
+            <w:tcW w:w="7037" w:type="dxa"/>
+            <w:tcBorders>
+              <w:top w:val="single" w:sz="4" w:space="0" w:color="BFBFBF"/>
+              <w:left w:val="single" w:sz="4" w:space="0" w:color="BFBFBF"/>
+              <w:bottom w:val="single" w:sz="4" w:space="0" w:color="BFBFBF"/>
+              <w:right w:val="single" w:sz="4" w:space="0" w:color="BFBFBF"/>
+            </w:tcBorders>
+          </w:tcPr>
+          <w:p>
+            <w:pPr>
+              <w:pStyle w:val="Normal"/>
+              <w:spacing w:before="0" w:after="20"/>
+              <w:rPr/>
+            </w:pPr>
+            <w:r>
+              <w:rPr>
+                <w:sz w:val="19"/>
+                <w:szCs w:val="19"/>
+              </w:rPr>
+              <w:t>No entran al cálculo ni a la línea de tiempo</w:t>
+            </w:r>
+          </w:p>
+        </w:tc>
+      </w:tr>
     </w:tbl>
     <w:p>
       <w:pPr>
         <w:pStyle w:val="Heading2"/>
         <w:rPr/>
       </w:pPr>
-      <w:bookmarkStart w:id="32" w:name="__RefHeading___Toc2065_2511961668"/>
+      <w:bookmarkStart w:id="32" w:name="__RefHeading___Toc2311_2490839014"/>
       <w:bookmarkEnd w:id="32"/>
       <w:r>
         <w:rPr/>
@@ -10943,7 +11249,7 @@
       <w:r>
         <w:br w:type="page"/>
       </w:r>
-      <w:bookmarkStart w:id="33" w:name="__RefHeading___Toc2067_2511961668"/>
+      <w:bookmarkStart w:id="33" w:name="__RefHeading___Toc2313_2490839014"/>
       <w:bookmarkEnd w:id="33"/>
       <w:r>
         <w:rPr/>
@@ -11771,7 +12077,7 @@
       <w:r>
         <w:br w:type="page"/>
       </w:r>
-      <w:bookmarkStart w:id="34" w:name="__RefHeading___Toc2069_2511961668"/>
+      <w:bookmarkStart w:id="34" w:name="__RefHeading___Toc2315_2490839014"/>
       <w:bookmarkEnd w:id="34"/>
       <w:r>
         <w:rPr/>
@@ -13237,6 +13543,240 @@
           </w:p>
         </w:tc>
       </w:tr>
+      <w:tr>
+        <w:trPr/>
+        <w:tc>
+          <w:tcPr>
+            <w:tcW w:w="1099" w:type="dxa"/>
+            <w:tcBorders>
+              <w:top w:val="single" w:sz="4" w:space="0" w:color="BFBFBF"/>
+              <w:left w:val="single" w:sz="4" w:space="0" w:color="BFBFBF"/>
+              <w:bottom w:val="single" w:sz="4" w:space="0" w:color="BFBFBF"/>
+              <w:right w:val="single" w:sz="4" w:space="0" w:color="BFBFBF"/>
+            </w:tcBorders>
+          </w:tcPr>
+          <w:p>
+            <w:pPr>
+              <w:pStyle w:val="Normal"/>
+              <w:spacing w:before="0" w:after="20"/>
+              <w:rPr/>
+            </w:pPr>
+            <w:r>
+              <w:rPr>
+                <w:sz w:val="19"/>
+                <w:szCs w:val="19"/>
+              </w:rPr>
+              <w:t>D26</w:t>
+            </w:r>
+          </w:p>
+        </w:tc>
+        <w:tc>
+          <w:tcPr>
+            <w:tcW w:w="4600" w:type="dxa"/>
+            <w:tcBorders>
+              <w:top w:val="single" w:sz="4" w:space="0" w:color="BFBFBF"/>
+              <w:left w:val="single" w:sz="4" w:space="0" w:color="BFBFBF"/>
+              <w:bottom w:val="single" w:sz="4" w:space="0" w:color="BFBFBF"/>
+              <w:right w:val="single" w:sz="4" w:space="0" w:color="BFBFBF"/>
+            </w:tcBorders>
+          </w:tcPr>
+          <w:p>
+            <w:pPr>
+              <w:pStyle w:val="Normal"/>
+              <w:spacing w:before="0" w:after="20"/>
+              <w:rPr/>
+            </w:pPr>
+            <w:r>
+              <w:rPr>
+                <w:sz w:val="19"/>
+                <w:szCs w:val="19"/>
+              </w:rPr>
+              <w:t>Grupo de comparación por tipo de actor</w:t>
+            </w:r>
+          </w:p>
+        </w:tc>
+        <w:tc>
+          <w:tcPr>
+            <w:tcW w:w="3939" w:type="dxa"/>
+            <w:tcBorders>
+              <w:top w:val="single" w:sz="4" w:space="0" w:color="BFBFBF"/>
+              <w:left w:val="single" w:sz="4" w:space="0" w:color="BFBFBF"/>
+              <w:bottom w:val="single" w:sz="4" w:space="0" w:color="BFBFBF"/>
+              <w:right w:val="single" w:sz="4" w:space="0" w:color="BFBFBF"/>
+            </w:tcBorders>
+          </w:tcPr>
+          <w:p>
+            <w:pPr>
+              <w:pStyle w:val="Normal"/>
+              <w:spacing w:before="0" w:after="20"/>
+              <w:rPr/>
+            </w:pPr>
+            <w:r>
+              <w:rPr>
+                <w:sz w:val="19"/>
+                <w:szCs w:val="19"/>
+              </w:rPr>
+              <w:t>Evitar sesgo de confirmación</w:t>
+            </w:r>
+          </w:p>
+        </w:tc>
+      </w:tr>
+      <w:tr>
+        <w:trPr/>
+        <w:tc>
+          <w:tcPr>
+            <w:tcW w:w="1099" w:type="dxa"/>
+            <w:tcBorders>
+              <w:top w:val="single" w:sz="4" w:space="0" w:color="BFBFBF"/>
+              <w:left w:val="single" w:sz="4" w:space="0" w:color="BFBFBF"/>
+              <w:bottom w:val="single" w:sz="4" w:space="0" w:color="BFBFBF"/>
+              <w:right w:val="single" w:sz="4" w:space="0" w:color="BFBFBF"/>
+            </w:tcBorders>
+          </w:tcPr>
+          <w:p>
+            <w:pPr>
+              <w:pStyle w:val="Normal"/>
+              <w:spacing w:before="0" w:after="20"/>
+              <w:rPr/>
+            </w:pPr>
+            <w:r>
+              <w:rPr>
+                <w:sz w:val="19"/>
+                <w:szCs w:val="19"/>
+              </w:rPr>
+              <w:t>D27</w:t>
+            </w:r>
+          </w:p>
+        </w:tc>
+        <w:tc>
+          <w:tcPr>
+            <w:tcW w:w="4600" w:type="dxa"/>
+            <w:tcBorders>
+              <w:top w:val="single" w:sz="4" w:space="0" w:color="BFBFBF"/>
+              <w:left w:val="single" w:sz="4" w:space="0" w:color="BFBFBF"/>
+              <w:bottom w:val="single" w:sz="4" w:space="0" w:color="BFBFBF"/>
+              <w:right w:val="single" w:sz="4" w:space="0" w:color="BFBFBF"/>
+            </w:tcBorders>
+          </w:tcPr>
+          <w:p>
+            <w:pPr>
+              <w:pStyle w:val="Normal"/>
+              <w:spacing w:before="0" w:after="20"/>
+              <w:rPr/>
+            </w:pPr>
+            <w:r>
+              <w:rPr>
+                <w:sz w:val="19"/>
+                <w:szCs w:val="19"/>
+              </w:rPr>
+              <w:t>Incidentes sin fecha fuera del cálculo</w:t>
+            </w:r>
+          </w:p>
+        </w:tc>
+        <w:tc>
+          <w:tcPr>
+            <w:tcW w:w="3939" w:type="dxa"/>
+            <w:tcBorders>
+              <w:top w:val="single" w:sz="4" w:space="0" w:color="BFBFBF"/>
+              <w:left w:val="single" w:sz="4" w:space="0" w:color="BFBFBF"/>
+              <w:bottom w:val="single" w:sz="4" w:space="0" w:color="BFBFBF"/>
+              <w:right w:val="single" w:sz="4" w:space="0" w:color="BFBFBF"/>
+            </w:tcBorders>
+          </w:tcPr>
+          <w:p>
+            <w:pPr>
+              <w:pStyle w:val="Normal"/>
+              <w:spacing w:before="0" w:after="20"/>
+              <w:rPr/>
+            </w:pPr>
+            <w:r>
+              <w:rPr>
+                <w:sz w:val="19"/>
+                <w:szCs w:val="19"/>
+              </w:rPr>
+              <w:t>No distorsionar la evaluación</w:t>
+            </w:r>
+          </w:p>
+        </w:tc>
+      </w:tr>
+      <w:tr>
+        <w:trPr/>
+        <w:tc>
+          <w:tcPr>
+            <w:tcW w:w="1099" w:type="dxa"/>
+            <w:tcBorders>
+              <w:top w:val="single" w:sz="4" w:space="0" w:color="BFBFBF"/>
+              <w:left w:val="single" w:sz="4" w:space="0" w:color="BFBFBF"/>
+              <w:bottom w:val="single" w:sz="4" w:space="0" w:color="BFBFBF"/>
+              <w:right w:val="single" w:sz="4" w:space="0" w:color="BFBFBF"/>
+            </w:tcBorders>
+          </w:tcPr>
+          <w:p>
+            <w:pPr>
+              <w:pStyle w:val="Normal"/>
+              <w:spacing w:before="0" w:after="20"/>
+              <w:rPr/>
+            </w:pPr>
+            <w:r>
+              <w:rPr>
+                <w:sz w:val="19"/>
+                <w:szCs w:val="19"/>
+              </w:rPr>
+              <w:t>D28</w:t>
+            </w:r>
+          </w:p>
+        </w:tc>
+        <w:tc>
+          <w:tcPr>
+            <w:tcW w:w="4600" w:type="dxa"/>
+            <w:tcBorders>
+              <w:top w:val="single" w:sz="4" w:space="0" w:color="BFBFBF"/>
+              <w:left w:val="single" w:sz="4" w:space="0" w:color="BFBFBF"/>
+              <w:bottom w:val="single" w:sz="4" w:space="0" w:color="BFBFBF"/>
+              <w:right w:val="single" w:sz="4" w:space="0" w:color="BFBFBF"/>
+            </w:tcBorders>
+          </w:tcPr>
+          <w:p>
+            <w:pPr>
+              <w:pStyle w:val="Normal"/>
+              <w:spacing w:before="0" w:after="20"/>
+              <w:rPr/>
+            </w:pPr>
+            <w:r>
+              <w:rPr>
+                <w:sz w:val="19"/>
+                <w:szCs w:val="19"/>
+              </w:rPr>
+              <w:t>Período extendido hasta la actualidad</w:t>
+            </w:r>
+          </w:p>
+        </w:tc>
+        <w:tc>
+          <w:tcPr>
+            <w:tcW w:w="3939" w:type="dxa"/>
+            <w:tcBorders>
+              <w:top w:val="single" w:sz="4" w:space="0" w:color="BFBFBF"/>
+              <w:left w:val="single" w:sz="4" w:space="0" w:color="BFBFBF"/>
+              <w:bottom w:val="single" w:sz="4" w:space="0" w:color="BFBFBF"/>
+              <w:right w:val="single" w:sz="4" w:space="0" w:color="BFBFBF"/>
+            </w:tcBorders>
+          </w:tcPr>
+          <w:p>
+            <w:pPr>
+              <w:pStyle w:val="Normal"/>
+              <w:spacing w:before="0" w:after="20"/>
+              <w:rPr/>
+            </w:pPr>
+            <w:r>
+              <w:rPr>
+                <w:sz w:val="19"/>
+                <w:szCs w:val="19"/>
+              </w:rPr>
+              <w:t>Incluir la ola de ataques de agosto de 2024</w:t>
+            </w:r>
+          </w:p>
+        </w:tc>
+      </w:tr>
     </w:tbl>
     <w:p>
       <w:pPr>
@@ -13246,7 +13786,7 @@
       <w:r>
         <w:br w:type="page"/>
       </w:r>
-      <w:bookmarkStart w:id="35" w:name="__RefHeading___Toc2071_2511961668"/>
+      <w:bookmarkStart w:id="35" w:name="__RefHeading___Toc2317_2490839014"/>
       <w:bookmarkEnd w:id="35"/>
       <w:r>
         <w:rPr/>
@@ -13258,7 +13798,7 @@
         <w:pStyle w:val="Heading2"/>
         <w:rPr/>
       </w:pPr>
-      <w:bookmarkStart w:id="36" w:name="__RefHeading___Toc2073_2511961668"/>
+      <w:bookmarkStart w:id="36" w:name="__RefHeading___Toc2319_2490839014"/>
       <w:bookmarkEnd w:id="36"/>
       <w:r>
         <w:rPr/>
@@ -13334,7 +13874,7 @@
         <w:pStyle w:val="Heading2"/>
         <w:rPr/>
       </w:pPr>
-      <w:bookmarkStart w:id="37" w:name="__RefHeading___Toc2075_2511961668"/>
+      <w:bookmarkStart w:id="37" w:name="__RefHeading___Toc2321_2490839014"/>
       <w:bookmarkEnd w:id="37"/>
       <w:r>
         <w:rPr/>
@@ -13360,7 +13900,18 @@
       </w:r>
       <w:r>
         <w:rPr/>
-        <w:t xml:space="preserve"> del período en </w:t>
+        <w:t xml:space="preserve">: </w:t>
+      </w:r>
+      <w:r>
+        <w:rPr>
+          <w:b/>
+          <w:bCs/>
+        </w:rPr>
+        <w:t>hecho el 14/10/2026</w:t>
+      </w:r>
+      <w:r>
+        <w:rPr/>
+        <w:t xml:space="preserve"> (13 incidentes en </w:t>
       </w:r>
       <w:r>
         <w:rPr>
@@ -13372,7 +13923,7 @@
       </w:r>
       <w:r>
         <w:rPr/>
-        <w:t>. Sin ellos, el modo histórico no puede mostrar alertas rojas ni evaluar la hipótesis.</w:t>
+        <w:t>). Queda ampliarlo para el período extendido.</w:t>
       </w:r>
     </w:p>
     <w:p>
@@ -13451,31 +14002,34 @@
           <w:b/>
           <w:bCs/>
         </w:rPr>
-        <w:t>Revisar los 13 incidentes candidatos</w:t>
-      </w:r>
-      <w:r>
-        <w:rPr/>
-        <w:t xml:space="preserve"> de </w:t>
-      </w:r>
-      <w:r>
-        <w:rPr>
-          <w:rFonts w:eastAsia="Consolas" w:cs="Consolas" w:ascii="Consolas" w:hAnsi="Consolas"/>
-          <w:sz w:val="19"/>
-          <w:szCs w:val="19"/>
-        </w:rPr>
-        <w:t>datos/candidatos_incidentes.csv</w:t>
-      </w:r>
-      <w:r>
-        <w:rPr/>
-        <w:t xml:space="preserve"> (capítulo 14) y decidir cuáles se cargan.</w:t>
+        <w:t>Verificar los 13 incidentes cargados</w:t>
+      </w:r>
+      <w:r>
+        <w:rPr/>
+        <w:t xml:space="preserve"> (capítulo 14) y averiguar las fechas de REM y Stucx Team.</w:t>
       </w:r>
     </w:p>
     <w:p>
       <w:pPr>
+        <w:pStyle w:val="ListParagraph"/>
+        <w:numPr>
+          <w:ilvl w:val="0"/>
+          <w:numId w:val="6"/>
+        </w:numPr>
+        <w:spacing w:before="0" w:after="60"/>
+        <w:rPr/>
+      </w:pPr>
+      <w:r>
+        <w:rPr/>
+        <w:t>Agregar hechos clave e incidentes posteriores a julio de 2024, ya que el período se extendió hasta la actualidad.</w:t>
+      </w:r>
+    </w:p>
+    <w:p>
+      <w:pPr>
         <w:pStyle w:val="Heading2"/>
         <w:rPr/>
       </w:pPr>
-      <w:bookmarkStart w:id="38" w:name="__RefHeading___Toc2077_2511961668"/>
+      <w:bookmarkStart w:id="38" w:name="__RefHeading___Toc2323_2490839014"/>
       <w:bookmarkEnd w:id="38"/>
       <w:r>
         <w:rPr/>
@@ -13556,7 +14110,7 @@
         <w:pStyle w:val="Heading1"/>
         <w:rPr/>
       </w:pPr>
-      <w:bookmarkStart w:id="39" w:name="__RefHeading___Toc2079_2511961668"/>
+      <w:bookmarkStart w:id="39" w:name="__RefHeading___Toc2325_2490839014"/>
       <w:bookmarkEnd w:id="39"/>
       <w:r>
         <w:rPr/>
@@ -13568,7 +14122,7 @@
         <w:pStyle w:val="Heading2"/>
         <w:rPr/>
       </w:pPr>
-      <w:bookmarkStart w:id="40" w:name="__RefHeading___Toc2081_2511961668"/>
+      <w:bookmarkStart w:id="40" w:name="__RefHeading___Toc2327_2490839014"/>
       <w:bookmarkEnd w:id="40"/>
       <w:r>
         <w:rPr/>
@@ -13591,7 +14145,7 @@
         <w:pStyle w:val="Heading2"/>
         <w:rPr/>
       </w:pPr>
-      <w:bookmarkStart w:id="41" w:name="__RefHeading___Toc2083_2511961668"/>
+      <w:bookmarkStart w:id="41" w:name="__RefHeading___Toc2329_2490839014"/>
       <w:bookmarkEnd w:id="41"/>
       <w:r>
         <w:rPr/>
@@ -13703,11 +14257,11 @@
         <w:pStyle w:val="Heading2"/>
         <w:rPr/>
       </w:pPr>
-      <w:bookmarkStart w:id="42" w:name="__RefHeading___Toc2085_2511961668"/>
+      <w:bookmarkStart w:id="42" w:name="__RefHeading___Toc2331_2490839014"/>
       <w:bookmarkEnd w:id="42"/>
       <w:r>
         <w:rPr/>
-        <w:t>14.3. Candidatos encontrados (pendientes de validación)</w:t>
+        <w:t>14.3. Incidentes cargados</w:t>
       </w:r>
     </w:p>
     <w:p>
@@ -13718,7 +14272,7 @@
       </w:pPr>
       <w:r>
         <w:rPr/>
-        <w:t xml:space="preserve">La búsqueda inicial (14/10/2026) identificó 13 candidatos, guardados en </w:t>
+        <w:t>La búsqueda inicial (14/10/2026) identificó 13 candidatos (</w:t>
       </w:r>
       <w:r>
         <w:rPr>
@@ -13730,18 +14284,52 @@
       </w:r>
       <w:r>
         <w:rPr/>
-        <w:t xml:space="preserve">. </w:t>
+        <w:t xml:space="preserve">). El autor decidió </w:t>
       </w:r>
       <w:r>
         <w:rPr>
           <w:b/>
           <w:bCs/>
         </w:rPr>
-        <w:t>Ninguno se dio por verificado</w:t>
-      </w:r>
-      <w:r>
-        <w:rPr/>
-        <w:t>: el autor debe revisar cada uno antes de pasarlo al archivo de incidentes. Varias fuentes son secundarias o recogen reivindicaciones de los propios grupos.</w:t>
+        <w:t>cargarlos todos</w:t>
+      </w:r>
+      <w:r>
+        <w:rPr/>
+        <w:t xml:space="preserve"> en </w:t>
+      </w:r>
+      <w:r>
+        <w:rPr>
+          <w:rFonts w:eastAsia="Consolas" w:cs="Consolas" w:ascii="Consolas" w:hAnsi="Consolas"/>
+          <w:sz w:val="19"/>
+          <w:szCs w:val="19"/>
+        </w:rPr>
+        <w:t>datos/incidentes_historicos.csv</w:t>
+      </w:r>
+      <w:r>
+        <w:rPr/>
+        <w:t xml:space="preserve">, marcados como </w:t>
+      </w:r>
+      <w:r>
+        <w:rPr>
+          <w:b/>
+          <w:bCs/>
+        </w:rPr>
+        <w:t>no verificados</w:t>
+      </w:r>
+      <w:r>
+        <w:rPr/>
+        <w:t xml:space="preserve">. Varias fuentes son secundarias o recogen reivindicaciones de los propios grupos, por lo que la verificación sigue pendiente. Los dos incidentes </w:t>
+      </w:r>
+      <w:r>
+        <w:rPr>
+          <w:b/>
+          <w:bCs/>
+        </w:rPr>
+        <w:t>sin fecha conocida</w:t>
+      </w:r>
+      <w:r>
+        <w:rPr/>
+        <w:t xml:space="preserve"> (REM y Stucx Team) se muestran en la página, pero no entran al cálculo.</w:t>
       </w:r>
     </w:p>
     <w:tbl>
@@ -15949,7 +16537,7 @@
         <w:pStyle w:val="Heading2"/>
         <w:rPr/>
       </w:pPr>
-      <w:bookmarkStart w:id="43" w:name="__RefHeading___Toc2087_2511961668"/>
+      <w:bookmarkStart w:id="43" w:name="__RefHeading___Toc2333_2490839014"/>
       <w:bookmarkEnd w:id="43"/>
       <w:r>
         <w:rPr/>
@@ -16075,8 +16663,1414 @@
         <w:pStyle w:val="Heading1"/>
         <w:rPr/>
       </w:pPr>
-      <w:bookmarkStart w:id="44" w:name="__RefHeading___Toc2089_2511961668"/>
+      <w:bookmarkStart w:id="44" w:name="__RefHeading___Toc2335_2490839014"/>
       <w:bookmarkEnd w:id="44"/>
+      <w:r>
+        <w:rPr/>
+        <w:t>15. Evaluación del modelo</w:t>
+      </w:r>
+    </w:p>
+    <w:p>
+      <w:pPr>
+        <w:pStyle w:val="Heading2"/>
+        <w:rPr/>
+      </w:pPr>
+      <w:bookmarkStart w:id="45" w:name="__RefHeading___Toc2337_2490839014"/>
+      <w:bookmarkEnd w:id="45"/>
+      <w:r>
+        <w:rPr/>
+        <w:t>15.1. Método</w:t>
+      </w:r>
+    </w:p>
+    <w:p>
+      <w:pPr>
+        <w:pStyle w:val="Normal"/>
+        <w:spacing w:lineRule="exact" w:line="290" w:before="0" w:after="120"/>
+        <w:rPr/>
+      </w:pPr>
+      <w:r>
+        <w:rPr/>
+        <w:t xml:space="preserve">Para cada tamaño de ventana y cada tipo de actor se calcula cuántos ataques ocurrieron </w:t>
+      </w:r>
+      <w:r>
+        <w:rPr>
+          <w:b/>
+          <w:bCs/>
+        </w:rPr>
+        <w:t>dentro</w:t>
+      </w:r>
+      <w:r>
+        <w:rPr/>
+        <w:t xml:space="preserve"> de una ventana de vigilancia. Ese porcentaje se compara con la </w:t>
+      </w:r>
+      <w:r>
+        <w:rPr>
+          <w:b/>
+          <w:bCs/>
+        </w:rPr>
+        <w:t>cobertura</w:t>
+      </w:r>
+      <w:r>
+        <w:rPr/>
+        <w:t xml:space="preserve">, es decir, el porcentaje de días del período cubiertos por ventanas: es lo que se esperaría si los ataques ocurrieran al azar. La </w:t>
+      </w:r>
+      <w:r>
+        <w:rPr>
+          <w:b/>
+          <w:bCs/>
+        </w:rPr>
+        <w:t>razón</w:t>
+      </w:r>
+      <w:r>
+        <w:rPr/>
+        <w:t xml:space="preserve"> entre ambos resume el resultado:</w:t>
+      </w:r>
+    </w:p>
+    <w:p>
+      <w:pPr>
+        <w:pStyle w:val="ListParagraph"/>
+        <w:numPr>
+          <w:ilvl w:val="0"/>
+          <w:numId w:val="3"/>
+        </w:numPr>
+        <w:spacing w:before="0" w:after="60"/>
+        <w:rPr/>
+      </w:pPr>
+      <w:r>
+        <w:rPr>
+          <w:b/>
+          <w:bCs/>
+        </w:rPr>
+        <w:t>Razón mayor que 1:</w:t>
+      </w:r>
+      <w:r>
+        <w:rPr/>
+        <w:t xml:space="preserve"> ese tipo de actor ataca dentro de las ventanas más de lo esperable por azar (evidencia a favor de la hipótesis).</w:t>
+      </w:r>
+    </w:p>
+    <w:p>
+      <w:pPr>
+        <w:pStyle w:val="ListParagraph"/>
+        <w:numPr>
+          <w:ilvl w:val="0"/>
+          <w:numId w:val="3"/>
+        </w:numPr>
+        <w:spacing w:before="0" w:after="60"/>
+        <w:rPr/>
+      </w:pPr>
+      <w:r>
+        <w:rPr>
+          <w:b/>
+          <w:bCs/>
+        </w:rPr>
+        <w:t>Razón cercana a 1:</w:t>
+      </w:r>
+      <w:r>
+        <w:rPr/>
+        <w:t xml:space="preserve"> no hay relación con los hechos detonantes. Es lo esperado para el grupo de comparación (cibercriminales).</w:t>
+      </w:r>
+    </w:p>
+    <w:p>
+      <w:pPr>
+        <w:pStyle w:val="Normal"/>
+        <w:spacing w:lineRule="exact" w:line="290" w:before="0" w:after="120"/>
+        <w:rPr/>
+      </w:pPr>
+      <w:r>
+        <w:rPr/>
+        <w:t>Se evalúan ventanas de 3, 7, 14 y 21 días (</w:t>
+      </w:r>
+      <w:r>
+        <w:rPr>
+          <w:b/>
+          <w:bCs/>
+        </w:rPr>
+        <w:t>análisis de sensibilidad</w:t>
+      </w:r>
+      <w:r>
+        <w:rPr/>
+        <w:t>). La de 7 días es la que usa el semáforo.</w:t>
+      </w:r>
+    </w:p>
+    <w:p>
+      <w:pPr>
+        <w:pStyle w:val="Heading2"/>
+        <w:rPr/>
+      </w:pPr>
+      <w:bookmarkStart w:id="46" w:name="__RefHeading___Toc2339_2490839014"/>
+      <w:bookmarkEnd w:id="46"/>
+      <w:r>
+        <w:rPr/>
+        <w:t>15.2. Resultados preliminares</w:t>
+      </w:r>
+    </w:p>
+    <w:p>
+      <w:pPr>
+        <w:pStyle w:val="Normal"/>
+        <w:spacing w:lineRule="exact" w:line="290" w:before="0" w:after="120"/>
+        <w:rPr/>
+      </w:pPr>
+      <w:r>
+        <w:rPr/>
+        <w:t>Período evaluado: 2023-08-01 a 2026-10-14 (1171 días, 31 días detonantes). Datos al 2026-10-14.</w:t>
+      </w:r>
+    </w:p>
+    <w:tbl>
+      <w:tblPr>
+        <w:tblW w:w="9638" w:type="dxa"/>
+        <w:jc w:val="left"/>
+        <w:tblInd w:w="0" w:type="dxa"/>
+        <w:tblLayout w:type="fixed"/>
+        <w:tblCellMar>
+          <w:top w:w="60" w:type="dxa"/>
+          <w:left w:w="100" w:type="dxa"/>
+          <w:bottom w:w="60" w:type="dxa"/>
+          <w:right w:w="100" w:type="dxa"/>
+        </w:tblCellMar>
+      </w:tblPr>
+      <w:tblGrid>
+        <w:gridCol w:w="1499"/>
+        <w:gridCol w:w="1501"/>
+        <w:gridCol w:w="2299"/>
+        <w:gridCol w:w="2170"/>
+        <w:gridCol w:w="2169"/>
+      </w:tblGrid>
+      <w:tr>
+        <w:trPr>
+          <w:tblHeader w:val="true"/>
+        </w:trPr>
+        <w:tc>
+          <w:tcPr>
+            <w:tcW w:w="1499" w:type="dxa"/>
+            <w:tcBorders>
+              <w:top w:val="single" w:sz="4" w:space="0" w:color="BFBFBF"/>
+              <w:left w:val="single" w:sz="4" w:space="0" w:color="BFBFBF"/>
+              <w:bottom w:val="single" w:sz="4" w:space="0" w:color="BFBFBF"/>
+              <w:right w:val="single" w:sz="4" w:space="0" w:color="BFBFBF"/>
+            </w:tcBorders>
+            <w:shd w:fill="1F4E79" w:val="clear"/>
+          </w:tcPr>
+          <w:p>
+            <w:pPr>
+              <w:pStyle w:val="Normal"/>
+              <w:spacing w:before="0" w:after="20"/>
+              <w:rPr/>
+            </w:pPr>
+            <w:r>
+              <w:rPr>
+                <w:b/>
+                <w:bCs/>
+                <w:color w:val="FFFFFF"/>
+                <w:sz w:val="19"/>
+                <w:szCs w:val="19"/>
+              </w:rPr>
+              <w:t>Ventana</w:t>
+            </w:r>
+          </w:p>
+        </w:tc>
+        <w:tc>
+          <w:tcPr>
+            <w:tcW w:w="1501" w:type="dxa"/>
+            <w:tcBorders>
+              <w:top w:val="single" w:sz="4" w:space="0" w:color="BFBFBF"/>
+              <w:left w:val="single" w:sz="4" w:space="0" w:color="BFBFBF"/>
+              <w:bottom w:val="single" w:sz="4" w:space="0" w:color="BFBFBF"/>
+              <w:right w:val="single" w:sz="4" w:space="0" w:color="BFBFBF"/>
+            </w:tcBorders>
+            <w:shd w:fill="1F4E79" w:val="clear"/>
+          </w:tcPr>
+          <w:p>
+            <w:pPr>
+              <w:pStyle w:val="Normal"/>
+              <w:spacing w:before="0" w:after="20"/>
+              <w:rPr/>
+            </w:pPr>
+            <w:r>
+              <w:rPr>
+                <w:b/>
+                <w:bCs/>
+                <w:color w:val="FFFFFF"/>
+                <w:sz w:val="19"/>
+                <w:szCs w:val="19"/>
+              </w:rPr>
+              <w:t>Cobertura</w:t>
+            </w:r>
+          </w:p>
+        </w:tc>
+        <w:tc>
+          <w:tcPr>
+            <w:tcW w:w="2299" w:type="dxa"/>
+            <w:tcBorders>
+              <w:top w:val="single" w:sz="4" w:space="0" w:color="BFBFBF"/>
+              <w:left w:val="single" w:sz="4" w:space="0" w:color="BFBFBF"/>
+              <w:bottom w:val="single" w:sz="4" w:space="0" w:color="BFBFBF"/>
+              <w:right w:val="single" w:sz="4" w:space="0" w:color="BFBFBF"/>
+            </w:tcBorders>
+            <w:shd w:fill="1F4E79" w:val="clear"/>
+          </w:tcPr>
+          <w:p>
+            <w:pPr>
+              <w:pStyle w:val="Normal"/>
+              <w:spacing w:before="0" w:after="20"/>
+              <w:rPr/>
+            </w:pPr>
+            <w:r>
+              <w:rPr>
+                <w:b/>
+                <w:bCs/>
+                <w:color w:val="FFFFFF"/>
+                <w:sz w:val="19"/>
+                <w:szCs w:val="19"/>
+              </w:rPr>
+              <w:t>Hacktivista</w:t>
+            </w:r>
+          </w:p>
+        </w:tc>
+        <w:tc>
+          <w:tcPr>
+            <w:tcW w:w="2170" w:type="dxa"/>
+            <w:tcBorders>
+              <w:top w:val="single" w:sz="4" w:space="0" w:color="BFBFBF"/>
+              <w:left w:val="single" w:sz="4" w:space="0" w:color="BFBFBF"/>
+              <w:bottom w:val="single" w:sz="4" w:space="0" w:color="BFBFBF"/>
+              <w:right w:val="single" w:sz="4" w:space="0" w:color="BFBFBF"/>
+            </w:tcBorders>
+            <w:shd w:fill="1F4E79" w:val="clear"/>
+          </w:tcPr>
+          <w:p>
+            <w:pPr>
+              <w:pStyle w:val="Normal"/>
+              <w:spacing w:before="0" w:after="20"/>
+              <w:rPr/>
+            </w:pPr>
+            <w:r>
+              <w:rPr>
+                <w:b/>
+                <w:bCs/>
+                <w:color w:val="FFFFFF"/>
+                <w:sz w:val="19"/>
+                <w:szCs w:val="19"/>
+              </w:rPr>
+              <w:t>Cibercriminal</w:t>
+            </w:r>
+          </w:p>
+        </w:tc>
+        <w:tc>
+          <w:tcPr>
+            <w:tcW w:w="2169" w:type="dxa"/>
+            <w:tcBorders>
+              <w:top w:val="single" w:sz="4" w:space="0" w:color="BFBFBF"/>
+              <w:left w:val="single" w:sz="4" w:space="0" w:color="BFBFBF"/>
+              <w:bottom w:val="single" w:sz="4" w:space="0" w:color="BFBFBF"/>
+              <w:right w:val="single" w:sz="4" w:space="0" w:color="BFBFBF"/>
+            </w:tcBorders>
+            <w:shd w:fill="1F4E79" w:val="clear"/>
+          </w:tcPr>
+          <w:p>
+            <w:pPr>
+              <w:pStyle w:val="Normal"/>
+              <w:spacing w:before="0" w:after="20"/>
+              <w:rPr/>
+            </w:pPr>
+            <w:r>
+              <w:rPr>
+                <w:b/>
+                <w:bCs/>
+                <w:color w:val="FFFFFF"/>
+                <w:sz w:val="19"/>
+                <w:szCs w:val="19"/>
+              </w:rPr>
+              <w:t>Desconocido</w:t>
+            </w:r>
+          </w:p>
+        </w:tc>
+      </w:tr>
+      <w:tr>
+        <w:trPr/>
+        <w:tc>
+          <w:tcPr>
+            <w:tcW w:w="1499" w:type="dxa"/>
+            <w:tcBorders>
+              <w:top w:val="single" w:sz="4" w:space="0" w:color="BFBFBF"/>
+              <w:left w:val="single" w:sz="4" w:space="0" w:color="BFBFBF"/>
+              <w:bottom w:val="single" w:sz="4" w:space="0" w:color="BFBFBF"/>
+              <w:right w:val="single" w:sz="4" w:space="0" w:color="BFBFBF"/>
+            </w:tcBorders>
+          </w:tcPr>
+          <w:p>
+            <w:pPr>
+              <w:pStyle w:val="Normal"/>
+              <w:spacing w:before="0" w:after="20"/>
+              <w:rPr/>
+            </w:pPr>
+            <w:r>
+              <w:rPr>
+                <w:sz w:val="19"/>
+                <w:szCs w:val="19"/>
+              </w:rPr>
+              <w:t>3 días</w:t>
+            </w:r>
+          </w:p>
+        </w:tc>
+        <w:tc>
+          <w:tcPr>
+            <w:tcW w:w="1501" w:type="dxa"/>
+            <w:tcBorders>
+              <w:top w:val="single" w:sz="4" w:space="0" w:color="BFBFBF"/>
+              <w:left w:val="single" w:sz="4" w:space="0" w:color="BFBFBF"/>
+              <w:bottom w:val="single" w:sz="4" w:space="0" w:color="BFBFBF"/>
+              <w:right w:val="single" w:sz="4" w:space="0" w:color="BFBFBF"/>
+            </w:tcBorders>
+          </w:tcPr>
+          <w:p>
+            <w:pPr>
+              <w:pStyle w:val="Normal"/>
+              <w:spacing w:before="0" w:after="20"/>
+              <w:rPr/>
+            </w:pPr>
+            <w:r>
+              <w:rPr>
+                <w:sz w:val="19"/>
+                <w:szCs w:val="19"/>
+              </w:rPr>
+              <w:t>6.8 %</w:t>
+            </w:r>
+          </w:p>
+        </w:tc>
+        <w:tc>
+          <w:tcPr>
+            <w:tcW w:w="2299" w:type="dxa"/>
+            <w:tcBorders>
+              <w:top w:val="single" w:sz="4" w:space="0" w:color="BFBFBF"/>
+              <w:left w:val="single" w:sz="4" w:space="0" w:color="BFBFBF"/>
+              <w:bottom w:val="single" w:sz="4" w:space="0" w:color="BFBFBF"/>
+              <w:right w:val="single" w:sz="4" w:space="0" w:color="BFBFBF"/>
+            </w:tcBorders>
+          </w:tcPr>
+          <w:p>
+            <w:pPr>
+              <w:pStyle w:val="Normal"/>
+              <w:spacing w:before="0" w:after="20"/>
+              <w:rPr/>
+            </w:pPr>
+            <w:r>
+              <w:rPr>
+                <w:sz w:val="19"/>
+                <w:szCs w:val="19"/>
+              </w:rPr>
+              <w:t>0/5 (0 %)</w:t>
+            </w:r>
+          </w:p>
+          <w:p>
+            <w:pPr>
+              <w:pStyle w:val="Normal"/>
+              <w:spacing w:before="0" w:after="20"/>
+              <w:rPr/>
+            </w:pPr>
+            <w:r>
+              <w:rPr>
+                <w:sz w:val="19"/>
+                <w:szCs w:val="19"/>
+              </w:rPr>
+              <w:t>razón 0</w:t>
+            </w:r>
+          </w:p>
+        </w:tc>
+        <w:tc>
+          <w:tcPr>
+            <w:tcW w:w="2170" w:type="dxa"/>
+            <w:tcBorders>
+              <w:top w:val="single" w:sz="4" w:space="0" w:color="BFBFBF"/>
+              <w:left w:val="single" w:sz="4" w:space="0" w:color="BFBFBF"/>
+              <w:bottom w:val="single" w:sz="4" w:space="0" w:color="BFBFBF"/>
+              <w:right w:val="single" w:sz="4" w:space="0" w:color="BFBFBF"/>
+            </w:tcBorders>
+          </w:tcPr>
+          <w:p>
+            <w:pPr>
+              <w:pStyle w:val="Normal"/>
+              <w:spacing w:before="0" w:after="20"/>
+              <w:rPr/>
+            </w:pPr>
+            <w:r>
+              <w:rPr>
+                <w:sz w:val="19"/>
+                <w:szCs w:val="19"/>
+              </w:rPr>
+              <w:t>1/3 (33.3 %)</w:t>
+            </w:r>
+          </w:p>
+          <w:p>
+            <w:pPr>
+              <w:pStyle w:val="Normal"/>
+              <w:spacing w:before="0" w:after="20"/>
+              <w:rPr/>
+            </w:pPr>
+            <w:r>
+              <w:rPr>
+                <w:sz w:val="19"/>
+                <w:szCs w:val="19"/>
+              </w:rPr>
+              <w:t>razón 4.88</w:t>
+            </w:r>
+          </w:p>
+        </w:tc>
+        <w:tc>
+          <w:tcPr>
+            <w:tcW w:w="2169" w:type="dxa"/>
+            <w:tcBorders>
+              <w:top w:val="single" w:sz="4" w:space="0" w:color="BFBFBF"/>
+              <w:left w:val="single" w:sz="4" w:space="0" w:color="BFBFBF"/>
+              <w:bottom w:val="single" w:sz="4" w:space="0" w:color="BFBFBF"/>
+              <w:right w:val="single" w:sz="4" w:space="0" w:color="BFBFBF"/>
+            </w:tcBorders>
+          </w:tcPr>
+          <w:p>
+            <w:pPr>
+              <w:pStyle w:val="Normal"/>
+              <w:spacing w:before="0" w:after="20"/>
+              <w:rPr/>
+            </w:pPr>
+            <w:r>
+              <w:rPr>
+                <w:sz w:val="19"/>
+                <w:szCs w:val="19"/>
+              </w:rPr>
+              <w:t>1/3 (33.3 %)</w:t>
+            </w:r>
+          </w:p>
+          <w:p>
+            <w:pPr>
+              <w:pStyle w:val="Normal"/>
+              <w:spacing w:before="0" w:after="20"/>
+              <w:rPr/>
+            </w:pPr>
+            <w:r>
+              <w:rPr>
+                <w:sz w:val="19"/>
+                <w:szCs w:val="19"/>
+              </w:rPr>
+              <w:t>razón 4.88</w:t>
+            </w:r>
+          </w:p>
+        </w:tc>
+      </w:tr>
+      <w:tr>
+        <w:trPr/>
+        <w:tc>
+          <w:tcPr>
+            <w:tcW w:w="1499" w:type="dxa"/>
+            <w:tcBorders>
+              <w:top w:val="single" w:sz="4" w:space="0" w:color="BFBFBF"/>
+              <w:left w:val="single" w:sz="4" w:space="0" w:color="BFBFBF"/>
+              <w:bottom w:val="single" w:sz="4" w:space="0" w:color="BFBFBF"/>
+              <w:right w:val="single" w:sz="4" w:space="0" w:color="BFBFBF"/>
+            </w:tcBorders>
+          </w:tcPr>
+          <w:p>
+            <w:pPr>
+              <w:pStyle w:val="Normal"/>
+              <w:spacing w:before="0" w:after="20"/>
+              <w:rPr/>
+            </w:pPr>
+            <w:r>
+              <w:rPr>
+                <w:sz w:val="19"/>
+                <w:szCs w:val="19"/>
+              </w:rPr>
+              <w:t>7 días</w:t>
+            </w:r>
+          </w:p>
+        </w:tc>
+        <w:tc>
+          <w:tcPr>
+            <w:tcW w:w="1501" w:type="dxa"/>
+            <w:tcBorders>
+              <w:top w:val="single" w:sz="4" w:space="0" w:color="BFBFBF"/>
+              <w:left w:val="single" w:sz="4" w:space="0" w:color="BFBFBF"/>
+              <w:bottom w:val="single" w:sz="4" w:space="0" w:color="BFBFBF"/>
+              <w:right w:val="single" w:sz="4" w:space="0" w:color="BFBFBF"/>
+            </w:tcBorders>
+          </w:tcPr>
+          <w:p>
+            <w:pPr>
+              <w:pStyle w:val="Normal"/>
+              <w:spacing w:before="0" w:after="20"/>
+              <w:rPr/>
+            </w:pPr>
+            <w:r>
+              <w:rPr>
+                <w:sz w:val="19"/>
+                <w:szCs w:val="19"/>
+              </w:rPr>
+              <w:t>10.1 %</w:t>
+            </w:r>
+          </w:p>
+        </w:tc>
+        <w:tc>
+          <w:tcPr>
+            <w:tcW w:w="2299" w:type="dxa"/>
+            <w:tcBorders>
+              <w:top w:val="single" w:sz="4" w:space="0" w:color="BFBFBF"/>
+              <w:left w:val="single" w:sz="4" w:space="0" w:color="BFBFBF"/>
+              <w:bottom w:val="single" w:sz="4" w:space="0" w:color="BFBFBF"/>
+              <w:right w:val="single" w:sz="4" w:space="0" w:color="BFBFBF"/>
+            </w:tcBorders>
+          </w:tcPr>
+          <w:p>
+            <w:pPr>
+              <w:pStyle w:val="Normal"/>
+              <w:spacing w:before="0" w:after="20"/>
+              <w:rPr/>
+            </w:pPr>
+            <w:r>
+              <w:rPr>
+                <w:sz w:val="19"/>
+                <w:szCs w:val="19"/>
+              </w:rPr>
+              <w:t>0/5 (0 %)</w:t>
+            </w:r>
+          </w:p>
+          <w:p>
+            <w:pPr>
+              <w:pStyle w:val="Normal"/>
+              <w:spacing w:before="0" w:after="20"/>
+              <w:rPr/>
+            </w:pPr>
+            <w:r>
+              <w:rPr>
+                <w:sz w:val="19"/>
+                <w:szCs w:val="19"/>
+              </w:rPr>
+              <w:t>razón 0</w:t>
+            </w:r>
+          </w:p>
+        </w:tc>
+        <w:tc>
+          <w:tcPr>
+            <w:tcW w:w="2170" w:type="dxa"/>
+            <w:tcBorders>
+              <w:top w:val="single" w:sz="4" w:space="0" w:color="BFBFBF"/>
+              <w:left w:val="single" w:sz="4" w:space="0" w:color="BFBFBF"/>
+              <w:bottom w:val="single" w:sz="4" w:space="0" w:color="BFBFBF"/>
+              <w:right w:val="single" w:sz="4" w:space="0" w:color="BFBFBF"/>
+            </w:tcBorders>
+          </w:tcPr>
+          <w:p>
+            <w:pPr>
+              <w:pStyle w:val="Normal"/>
+              <w:spacing w:before="0" w:after="20"/>
+              <w:rPr/>
+            </w:pPr>
+            <w:r>
+              <w:rPr>
+                <w:sz w:val="19"/>
+                <w:szCs w:val="19"/>
+              </w:rPr>
+              <w:t>1/3 (33.3 %)</w:t>
+            </w:r>
+          </w:p>
+          <w:p>
+            <w:pPr>
+              <w:pStyle w:val="Normal"/>
+              <w:spacing w:before="0" w:after="20"/>
+              <w:rPr/>
+            </w:pPr>
+            <w:r>
+              <w:rPr>
+                <w:sz w:val="19"/>
+                <w:szCs w:val="19"/>
+              </w:rPr>
+              <w:t>razón 3.31</w:t>
+            </w:r>
+          </w:p>
+        </w:tc>
+        <w:tc>
+          <w:tcPr>
+            <w:tcW w:w="2169" w:type="dxa"/>
+            <w:tcBorders>
+              <w:top w:val="single" w:sz="4" w:space="0" w:color="BFBFBF"/>
+              <w:left w:val="single" w:sz="4" w:space="0" w:color="BFBFBF"/>
+              <w:bottom w:val="single" w:sz="4" w:space="0" w:color="BFBFBF"/>
+              <w:right w:val="single" w:sz="4" w:space="0" w:color="BFBFBF"/>
+            </w:tcBorders>
+          </w:tcPr>
+          <w:p>
+            <w:pPr>
+              <w:pStyle w:val="Normal"/>
+              <w:spacing w:before="0" w:after="20"/>
+              <w:rPr/>
+            </w:pPr>
+            <w:r>
+              <w:rPr>
+                <w:sz w:val="19"/>
+                <w:szCs w:val="19"/>
+              </w:rPr>
+              <w:t>1/3 (33.3 %)</w:t>
+            </w:r>
+          </w:p>
+          <w:p>
+            <w:pPr>
+              <w:pStyle w:val="Normal"/>
+              <w:spacing w:before="0" w:after="20"/>
+              <w:rPr/>
+            </w:pPr>
+            <w:r>
+              <w:rPr>
+                <w:sz w:val="19"/>
+                <w:szCs w:val="19"/>
+              </w:rPr>
+              <w:t>razón 3.31</w:t>
+            </w:r>
+          </w:p>
+        </w:tc>
+      </w:tr>
+      <w:tr>
+        <w:trPr/>
+        <w:tc>
+          <w:tcPr>
+            <w:tcW w:w="1499" w:type="dxa"/>
+            <w:tcBorders>
+              <w:top w:val="single" w:sz="4" w:space="0" w:color="BFBFBF"/>
+              <w:left w:val="single" w:sz="4" w:space="0" w:color="BFBFBF"/>
+              <w:bottom w:val="single" w:sz="4" w:space="0" w:color="BFBFBF"/>
+              <w:right w:val="single" w:sz="4" w:space="0" w:color="BFBFBF"/>
+            </w:tcBorders>
+          </w:tcPr>
+          <w:p>
+            <w:pPr>
+              <w:pStyle w:val="Normal"/>
+              <w:spacing w:before="0" w:after="20"/>
+              <w:rPr/>
+            </w:pPr>
+            <w:r>
+              <w:rPr>
+                <w:sz w:val="19"/>
+                <w:szCs w:val="19"/>
+              </w:rPr>
+              <w:t>14 días</w:t>
+            </w:r>
+          </w:p>
+        </w:tc>
+        <w:tc>
+          <w:tcPr>
+            <w:tcW w:w="1501" w:type="dxa"/>
+            <w:tcBorders>
+              <w:top w:val="single" w:sz="4" w:space="0" w:color="BFBFBF"/>
+              <w:left w:val="single" w:sz="4" w:space="0" w:color="BFBFBF"/>
+              <w:bottom w:val="single" w:sz="4" w:space="0" w:color="BFBFBF"/>
+              <w:right w:val="single" w:sz="4" w:space="0" w:color="BFBFBF"/>
+            </w:tcBorders>
+          </w:tcPr>
+          <w:p>
+            <w:pPr>
+              <w:pStyle w:val="Normal"/>
+              <w:spacing w:before="0" w:after="20"/>
+              <w:rPr/>
+            </w:pPr>
+            <w:r>
+              <w:rPr>
+                <w:sz w:val="19"/>
+                <w:szCs w:val="19"/>
+              </w:rPr>
+              <w:t>14.8 %</w:t>
+            </w:r>
+          </w:p>
+        </w:tc>
+        <w:tc>
+          <w:tcPr>
+            <w:tcW w:w="2299" w:type="dxa"/>
+            <w:tcBorders>
+              <w:top w:val="single" w:sz="4" w:space="0" w:color="BFBFBF"/>
+              <w:left w:val="single" w:sz="4" w:space="0" w:color="BFBFBF"/>
+              <w:bottom w:val="single" w:sz="4" w:space="0" w:color="BFBFBF"/>
+              <w:right w:val="single" w:sz="4" w:space="0" w:color="BFBFBF"/>
+            </w:tcBorders>
+          </w:tcPr>
+          <w:p>
+            <w:pPr>
+              <w:pStyle w:val="Normal"/>
+              <w:spacing w:before="0" w:after="20"/>
+              <w:rPr/>
+            </w:pPr>
+            <w:r>
+              <w:rPr>
+                <w:sz w:val="19"/>
+                <w:szCs w:val="19"/>
+              </w:rPr>
+              <w:t>1/5 (20 %)</w:t>
+            </w:r>
+          </w:p>
+          <w:p>
+            <w:pPr>
+              <w:pStyle w:val="Normal"/>
+              <w:spacing w:before="0" w:after="20"/>
+              <w:rPr/>
+            </w:pPr>
+            <w:r>
+              <w:rPr>
+                <w:sz w:val="19"/>
+                <w:szCs w:val="19"/>
+              </w:rPr>
+              <w:t>razón 1.35</w:t>
+            </w:r>
+          </w:p>
+        </w:tc>
+        <w:tc>
+          <w:tcPr>
+            <w:tcW w:w="2170" w:type="dxa"/>
+            <w:tcBorders>
+              <w:top w:val="single" w:sz="4" w:space="0" w:color="BFBFBF"/>
+              <w:left w:val="single" w:sz="4" w:space="0" w:color="BFBFBF"/>
+              <w:bottom w:val="single" w:sz="4" w:space="0" w:color="BFBFBF"/>
+              <w:right w:val="single" w:sz="4" w:space="0" w:color="BFBFBF"/>
+            </w:tcBorders>
+          </w:tcPr>
+          <w:p>
+            <w:pPr>
+              <w:pStyle w:val="Normal"/>
+              <w:spacing w:before="0" w:after="20"/>
+              <w:rPr/>
+            </w:pPr>
+            <w:r>
+              <w:rPr>
+                <w:sz w:val="19"/>
+                <w:szCs w:val="19"/>
+              </w:rPr>
+              <w:t>1/3 (33.3 %)</w:t>
+            </w:r>
+          </w:p>
+          <w:p>
+            <w:pPr>
+              <w:pStyle w:val="Normal"/>
+              <w:spacing w:before="0" w:after="20"/>
+              <w:rPr/>
+            </w:pPr>
+            <w:r>
+              <w:rPr>
+                <w:sz w:val="19"/>
+                <w:szCs w:val="19"/>
+              </w:rPr>
+              <w:t>razón 2.26</w:t>
+            </w:r>
+          </w:p>
+        </w:tc>
+        <w:tc>
+          <w:tcPr>
+            <w:tcW w:w="2169" w:type="dxa"/>
+            <w:tcBorders>
+              <w:top w:val="single" w:sz="4" w:space="0" w:color="BFBFBF"/>
+              <w:left w:val="single" w:sz="4" w:space="0" w:color="BFBFBF"/>
+              <w:bottom w:val="single" w:sz="4" w:space="0" w:color="BFBFBF"/>
+              <w:right w:val="single" w:sz="4" w:space="0" w:color="BFBFBF"/>
+            </w:tcBorders>
+          </w:tcPr>
+          <w:p>
+            <w:pPr>
+              <w:pStyle w:val="Normal"/>
+              <w:spacing w:before="0" w:after="20"/>
+              <w:rPr/>
+            </w:pPr>
+            <w:r>
+              <w:rPr>
+                <w:sz w:val="19"/>
+                <w:szCs w:val="19"/>
+              </w:rPr>
+              <w:t>1/3 (33.3 %)</w:t>
+            </w:r>
+          </w:p>
+          <w:p>
+            <w:pPr>
+              <w:pStyle w:val="Normal"/>
+              <w:spacing w:before="0" w:after="20"/>
+              <w:rPr/>
+            </w:pPr>
+            <w:r>
+              <w:rPr>
+                <w:sz w:val="19"/>
+                <w:szCs w:val="19"/>
+              </w:rPr>
+              <w:t>razón 2.26</w:t>
+            </w:r>
+          </w:p>
+        </w:tc>
+      </w:tr>
+      <w:tr>
+        <w:trPr/>
+        <w:tc>
+          <w:tcPr>
+            <w:tcW w:w="1499" w:type="dxa"/>
+            <w:tcBorders>
+              <w:top w:val="single" w:sz="4" w:space="0" w:color="BFBFBF"/>
+              <w:left w:val="single" w:sz="4" w:space="0" w:color="BFBFBF"/>
+              <w:bottom w:val="single" w:sz="4" w:space="0" w:color="BFBFBF"/>
+              <w:right w:val="single" w:sz="4" w:space="0" w:color="BFBFBF"/>
+            </w:tcBorders>
+          </w:tcPr>
+          <w:p>
+            <w:pPr>
+              <w:pStyle w:val="Normal"/>
+              <w:spacing w:before="0" w:after="20"/>
+              <w:rPr/>
+            </w:pPr>
+            <w:r>
+              <w:rPr>
+                <w:sz w:val="19"/>
+                <w:szCs w:val="19"/>
+              </w:rPr>
+              <w:t>21 días</w:t>
+            </w:r>
+          </w:p>
+        </w:tc>
+        <w:tc>
+          <w:tcPr>
+            <w:tcW w:w="1501" w:type="dxa"/>
+            <w:tcBorders>
+              <w:top w:val="single" w:sz="4" w:space="0" w:color="BFBFBF"/>
+              <w:left w:val="single" w:sz="4" w:space="0" w:color="BFBFBF"/>
+              <w:bottom w:val="single" w:sz="4" w:space="0" w:color="BFBFBF"/>
+              <w:right w:val="single" w:sz="4" w:space="0" w:color="BFBFBF"/>
+            </w:tcBorders>
+          </w:tcPr>
+          <w:p>
+            <w:pPr>
+              <w:pStyle w:val="Normal"/>
+              <w:spacing w:before="0" w:after="20"/>
+              <w:rPr/>
+            </w:pPr>
+            <w:r>
+              <w:rPr>
+                <w:sz w:val="19"/>
+                <w:szCs w:val="19"/>
+              </w:rPr>
+              <w:t>18.1 %</w:t>
+            </w:r>
+          </w:p>
+        </w:tc>
+        <w:tc>
+          <w:tcPr>
+            <w:tcW w:w="2299" w:type="dxa"/>
+            <w:tcBorders>
+              <w:top w:val="single" w:sz="4" w:space="0" w:color="BFBFBF"/>
+              <w:left w:val="single" w:sz="4" w:space="0" w:color="BFBFBF"/>
+              <w:bottom w:val="single" w:sz="4" w:space="0" w:color="BFBFBF"/>
+              <w:right w:val="single" w:sz="4" w:space="0" w:color="BFBFBF"/>
+            </w:tcBorders>
+          </w:tcPr>
+          <w:p>
+            <w:pPr>
+              <w:pStyle w:val="Normal"/>
+              <w:spacing w:before="0" w:after="20"/>
+              <w:rPr/>
+            </w:pPr>
+            <w:r>
+              <w:rPr>
+                <w:sz w:val="19"/>
+                <w:szCs w:val="19"/>
+              </w:rPr>
+              <w:t>3/5 (60 %)</w:t>
+            </w:r>
+          </w:p>
+          <w:p>
+            <w:pPr>
+              <w:pStyle w:val="Normal"/>
+              <w:spacing w:before="0" w:after="20"/>
+              <w:rPr/>
+            </w:pPr>
+            <w:r>
+              <w:rPr>
+                <w:sz w:val="19"/>
+                <w:szCs w:val="19"/>
+              </w:rPr>
+              <w:t>razón 3.31</w:t>
+            </w:r>
+          </w:p>
+        </w:tc>
+        <w:tc>
+          <w:tcPr>
+            <w:tcW w:w="2170" w:type="dxa"/>
+            <w:tcBorders>
+              <w:top w:val="single" w:sz="4" w:space="0" w:color="BFBFBF"/>
+              <w:left w:val="single" w:sz="4" w:space="0" w:color="BFBFBF"/>
+              <w:bottom w:val="single" w:sz="4" w:space="0" w:color="BFBFBF"/>
+              <w:right w:val="single" w:sz="4" w:space="0" w:color="BFBFBF"/>
+            </w:tcBorders>
+          </w:tcPr>
+          <w:p>
+            <w:pPr>
+              <w:pStyle w:val="Normal"/>
+              <w:spacing w:before="0" w:after="20"/>
+              <w:rPr/>
+            </w:pPr>
+            <w:r>
+              <w:rPr>
+                <w:sz w:val="19"/>
+                <w:szCs w:val="19"/>
+              </w:rPr>
+              <w:t>1/3 (33.3 %)</w:t>
+            </w:r>
+          </w:p>
+          <w:p>
+            <w:pPr>
+              <w:pStyle w:val="Normal"/>
+              <w:spacing w:before="0" w:after="20"/>
+              <w:rPr/>
+            </w:pPr>
+            <w:r>
+              <w:rPr>
+                <w:sz w:val="19"/>
+                <w:szCs w:val="19"/>
+              </w:rPr>
+              <w:t>razón 1.84</w:t>
+            </w:r>
+          </w:p>
+        </w:tc>
+        <w:tc>
+          <w:tcPr>
+            <w:tcW w:w="2169" w:type="dxa"/>
+            <w:tcBorders>
+              <w:top w:val="single" w:sz="4" w:space="0" w:color="BFBFBF"/>
+              <w:left w:val="single" w:sz="4" w:space="0" w:color="BFBFBF"/>
+              <w:bottom w:val="single" w:sz="4" w:space="0" w:color="BFBFBF"/>
+              <w:right w:val="single" w:sz="4" w:space="0" w:color="BFBFBF"/>
+            </w:tcBorders>
+          </w:tcPr>
+          <w:p>
+            <w:pPr>
+              <w:pStyle w:val="Normal"/>
+              <w:spacing w:before="0" w:after="20"/>
+              <w:rPr/>
+            </w:pPr>
+            <w:r>
+              <w:rPr>
+                <w:sz w:val="19"/>
+                <w:szCs w:val="19"/>
+              </w:rPr>
+              <w:t>1/3 (33.3 %)</w:t>
+            </w:r>
+          </w:p>
+          <w:p>
+            <w:pPr>
+              <w:pStyle w:val="Normal"/>
+              <w:spacing w:before="0" w:after="20"/>
+              <w:rPr/>
+            </w:pPr>
+            <w:r>
+              <w:rPr>
+                <w:sz w:val="19"/>
+                <w:szCs w:val="19"/>
+              </w:rPr>
+              <w:t>razón 1.84</w:t>
+            </w:r>
+          </w:p>
+        </w:tc>
+      </w:tr>
+    </w:tbl>
+    <w:p>
+      <w:pPr>
+        <w:pStyle w:val="Normal"/>
+        <w:spacing w:before="0" w:after="120"/>
+        <w:rPr/>
+      </w:pPr>
+      <w:r>
+        <w:rPr/>
+      </w:r>
+    </w:p>
+    <w:p>
+      <w:pPr>
+        <w:pStyle w:val="Normal"/>
+        <w:keepNext w:val="true"/>
+        <w:spacing w:before="120" w:after="60"/>
+        <w:jc w:val="center"/>
+        <w:rPr/>
+      </w:pPr>
+      <w:r>
+        <w:rPr/>
+        <w:drawing>
+          <wp:inline distT="0" distB="0" distL="0" distR="0">
+            <wp:extent cx="5715000" cy="2933700"/>
+            <wp:effectExtent l="0" t="0" r="0" b="0"/>
+            <wp:docPr id="11" name="web_evaluacion.png" descr="Figura 11&#10;Sección «Evaluación del modelo» en la página, con los incidentes sin fecha al pie."/>
+            <wp:cNvGraphicFramePr>
+              <a:graphicFrameLocks xmlns:a="http://schemas.openxmlformats.org/drawingml/2006/main" noChangeAspect="1"/>
+            </wp:cNvGraphicFramePr>
+            <a:graphic xmlns:a="http://schemas.openxmlformats.org/drawingml/2006/main">
+              <a:graphicData uri="http://schemas.openxmlformats.org/drawingml/2006/picture">
+                <pic:pic xmlns:pic="http://schemas.openxmlformats.org/drawingml/2006/picture">
+                  <pic:nvPicPr>
+                    <pic:cNvPr id="11" name="web_evaluacion.png" descr="Figura 11&#10;Sección «Evaluación del modelo» en la página, con los incidentes sin fecha al pie."/>
+                    <pic:cNvPicPr>
+                      <a:picLocks noChangeAspect="1" noChangeArrowheads="1"/>
+                    </pic:cNvPicPr>
+                  </pic:nvPicPr>
+                  <pic:blipFill>
+                    <a:blip r:embed="rId12"/>
+                    <a:stretch>
+                      <a:fillRect/>
+                    </a:stretch>
+                  </pic:blipFill>
+                  <pic:spPr bwMode="auto">
+                    <a:xfrm>
+                      <a:off x="0" y="0"/>
+                      <a:ext cx="5715000" cy="2933700"/>
+                    </a:xfrm>
+                    <a:prstGeom prst="rect">
+                      <a:avLst/>
+                    </a:prstGeom>
+                  </pic:spPr>
+                </pic:pic>
+              </a:graphicData>
+            </a:graphic>
+          </wp:inline>
+        </w:drawing>
+      </w:r>
+    </w:p>
+    <w:p>
+      <w:pPr>
+        <w:pStyle w:val="Normal"/>
+        <w:spacing w:before="0" w:after="200"/>
+        <w:jc w:val="center"/>
+        <w:rPr/>
+      </w:pPr>
+      <w:r>
+        <w:rPr>
+          <w:b/>
+          <w:bCs/>
+          <w:color w:val="52514E"/>
+          <w:sz w:val="18"/>
+          <w:szCs w:val="18"/>
+        </w:rPr>
+        <w:t xml:space="preserve">Figura 11. </w:t>
+      </w:r>
+      <w:r>
+        <w:rPr>
+          <w:i/>
+          <w:iCs/>
+          <w:color w:val="52514E"/>
+          <w:sz w:val="18"/>
+          <w:szCs w:val="18"/>
+        </w:rPr>
+        <w:t>Sección «Evaluación del modelo» en la página, con los incidentes sin fecha al pie.</w:t>
+      </w:r>
+    </w:p>
+    <w:p>
+      <w:pPr>
+        <w:pStyle w:val="Heading2"/>
+        <w:rPr/>
+      </w:pPr>
+      <w:bookmarkStart w:id="47" w:name="__RefHeading___Toc2341_2490839014"/>
+      <w:bookmarkEnd w:id="47"/>
+      <w:r>
+        <w:rPr/>
+        <w:t>15.3. Lectura de los resultados</w:t>
+      </w:r>
+    </w:p>
+    <w:p>
+      <w:pPr>
+        <w:pStyle w:val="ListParagraph"/>
+        <w:numPr>
+          <w:ilvl w:val="0"/>
+          <w:numId w:val="3"/>
+        </w:numPr>
+        <w:spacing w:before="0" w:after="60"/>
+        <w:rPr/>
+      </w:pPr>
+      <w:r>
+        <w:rPr/>
+        <w:t xml:space="preserve">Con la ventana de </w:t>
+      </w:r>
+      <w:r>
+        <w:rPr>
+          <w:b/>
+          <w:bCs/>
+        </w:rPr>
+        <w:t>7 días</w:t>
+      </w:r>
+      <w:r>
+        <w:rPr/>
+        <w:t xml:space="preserve"> ningún ataque hacktivista cae dentro; con </w:t>
+      </w:r>
+      <w:r>
+        <w:rPr>
+          <w:b/>
+          <w:bCs/>
+        </w:rPr>
+        <w:t>21 días</w:t>
+      </w:r>
+      <w:r>
+        <w:rPr/>
+        <w:t xml:space="preserve">, 3 de 5 (razón superior a 3). Esto sugiere que, si existe relación, el hacktivismo </w:t>
+      </w:r>
+      <w:r>
+        <w:rPr>
+          <w:b/>
+          <w:bCs/>
+        </w:rPr>
+        <w:t>no reacciona en una semana</w:t>
+      </w:r>
+      <w:r>
+        <w:rPr/>
+        <w:t>, sino en dos o tres. Es una hipótesis a confirmar con más datos.</w:t>
+      </w:r>
+    </w:p>
+    <w:p>
+      <w:pPr>
+        <w:pStyle w:val="ListParagraph"/>
+        <w:numPr>
+          <w:ilvl w:val="0"/>
+          <w:numId w:val="3"/>
+        </w:numPr>
+        <w:spacing w:before="0" w:after="60"/>
+        <w:rPr/>
+      </w:pPr>
+      <w:r>
+        <w:rPr/>
+        <w:t xml:space="preserve">El defacement de argentina.gob.ar (19/10/2023), de motivación política interna, cae dentro de la ventana abierta tras el 7 de octubre de 2023 y pone el semáforo en rojo: es un </w:t>
+      </w:r>
+      <w:r>
+        <w:rPr>
+          <w:b/>
+          <w:bCs/>
+        </w:rPr>
+        <w:t>falso positivo</w:t>
+      </w:r>
+      <w:r>
+        <w:rPr/>
+        <w:t xml:space="preserve"> que muestra el límite de un modelo basado solo en fechas.</w:t>
+      </w:r>
+    </w:p>
+    <w:p>
+      <w:pPr>
+        <w:pStyle w:val="Normal"/>
+        <w:pBdr>
+          <w:left w:val="single" w:sz="18" w:space="8" w:color="2A78D6"/>
+        </w:pBdr>
+        <w:shd w:val="clear" w:fill="EAF1FB"/>
+        <w:spacing w:before="120" w:after="160"/>
+        <w:ind w:left="200" w:right="200"/>
+        <w:rPr/>
+      </w:pPr>
+      <w:r>
+        <w:rPr>
+          <w:b/>
+          <w:bCs/>
+        </w:rPr>
+        <w:t>Advertencia:</w:t>
+      </w:r>
+      <w:r>
+        <w:rPr/>
+        <w:t xml:space="preserve"> son muy pocos incidentes y casi todos sin verificar. Estos números ilustran el </w:t>
+      </w:r>
+      <w:r>
+        <w:rPr>
+          <w:b/>
+          <w:bCs/>
+        </w:rPr>
+        <w:t>método</w:t>
+      </w:r>
+      <w:r>
+        <w:rPr/>
+        <w:t>; no permiten conclusiones. Al completarse el histórico de GDELT y verificarse los incidentes, la tabla se recalcula sola.</w:t>
+      </w:r>
+    </w:p>
+    <w:p>
+      <w:pPr>
+        <w:pStyle w:val="Heading2"/>
+        <w:rPr/>
+      </w:pPr>
+      <w:bookmarkStart w:id="48" w:name="__RefHeading___Toc2343_2490839014"/>
+      <w:bookmarkEnd w:id="48"/>
+      <w:r>
+        <w:rPr/>
+        <w:t>15.4. Extensión del período hasta la actualidad</w:t>
+      </w:r>
+    </w:p>
+    <w:p>
+      <w:pPr>
+        <w:pStyle w:val="Normal"/>
+        <w:spacing w:lineRule="exact" w:line="290" w:before="0" w:after="120"/>
+        <w:rPr/>
+      </w:pPr>
+      <w:r>
+        <w:rPr/>
+        <w:t xml:space="preserve">A pedido del autor, el período histórico se extendió a </w:t>
+      </w:r>
+      <w:r>
+        <w:rPr>
+          <w:b/>
+          <w:bCs/>
+        </w:rPr>
+        <w:t>01/08/2023 – 11/10/2026</w:t>
+      </w:r>
+      <w:r>
+        <w:rPr/>
+        <w:t xml:space="preserve"> (el día anterior al inicio del monitoreo en vivo). El caso de estudio original se mantiene como período predefinido en la página. La descarga de GDELT conserva lo ya obtenido y pasa de 196 a 623 tramos, por lo que tardará varios días más en completarse.</w:t>
+      </w:r>
+    </w:p>
+    <w:p>
+      <w:pPr>
+        <w:pStyle w:val="Normal"/>
+        <w:keepNext w:val="true"/>
+        <w:spacing w:before="120" w:after="60"/>
+        <w:jc w:val="center"/>
+        <w:rPr/>
+      </w:pPr>
+      <w:r>
+        <w:rPr/>
+        <w:drawing>
+          <wp:inline distT="0" distB="0" distL="0" distR="0">
+            <wp:extent cx="5715000" cy="4019550"/>
+            <wp:effectExtent l="0" t="0" r="0" b="0"/>
+            <wp:docPr id="12" name="web_periodo_completo.png" descr="Figura 12&#10;Vista del período completo (agosto 2023 – hoy) con los incidentes cargados y la descarga de GDELT todavía en curso."/>
+            <wp:cNvGraphicFramePr>
+              <a:graphicFrameLocks xmlns:a="http://schemas.openxmlformats.org/drawingml/2006/main" noChangeAspect="1"/>
+            </wp:cNvGraphicFramePr>
+            <a:graphic xmlns:a="http://schemas.openxmlformats.org/drawingml/2006/main">
+              <a:graphicData uri="http://schemas.openxmlformats.org/drawingml/2006/picture">
+                <pic:pic xmlns:pic="http://schemas.openxmlformats.org/drawingml/2006/picture">
+                  <pic:nvPicPr>
+                    <pic:cNvPr id="12" name="web_periodo_completo.png" descr="Figura 12&#10;Vista del período completo (agosto 2023 – hoy) con los incidentes cargados y la descarga de GDELT todavía en curso."/>
+                    <pic:cNvPicPr>
+                      <a:picLocks noChangeAspect="1" noChangeArrowheads="1"/>
+                    </pic:cNvPicPr>
+                  </pic:nvPicPr>
+                  <pic:blipFill>
+                    <a:blip r:embed="rId13"/>
+                    <a:stretch>
+                      <a:fillRect/>
+                    </a:stretch>
+                  </pic:blipFill>
+                  <pic:spPr bwMode="auto">
+                    <a:xfrm>
+                      <a:off x="0" y="0"/>
+                      <a:ext cx="5715000" cy="4019550"/>
+                    </a:xfrm>
+                    <a:prstGeom prst="rect">
+                      <a:avLst/>
+                    </a:prstGeom>
+                  </pic:spPr>
+                </pic:pic>
+              </a:graphicData>
+            </a:graphic>
+          </wp:inline>
+        </w:drawing>
+      </w:r>
+    </w:p>
+    <w:p>
+      <w:pPr>
+        <w:pStyle w:val="Normal"/>
+        <w:spacing w:before="0" w:after="200"/>
+        <w:jc w:val="center"/>
+        <w:rPr/>
+      </w:pPr>
+      <w:r>
+        <w:rPr>
+          <w:b/>
+          <w:bCs/>
+          <w:color w:val="52514E"/>
+          <w:sz w:val="18"/>
+          <w:szCs w:val="18"/>
+        </w:rPr>
+        <w:t xml:space="preserve">Figura 12. </w:t>
+      </w:r>
+      <w:r>
+        <w:rPr>
+          <w:i/>
+          <w:iCs/>
+          <w:color w:val="52514E"/>
+          <w:sz w:val="18"/>
+          <w:szCs w:val="18"/>
+        </w:rPr>
+        <w:t>Vista del período completo (agosto 2023 – hoy) con los incidentes cargados y la descarga de GDELT todavía en curso.</w:t>
+      </w:r>
+    </w:p>
+    <w:p>
+      <w:pPr>
+        <w:pStyle w:val="Normal"/>
+        <w:keepNext w:val="true"/>
+        <w:spacing w:before="120" w:after="60"/>
+        <w:jc w:val="center"/>
+        <w:rPr/>
+      </w:pPr>
+      <w:r>
+        <w:rPr/>
+        <w:drawing>
+          <wp:inline distT="0" distB="0" distL="0" distR="0">
+            <wp:extent cx="5715000" cy="1704975"/>
+            <wp:effectExtent l="0" t="0" r="0" b="0"/>
+            <wp:docPr id="13" name="web_linea_caso.png" descr="Figura 13&#10;Línea de tiempo del caso de estudio (ago 2023 – jul 2024): ventanas amarillas, períodos en rojo e incidentes cargados (rombos)."/>
+            <wp:cNvGraphicFramePr>
+              <a:graphicFrameLocks xmlns:a="http://schemas.openxmlformats.org/drawingml/2006/main" noChangeAspect="1"/>
+            </wp:cNvGraphicFramePr>
+            <a:graphic xmlns:a="http://schemas.openxmlformats.org/drawingml/2006/main">
+              <a:graphicData uri="http://schemas.openxmlformats.org/drawingml/2006/picture">
+                <pic:pic xmlns:pic="http://schemas.openxmlformats.org/drawingml/2006/picture">
+                  <pic:nvPicPr>
+                    <pic:cNvPr id="13" name="web_linea_caso.png" descr="Figura 13&#10;Línea de tiempo del caso de estudio (ago 2023 – jul 2024): ventanas amarillas, períodos en rojo e incidentes cargados (rombos)."/>
+                    <pic:cNvPicPr>
+                      <a:picLocks noChangeAspect="1" noChangeArrowheads="1"/>
+                    </pic:cNvPicPr>
+                  </pic:nvPicPr>
+                  <pic:blipFill>
+                    <a:blip r:embed="rId14"/>
+                    <a:stretch>
+                      <a:fillRect/>
+                    </a:stretch>
+                  </pic:blipFill>
+                  <pic:spPr bwMode="auto">
+                    <a:xfrm>
+                      <a:off x="0" y="0"/>
+                      <a:ext cx="5715000" cy="1704975"/>
+                    </a:xfrm>
+                    <a:prstGeom prst="rect">
+                      <a:avLst/>
+                    </a:prstGeom>
+                  </pic:spPr>
+                </pic:pic>
+              </a:graphicData>
+            </a:graphic>
+          </wp:inline>
+        </w:drawing>
+      </w:r>
+    </w:p>
+    <w:p>
+      <w:pPr>
+        <w:pStyle w:val="Normal"/>
+        <w:spacing w:before="0" w:after="200"/>
+        <w:jc w:val="center"/>
+        <w:rPr/>
+      </w:pPr>
+      <w:r>
+        <w:rPr>
+          <w:b/>
+          <w:bCs/>
+          <w:color w:val="52514E"/>
+          <w:sz w:val="18"/>
+          <w:szCs w:val="18"/>
+        </w:rPr>
+        <w:t xml:space="preserve">Figura 13. </w:t>
+      </w:r>
+      <w:r>
+        <w:rPr>
+          <w:i/>
+          <w:iCs/>
+          <w:color w:val="52514E"/>
+          <w:sz w:val="18"/>
+          <w:szCs w:val="18"/>
+        </w:rPr>
+        <w:t>Línea de tiempo del caso de estudio (ago 2023 – jul 2024): ventanas amarillas, períodos en rojo e incidentes cargados (rombos).</w:t>
+      </w:r>
+      <w:r>
+        <w:br w:type="page"/>
+      </w:r>
+    </w:p>
+    <w:p>
+      <w:pPr>
+        <w:pStyle w:val="Heading1"/>
+        <w:rPr/>
+      </w:pPr>
+      <w:bookmarkStart w:id="49" w:name="__RefHeading___Toc2345_2490839014"/>
+      <w:bookmarkEnd w:id="49"/>
       <w:r>
         <w:rPr/>
         <w:t>Anexo A. Bitácora del proyecto</w:t>
@@ -18190,6 +20184,418 @@
           </w:p>
         </w:tc>
       </w:tr>
+      <w:tr>
+        <w:trPr/>
+        <w:tc>
+          <w:tcPr>
+            <w:tcW w:w="1250" w:type="dxa"/>
+            <w:tcBorders>
+              <w:top w:val="single" w:sz="4" w:space="0" w:color="BFBFBF"/>
+              <w:left w:val="single" w:sz="4" w:space="0" w:color="BFBFBF"/>
+              <w:bottom w:val="single" w:sz="4" w:space="0" w:color="BFBFBF"/>
+              <w:right w:val="single" w:sz="4" w:space="0" w:color="BFBFBF"/>
+            </w:tcBorders>
+          </w:tcPr>
+          <w:p>
+            <w:pPr>
+              <w:pStyle w:val="Normal"/>
+              <w:spacing w:before="0" w:after="20"/>
+              <w:rPr/>
+            </w:pPr>
+            <w:r>
+              <w:rPr>
+                <w:sz w:val="19"/>
+                <w:szCs w:val="19"/>
+              </w:rPr>
+              <w:t>14/10/2026</w:t>
+            </w:r>
+          </w:p>
+        </w:tc>
+        <w:tc>
+          <w:tcPr>
+            <w:tcW w:w="1650" w:type="dxa"/>
+            <w:tcBorders>
+              <w:top w:val="single" w:sz="4" w:space="0" w:color="BFBFBF"/>
+              <w:left w:val="single" w:sz="4" w:space="0" w:color="BFBFBF"/>
+              <w:bottom w:val="single" w:sz="4" w:space="0" w:color="BFBFBF"/>
+              <w:right w:val="single" w:sz="4" w:space="0" w:color="BFBFBF"/>
+            </w:tcBorders>
+          </w:tcPr>
+          <w:p>
+            <w:pPr>
+              <w:pStyle w:val="Normal"/>
+              <w:spacing w:before="0" w:after="20"/>
+              <w:rPr/>
+            </w:pPr>
+            <w:r>
+              <w:rPr>
+                <w:sz w:val="19"/>
+                <w:szCs w:val="19"/>
+              </w:rPr>
+              <w:t>Decisión</w:t>
+            </w:r>
+          </w:p>
+        </w:tc>
+        <w:tc>
+          <w:tcPr>
+            <w:tcW w:w="2299" w:type="dxa"/>
+            <w:tcBorders>
+              <w:top w:val="single" w:sz="4" w:space="0" w:color="BFBFBF"/>
+              <w:left w:val="single" w:sz="4" w:space="0" w:color="BFBFBF"/>
+              <w:bottom w:val="single" w:sz="4" w:space="0" w:color="BFBFBF"/>
+              <w:right w:val="single" w:sz="4" w:space="0" w:color="BFBFBF"/>
+            </w:tcBorders>
+          </w:tcPr>
+          <w:p>
+            <w:pPr>
+              <w:pStyle w:val="Normal"/>
+              <w:spacing w:before="0" w:after="20"/>
+              <w:rPr/>
+            </w:pPr>
+            <w:r>
+              <w:rPr>
+                <w:sz w:val="19"/>
+                <w:szCs w:val="19"/>
+              </w:rPr>
+              <w:t>Carga de los 13 incidentes candidatos</w:t>
+            </w:r>
+          </w:p>
+        </w:tc>
+        <w:tc>
+          <w:tcPr>
+            <w:tcW w:w="4438" w:type="dxa"/>
+            <w:tcBorders>
+              <w:top w:val="single" w:sz="4" w:space="0" w:color="BFBFBF"/>
+              <w:left w:val="single" w:sz="4" w:space="0" w:color="BFBFBF"/>
+              <w:bottom w:val="single" w:sz="4" w:space="0" w:color="BFBFBF"/>
+              <w:right w:val="single" w:sz="4" w:space="0" w:color="BFBFBF"/>
+            </w:tcBorders>
+          </w:tcPr>
+          <w:p>
+            <w:pPr>
+              <w:pStyle w:val="Normal"/>
+              <w:spacing w:before="0" w:after="20"/>
+              <w:rPr/>
+            </w:pPr>
+            <w:r>
+              <w:rPr>
+                <w:sz w:val="19"/>
+                <w:szCs w:val="19"/>
+              </w:rPr>
+              <w:t>El autor decidió cargar los 13 candidatos en datos/incidentes_historicos.csv, todos marcados como no verificados. Los 2 sin fecha conocida (REM y Stucx Team) se listan, pero no entran al cálculo.</w:t>
+            </w:r>
+          </w:p>
+        </w:tc>
+      </w:tr>
+      <w:tr>
+        <w:trPr/>
+        <w:tc>
+          <w:tcPr>
+            <w:tcW w:w="1250" w:type="dxa"/>
+            <w:tcBorders>
+              <w:top w:val="single" w:sz="4" w:space="0" w:color="BFBFBF"/>
+              <w:left w:val="single" w:sz="4" w:space="0" w:color="BFBFBF"/>
+              <w:bottom w:val="single" w:sz="4" w:space="0" w:color="BFBFBF"/>
+              <w:right w:val="single" w:sz="4" w:space="0" w:color="BFBFBF"/>
+            </w:tcBorders>
+          </w:tcPr>
+          <w:p>
+            <w:pPr>
+              <w:pStyle w:val="Normal"/>
+              <w:spacing w:before="0" w:after="20"/>
+              <w:rPr/>
+            </w:pPr>
+            <w:r>
+              <w:rPr>
+                <w:sz w:val="19"/>
+                <w:szCs w:val="19"/>
+              </w:rPr>
+              <w:t>14/10/2026</w:t>
+            </w:r>
+          </w:p>
+        </w:tc>
+        <w:tc>
+          <w:tcPr>
+            <w:tcW w:w="1650" w:type="dxa"/>
+            <w:tcBorders>
+              <w:top w:val="single" w:sz="4" w:space="0" w:color="BFBFBF"/>
+              <w:left w:val="single" w:sz="4" w:space="0" w:color="BFBFBF"/>
+              <w:bottom w:val="single" w:sz="4" w:space="0" w:color="BFBFBF"/>
+              <w:right w:val="single" w:sz="4" w:space="0" w:color="BFBFBF"/>
+            </w:tcBorders>
+          </w:tcPr>
+          <w:p>
+            <w:pPr>
+              <w:pStyle w:val="Normal"/>
+              <w:spacing w:before="0" w:after="20"/>
+              <w:rPr/>
+            </w:pPr>
+            <w:r>
+              <w:rPr>
+                <w:sz w:val="19"/>
+                <w:szCs w:val="19"/>
+              </w:rPr>
+              <w:t>Desarrollo</w:t>
+            </w:r>
+          </w:p>
+        </w:tc>
+        <w:tc>
+          <w:tcPr>
+            <w:tcW w:w="2299" w:type="dxa"/>
+            <w:tcBorders>
+              <w:top w:val="single" w:sz="4" w:space="0" w:color="BFBFBF"/>
+              <w:left w:val="single" w:sz="4" w:space="0" w:color="BFBFBF"/>
+              <w:bottom w:val="single" w:sz="4" w:space="0" w:color="BFBFBF"/>
+              <w:right w:val="single" w:sz="4" w:space="0" w:color="BFBFBF"/>
+            </w:tcBorders>
+          </w:tcPr>
+          <w:p>
+            <w:pPr>
+              <w:pStyle w:val="Normal"/>
+              <w:spacing w:before="0" w:after="20"/>
+              <w:rPr/>
+            </w:pPr>
+            <w:r>
+              <w:rPr>
+                <w:sz w:val="19"/>
+                <w:szCs w:val="19"/>
+              </w:rPr>
+              <w:t>Evaluación del modelo por tipo de actor</w:t>
+            </w:r>
+          </w:p>
+        </w:tc>
+        <w:tc>
+          <w:tcPr>
+            <w:tcW w:w="4438" w:type="dxa"/>
+            <w:tcBorders>
+              <w:top w:val="single" w:sz="4" w:space="0" w:color="BFBFBF"/>
+              <w:left w:val="single" w:sz="4" w:space="0" w:color="BFBFBF"/>
+              <w:bottom w:val="single" w:sz="4" w:space="0" w:color="BFBFBF"/>
+              <w:right w:val="single" w:sz="4" w:space="0" w:color="BFBFBF"/>
+            </w:tcBorders>
+          </w:tcPr>
+          <w:p>
+            <w:pPr>
+              <w:pStyle w:val="Normal"/>
+              <w:spacing w:before="0" w:after="20"/>
+              <w:rPr/>
+            </w:pPr>
+            <w:r>
+              <w:rPr>
+                <w:sz w:val="19"/>
+                <w:szCs w:val="19"/>
+              </w:rPr>
+              <w:t>Nuevas columnas tipo_actor y fecha_precision. Nuevo módulo de evaluación que compara, para ventanas de 3, 7, 14 y 21 días, el porcentaje de ataques dentro de las ventanas con la cobertura esperable por azar. Se muestra en la web en la sección 'Evaluación del modelo'. Total de pruebas automáticas: 15.</w:t>
+            </w:r>
+          </w:p>
+        </w:tc>
+      </w:tr>
+      <w:tr>
+        <w:trPr/>
+        <w:tc>
+          <w:tcPr>
+            <w:tcW w:w="1250" w:type="dxa"/>
+            <w:tcBorders>
+              <w:top w:val="single" w:sz="4" w:space="0" w:color="BFBFBF"/>
+              <w:left w:val="single" w:sz="4" w:space="0" w:color="BFBFBF"/>
+              <w:bottom w:val="single" w:sz="4" w:space="0" w:color="BFBFBF"/>
+              <w:right w:val="single" w:sz="4" w:space="0" w:color="BFBFBF"/>
+            </w:tcBorders>
+          </w:tcPr>
+          <w:p>
+            <w:pPr>
+              <w:pStyle w:val="Normal"/>
+              <w:spacing w:before="0" w:after="20"/>
+              <w:rPr/>
+            </w:pPr>
+            <w:r>
+              <w:rPr>
+                <w:sz w:val="19"/>
+                <w:szCs w:val="19"/>
+              </w:rPr>
+              <w:t>14/10/2026</w:t>
+            </w:r>
+          </w:p>
+        </w:tc>
+        <w:tc>
+          <w:tcPr>
+            <w:tcW w:w="1650" w:type="dxa"/>
+            <w:tcBorders>
+              <w:top w:val="single" w:sz="4" w:space="0" w:color="BFBFBF"/>
+              <w:left w:val="single" w:sz="4" w:space="0" w:color="BFBFBF"/>
+              <w:bottom w:val="single" w:sz="4" w:space="0" w:color="BFBFBF"/>
+              <w:right w:val="single" w:sz="4" w:space="0" w:color="BFBFBF"/>
+            </w:tcBorders>
+          </w:tcPr>
+          <w:p>
+            <w:pPr>
+              <w:pStyle w:val="Normal"/>
+              <w:spacing w:before="0" w:after="20"/>
+              <w:rPr/>
+            </w:pPr>
+            <w:r>
+              <w:rPr>
+                <w:sz w:val="19"/>
+                <w:szCs w:val="19"/>
+              </w:rPr>
+              <w:t>Decisión</w:t>
+            </w:r>
+          </w:p>
+        </w:tc>
+        <w:tc>
+          <w:tcPr>
+            <w:tcW w:w="2299" w:type="dxa"/>
+            <w:tcBorders>
+              <w:top w:val="single" w:sz="4" w:space="0" w:color="BFBFBF"/>
+              <w:left w:val="single" w:sz="4" w:space="0" w:color="BFBFBF"/>
+              <w:bottom w:val="single" w:sz="4" w:space="0" w:color="BFBFBF"/>
+              <w:right w:val="single" w:sz="4" w:space="0" w:color="BFBFBF"/>
+            </w:tcBorders>
+          </w:tcPr>
+          <w:p>
+            <w:pPr>
+              <w:pStyle w:val="Normal"/>
+              <w:spacing w:before="0" w:after="20"/>
+              <w:rPr/>
+            </w:pPr>
+            <w:r>
+              <w:rPr>
+                <w:sz w:val="19"/>
+                <w:szCs w:val="19"/>
+              </w:rPr>
+              <w:t>Extensión del período histórico hasta la actualidad</w:t>
+            </w:r>
+          </w:p>
+        </w:tc>
+        <w:tc>
+          <w:tcPr>
+            <w:tcW w:w="4438" w:type="dxa"/>
+            <w:tcBorders>
+              <w:top w:val="single" w:sz="4" w:space="0" w:color="BFBFBF"/>
+              <w:left w:val="single" w:sz="4" w:space="0" w:color="BFBFBF"/>
+              <w:bottom w:val="single" w:sz="4" w:space="0" w:color="BFBFBF"/>
+              <w:right w:val="single" w:sz="4" w:space="0" w:color="BFBFBF"/>
+            </w:tcBorders>
+          </w:tcPr>
+          <w:p>
+            <w:pPr>
+              <w:pStyle w:val="Normal"/>
+              <w:spacing w:before="0" w:after="20"/>
+              <w:rPr/>
+            </w:pPr>
+            <w:r>
+              <w:rPr>
+                <w:sz w:val="19"/>
+                <w:szCs w:val="19"/>
+              </w:rPr>
+              <w:t>El período pasa a ser 01/08/2023 – 11/10/2026 (el día anterior al inicio del monitoreo en vivo). El caso de estudio original se conserva como período predefinido. La descarga de GDELT conserva lo ya descargado (44 tramos, ~10.000 artículos) y pasa de 196 a 623 tramos.</w:t>
+            </w:r>
+          </w:p>
+        </w:tc>
+      </w:tr>
+      <w:tr>
+        <w:trPr/>
+        <w:tc>
+          <w:tcPr>
+            <w:tcW w:w="1250" w:type="dxa"/>
+            <w:tcBorders>
+              <w:top w:val="single" w:sz="4" w:space="0" w:color="BFBFBF"/>
+              <w:left w:val="single" w:sz="4" w:space="0" w:color="BFBFBF"/>
+              <w:bottom w:val="single" w:sz="4" w:space="0" w:color="BFBFBF"/>
+              <w:right w:val="single" w:sz="4" w:space="0" w:color="BFBFBF"/>
+            </w:tcBorders>
+          </w:tcPr>
+          <w:p>
+            <w:pPr>
+              <w:pStyle w:val="Normal"/>
+              <w:spacing w:before="0" w:after="20"/>
+              <w:rPr/>
+            </w:pPr>
+            <w:r>
+              <w:rPr>
+                <w:sz w:val="19"/>
+                <w:szCs w:val="19"/>
+              </w:rPr>
+              <w:t>14/10/2026</w:t>
+            </w:r>
+          </w:p>
+        </w:tc>
+        <w:tc>
+          <w:tcPr>
+            <w:tcW w:w="1650" w:type="dxa"/>
+            <w:tcBorders>
+              <w:top w:val="single" w:sz="4" w:space="0" w:color="BFBFBF"/>
+              <w:left w:val="single" w:sz="4" w:space="0" w:color="BFBFBF"/>
+              <w:bottom w:val="single" w:sz="4" w:space="0" w:color="BFBFBF"/>
+              <w:right w:val="single" w:sz="4" w:space="0" w:color="BFBFBF"/>
+            </w:tcBorders>
+          </w:tcPr>
+          <w:p>
+            <w:pPr>
+              <w:pStyle w:val="Normal"/>
+              <w:spacing w:before="0" w:after="20"/>
+              <w:rPr/>
+            </w:pPr>
+            <w:r>
+              <w:rPr>
+                <w:sz w:val="19"/>
+                <w:szCs w:val="19"/>
+              </w:rPr>
+              <w:t>Resultado</w:t>
+            </w:r>
+          </w:p>
+        </w:tc>
+        <w:tc>
+          <w:tcPr>
+            <w:tcW w:w="2299" w:type="dxa"/>
+            <w:tcBorders>
+              <w:top w:val="single" w:sz="4" w:space="0" w:color="BFBFBF"/>
+              <w:left w:val="single" w:sz="4" w:space="0" w:color="BFBFBF"/>
+              <w:bottom w:val="single" w:sz="4" w:space="0" w:color="BFBFBF"/>
+              <w:right w:val="single" w:sz="4" w:space="0" w:color="BFBFBF"/>
+            </w:tcBorders>
+          </w:tcPr>
+          <w:p>
+            <w:pPr>
+              <w:pStyle w:val="Normal"/>
+              <w:spacing w:before="0" w:after="20"/>
+              <w:rPr/>
+            </w:pPr>
+            <w:r>
+              <w:rPr>
+                <w:sz w:val="19"/>
+                <w:szCs w:val="19"/>
+              </w:rPr>
+              <w:t>Primeros resultados preliminares</w:t>
+            </w:r>
+          </w:p>
+        </w:tc>
+        <w:tc>
+          <w:tcPr>
+            <w:tcW w:w="4438" w:type="dxa"/>
+            <w:tcBorders>
+              <w:top w:val="single" w:sz="4" w:space="0" w:color="BFBFBF"/>
+              <w:left w:val="single" w:sz="4" w:space="0" w:color="BFBFBF"/>
+              <w:bottom w:val="single" w:sz="4" w:space="0" w:color="BFBFBF"/>
+              <w:right w:val="single" w:sz="4" w:space="0" w:color="BFBFBF"/>
+            </w:tcBorders>
+          </w:tcPr>
+          <w:p>
+            <w:pPr>
+              <w:pStyle w:val="Normal"/>
+              <w:spacing w:before="0" w:after="20"/>
+              <w:rPr/>
+            </w:pPr>
+            <w:r>
+              <w:rPr>
+                <w:sz w:val="19"/>
+                <w:szCs w:val="19"/>
+              </w:rPr>
+              <w:t>Con 21 días de ventana, 3 de 5 ataques hacktivistas con fecha caen dentro de ventanas (60 %) frente a una cobertura del 18 % (razón 3,3). Con 7 días ninguno cae dentro. El defacement de argentina.gob.ar (19/10/2023, motivación interna) cae dentro de la ventana posterior al 7 de octubre: ejemplo de falso positivo.</w:t>
+            </w:r>
+          </w:p>
+        </w:tc>
+      </w:tr>
     </w:tbl>
     <w:p>
       <w:pPr>
@@ -18199,8 +20605,8 @@
       <w:r>
         <w:br w:type="page"/>
       </w:r>
-      <w:bookmarkStart w:id="45" w:name="__RefHeading___Toc2091_2511961668"/>
-      <w:bookmarkEnd w:id="45"/>
+      <w:bookmarkStart w:id="50" w:name="__RefHeading___Toc2347_2490839014"/>
+      <w:bookmarkEnd w:id="50"/>
       <w:r>
         <w:rPr/>
         <w:t>Anexo B. Glosario</w:t>
@@ -19454,12 +21860,12 @@
       </w:tr>
     </w:tbl>
     <w:sectPr>
-      <w:headerReference w:type="even" r:id="rId12"/>
-      <w:headerReference w:type="default" r:id="rId13"/>
-      <w:headerReference w:type="first" r:id="rId14"/>
-      <w:footerReference w:type="even" r:id="rId15"/>
-      <w:footerReference w:type="default" r:id="rId16"/>
-      <w:footerReference w:type="first" r:id="rId17"/>
+      <w:headerReference w:type="even" r:id="rId15"/>
+      <w:headerReference w:type="default" r:id="rId16"/>
+      <w:headerReference w:type="first" r:id="rId17"/>
+      <w:footerReference w:type="even" r:id="rId18"/>
+      <w:footerReference w:type="default" r:id="rId19"/>
+      <w:footerReference w:type="first" r:id="rId20"/>
       <w:type w:val="nextPage"/>
       <w:pgSz w:w="11906" w:h="16838"/>
       <w:pgMar w:left="1134" w:right="1134" w:gutter="0" w:header="708" w:top="1134" w:footer="708" w:bottom="1134"/>
@@ -19516,7 +21922,7 @@
     </w:r>
     <w:r>
       <w:rPr/>
-      <w:t>27</w:t>
+      <w:t>32</w:t>
     </w:r>
     <w:r>
       <w:rPr/>
@@ -19528,7 +21934,7 @@
         <w:sz w:val="16"/>
         <w:szCs w:val="16"/>
       </w:rPr>
-      <w:t xml:space="preserve"> · Versión 0.2 (14/10/2026)</w:t>
+      <w:t xml:space="preserve"> · Versión 0.3 (14/10/2026)</w:t>
     </w:r>
   </w:p>
 </w:ftr>
@@ -19564,7 +21970,7 @@
     </w:r>
     <w:r>
       <w:rPr/>
-      <w:t>27</w:t>
+      <w:t>32</w:t>
     </w:r>
     <w:r>
       <w:rPr/>
@@ -19576,7 +21982,7 @@
         <w:sz w:val="16"/>
         <w:szCs w:val="16"/>
       </w:rPr>
-      <w:t xml:space="preserve"> · Versión 0.2 (14/10/2026)</w:t>
+      <w:t xml:space="preserve"> · Versión 0.3 (14/10/2026)</w:t>
     </w:r>
   </w:p>
 </w:ftr>

</xml_diff>

<commit_message>
Carga de la segunda lista y evaluación con filtro por confianza
- 10 incidentes nuevos (INC-014 a INC-023) y 8 hechos clave (HC-009 a HC-016), sin verificar
- Evaluación en dos variantes: todos los incidentes y solo confianza media/alta (robustez)
- Web: selector de variante en 'Evaluación del modelo'
- 16 pruebas; decisión técnica D29; memoria v0.5

Co-Authored-By: Claude Opus 5.5 <noreply@anthropic.com>
Claude-Session: https://claude.ai/code/session_011eMYWh6VDWd8LKxBrkPUCG
</commit_message>
<xml_diff>
--- a/memoria/Memoria_TFM.docx
+++ b/memoria/Memoria_TFM.docx
@@ -145,7 +145,7 @@
           <w:sz w:val="20"/>
           <w:szCs w:val="20"/>
         </w:rPr>
-        <w:t>Versión 0.4 · 14/10/2026</w:t>
+        <w:t>Versión 0.5 · 14/10/2026</w:t>
       </w:r>
     </w:p>
     <w:p>
@@ -696,6 +696,84 @@
                 <w:szCs w:val="19"/>
               </w:rPr>
               <w:t>Segunda lista de candidatos (agosto 2024 – hoy): 8 hechos clave y 10 incidentes, pendientes de decisión del autor.</w:t>
+            </w:r>
+          </w:p>
+        </w:tc>
+      </w:tr>
+      <w:tr>
+        <w:trPr/>
+        <w:tc>
+          <w:tcPr>
+            <w:tcW w:w="1099" w:type="dxa"/>
+            <w:tcBorders>
+              <w:top w:val="single" w:sz="4" w:space="0" w:color="BFBFBF"/>
+              <w:left w:val="single" w:sz="4" w:space="0" w:color="BFBFBF"/>
+              <w:bottom w:val="single" w:sz="4" w:space="0" w:color="BFBFBF"/>
+              <w:right w:val="single" w:sz="4" w:space="0" w:color="BFBFBF"/>
+            </w:tcBorders>
+          </w:tcPr>
+          <w:p>
+            <w:pPr>
+              <w:pStyle w:val="Normal"/>
+              <w:spacing w:before="0" w:after="20"/>
+              <w:rPr/>
+            </w:pPr>
+            <w:r>
+              <w:rPr>
+                <w:sz w:val="19"/>
+                <w:szCs w:val="19"/>
+              </w:rPr>
+              <w:t>0.5</w:t>
+            </w:r>
+          </w:p>
+        </w:tc>
+        <w:tc>
+          <w:tcPr>
+            <w:tcW w:w="1401" w:type="dxa"/>
+            <w:tcBorders>
+              <w:top w:val="single" w:sz="4" w:space="0" w:color="BFBFBF"/>
+              <w:left w:val="single" w:sz="4" w:space="0" w:color="BFBFBF"/>
+              <w:bottom w:val="single" w:sz="4" w:space="0" w:color="BFBFBF"/>
+              <w:right w:val="single" w:sz="4" w:space="0" w:color="BFBFBF"/>
+            </w:tcBorders>
+          </w:tcPr>
+          <w:p>
+            <w:pPr>
+              <w:pStyle w:val="Normal"/>
+              <w:spacing w:before="0" w:after="20"/>
+              <w:rPr/>
+            </w:pPr>
+            <w:r>
+              <w:rPr>
+                <w:sz w:val="19"/>
+                <w:szCs w:val="19"/>
+              </w:rPr>
+              <w:t>14/10/2026</w:t>
+            </w:r>
+          </w:p>
+        </w:tc>
+        <w:tc>
+          <w:tcPr>
+            <w:tcW w:w="7138" w:type="dxa"/>
+            <w:tcBorders>
+              <w:top w:val="single" w:sz="4" w:space="0" w:color="BFBFBF"/>
+              <w:left w:val="single" w:sz="4" w:space="0" w:color="BFBFBF"/>
+              <w:bottom w:val="single" w:sz="4" w:space="0" w:color="BFBFBF"/>
+              <w:right w:val="single" w:sz="4" w:space="0" w:color="BFBFBF"/>
+            </w:tcBorders>
+          </w:tcPr>
+          <w:p>
+            <w:pPr>
+              <w:pStyle w:val="Normal"/>
+              <w:spacing w:before="0" w:after="20"/>
+              <w:rPr/>
+            </w:pPr>
+            <w:r>
+              <w:rPr>
+                <w:sz w:val="19"/>
+                <w:szCs w:val="19"/>
+              </w:rPr>
+              <w:t>Carga de la segunda lista (8 hechos clave y 10 incidentes) y evaluación con filtro por confianza (análisis de robustez).</w:t>
             </w:r>
           </w:p>
         </w:tc>
@@ -786,7 +864,7 @@
             </w:rPr>
             <w:fldChar w:fldCharType="separate"/>
           </w:r>
-          <w:hyperlink w:anchor="__RefHeading___Toc2571_1251848270">
+          <w:hyperlink w:anchor="__RefHeading___Toc2733_3501254244">
             <w:r>
               <w:rPr>
                 <w:rStyle w:val="IndexLink"/>
@@ -806,7 +884,7 @@
             </w:tabs>
             <w:rPr/>
           </w:pPr>
-          <w:hyperlink w:anchor="__RefHeading___Toc2573_1251848270">
+          <w:hyperlink w:anchor="__RefHeading___Toc2735_3501254244">
             <w:r>
               <w:rPr>
                 <w:rStyle w:val="IndexLink"/>
@@ -826,7 +904,7 @@
             </w:tabs>
             <w:rPr/>
           </w:pPr>
-          <w:hyperlink w:anchor="__RefHeading___Toc2575_1251848270">
+          <w:hyperlink w:anchor="__RefHeading___Toc2737_3501254244">
             <w:r>
               <w:rPr>
                 <w:rStyle w:val="IndexLink"/>
@@ -846,7 +924,7 @@
             </w:tabs>
             <w:rPr/>
           </w:pPr>
-          <w:hyperlink w:anchor="__RefHeading___Toc2577_1251848270">
+          <w:hyperlink w:anchor="__RefHeading___Toc2739_3501254244">
             <w:r>
               <w:rPr>
                 <w:rStyle w:val="IndexLink"/>
@@ -866,7 +944,7 @@
             </w:tabs>
             <w:rPr/>
           </w:pPr>
-          <w:hyperlink w:anchor="__RefHeading___Toc2579_1251848270">
+          <w:hyperlink w:anchor="__RefHeading___Toc2741_3501254244">
             <w:r>
               <w:rPr>
                 <w:rStyle w:val="IndexLink"/>
@@ -886,7 +964,7 @@
             </w:tabs>
             <w:rPr/>
           </w:pPr>
-          <w:hyperlink w:anchor="__RefHeading___Toc2581_1251848270">
+          <w:hyperlink w:anchor="__RefHeading___Toc2743_3501254244">
             <w:r>
               <w:rPr>
                 <w:rStyle w:val="IndexLink"/>
@@ -906,7 +984,7 @@
             </w:tabs>
             <w:rPr/>
           </w:pPr>
-          <w:hyperlink w:anchor="__RefHeading___Toc2583_1251848270">
+          <w:hyperlink w:anchor="__RefHeading___Toc2745_3501254244">
             <w:r>
               <w:rPr>
                 <w:rStyle w:val="IndexLink"/>
@@ -926,7 +1004,7 @@
             </w:tabs>
             <w:rPr/>
           </w:pPr>
-          <w:hyperlink w:anchor="__RefHeading___Toc2585_1251848270">
+          <w:hyperlink w:anchor="__RefHeading___Toc2747_3501254244">
             <w:r>
               <w:rPr>
                 <w:rStyle w:val="IndexLink"/>
@@ -946,7 +1024,7 @@
             </w:tabs>
             <w:rPr/>
           </w:pPr>
-          <w:hyperlink w:anchor="__RefHeading___Toc2587_1251848270">
+          <w:hyperlink w:anchor="__RefHeading___Toc2749_3501254244">
             <w:r>
               <w:rPr>
                 <w:rStyle w:val="IndexLink"/>
@@ -966,7 +1044,7 @@
             </w:tabs>
             <w:rPr/>
           </w:pPr>
-          <w:hyperlink w:anchor="__RefHeading___Toc2589_1251848270">
+          <w:hyperlink w:anchor="__RefHeading___Toc2751_3501254244">
             <w:r>
               <w:rPr>
                 <w:rStyle w:val="IndexLink"/>
@@ -986,7 +1064,7 @@
             </w:tabs>
             <w:rPr/>
           </w:pPr>
-          <w:hyperlink w:anchor="__RefHeading___Toc2591_1251848270">
+          <w:hyperlink w:anchor="__RefHeading___Toc2753_3501254244">
             <w:r>
               <w:rPr>
                 <w:rStyle w:val="IndexLink"/>
@@ -1006,7 +1084,7 @@
             </w:tabs>
             <w:rPr/>
           </w:pPr>
-          <w:hyperlink w:anchor="__RefHeading___Toc2593_1251848270">
+          <w:hyperlink w:anchor="__RefHeading___Toc2755_3501254244">
             <w:r>
               <w:rPr>
                 <w:rStyle w:val="IndexLink"/>
@@ -1026,7 +1104,7 @@
             </w:tabs>
             <w:rPr/>
           </w:pPr>
-          <w:hyperlink w:anchor="__RefHeading___Toc2595_1251848270">
+          <w:hyperlink w:anchor="__RefHeading___Toc2757_3501254244">
             <w:r>
               <w:rPr>
                 <w:rStyle w:val="IndexLink"/>
@@ -1046,7 +1124,7 @@
             </w:tabs>
             <w:rPr/>
           </w:pPr>
-          <w:hyperlink w:anchor="__RefHeading___Toc2597_1251848270">
+          <w:hyperlink w:anchor="__RefHeading___Toc2759_3501254244">
             <w:r>
               <w:rPr>
                 <w:rStyle w:val="IndexLink"/>
@@ -1066,7 +1144,7 @@
             </w:tabs>
             <w:rPr/>
           </w:pPr>
-          <w:hyperlink w:anchor="__RefHeading___Toc2599_1251848270">
+          <w:hyperlink w:anchor="__RefHeading___Toc2761_3501254244">
             <w:r>
               <w:rPr>
                 <w:rStyle w:val="IndexLink"/>
@@ -1086,7 +1164,7 @@
             </w:tabs>
             <w:rPr/>
           </w:pPr>
-          <w:hyperlink w:anchor="__RefHeading___Toc2601_1251848270">
+          <w:hyperlink w:anchor="__RefHeading___Toc2763_3501254244">
             <w:r>
               <w:rPr>
                 <w:rStyle w:val="IndexLink"/>
@@ -1106,7 +1184,7 @@
             </w:tabs>
             <w:rPr/>
           </w:pPr>
-          <w:hyperlink w:anchor="__RefHeading___Toc2603_1251848270">
+          <w:hyperlink w:anchor="__RefHeading___Toc2765_3501254244">
             <w:r>
               <w:rPr>
                 <w:rStyle w:val="IndexLink"/>
@@ -1126,7 +1204,7 @@
             </w:tabs>
             <w:rPr/>
           </w:pPr>
-          <w:hyperlink w:anchor="__RefHeading___Toc2605_1251848270">
+          <w:hyperlink w:anchor="__RefHeading___Toc2767_3501254244">
             <w:r>
               <w:rPr>
                 <w:rStyle w:val="IndexLink"/>
@@ -1146,7 +1224,7 @@
             </w:tabs>
             <w:rPr/>
           </w:pPr>
-          <w:hyperlink w:anchor="__RefHeading___Toc2607_1251848270">
+          <w:hyperlink w:anchor="__RefHeading___Toc2769_3501254244">
             <w:r>
               <w:rPr>
                 <w:rStyle w:val="IndexLink"/>
@@ -1166,7 +1244,7 @@
             </w:tabs>
             <w:rPr/>
           </w:pPr>
-          <w:hyperlink w:anchor="__RefHeading___Toc2609_1251848270">
+          <w:hyperlink w:anchor="__RefHeading___Toc2771_3501254244">
             <w:r>
               <w:rPr>
                 <w:rStyle w:val="IndexLink"/>
@@ -1186,7 +1264,7 @@
             </w:tabs>
             <w:rPr/>
           </w:pPr>
-          <w:hyperlink w:anchor="__RefHeading___Toc2611_1251848270">
+          <w:hyperlink w:anchor="__RefHeading___Toc2773_3501254244">
             <w:r>
               <w:rPr>
                 <w:rStyle w:val="IndexLink"/>
@@ -1206,7 +1284,7 @@
             </w:tabs>
             <w:rPr/>
           </w:pPr>
-          <w:hyperlink w:anchor="__RefHeading___Toc2613_1251848270">
+          <w:hyperlink w:anchor="__RefHeading___Toc2775_3501254244">
             <w:r>
               <w:rPr>
                 <w:rStyle w:val="IndexLink"/>
@@ -1226,7 +1304,7 @@
             </w:tabs>
             <w:rPr/>
           </w:pPr>
-          <w:hyperlink w:anchor="__RefHeading___Toc2615_1251848270">
+          <w:hyperlink w:anchor="__RefHeading___Toc2777_3501254244">
             <w:r>
               <w:rPr>
                 <w:rStyle w:val="IndexLink"/>
@@ -1246,7 +1324,7 @@
             </w:tabs>
             <w:rPr/>
           </w:pPr>
-          <w:hyperlink w:anchor="__RefHeading___Toc2617_1251848270">
+          <w:hyperlink w:anchor="__RefHeading___Toc2779_3501254244">
             <w:r>
               <w:rPr>
                 <w:rStyle w:val="IndexLink"/>
@@ -1266,7 +1344,7 @@
             </w:tabs>
             <w:rPr/>
           </w:pPr>
-          <w:hyperlink w:anchor="__RefHeading___Toc2619_1251848270">
+          <w:hyperlink w:anchor="__RefHeading___Toc2781_3501254244">
             <w:r>
               <w:rPr>
                 <w:rStyle w:val="IndexLink"/>
@@ -1286,7 +1364,7 @@
             </w:tabs>
             <w:rPr/>
           </w:pPr>
-          <w:hyperlink w:anchor="__RefHeading___Toc2621_1251848270">
+          <w:hyperlink w:anchor="__RefHeading___Toc2783_3501254244">
             <w:r>
               <w:rPr>
                 <w:rStyle w:val="IndexLink"/>
@@ -1306,7 +1384,7 @@
             </w:tabs>
             <w:rPr/>
           </w:pPr>
-          <w:hyperlink w:anchor="__RefHeading___Toc2623_1251848270">
+          <w:hyperlink w:anchor="__RefHeading___Toc2785_3501254244">
             <w:r>
               <w:rPr>
                 <w:rStyle w:val="IndexLink"/>
@@ -1326,7 +1404,7 @@
             </w:tabs>
             <w:rPr/>
           </w:pPr>
-          <w:hyperlink w:anchor="__RefHeading___Toc2625_1251848270">
+          <w:hyperlink w:anchor="__RefHeading___Toc2787_3501254244">
             <w:r>
               <w:rPr>
                 <w:rStyle w:val="IndexLink"/>
@@ -1346,7 +1424,7 @@
             </w:tabs>
             <w:rPr/>
           </w:pPr>
-          <w:hyperlink w:anchor="__RefHeading___Toc2627_1251848270">
+          <w:hyperlink w:anchor="__RefHeading___Toc2789_3501254244">
             <w:r>
               <w:rPr>
                 <w:rStyle w:val="IndexLink"/>
@@ -1366,7 +1444,7 @@
             </w:tabs>
             <w:rPr/>
           </w:pPr>
-          <w:hyperlink w:anchor="__RefHeading___Toc2629_1251848270">
+          <w:hyperlink w:anchor="__RefHeading___Toc2791_3501254244">
             <w:r>
               <w:rPr>
                 <w:rStyle w:val="IndexLink"/>
@@ -1386,7 +1464,7 @@
             </w:tabs>
             <w:rPr/>
           </w:pPr>
-          <w:hyperlink w:anchor="__RefHeading___Toc2631_1251848270">
+          <w:hyperlink w:anchor="__RefHeading___Toc2793_3501254244">
             <w:r>
               <w:rPr>
                 <w:rStyle w:val="IndexLink"/>
@@ -1406,7 +1484,7 @@
             </w:tabs>
             <w:rPr/>
           </w:pPr>
-          <w:hyperlink w:anchor="__RefHeading___Toc2633_1251848270">
+          <w:hyperlink w:anchor="__RefHeading___Toc2795_3501254244">
             <w:r>
               <w:rPr>
                 <w:rStyle w:val="IndexLink"/>
@@ -1426,7 +1504,7 @@
             </w:tabs>
             <w:rPr/>
           </w:pPr>
-          <w:hyperlink w:anchor="__RefHeading___Toc2635_1251848270">
+          <w:hyperlink w:anchor="__RefHeading___Toc2797_3501254244">
             <w:r>
               <w:rPr>
                 <w:rStyle w:val="IndexLink"/>
@@ -1446,7 +1524,7 @@
             </w:tabs>
             <w:rPr/>
           </w:pPr>
-          <w:hyperlink w:anchor="__RefHeading___Toc2637_1251848270">
+          <w:hyperlink w:anchor="__RefHeading___Toc2799_3501254244">
             <w:r>
               <w:rPr>
                 <w:rStyle w:val="IndexLink"/>
@@ -1466,7 +1544,7 @@
             </w:tabs>
             <w:rPr/>
           </w:pPr>
-          <w:hyperlink w:anchor="__RefHeading___Toc2639_1251848270">
+          <w:hyperlink w:anchor="__RefHeading___Toc2801_3501254244">
             <w:r>
               <w:rPr>
                 <w:rStyle w:val="IndexLink"/>
@@ -1486,7 +1564,7 @@
             </w:tabs>
             <w:rPr/>
           </w:pPr>
-          <w:hyperlink w:anchor="__RefHeading___Toc2641_1251848270">
+          <w:hyperlink w:anchor="__RefHeading___Toc2803_3501254244">
             <w:r>
               <w:rPr>
                 <w:rStyle w:val="IndexLink"/>
@@ -1506,7 +1584,7 @@
             </w:tabs>
             <w:rPr/>
           </w:pPr>
-          <w:hyperlink w:anchor="__RefHeading___Toc2643_1251848270">
+          <w:hyperlink w:anchor="__RefHeading___Toc2805_3501254244">
             <w:r>
               <w:rPr>
                 <w:rStyle w:val="IndexLink"/>
@@ -1526,7 +1604,7 @@
             </w:tabs>
             <w:rPr/>
           </w:pPr>
-          <w:hyperlink w:anchor="__RefHeading___Toc2645_1251848270">
+          <w:hyperlink w:anchor="__RefHeading___Toc2807_3501254244">
             <w:r>
               <w:rPr>
                 <w:rStyle w:val="IndexLink"/>
@@ -1546,7 +1624,7 @@
             </w:tabs>
             <w:rPr/>
           </w:pPr>
-          <w:hyperlink w:anchor="__RefHeading___Toc2647_1251848270">
+          <w:hyperlink w:anchor="__RefHeading___Toc2809_3501254244">
             <w:r>
               <w:rPr>
                 <w:rStyle w:val="IndexLink"/>
@@ -1566,7 +1644,7 @@
             </w:tabs>
             <w:rPr/>
           </w:pPr>
-          <w:hyperlink w:anchor="__RefHeading___Toc2649_1251848270">
+          <w:hyperlink w:anchor="__RefHeading___Toc2811_3501254244">
             <w:r>
               <w:rPr>
                 <w:rStyle w:val="IndexLink"/>
@@ -1586,7 +1664,7 @@
             </w:tabs>
             <w:rPr/>
           </w:pPr>
-          <w:hyperlink w:anchor="__RefHeading___Toc2651_1251848270">
+          <w:hyperlink w:anchor="__RefHeading___Toc2813_3501254244">
             <w:r>
               <w:rPr>
                 <w:rStyle w:val="IndexLink"/>
@@ -1606,7 +1684,7 @@
             </w:tabs>
             <w:rPr/>
           </w:pPr>
-          <w:hyperlink w:anchor="__RefHeading___Toc2653_1251848270">
+          <w:hyperlink w:anchor="__RefHeading___Toc2815_3501254244">
             <w:r>
               <w:rPr>
                 <w:rStyle w:val="IndexLink"/>
@@ -1626,7 +1704,7 @@
             </w:tabs>
             <w:rPr/>
           </w:pPr>
-          <w:hyperlink w:anchor="__RefHeading___Toc2655_1251848270">
+          <w:hyperlink w:anchor="__RefHeading___Toc2817_3501254244">
             <w:r>
               <w:rPr>
                 <w:rStyle w:val="IndexLink"/>
@@ -1646,7 +1724,7 @@
             </w:tabs>
             <w:rPr/>
           </w:pPr>
-          <w:hyperlink w:anchor="__RefHeading___Toc2657_1251848270">
+          <w:hyperlink w:anchor="__RefHeading___Toc2819_3501254244">
             <w:r>
               <w:rPr>
                 <w:rStyle w:val="IndexLink"/>
@@ -1666,7 +1744,7 @@
             </w:tabs>
             <w:rPr/>
           </w:pPr>
-          <w:hyperlink w:anchor="__RefHeading___Toc2659_1251848270">
+          <w:hyperlink w:anchor="__RefHeading___Toc2821_3501254244">
             <w:r>
               <w:rPr>
                 <w:rStyle w:val="IndexLink"/>
@@ -1686,7 +1764,7 @@
             </w:tabs>
             <w:rPr/>
           </w:pPr>
-          <w:hyperlink w:anchor="__RefHeading___Toc2661_1251848270">
+          <w:hyperlink w:anchor="__RefHeading___Toc2823_3501254244">
             <w:r>
               <w:rPr>
                 <w:rStyle w:val="IndexLink"/>
@@ -1706,7 +1784,7 @@
             </w:tabs>
             <w:rPr/>
           </w:pPr>
-          <w:hyperlink w:anchor="__RefHeading___Toc2663_1251848270">
+          <w:hyperlink w:anchor="__RefHeading___Toc2825_3501254244">
             <w:r>
               <w:rPr>
                 <w:rStyle w:val="IndexLink"/>
@@ -1726,7 +1804,7 @@
             </w:tabs>
             <w:rPr/>
           </w:pPr>
-          <w:hyperlink w:anchor="__RefHeading___Toc2665_1251848270">
+          <w:hyperlink w:anchor="__RefHeading___Toc2827_3501254244">
             <w:r>
               <w:rPr>
                 <w:rStyle w:val="IndexLink"/>
@@ -1746,7 +1824,7 @@
             </w:tabs>
             <w:rPr/>
           </w:pPr>
-          <w:hyperlink w:anchor="__RefHeading___Toc2667_1251848270">
+          <w:hyperlink w:anchor="__RefHeading___Toc2829_3501254244">
             <w:r>
               <w:rPr>
                 <w:rStyle w:val="IndexLink"/>
@@ -1766,7 +1844,7 @@
             </w:tabs>
             <w:rPr/>
           </w:pPr>
-          <w:hyperlink w:anchor="__RefHeading___Toc2669_1251848270">
+          <w:hyperlink w:anchor="__RefHeading___Toc2831_3501254244">
             <w:r>
               <w:rPr>
                 <w:rStyle w:val="IndexLink"/>
@@ -1786,7 +1864,7 @@
             </w:tabs>
             <w:rPr/>
           </w:pPr>
-          <w:hyperlink w:anchor="__RefHeading___Toc2671_1251848270">
+          <w:hyperlink w:anchor="__RefHeading___Toc2833_3501254244">
             <w:r>
               <w:rPr>
                 <w:rStyle w:val="IndexLink"/>
@@ -1806,7 +1884,7 @@
             </w:tabs>
             <w:rPr/>
           </w:pPr>
-          <w:hyperlink w:anchor="__RefHeading___Toc2673_1251848270">
+          <w:hyperlink w:anchor="__RefHeading___Toc2835_3501254244">
             <w:r>
               <w:rPr>
                 <w:rStyle w:val="IndexLink"/>
@@ -1842,7 +1920,7 @@
         <w:pStyle w:val="Heading1"/>
         <w:rPr/>
       </w:pPr>
-      <w:bookmarkStart w:id="0" w:name="__RefHeading___Toc2571_1251848270"/>
+      <w:bookmarkStart w:id="0" w:name="__RefHeading___Toc2733_3501254244"/>
       <w:bookmarkEnd w:id="0"/>
       <w:r>
         <w:rPr/>
@@ -1854,7 +1932,7 @@
         <w:pStyle w:val="Heading2"/>
         <w:rPr/>
       </w:pPr>
-      <w:bookmarkStart w:id="1" w:name="__RefHeading___Toc2573_1251848270"/>
+      <w:bookmarkStart w:id="1" w:name="__RefHeading___Toc2735_3501254244"/>
       <w:bookmarkEnd w:id="1"/>
       <w:r>
         <w:rPr/>
@@ -1910,7 +1988,7 @@
         <w:pStyle w:val="Heading2"/>
         <w:rPr/>
       </w:pPr>
-      <w:bookmarkStart w:id="2" w:name="__RefHeading___Toc2575_1251848270"/>
+      <w:bookmarkStart w:id="2" w:name="__RefHeading___Toc2737_3501254244"/>
       <w:bookmarkEnd w:id="2"/>
       <w:r>
         <w:rPr/>
@@ -2012,7 +2090,7 @@
         <w:pStyle w:val="Heading2"/>
         <w:rPr/>
       </w:pPr>
-      <w:bookmarkStart w:id="3" w:name="__RefHeading___Toc2577_1251848270"/>
+      <w:bookmarkStart w:id="3" w:name="__RefHeading___Toc2739_3501254244"/>
       <w:bookmarkEnd w:id="3"/>
       <w:r>
         <w:rPr/>
@@ -2049,7 +2127,7 @@
         <w:pStyle w:val="Heading1"/>
         <w:rPr/>
       </w:pPr>
-      <w:bookmarkStart w:id="4" w:name="__RefHeading___Toc2579_1251848270"/>
+      <w:bookmarkStart w:id="4" w:name="__RefHeading___Toc2741_3501254244"/>
       <w:bookmarkEnd w:id="4"/>
       <w:r>
         <w:rPr/>
@@ -2061,7 +2139,7 @@
         <w:pStyle w:val="Heading2"/>
         <w:rPr/>
       </w:pPr>
-      <w:bookmarkStart w:id="5" w:name="__RefHeading___Toc2581_1251848270"/>
+      <w:bookmarkStart w:id="5" w:name="__RefHeading___Toc2743_3501254244"/>
       <w:bookmarkEnd w:id="5"/>
       <w:r>
         <w:rPr/>
@@ -2095,7 +2173,7 @@
         <w:pStyle w:val="Heading2"/>
         <w:rPr/>
       </w:pPr>
-      <w:bookmarkStart w:id="6" w:name="__RefHeading___Toc2583_1251848270"/>
+      <w:bookmarkStart w:id="6" w:name="__RefHeading___Toc2745_3501254244"/>
       <w:bookmarkEnd w:id="6"/>
       <w:r>
         <w:rPr/>
@@ -2359,7 +2437,7 @@
         <w:pStyle w:val="Heading2"/>
         <w:rPr/>
       </w:pPr>
-      <w:bookmarkStart w:id="7" w:name="__RefHeading___Toc2585_1251848270"/>
+      <w:bookmarkStart w:id="7" w:name="__RefHeading___Toc2747_3501254244"/>
       <w:bookmarkEnd w:id="7"/>
       <w:r>
         <w:rPr/>
@@ -2773,7 +2851,7 @@
       <w:r>
         <w:br w:type="page"/>
       </w:r>
-      <w:bookmarkStart w:id="8" w:name="__RefHeading___Toc2587_1251848270"/>
+      <w:bookmarkStart w:id="8" w:name="__RefHeading___Toc2749_3501254244"/>
       <w:bookmarkEnd w:id="8"/>
       <w:r>
         <w:rPr/>
@@ -3357,7 +3435,7 @@
       <w:r>
         <w:br w:type="page"/>
       </w:r>
-      <w:bookmarkStart w:id="9" w:name="__RefHeading___Toc2589_1251848270"/>
+      <w:bookmarkStart w:id="9" w:name="__RefHeading___Toc2751_3501254244"/>
       <w:bookmarkEnd w:id="9"/>
       <w:r>
         <w:rPr/>
@@ -3591,7 +3669,7 @@
         <w:pStyle w:val="Heading2"/>
         <w:rPr/>
       </w:pPr>
-      <w:bookmarkStart w:id="10" w:name="__RefHeading___Toc2591_1251848270"/>
+      <w:bookmarkStart w:id="10" w:name="__RefHeading___Toc2753_3501254244"/>
       <w:bookmarkEnd w:id="10"/>
       <w:r>
         <w:rPr/>
@@ -3898,7 +3976,7 @@
         <w:pStyle w:val="Heading1"/>
         <w:rPr/>
       </w:pPr>
-      <w:bookmarkStart w:id="11" w:name="__RefHeading___Toc2593_1251848270"/>
+      <w:bookmarkStart w:id="11" w:name="__RefHeading___Toc2755_3501254244"/>
       <w:bookmarkEnd w:id="11"/>
       <w:r>
         <w:rPr/>
@@ -3910,7 +3988,7 @@
         <w:pStyle w:val="Heading2"/>
         <w:rPr/>
       </w:pPr>
-      <w:bookmarkStart w:id="12" w:name="__RefHeading___Toc2595_1251848270"/>
+      <w:bookmarkStart w:id="12" w:name="__RefHeading___Toc2757_3501254244"/>
       <w:bookmarkEnd w:id="12"/>
       <w:r>
         <w:rPr/>
@@ -4700,7 +4778,7 @@
         <w:pStyle w:val="Heading2"/>
         <w:rPr/>
       </w:pPr>
-      <w:bookmarkStart w:id="13" w:name="__RefHeading___Toc2597_1251848270"/>
+      <w:bookmarkStart w:id="13" w:name="__RefHeading___Toc2759_3501254244"/>
       <w:bookmarkEnd w:id="13"/>
       <w:r>
         <w:rPr/>
@@ -4878,7 +4956,7 @@
         <w:pStyle w:val="Heading2"/>
         <w:rPr/>
       </w:pPr>
-      <w:bookmarkStart w:id="14" w:name="__RefHeading___Toc2599_1251848270"/>
+      <w:bookmarkStart w:id="14" w:name="__RefHeading___Toc2761_3501254244"/>
       <w:bookmarkEnd w:id="14"/>
       <w:r>
         <w:rPr/>
@@ -5368,7 +5446,7 @@
         <w:pStyle w:val="Heading2"/>
         <w:rPr/>
       </w:pPr>
-      <w:bookmarkStart w:id="15" w:name="__RefHeading___Toc2601_1251848270"/>
+      <w:bookmarkStart w:id="15" w:name="__RefHeading___Toc2763_3501254244"/>
       <w:bookmarkEnd w:id="15"/>
       <w:r>
         <w:rPr/>
@@ -6363,7 +6441,7 @@
         <w:pStyle w:val="Heading1"/>
         <w:rPr/>
       </w:pPr>
-      <w:bookmarkStart w:id="16" w:name="__RefHeading___Toc2603_1251848270"/>
+      <w:bookmarkStart w:id="16" w:name="__RefHeading___Toc2765_3501254244"/>
       <w:bookmarkEnd w:id="16"/>
       <w:r>
         <w:rPr/>
@@ -6375,7 +6453,7 @@
         <w:pStyle w:val="Heading2"/>
         <w:rPr/>
       </w:pPr>
-      <w:bookmarkStart w:id="17" w:name="__RefHeading___Toc2605_1251848270"/>
+      <w:bookmarkStart w:id="17" w:name="__RefHeading___Toc2767_3501254244"/>
       <w:bookmarkEnd w:id="17"/>
       <w:r>
         <w:rPr/>
@@ -6650,7 +6728,7 @@
         <w:pStyle w:val="Heading2"/>
         <w:rPr/>
       </w:pPr>
-      <w:bookmarkStart w:id="18" w:name="__RefHeading___Toc2607_1251848270"/>
+      <w:bookmarkStart w:id="18" w:name="__RefHeading___Toc2769_3501254244"/>
       <w:bookmarkEnd w:id="18"/>
       <w:r>
         <w:rPr/>
@@ -6748,7 +6826,7 @@
         <w:pStyle w:val="Heading2"/>
         <w:rPr/>
       </w:pPr>
-      <w:bookmarkStart w:id="19" w:name="__RefHeading___Toc2609_1251848270"/>
+      <w:bookmarkStart w:id="19" w:name="__RefHeading___Toc2771_3501254244"/>
       <w:bookmarkEnd w:id="19"/>
       <w:r>
         <w:rPr/>
@@ -7254,7 +7332,7 @@
       <w:r>
         <w:br w:type="page"/>
       </w:r>
-      <w:bookmarkStart w:id="20" w:name="__RefHeading___Toc2611_1251848270"/>
+      <w:bookmarkStart w:id="20" w:name="__RefHeading___Toc2773_3501254244"/>
       <w:bookmarkEnd w:id="20"/>
       <w:r>
         <w:rPr/>
@@ -7266,7 +7344,7 @@
         <w:pStyle w:val="Heading2"/>
         <w:rPr/>
       </w:pPr>
-      <w:bookmarkStart w:id="21" w:name="__RefHeading___Toc2613_1251848270"/>
+      <w:bookmarkStart w:id="21" w:name="__RefHeading___Toc2775_3501254244"/>
       <w:bookmarkEnd w:id="21"/>
       <w:r>
         <w:rPr/>
@@ -7432,7 +7510,7 @@
         <w:pStyle w:val="Heading2"/>
         <w:rPr/>
       </w:pPr>
-      <w:bookmarkStart w:id="22" w:name="__RefHeading___Toc2615_1251848270"/>
+      <w:bookmarkStart w:id="22" w:name="__RefHeading___Toc2777_3501254244"/>
       <w:bookmarkEnd w:id="22"/>
       <w:r>
         <w:rPr/>
@@ -7966,7 +8044,7 @@
         <w:pStyle w:val="Heading2"/>
         <w:rPr/>
       </w:pPr>
-      <w:bookmarkStart w:id="23" w:name="__RefHeading___Toc2617_1251848270"/>
+      <w:bookmarkStart w:id="23" w:name="__RefHeading___Toc2779_3501254244"/>
       <w:bookmarkEnd w:id="23"/>
       <w:r>
         <w:rPr/>
@@ -8404,7 +8482,7 @@
       <w:r>
         <w:br w:type="page"/>
       </w:r>
-      <w:bookmarkStart w:id="24" w:name="__RefHeading___Toc2619_1251848270"/>
+      <w:bookmarkStart w:id="24" w:name="__RefHeading___Toc2781_3501254244"/>
       <w:bookmarkEnd w:id="24"/>
       <w:r>
         <w:rPr/>
@@ -8504,7 +8582,7 @@
         <w:pStyle w:val="Heading2"/>
         <w:rPr/>
       </w:pPr>
-      <w:bookmarkStart w:id="25" w:name="__RefHeading___Toc2621_1251848270"/>
+      <w:bookmarkStart w:id="25" w:name="__RefHeading___Toc2783_3501254244"/>
       <w:bookmarkEnd w:id="25"/>
       <w:r>
         <w:rPr/>
@@ -8970,7 +9048,7 @@
         <w:pStyle w:val="Heading1"/>
         <w:rPr/>
       </w:pPr>
-      <w:bookmarkStart w:id="26" w:name="__RefHeading___Toc2623_1251848270"/>
+      <w:bookmarkStart w:id="26" w:name="__RefHeading___Toc2785_3501254244"/>
       <w:bookmarkEnd w:id="26"/>
       <w:r>
         <w:rPr/>
@@ -8982,7 +9060,7 @@
         <w:pStyle w:val="Heading2"/>
         <w:rPr/>
       </w:pPr>
-      <w:bookmarkStart w:id="27" w:name="__RefHeading___Toc2625_1251848270"/>
+      <w:bookmarkStart w:id="27" w:name="__RefHeading___Toc2787_3501254244"/>
       <w:bookmarkEnd w:id="27"/>
       <w:r>
         <w:rPr/>
@@ -9339,7 +9417,7 @@
         <w:pStyle w:val="Heading2"/>
         <w:rPr/>
       </w:pPr>
-      <w:bookmarkStart w:id="28" w:name="__RefHeading___Toc2627_1251848270"/>
+      <w:bookmarkStart w:id="28" w:name="__RefHeading___Toc2789_3501254244"/>
       <w:bookmarkEnd w:id="28"/>
       <w:r>
         <w:rPr/>
@@ -9627,7 +9705,7 @@
         <w:pStyle w:val="Heading2"/>
         <w:rPr/>
       </w:pPr>
-      <w:bookmarkStart w:id="29" w:name="__RefHeading___Toc2629_1251848270"/>
+      <w:bookmarkStart w:id="29" w:name="__RefHeading___Toc2791_3501254244"/>
       <w:bookmarkEnd w:id="29"/>
       <w:r>
         <w:rPr/>
@@ -9830,7 +9908,7 @@
         <w:pStyle w:val="Heading1"/>
         <w:rPr/>
       </w:pPr>
-      <w:bookmarkStart w:id="30" w:name="__RefHeading___Toc2631_1251848270"/>
+      <w:bookmarkStart w:id="30" w:name="__RefHeading___Toc2793_3501254244"/>
       <w:bookmarkEnd w:id="30"/>
       <w:r>
         <w:rPr/>
@@ -9842,7 +9920,7 @@
         <w:pStyle w:val="Heading2"/>
         <w:rPr/>
       </w:pPr>
-      <w:bookmarkStart w:id="31" w:name="__RefHeading___Toc2633_1251848270"/>
+      <w:bookmarkStart w:id="31" w:name="__RefHeading___Toc2795_3501254244"/>
       <w:bookmarkEnd w:id="31"/>
       <w:r>
         <w:rPr/>
@@ -9869,7 +9947,7 @@
       </w:r>
       <w:r>
         <w:rPr/>
-        <w:t xml:space="preserve"> contiene 15 pruebas que se ejecutan antes de cada revisión. Si alguna falla, la revisión se detiene y la web publicada no cambia.</w:t>
+        <w:t xml:space="preserve"> contiene 16 pruebas que se ejecutan antes de cada revisión. Si alguna falla, la revisión se detiene y la web publicada no cambia.</w:t>
       </w:r>
     </w:p>
     <w:tbl>
@@ -10747,13 +10825,66 @@
           </w:p>
         </w:tc>
       </w:tr>
+      <w:tr>
+        <w:trPr/>
+        <w:tc>
+          <w:tcPr>
+            <w:tcW w:w="2600" w:type="dxa"/>
+            <w:tcBorders>
+              <w:top w:val="single" w:sz="4" w:space="0" w:color="BFBFBF"/>
+              <w:left w:val="single" w:sz="4" w:space="0" w:color="BFBFBF"/>
+              <w:bottom w:val="single" w:sz="4" w:space="0" w:color="BFBFBF"/>
+              <w:right w:val="single" w:sz="4" w:space="0" w:color="BFBFBF"/>
+            </w:tcBorders>
+          </w:tcPr>
+          <w:p>
+            <w:pPr>
+              <w:pStyle w:val="Normal"/>
+              <w:spacing w:before="0" w:after="20"/>
+              <w:rPr/>
+            </w:pPr>
+            <w:r>
+              <w:rPr>
+                <w:sz w:val="19"/>
+                <w:szCs w:val="19"/>
+              </w:rPr>
+              <w:t>Filtro por confianza</w:t>
+            </w:r>
+          </w:p>
+        </w:tc>
+        <w:tc>
+          <w:tcPr>
+            <w:tcW w:w="7037" w:type="dxa"/>
+            <w:tcBorders>
+              <w:top w:val="single" w:sz="4" w:space="0" w:color="BFBFBF"/>
+              <w:left w:val="single" w:sz="4" w:space="0" w:color="BFBFBF"/>
+              <w:bottom w:val="single" w:sz="4" w:space="0" w:color="BFBFBF"/>
+              <w:right w:val="single" w:sz="4" w:space="0" w:color="BFBFBF"/>
+            </w:tcBorders>
+          </w:tcPr>
+          <w:p>
+            <w:pPr>
+              <w:pStyle w:val="Normal"/>
+              <w:spacing w:before="0" w:after="20"/>
+              <w:rPr/>
+            </w:pPr>
+            <w:r>
+              <w:rPr>
+                <w:sz w:val="19"/>
+                <w:szCs w:val="19"/>
+              </w:rPr>
+              <w:t>La variante media/alta excluye los incidentes de confianza baja</w:t>
+            </w:r>
+          </w:p>
+        </w:tc>
+      </w:tr>
     </w:tbl>
     <w:p>
       <w:pPr>
         <w:pStyle w:val="Heading2"/>
         <w:rPr/>
       </w:pPr>
-      <w:bookmarkStart w:id="32" w:name="__RefHeading___Toc2635_1251848270"/>
+      <w:bookmarkStart w:id="32" w:name="__RefHeading___Toc2797_3501254244"/>
       <w:bookmarkEnd w:id="32"/>
       <w:r>
         <w:rPr/>
@@ -11347,7 +11478,7 @@
       <w:r>
         <w:br w:type="page"/>
       </w:r>
-      <w:bookmarkStart w:id="33" w:name="__RefHeading___Toc2637_1251848270"/>
+      <w:bookmarkStart w:id="33" w:name="__RefHeading___Toc2799_3501254244"/>
       <w:bookmarkEnd w:id="33"/>
       <w:r>
         <w:rPr/>
@@ -12175,7 +12306,7 @@
       <w:r>
         <w:br w:type="page"/>
       </w:r>
-      <w:bookmarkStart w:id="34" w:name="__RefHeading___Toc2639_1251848270"/>
+      <w:bookmarkStart w:id="34" w:name="__RefHeading___Toc2801_3501254244"/>
       <w:bookmarkEnd w:id="34"/>
       <w:r>
         <w:rPr/>
@@ -13875,6 +14006,84 @@
           </w:p>
         </w:tc>
       </w:tr>
+      <w:tr>
+        <w:trPr/>
+        <w:tc>
+          <w:tcPr>
+            <w:tcW w:w="1099" w:type="dxa"/>
+            <w:tcBorders>
+              <w:top w:val="single" w:sz="4" w:space="0" w:color="BFBFBF"/>
+              <w:left w:val="single" w:sz="4" w:space="0" w:color="BFBFBF"/>
+              <w:bottom w:val="single" w:sz="4" w:space="0" w:color="BFBFBF"/>
+              <w:right w:val="single" w:sz="4" w:space="0" w:color="BFBFBF"/>
+            </w:tcBorders>
+          </w:tcPr>
+          <w:p>
+            <w:pPr>
+              <w:pStyle w:val="Normal"/>
+              <w:spacing w:before="0" w:after="20"/>
+              <w:rPr/>
+            </w:pPr>
+            <w:r>
+              <w:rPr>
+                <w:sz w:val="19"/>
+                <w:szCs w:val="19"/>
+              </w:rPr>
+              <w:t>D29</w:t>
+            </w:r>
+          </w:p>
+        </w:tc>
+        <w:tc>
+          <w:tcPr>
+            <w:tcW w:w="4600" w:type="dxa"/>
+            <w:tcBorders>
+              <w:top w:val="single" w:sz="4" w:space="0" w:color="BFBFBF"/>
+              <w:left w:val="single" w:sz="4" w:space="0" w:color="BFBFBF"/>
+              <w:bottom w:val="single" w:sz="4" w:space="0" w:color="BFBFBF"/>
+              <w:right w:val="single" w:sz="4" w:space="0" w:color="BFBFBF"/>
+            </w:tcBorders>
+          </w:tcPr>
+          <w:p>
+            <w:pPr>
+              <w:pStyle w:val="Normal"/>
+              <w:spacing w:before="0" w:after="20"/>
+              <w:rPr/>
+            </w:pPr>
+            <w:r>
+              <w:rPr>
+                <w:sz w:val="19"/>
+                <w:szCs w:val="19"/>
+              </w:rPr>
+              <w:t>Evaluación con y sin incidentes de confianza baja</w:t>
+            </w:r>
+          </w:p>
+        </w:tc>
+        <w:tc>
+          <w:tcPr>
+            <w:tcW w:w="3939" w:type="dxa"/>
+            <w:tcBorders>
+              <w:top w:val="single" w:sz="4" w:space="0" w:color="BFBFBF"/>
+              <w:left w:val="single" w:sz="4" w:space="0" w:color="BFBFBF"/>
+              <w:bottom w:val="single" w:sz="4" w:space="0" w:color="BFBFBF"/>
+              <w:right w:val="single" w:sz="4" w:space="0" w:color="BFBFBF"/>
+            </w:tcBorders>
+          </w:tcPr>
+          <w:p>
+            <w:pPr>
+              <w:pStyle w:val="Normal"/>
+              <w:spacing w:before="0" w:after="20"/>
+              <w:rPr/>
+            </w:pPr>
+            <w:r>
+              <w:rPr>
+                <w:sz w:val="19"/>
+                <w:szCs w:val="19"/>
+              </w:rPr>
+              <w:t>Robustez de las conclusiones</w:t>
+            </w:r>
+          </w:p>
+        </w:tc>
+      </w:tr>
     </w:tbl>
     <w:p>
       <w:pPr>
@@ -13884,7 +14093,7 @@
       <w:r>
         <w:br w:type="page"/>
       </w:r>
-      <w:bookmarkStart w:id="35" w:name="__RefHeading___Toc2641_1251848270"/>
+      <w:bookmarkStart w:id="35" w:name="__RefHeading___Toc2803_3501254244"/>
       <w:bookmarkEnd w:id="35"/>
       <w:r>
         <w:rPr/>
@@ -13896,7 +14105,7 @@
         <w:pStyle w:val="Heading2"/>
         <w:rPr/>
       </w:pPr>
-      <w:bookmarkStart w:id="36" w:name="__RefHeading___Toc2643_1251848270"/>
+      <w:bookmarkStart w:id="36" w:name="__RefHeading___Toc2805_3501254244"/>
       <w:bookmarkEnd w:id="36"/>
       <w:r>
         <w:rPr/>
@@ -13972,7 +14181,7 @@
         <w:pStyle w:val="Heading2"/>
         <w:rPr/>
       </w:pPr>
-      <w:bookmarkStart w:id="37" w:name="__RefHeading___Toc2645_1251848270"/>
+      <w:bookmarkStart w:id="37" w:name="__RefHeading___Toc2807_3501254244"/>
       <w:bookmarkEnd w:id="37"/>
       <w:r>
         <w:rPr/>
@@ -14100,7 +14309,7 @@
           <w:b/>
           <w:bCs/>
         </w:rPr>
-        <w:t>Verificar los 13 incidentes cargados</w:t>
+        <w:t>Verificar los 23 incidentes y los 16 hechos clave cargados</w:t>
       </w:r>
       <w:r>
         <w:rPr/>
@@ -14109,25 +14318,10 @@
     </w:p>
     <w:p>
       <w:pPr>
-        <w:pStyle w:val="ListParagraph"/>
-        <w:numPr>
-          <w:ilvl w:val="0"/>
-          <w:numId w:val="6"/>
-        </w:numPr>
-        <w:spacing w:before="0" w:after="60"/>
-        <w:rPr/>
-      </w:pPr>
-      <w:r>
-        <w:rPr/>
-        <w:t>Agregar hechos clave e incidentes posteriores a julio de 2024, ya que el período se extendió hasta la actualidad.</w:t>
-      </w:r>
-    </w:p>
-    <w:p>
-      <w:pPr>
         <w:pStyle w:val="Heading2"/>
         <w:rPr/>
       </w:pPr>
-      <w:bookmarkStart w:id="38" w:name="__RefHeading___Toc2647_1251848270"/>
+      <w:bookmarkStart w:id="38" w:name="__RefHeading___Toc2809_3501254244"/>
       <w:bookmarkEnd w:id="38"/>
       <w:r>
         <w:rPr/>
@@ -14208,7 +14402,7 @@
         <w:pStyle w:val="Heading1"/>
         <w:rPr/>
       </w:pPr>
-      <w:bookmarkStart w:id="39" w:name="__RefHeading___Toc2649_1251848270"/>
+      <w:bookmarkStart w:id="39" w:name="__RefHeading___Toc2811_3501254244"/>
       <w:bookmarkEnd w:id="39"/>
       <w:r>
         <w:rPr/>
@@ -14220,7 +14414,7 @@
         <w:pStyle w:val="Heading2"/>
         <w:rPr/>
       </w:pPr>
-      <w:bookmarkStart w:id="40" w:name="__RefHeading___Toc2651_1251848270"/>
+      <w:bookmarkStart w:id="40" w:name="__RefHeading___Toc2813_3501254244"/>
       <w:bookmarkEnd w:id="40"/>
       <w:r>
         <w:rPr/>
@@ -14243,7 +14437,7 @@
         <w:pStyle w:val="Heading2"/>
         <w:rPr/>
       </w:pPr>
-      <w:bookmarkStart w:id="41" w:name="__RefHeading___Toc2653_1251848270"/>
+      <w:bookmarkStart w:id="41" w:name="__RefHeading___Toc2815_3501254244"/>
       <w:bookmarkEnd w:id="41"/>
       <w:r>
         <w:rPr/>
@@ -14355,7 +14549,7 @@
         <w:pStyle w:val="Heading2"/>
         <w:rPr/>
       </w:pPr>
-      <w:bookmarkStart w:id="42" w:name="__RefHeading___Toc2655_1251848270"/>
+      <w:bookmarkStart w:id="42" w:name="__RefHeading___Toc2817_3501254244"/>
       <w:bookmarkEnd w:id="42"/>
       <w:r>
         <w:rPr/>
@@ -16635,7 +16829,7 @@
         <w:pStyle w:val="Heading2"/>
         <w:rPr/>
       </w:pPr>
-      <w:bookmarkStart w:id="43" w:name="__RefHeading___Toc2657_1251848270"/>
+      <w:bookmarkStart w:id="43" w:name="__RefHeading___Toc2819_3501254244"/>
       <w:bookmarkEnd w:id="43"/>
       <w:r>
         <w:rPr/>
@@ -16758,7 +16952,7 @@
         <w:pStyle w:val="Heading2"/>
         <w:rPr/>
       </w:pPr>
-      <w:bookmarkStart w:id="44" w:name="__RefHeading___Toc2659_1251848270"/>
+      <w:bookmarkStart w:id="44" w:name="__RefHeading___Toc2821_3501254244"/>
       <w:bookmarkEnd w:id="44"/>
       <w:r>
         <w:rPr/>
@@ -16795,7 +16989,7 @@
       </w:r>
       <w:r>
         <w:rPr/>
-        <w:t xml:space="preserve"> candidatos, pendientes de decisión del autor (</w:t>
+        <w:t xml:space="preserve"> candidatos (</w:t>
       </w:r>
       <w:r>
         <w:rPr>
@@ -16819,7 +17013,18 @@
       </w:r>
       <w:r>
         <w:rPr/>
-        <w:t>).</w:t>
+        <w:t xml:space="preserve">). El autor decidió </w:t>
+      </w:r>
+      <w:r>
+        <w:rPr>
+          <w:b/>
+          <w:bCs/>
+        </w:rPr>
+        <w:t>cargarlos todos</w:t>
+      </w:r>
+      <w:r>
+        <w:rPr/>
+        <w:t>, sin verificar, y evaluar el modelo también sin los incidentes de confianza baja (decisión D29).</w:t>
       </w:r>
     </w:p>
     <w:p>
@@ -19399,7 +19604,7 @@
         <w:pStyle w:val="Heading1"/>
         <w:rPr/>
       </w:pPr>
-      <w:bookmarkStart w:id="45" w:name="__RefHeading___Toc2661_1251848270"/>
+      <w:bookmarkStart w:id="45" w:name="__RefHeading___Toc2823_3501254244"/>
       <w:bookmarkEnd w:id="45"/>
       <w:r>
         <w:rPr/>
@@ -19411,7 +19616,7 @@
         <w:pStyle w:val="Heading2"/>
         <w:rPr/>
       </w:pPr>
-      <w:bookmarkStart w:id="46" w:name="__RefHeading___Toc2663_1251848270"/>
+      <w:bookmarkStart w:id="46" w:name="__RefHeading___Toc2825_3501254244"/>
       <w:bookmarkEnd w:id="46"/>
       <w:r>
         <w:rPr/>
@@ -19533,7 +19738,7 @@
         <w:pStyle w:val="Heading2"/>
         <w:rPr/>
       </w:pPr>
-      <w:bookmarkStart w:id="47" w:name="__RefHeading___Toc2665_1251848270"/>
+      <w:bookmarkStart w:id="47" w:name="__RefHeading___Toc2827_3501254244"/>
       <w:bookmarkEnd w:id="47"/>
       <w:r>
         <w:rPr/>
@@ -19548,7 +19753,17 @@
       </w:pPr>
       <w:r>
         <w:rPr/>
-        <w:t>Período evaluado: 2023-08-01 a 2026-10-14 (1171 días, 32 días detonantes). Datos al 2026-10-14.</w:t>
+        <w:t>Período evaluado: 2023-08-01 a 2026-10-14 (1171 días, 40 días detonantes). Datos al 2026-10-14.</w:t>
+      </w:r>
+    </w:p>
+    <w:p>
+      <w:pPr>
+        <w:pStyle w:val="Heading3"/>
+        <w:rPr/>
+      </w:pPr>
+      <w:r>
+        <w:rPr/>
+        <w:t>Con todos los incidentes</w:t>
       </w:r>
     </w:p>
     <w:tbl>
@@ -19769,7 +19984,7 @@
                 <w:sz w:val="19"/>
                 <w:szCs w:val="19"/>
               </w:rPr>
-              <w:t>6.9 %</w:t>
+              <w:t>9.6 %</w:t>
             </w:r>
           </w:p>
         </w:tc>
@@ -19794,7 +20009,7 @@
                 <w:sz w:val="19"/>
                 <w:szCs w:val="19"/>
               </w:rPr>
-              <w:t>0/5 (0 %)</w:t>
+              <w:t>0/7 (0 %)</w:t>
             </w:r>
           </w:p>
           <w:p>
@@ -19833,21 +20048,21 @@
                 <w:sz w:val="19"/>
                 <w:szCs w:val="19"/>
               </w:rPr>
-              <w:t>1/3 (33.3 %)</w:t>
-            </w:r>
-          </w:p>
-          <w:p>
-            <w:pPr>
-              <w:pStyle w:val="Normal"/>
-              <w:spacing w:before="0" w:after="20"/>
-              <w:rPr/>
-            </w:pPr>
-            <w:r>
-              <w:rPr>
-                <w:sz w:val="19"/>
-                <w:szCs w:val="19"/>
-              </w:rPr>
-              <w:t>razón 4.82</w:t>
+              <w:t>1/9 (11.1 %)</w:t>
+            </w:r>
+          </w:p>
+          <w:p>
+            <w:pPr>
+              <w:pStyle w:val="Normal"/>
+              <w:spacing w:before="0" w:after="20"/>
+              <w:rPr/>
+            </w:pPr>
+            <w:r>
+              <w:rPr>
+                <w:sz w:val="19"/>
+                <w:szCs w:val="19"/>
+              </w:rPr>
+              <w:t>razón 1.15</w:t>
             </w:r>
           </w:p>
         </w:tc>
@@ -19872,21 +20087,21 @@
                 <w:sz w:val="19"/>
                 <w:szCs w:val="19"/>
               </w:rPr>
-              <w:t>1/3 (33.3 %)</w:t>
-            </w:r>
-          </w:p>
-          <w:p>
-            <w:pPr>
-              <w:pStyle w:val="Normal"/>
-              <w:spacing w:before="0" w:after="20"/>
-              <w:rPr/>
-            </w:pPr>
-            <w:r>
-              <w:rPr>
-                <w:sz w:val="19"/>
-                <w:szCs w:val="19"/>
-              </w:rPr>
-              <w:t>razón 4.82</w:t>
+              <w:t>1/5 (20 %)</w:t>
+            </w:r>
+          </w:p>
+          <w:p>
+            <w:pPr>
+              <w:pStyle w:val="Normal"/>
+              <w:spacing w:before="0" w:after="20"/>
+              <w:rPr/>
+            </w:pPr>
+            <w:r>
+              <w:rPr>
+                <w:sz w:val="19"/>
+                <w:szCs w:val="19"/>
+              </w:rPr>
+              <w:t>razón 2.07</w:t>
             </w:r>
           </w:p>
         </w:tc>
@@ -19939,7 +20154,7 @@
                 <w:sz w:val="19"/>
                 <w:szCs w:val="19"/>
               </w:rPr>
-              <w:t>10.1 %</w:t>
+              <w:t>15.5 %</w:t>
             </w:r>
           </w:p>
         </w:tc>
@@ -19964,7 +20179,7 @@
                 <w:sz w:val="19"/>
                 <w:szCs w:val="19"/>
               </w:rPr>
-              <w:t>0/5 (0 %)</w:t>
+              <w:t>0/7 (0 %)</w:t>
             </w:r>
           </w:p>
           <w:p>
@@ -20003,21 +20218,21 @@
                 <w:sz w:val="19"/>
                 <w:szCs w:val="19"/>
               </w:rPr>
-              <w:t>1/3 (33.3 %)</w:t>
-            </w:r>
-          </w:p>
-          <w:p>
-            <w:pPr>
-              <w:pStyle w:val="Normal"/>
-              <w:spacing w:before="0" w:after="20"/>
-              <w:rPr/>
-            </w:pPr>
-            <w:r>
-              <w:rPr>
-                <w:sz w:val="19"/>
-                <w:szCs w:val="19"/>
-              </w:rPr>
-              <w:t>razón 3.31</w:t>
+              <w:t>2/9 (22.2 %)</w:t>
+            </w:r>
+          </w:p>
+          <w:p>
+            <w:pPr>
+              <w:pStyle w:val="Normal"/>
+              <w:spacing w:before="0" w:after="20"/>
+              <w:rPr/>
+            </w:pPr>
+            <w:r>
+              <w:rPr>
+                <w:sz w:val="19"/>
+                <w:szCs w:val="19"/>
+              </w:rPr>
+              <w:t>razón 1.43</w:t>
             </w:r>
           </w:p>
         </w:tc>
@@ -20042,21 +20257,21 @@
                 <w:sz w:val="19"/>
                 <w:szCs w:val="19"/>
               </w:rPr>
-              <w:t>1/3 (33.3 %)</w:t>
-            </w:r>
-          </w:p>
-          <w:p>
-            <w:pPr>
-              <w:pStyle w:val="Normal"/>
-              <w:spacing w:before="0" w:after="20"/>
-              <w:rPr/>
-            </w:pPr>
-            <w:r>
-              <w:rPr>
-                <w:sz w:val="19"/>
-                <w:szCs w:val="19"/>
-              </w:rPr>
-              <w:t>razón 3.31</w:t>
+              <w:t>1/5 (20 %)</w:t>
+            </w:r>
+          </w:p>
+          <w:p>
+            <w:pPr>
+              <w:pStyle w:val="Normal"/>
+              <w:spacing w:before="0" w:after="20"/>
+              <w:rPr/>
+            </w:pPr>
+            <w:r>
+              <w:rPr>
+                <w:sz w:val="19"/>
+                <w:szCs w:val="19"/>
+              </w:rPr>
+              <w:t>razón 1.29</w:t>
             </w:r>
           </w:p>
         </w:tc>
@@ -20109,7 +20324,7 @@
                 <w:sz w:val="19"/>
                 <w:szCs w:val="19"/>
               </w:rPr>
-              <w:t>14.8 %</w:t>
+              <w:t>24.2 %</w:t>
             </w:r>
           </w:p>
         </w:tc>
@@ -20134,6 +20349,84 @@
                 <w:sz w:val="19"/>
                 <w:szCs w:val="19"/>
               </w:rPr>
+              <w:t>1/7 (14.3 %)</w:t>
+            </w:r>
+          </w:p>
+          <w:p>
+            <w:pPr>
+              <w:pStyle w:val="Normal"/>
+              <w:spacing w:before="0" w:after="20"/>
+              <w:rPr/>
+            </w:pPr>
+            <w:r>
+              <w:rPr>
+                <w:sz w:val="19"/>
+                <w:szCs w:val="19"/>
+              </w:rPr>
+              <w:t>razón 0.59</w:t>
+            </w:r>
+          </w:p>
+        </w:tc>
+        <w:tc>
+          <w:tcPr>
+            <w:tcW w:w="2170" w:type="dxa"/>
+            <w:tcBorders>
+              <w:top w:val="single" w:sz="4" w:space="0" w:color="BFBFBF"/>
+              <w:left w:val="single" w:sz="4" w:space="0" w:color="BFBFBF"/>
+              <w:bottom w:val="single" w:sz="4" w:space="0" w:color="BFBFBF"/>
+              <w:right w:val="single" w:sz="4" w:space="0" w:color="BFBFBF"/>
+            </w:tcBorders>
+          </w:tcPr>
+          <w:p>
+            <w:pPr>
+              <w:pStyle w:val="Normal"/>
+              <w:spacing w:before="0" w:after="20"/>
+              <w:rPr/>
+            </w:pPr>
+            <w:r>
+              <w:rPr>
+                <w:sz w:val="19"/>
+                <w:szCs w:val="19"/>
+              </w:rPr>
+              <w:t>2/9 (22.2 %)</w:t>
+            </w:r>
+          </w:p>
+          <w:p>
+            <w:pPr>
+              <w:pStyle w:val="Normal"/>
+              <w:spacing w:before="0" w:after="20"/>
+              <w:rPr/>
+            </w:pPr>
+            <w:r>
+              <w:rPr>
+                <w:sz w:val="19"/>
+                <w:szCs w:val="19"/>
+              </w:rPr>
+              <w:t>razón 0.92</w:t>
+            </w:r>
+          </w:p>
+        </w:tc>
+        <w:tc>
+          <w:tcPr>
+            <w:tcW w:w="2169" w:type="dxa"/>
+            <w:tcBorders>
+              <w:top w:val="single" w:sz="4" w:space="0" w:color="BFBFBF"/>
+              <w:left w:val="single" w:sz="4" w:space="0" w:color="BFBFBF"/>
+              <w:bottom w:val="single" w:sz="4" w:space="0" w:color="BFBFBF"/>
+              <w:right w:val="single" w:sz="4" w:space="0" w:color="BFBFBF"/>
+            </w:tcBorders>
+          </w:tcPr>
+          <w:p>
+            <w:pPr>
+              <w:pStyle w:val="Normal"/>
+              <w:spacing w:before="0" w:after="20"/>
+              <w:rPr/>
+            </w:pPr>
+            <w:r>
+              <w:rPr>
+                <w:sz w:val="19"/>
+                <w:szCs w:val="19"/>
+              </w:rPr>
               <w:t>1/5 (20 %)</w:t>
             </w:r>
           </w:p>
@@ -20148,85 +20441,7 @@
                 <w:sz w:val="19"/>
                 <w:szCs w:val="19"/>
               </w:rPr>
-              <w:t>razón 1.35</w:t>
-            </w:r>
-          </w:p>
-        </w:tc>
-        <w:tc>
-          <w:tcPr>
-            <w:tcW w:w="2170" w:type="dxa"/>
-            <w:tcBorders>
-              <w:top w:val="single" w:sz="4" w:space="0" w:color="BFBFBF"/>
-              <w:left w:val="single" w:sz="4" w:space="0" w:color="BFBFBF"/>
-              <w:bottom w:val="single" w:sz="4" w:space="0" w:color="BFBFBF"/>
-              <w:right w:val="single" w:sz="4" w:space="0" w:color="BFBFBF"/>
-            </w:tcBorders>
-          </w:tcPr>
-          <w:p>
-            <w:pPr>
-              <w:pStyle w:val="Normal"/>
-              <w:spacing w:before="0" w:after="20"/>
-              <w:rPr/>
-            </w:pPr>
-            <w:r>
-              <w:rPr>
-                <w:sz w:val="19"/>
-                <w:szCs w:val="19"/>
-              </w:rPr>
-              <w:t>1/3 (33.3 %)</w:t>
-            </w:r>
-          </w:p>
-          <w:p>
-            <w:pPr>
-              <w:pStyle w:val="Normal"/>
-              <w:spacing w:before="0" w:after="20"/>
-              <w:rPr/>
-            </w:pPr>
-            <w:r>
-              <w:rPr>
-                <w:sz w:val="19"/>
-                <w:szCs w:val="19"/>
-              </w:rPr>
-              <w:t>razón 2.26</w:t>
-            </w:r>
-          </w:p>
-        </w:tc>
-        <w:tc>
-          <w:tcPr>
-            <w:tcW w:w="2169" w:type="dxa"/>
-            <w:tcBorders>
-              <w:top w:val="single" w:sz="4" w:space="0" w:color="BFBFBF"/>
-              <w:left w:val="single" w:sz="4" w:space="0" w:color="BFBFBF"/>
-              <w:bottom w:val="single" w:sz="4" w:space="0" w:color="BFBFBF"/>
-              <w:right w:val="single" w:sz="4" w:space="0" w:color="BFBFBF"/>
-            </w:tcBorders>
-          </w:tcPr>
-          <w:p>
-            <w:pPr>
-              <w:pStyle w:val="Normal"/>
-              <w:spacing w:before="0" w:after="20"/>
-              <w:rPr/>
-            </w:pPr>
-            <w:r>
-              <w:rPr>
-                <w:sz w:val="19"/>
-                <w:szCs w:val="19"/>
-              </w:rPr>
-              <w:t>1/3 (33.3 %)</w:t>
-            </w:r>
-          </w:p>
-          <w:p>
-            <w:pPr>
-              <w:pStyle w:val="Normal"/>
-              <w:spacing w:before="0" w:after="20"/>
-              <w:rPr/>
-            </w:pPr>
-            <w:r>
-              <w:rPr>
-                <w:sz w:val="19"/>
-                <w:szCs w:val="19"/>
-              </w:rPr>
-              <w:t>razón 2.26</w:t>
+              <w:t>razón 0.83</w:t>
             </w:r>
           </w:p>
         </w:tc>
@@ -20279,7 +20494,7 @@
                 <w:sz w:val="19"/>
                 <w:szCs w:val="19"/>
               </w:rPr>
-              <w:t>18.1 %</w:t>
+              <w:t>29.7 %</w:t>
             </w:r>
           </w:p>
         </w:tc>
@@ -20304,21 +20519,21 @@
                 <w:sz w:val="19"/>
                 <w:szCs w:val="19"/>
               </w:rPr>
-              <w:t>3/5 (60 %)</w:t>
-            </w:r>
-          </w:p>
-          <w:p>
-            <w:pPr>
-              <w:pStyle w:val="Normal"/>
-              <w:spacing w:before="0" w:after="20"/>
-              <w:rPr/>
-            </w:pPr>
-            <w:r>
-              <w:rPr>
-                <w:sz w:val="19"/>
-                <w:szCs w:val="19"/>
-              </w:rPr>
-              <w:t>razón 3.31</w:t>
+              <w:t>4/7 (57.1 %)</w:t>
+            </w:r>
+          </w:p>
+          <w:p>
+            <w:pPr>
+              <w:pStyle w:val="Normal"/>
+              <w:spacing w:before="0" w:after="20"/>
+              <w:rPr/>
+            </w:pPr>
+            <w:r>
+              <w:rPr>
+                <w:sz w:val="19"/>
+                <w:szCs w:val="19"/>
+              </w:rPr>
+              <w:t>razón 1.92</w:t>
             </w:r>
           </w:p>
         </w:tc>
@@ -20343,21 +20558,21 @@
                 <w:sz w:val="19"/>
                 <w:szCs w:val="19"/>
               </w:rPr>
-              <w:t>1/3 (33.3 %)</w:t>
-            </w:r>
-          </w:p>
-          <w:p>
-            <w:pPr>
-              <w:pStyle w:val="Normal"/>
-              <w:spacing w:before="0" w:after="20"/>
-              <w:rPr/>
-            </w:pPr>
-            <w:r>
-              <w:rPr>
-                <w:sz w:val="19"/>
-                <w:szCs w:val="19"/>
-              </w:rPr>
-              <w:t>razón 1.84</w:t>
+              <w:t>2/9 (22.2 %)</w:t>
+            </w:r>
+          </w:p>
+          <w:p>
+            <w:pPr>
+              <w:pStyle w:val="Normal"/>
+              <w:spacing w:before="0" w:after="20"/>
+              <w:rPr/>
+            </w:pPr>
+            <w:r>
+              <w:rPr>
+                <w:sz w:val="19"/>
+                <w:szCs w:val="19"/>
+              </w:rPr>
+              <w:t>razón 0.75</w:t>
             </w:r>
           </w:p>
         </w:tc>
@@ -20382,21 +20597,892 @@
                 <w:sz w:val="19"/>
                 <w:szCs w:val="19"/>
               </w:rPr>
-              <w:t>1/3 (33.3 %)</w:t>
-            </w:r>
-          </w:p>
-          <w:p>
-            <w:pPr>
-              <w:pStyle w:val="Normal"/>
-              <w:spacing w:before="0" w:after="20"/>
-              <w:rPr/>
-            </w:pPr>
-            <w:r>
-              <w:rPr>
-                <w:sz w:val="19"/>
-                <w:szCs w:val="19"/>
-              </w:rPr>
-              <w:t>razón 1.84</w:t>
+              <w:t>1/5 (20 %)</w:t>
+            </w:r>
+          </w:p>
+          <w:p>
+            <w:pPr>
+              <w:pStyle w:val="Normal"/>
+              <w:spacing w:before="0" w:after="20"/>
+              <w:rPr/>
+            </w:pPr>
+            <w:r>
+              <w:rPr>
+                <w:sz w:val="19"/>
+                <w:szCs w:val="19"/>
+              </w:rPr>
+              <w:t>razón 0.67</w:t>
+            </w:r>
+          </w:p>
+        </w:tc>
+      </w:tr>
+    </w:tbl>
+    <w:p>
+      <w:pPr>
+        <w:pStyle w:val="Normal"/>
+        <w:spacing w:before="0" w:after="120"/>
+        <w:rPr/>
+      </w:pPr>
+      <w:r>
+        <w:rPr/>
+      </w:r>
+    </w:p>
+    <w:p>
+      <w:pPr>
+        <w:pStyle w:val="Heading3"/>
+        <w:rPr/>
+      </w:pPr>
+      <w:r>
+        <w:rPr/>
+        <w:t>Solo incidentes de confianza media o alta (robustez)</w:t>
+      </w:r>
+    </w:p>
+    <w:tbl>
+      <w:tblPr>
+        <w:tblW w:w="9638" w:type="dxa"/>
+        <w:jc w:val="left"/>
+        <w:tblInd w:w="0" w:type="dxa"/>
+        <w:tblLayout w:type="fixed"/>
+        <w:tblCellMar>
+          <w:top w:w="60" w:type="dxa"/>
+          <w:left w:w="100" w:type="dxa"/>
+          <w:bottom w:w="60" w:type="dxa"/>
+          <w:right w:w="100" w:type="dxa"/>
+        </w:tblCellMar>
+      </w:tblPr>
+      <w:tblGrid>
+        <w:gridCol w:w="1499"/>
+        <w:gridCol w:w="1501"/>
+        <w:gridCol w:w="2299"/>
+        <w:gridCol w:w="2170"/>
+        <w:gridCol w:w="2169"/>
+      </w:tblGrid>
+      <w:tr>
+        <w:trPr>
+          <w:tblHeader w:val="true"/>
+        </w:trPr>
+        <w:tc>
+          <w:tcPr>
+            <w:tcW w:w="1499" w:type="dxa"/>
+            <w:tcBorders>
+              <w:top w:val="single" w:sz="4" w:space="0" w:color="BFBFBF"/>
+              <w:left w:val="single" w:sz="4" w:space="0" w:color="BFBFBF"/>
+              <w:bottom w:val="single" w:sz="4" w:space="0" w:color="BFBFBF"/>
+              <w:right w:val="single" w:sz="4" w:space="0" w:color="BFBFBF"/>
+            </w:tcBorders>
+            <w:shd w:fill="1F4E79" w:val="clear"/>
+          </w:tcPr>
+          <w:p>
+            <w:pPr>
+              <w:pStyle w:val="Normal"/>
+              <w:spacing w:before="0" w:after="20"/>
+              <w:rPr/>
+            </w:pPr>
+            <w:r>
+              <w:rPr>
+                <w:b/>
+                <w:bCs/>
+                <w:color w:val="FFFFFF"/>
+                <w:sz w:val="19"/>
+                <w:szCs w:val="19"/>
+              </w:rPr>
+              <w:t>Ventana</w:t>
+            </w:r>
+          </w:p>
+        </w:tc>
+        <w:tc>
+          <w:tcPr>
+            <w:tcW w:w="1501" w:type="dxa"/>
+            <w:tcBorders>
+              <w:top w:val="single" w:sz="4" w:space="0" w:color="BFBFBF"/>
+              <w:left w:val="single" w:sz="4" w:space="0" w:color="BFBFBF"/>
+              <w:bottom w:val="single" w:sz="4" w:space="0" w:color="BFBFBF"/>
+              <w:right w:val="single" w:sz="4" w:space="0" w:color="BFBFBF"/>
+            </w:tcBorders>
+            <w:shd w:fill="1F4E79" w:val="clear"/>
+          </w:tcPr>
+          <w:p>
+            <w:pPr>
+              <w:pStyle w:val="Normal"/>
+              <w:spacing w:before="0" w:after="20"/>
+              <w:rPr/>
+            </w:pPr>
+            <w:r>
+              <w:rPr>
+                <w:b/>
+                <w:bCs/>
+                <w:color w:val="FFFFFF"/>
+                <w:sz w:val="19"/>
+                <w:szCs w:val="19"/>
+              </w:rPr>
+              <w:t>Cobertura</w:t>
+            </w:r>
+          </w:p>
+        </w:tc>
+        <w:tc>
+          <w:tcPr>
+            <w:tcW w:w="2299" w:type="dxa"/>
+            <w:tcBorders>
+              <w:top w:val="single" w:sz="4" w:space="0" w:color="BFBFBF"/>
+              <w:left w:val="single" w:sz="4" w:space="0" w:color="BFBFBF"/>
+              <w:bottom w:val="single" w:sz="4" w:space="0" w:color="BFBFBF"/>
+              <w:right w:val="single" w:sz="4" w:space="0" w:color="BFBFBF"/>
+            </w:tcBorders>
+            <w:shd w:fill="1F4E79" w:val="clear"/>
+          </w:tcPr>
+          <w:p>
+            <w:pPr>
+              <w:pStyle w:val="Normal"/>
+              <w:spacing w:before="0" w:after="20"/>
+              <w:rPr/>
+            </w:pPr>
+            <w:r>
+              <w:rPr>
+                <w:b/>
+                <w:bCs/>
+                <w:color w:val="FFFFFF"/>
+                <w:sz w:val="19"/>
+                <w:szCs w:val="19"/>
+              </w:rPr>
+              <w:t>Hacktivista</w:t>
+            </w:r>
+          </w:p>
+        </w:tc>
+        <w:tc>
+          <w:tcPr>
+            <w:tcW w:w="2170" w:type="dxa"/>
+            <w:tcBorders>
+              <w:top w:val="single" w:sz="4" w:space="0" w:color="BFBFBF"/>
+              <w:left w:val="single" w:sz="4" w:space="0" w:color="BFBFBF"/>
+              <w:bottom w:val="single" w:sz="4" w:space="0" w:color="BFBFBF"/>
+              <w:right w:val="single" w:sz="4" w:space="0" w:color="BFBFBF"/>
+            </w:tcBorders>
+            <w:shd w:fill="1F4E79" w:val="clear"/>
+          </w:tcPr>
+          <w:p>
+            <w:pPr>
+              <w:pStyle w:val="Normal"/>
+              <w:spacing w:before="0" w:after="20"/>
+              <w:rPr/>
+            </w:pPr>
+            <w:r>
+              <w:rPr>
+                <w:b/>
+                <w:bCs/>
+                <w:color w:val="FFFFFF"/>
+                <w:sz w:val="19"/>
+                <w:szCs w:val="19"/>
+              </w:rPr>
+              <w:t>Cibercriminal</w:t>
+            </w:r>
+          </w:p>
+        </w:tc>
+        <w:tc>
+          <w:tcPr>
+            <w:tcW w:w="2169" w:type="dxa"/>
+            <w:tcBorders>
+              <w:top w:val="single" w:sz="4" w:space="0" w:color="BFBFBF"/>
+              <w:left w:val="single" w:sz="4" w:space="0" w:color="BFBFBF"/>
+              <w:bottom w:val="single" w:sz="4" w:space="0" w:color="BFBFBF"/>
+              <w:right w:val="single" w:sz="4" w:space="0" w:color="BFBFBF"/>
+            </w:tcBorders>
+            <w:shd w:fill="1F4E79" w:val="clear"/>
+          </w:tcPr>
+          <w:p>
+            <w:pPr>
+              <w:pStyle w:val="Normal"/>
+              <w:spacing w:before="0" w:after="20"/>
+              <w:rPr/>
+            </w:pPr>
+            <w:r>
+              <w:rPr>
+                <w:b/>
+                <w:bCs/>
+                <w:color w:val="FFFFFF"/>
+                <w:sz w:val="19"/>
+                <w:szCs w:val="19"/>
+              </w:rPr>
+              <w:t>Desconocido</w:t>
+            </w:r>
+          </w:p>
+        </w:tc>
+      </w:tr>
+      <w:tr>
+        <w:trPr/>
+        <w:tc>
+          <w:tcPr>
+            <w:tcW w:w="1499" w:type="dxa"/>
+            <w:tcBorders>
+              <w:top w:val="single" w:sz="4" w:space="0" w:color="BFBFBF"/>
+              <w:left w:val="single" w:sz="4" w:space="0" w:color="BFBFBF"/>
+              <w:bottom w:val="single" w:sz="4" w:space="0" w:color="BFBFBF"/>
+              <w:right w:val="single" w:sz="4" w:space="0" w:color="BFBFBF"/>
+            </w:tcBorders>
+          </w:tcPr>
+          <w:p>
+            <w:pPr>
+              <w:pStyle w:val="Normal"/>
+              <w:spacing w:before="0" w:after="20"/>
+              <w:rPr/>
+            </w:pPr>
+            <w:r>
+              <w:rPr>
+                <w:sz w:val="19"/>
+                <w:szCs w:val="19"/>
+              </w:rPr>
+              <w:t>3 días</w:t>
+            </w:r>
+          </w:p>
+        </w:tc>
+        <w:tc>
+          <w:tcPr>
+            <w:tcW w:w="1501" w:type="dxa"/>
+            <w:tcBorders>
+              <w:top w:val="single" w:sz="4" w:space="0" w:color="BFBFBF"/>
+              <w:left w:val="single" w:sz="4" w:space="0" w:color="BFBFBF"/>
+              <w:bottom w:val="single" w:sz="4" w:space="0" w:color="BFBFBF"/>
+              <w:right w:val="single" w:sz="4" w:space="0" w:color="BFBFBF"/>
+            </w:tcBorders>
+          </w:tcPr>
+          <w:p>
+            <w:pPr>
+              <w:pStyle w:val="Normal"/>
+              <w:spacing w:before="0" w:after="20"/>
+              <w:rPr/>
+            </w:pPr>
+            <w:r>
+              <w:rPr>
+                <w:sz w:val="19"/>
+                <w:szCs w:val="19"/>
+              </w:rPr>
+              <w:t>9.6 %</w:t>
+            </w:r>
+          </w:p>
+        </w:tc>
+        <w:tc>
+          <w:tcPr>
+            <w:tcW w:w="2299" w:type="dxa"/>
+            <w:tcBorders>
+              <w:top w:val="single" w:sz="4" w:space="0" w:color="BFBFBF"/>
+              <w:left w:val="single" w:sz="4" w:space="0" w:color="BFBFBF"/>
+              <w:bottom w:val="single" w:sz="4" w:space="0" w:color="BFBFBF"/>
+              <w:right w:val="single" w:sz="4" w:space="0" w:color="BFBFBF"/>
+            </w:tcBorders>
+          </w:tcPr>
+          <w:p>
+            <w:pPr>
+              <w:pStyle w:val="Normal"/>
+              <w:spacing w:before="0" w:after="20"/>
+              <w:rPr/>
+            </w:pPr>
+            <w:r>
+              <w:rPr>
+                <w:sz w:val="19"/>
+                <w:szCs w:val="19"/>
+              </w:rPr>
+              <w:t>0/4 (0 %)</w:t>
+            </w:r>
+          </w:p>
+          <w:p>
+            <w:pPr>
+              <w:pStyle w:val="Normal"/>
+              <w:spacing w:before="0" w:after="20"/>
+              <w:rPr/>
+            </w:pPr>
+            <w:r>
+              <w:rPr>
+                <w:sz w:val="19"/>
+                <w:szCs w:val="19"/>
+              </w:rPr>
+              <w:t>razón 0</w:t>
+            </w:r>
+          </w:p>
+        </w:tc>
+        <w:tc>
+          <w:tcPr>
+            <w:tcW w:w="2170" w:type="dxa"/>
+            <w:tcBorders>
+              <w:top w:val="single" w:sz="4" w:space="0" w:color="BFBFBF"/>
+              <w:left w:val="single" w:sz="4" w:space="0" w:color="BFBFBF"/>
+              <w:bottom w:val="single" w:sz="4" w:space="0" w:color="BFBFBF"/>
+              <w:right w:val="single" w:sz="4" w:space="0" w:color="BFBFBF"/>
+            </w:tcBorders>
+          </w:tcPr>
+          <w:p>
+            <w:pPr>
+              <w:pStyle w:val="Normal"/>
+              <w:spacing w:before="0" w:after="20"/>
+              <w:rPr/>
+            </w:pPr>
+            <w:r>
+              <w:rPr>
+                <w:sz w:val="19"/>
+                <w:szCs w:val="19"/>
+              </w:rPr>
+              <w:t>1/4 (25 %)</w:t>
+            </w:r>
+          </w:p>
+          <w:p>
+            <w:pPr>
+              <w:pStyle w:val="Normal"/>
+              <w:spacing w:before="0" w:after="20"/>
+              <w:rPr/>
+            </w:pPr>
+            <w:r>
+              <w:rPr>
+                <w:sz w:val="19"/>
+                <w:szCs w:val="19"/>
+              </w:rPr>
+              <w:t>razón 2.59</w:t>
+            </w:r>
+          </w:p>
+        </w:tc>
+        <w:tc>
+          <w:tcPr>
+            <w:tcW w:w="2169" w:type="dxa"/>
+            <w:tcBorders>
+              <w:top w:val="single" w:sz="4" w:space="0" w:color="BFBFBF"/>
+              <w:left w:val="single" w:sz="4" w:space="0" w:color="BFBFBF"/>
+              <w:bottom w:val="single" w:sz="4" w:space="0" w:color="BFBFBF"/>
+              <w:right w:val="single" w:sz="4" w:space="0" w:color="BFBFBF"/>
+            </w:tcBorders>
+          </w:tcPr>
+          <w:p>
+            <w:pPr>
+              <w:pStyle w:val="Normal"/>
+              <w:spacing w:before="0" w:after="20"/>
+              <w:rPr/>
+            </w:pPr>
+            <w:r>
+              <w:rPr>
+                <w:sz w:val="19"/>
+                <w:szCs w:val="19"/>
+              </w:rPr>
+              <w:t>1/4 (25 %)</w:t>
+            </w:r>
+          </w:p>
+          <w:p>
+            <w:pPr>
+              <w:pStyle w:val="Normal"/>
+              <w:spacing w:before="0" w:after="20"/>
+              <w:rPr/>
+            </w:pPr>
+            <w:r>
+              <w:rPr>
+                <w:sz w:val="19"/>
+                <w:szCs w:val="19"/>
+              </w:rPr>
+              <w:t>razón 2.59</w:t>
+            </w:r>
+          </w:p>
+        </w:tc>
+      </w:tr>
+      <w:tr>
+        <w:trPr/>
+        <w:tc>
+          <w:tcPr>
+            <w:tcW w:w="1499" w:type="dxa"/>
+            <w:tcBorders>
+              <w:top w:val="single" w:sz="4" w:space="0" w:color="BFBFBF"/>
+              <w:left w:val="single" w:sz="4" w:space="0" w:color="BFBFBF"/>
+              <w:bottom w:val="single" w:sz="4" w:space="0" w:color="BFBFBF"/>
+              <w:right w:val="single" w:sz="4" w:space="0" w:color="BFBFBF"/>
+            </w:tcBorders>
+          </w:tcPr>
+          <w:p>
+            <w:pPr>
+              <w:pStyle w:val="Normal"/>
+              <w:spacing w:before="0" w:after="20"/>
+              <w:rPr/>
+            </w:pPr>
+            <w:r>
+              <w:rPr>
+                <w:sz w:val="19"/>
+                <w:szCs w:val="19"/>
+              </w:rPr>
+              <w:t>7 días</w:t>
+            </w:r>
+          </w:p>
+        </w:tc>
+        <w:tc>
+          <w:tcPr>
+            <w:tcW w:w="1501" w:type="dxa"/>
+            <w:tcBorders>
+              <w:top w:val="single" w:sz="4" w:space="0" w:color="BFBFBF"/>
+              <w:left w:val="single" w:sz="4" w:space="0" w:color="BFBFBF"/>
+              <w:bottom w:val="single" w:sz="4" w:space="0" w:color="BFBFBF"/>
+              <w:right w:val="single" w:sz="4" w:space="0" w:color="BFBFBF"/>
+            </w:tcBorders>
+          </w:tcPr>
+          <w:p>
+            <w:pPr>
+              <w:pStyle w:val="Normal"/>
+              <w:spacing w:before="0" w:after="20"/>
+              <w:rPr/>
+            </w:pPr>
+            <w:r>
+              <w:rPr>
+                <w:sz w:val="19"/>
+                <w:szCs w:val="19"/>
+              </w:rPr>
+              <w:t>15.5 %</w:t>
+            </w:r>
+          </w:p>
+        </w:tc>
+        <w:tc>
+          <w:tcPr>
+            <w:tcW w:w="2299" w:type="dxa"/>
+            <w:tcBorders>
+              <w:top w:val="single" w:sz="4" w:space="0" w:color="BFBFBF"/>
+              <w:left w:val="single" w:sz="4" w:space="0" w:color="BFBFBF"/>
+              <w:bottom w:val="single" w:sz="4" w:space="0" w:color="BFBFBF"/>
+              <w:right w:val="single" w:sz="4" w:space="0" w:color="BFBFBF"/>
+            </w:tcBorders>
+          </w:tcPr>
+          <w:p>
+            <w:pPr>
+              <w:pStyle w:val="Normal"/>
+              <w:spacing w:before="0" w:after="20"/>
+              <w:rPr/>
+            </w:pPr>
+            <w:r>
+              <w:rPr>
+                <w:sz w:val="19"/>
+                <w:szCs w:val="19"/>
+              </w:rPr>
+              <w:t>0/4 (0 %)</w:t>
+            </w:r>
+          </w:p>
+          <w:p>
+            <w:pPr>
+              <w:pStyle w:val="Normal"/>
+              <w:spacing w:before="0" w:after="20"/>
+              <w:rPr/>
+            </w:pPr>
+            <w:r>
+              <w:rPr>
+                <w:sz w:val="19"/>
+                <w:szCs w:val="19"/>
+              </w:rPr>
+              <w:t>razón 0</w:t>
+            </w:r>
+          </w:p>
+        </w:tc>
+        <w:tc>
+          <w:tcPr>
+            <w:tcW w:w="2170" w:type="dxa"/>
+            <w:tcBorders>
+              <w:top w:val="single" w:sz="4" w:space="0" w:color="BFBFBF"/>
+              <w:left w:val="single" w:sz="4" w:space="0" w:color="BFBFBF"/>
+              <w:bottom w:val="single" w:sz="4" w:space="0" w:color="BFBFBF"/>
+              <w:right w:val="single" w:sz="4" w:space="0" w:color="BFBFBF"/>
+            </w:tcBorders>
+          </w:tcPr>
+          <w:p>
+            <w:pPr>
+              <w:pStyle w:val="Normal"/>
+              <w:spacing w:before="0" w:after="20"/>
+              <w:rPr/>
+            </w:pPr>
+            <w:r>
+              <w:rPr>
+                <w:sz w:val="19"/>
+                <w:szCs w:val="19"/>
+              </w:rPr>
+              <w:t>1/4 (25 %)</w:t>
+            </w:r>
+          </w:p>
+          <w:p>
+            <w:pPr>
+              <w:pStyle w:val="Normal"/>
+              <w:spacing w:before="0" w:after="20"/>
+              <w:rPr/>
+            </w:pPr>
+            <w:r>
+              <w:rPr>
+                <w:sz w:val="19"/>
+                <w:szCs w:val="19"/>
+              </w:rPr>
+              <w:t>razón 1.61</w:t>
+            </w:r>
+          </w:p>
+        </w:tc>
+        <w:tc>
+          <w:tcPr>
+            <w:tcW w:w="2169" w:type="dxa"/>
+            <w:tcBorders>
+              <w:top w:val="single" w:sz="4" w:space="0" w:color="BFBFBF"/>
+              <w:left w:val="single" w:sz="4" w:space="0" w:color="BFBFBF"/>
+              <w:bottom w:val="single" w:sz="4" w:space="0" w:color="BFBFBF"/>
+              <w:right w:val="single" w:sz="4" w:space="0" w:color="BFBFBF"/>
+            </w:tcBorders>
+          </w:tcPr>
+          <w:p>
+            <w:pPr>
+              <w:pStyle w:val="Normal"/>
+              <w:spacing w:before="0" w:after="20"/>
+              <w:rPr/>
+            </w:pPr>
+            <w:r>
+              <w:rPr>
+                <w:sz w:val="19"/>
+                <w:szCs w:val="19"/>
+              </w:rPr>
+              <w:t>1/4 (25 %)</w:t>
+            </w:r>
+          </w:p>
+          <w:p>
+            <w:pPr>
+              <w:pStyle w:val="Normal"/>
+              <w:spacing w:before="0" w:after="20"/>
+              <w:rPr/>
+            </w:pPr>
+            <w:r>
+              <w:rPr>
+                <w:sz w:val="19"/>
+                <w:szCs w:val="19"/>
+              </w:rPr>
+              <w:t>razón 1.61</w:t>
+            </w:r>
+          </w:p>
+        </w:tc>
+      </w:tr>
+      <w:tr>
+        <w:trPr/>
+        <w:tc>
+          <w:tcPr>
+            <w:tcW w:w="1499" w:type="dxa"/>
+            <w:tcBorders>
+              <w:top w:val="single" w:sz="4" w:space="0" w:color="BFBFBF"/>
+              <w:left w:val="single" w:sz="4" w:space="0" w:color="BFBFBF"/>
+              <w:bottom w:val="single" w:sz="4" w:space="0" w:color="BFBFBF"/>
+              <w:right w:val="single" w:sz="4" w:space="0" w:color="BFBFBF"/>
+            </w:tcBorders>
+          </w:tcPr>
+          <w:p>
+            <w:pPr>
+              <w:pStyle w:val="Normal"/>
+              <w:spacing w:before="0" w:after="20"/>
+              <w:rPr/>
+            </w:pPr>
+            <w:r>
+              <w:rPr>
+                <w:sz w:val="19"/>
+                <w:szCs w:val="19"/>
+              </w:rPr>
+              <w:t>14 días</w:t>
+            </w:r>
+          </w:p>
+        </w:tc>
+        <w:tc>
+          <w:tcPr>
+            <w:tcW w:w="1501" w:type="dxa"/>
+            <w:tcBorders>
+              <w:top w:val="single" w:sz="4" w:space="0" w:color="BFBFBF"/>
+              <w:left w:val="single" w:sz="4" w:space="0" w:color="BFBFBF"/>
+              <w:bottom w:val="single" w:sz="4" w:space="0" w:color="BFBFBF"/>
+              <w:right w:val="single" w:sz="4" w:space="0" w:color="BFBFBF"/>
+            </w:tcBorders>
+          </w:tcPr>
+          <w:p>
+            <w:pPr>
+              <w:pStyle w:val="Normal"/>
+              <w:spacing w:before="0" w:after="20"/>
+              <w:rPr/>
+            </w:pPr>
+            <w:r>
+              <w:rPr>
+                <w:sz w:val="19"/>
+                <w:szCs w:val="19"/>
+              </w:rPr>
+              <w:t>24.2 %</w:t>
+            </w:r>
+          </w:p>
+        </w:tc>
+        <w:tc>
+          <w:tcPr>
+            <w:tcW w:w="2299" w:type="dxa"/>
+            <w:tcBorders>
+              <w:top w:val="single" w:sz="4" w:space="0" w:color="BFBFBF"/>
+              <w:left w:val="single" w:sz="4" w:space="0" w:color="BFBFBF"/>
+              <w:bottom w:val="single" w:sz="4" w:space="0" w:color="BFBFBF"/>
+              <w:right w:val="single" w:sz="4" w:space="0" w:color="BFBFBF"/>
+            </w:tcBorders>
+          </w:tcPr>
+          <w:p>
+            <w:pPr>
+              <w:pStyle w:val="Normal"/>
+              <w:spacing w:before="0" w:after="20"/>
+              <w:rPr/>
+            </w:pPr>
+            <w:r>
+              <w:rPr>
+                <w:sz w:val="19"/>
+                <w:szCs w:val="19"/>
+              </w:rPr>
+              <w:t>0/4 (0 %)</w:t>
+            </w:r>
+          </w:p>
+          <w:p>
+            <w:pPr>
+              <w:pStyle w:val="Normal"/>
+              <w:spacing w:before="0" w:after="20"/>
+              <w:rPr/>
+            </w:pPr>
+            <w:r>
+              <w:rPr>
+                <w:sz w:val="19"/>
+                <w:szCs w:val="19"/>
+              </w:rPr>
+              <w:t>razón 0</w:t>
+            </w:r>
+          </w:p>
+        </w:tc>
+        <w:tc>
+          <w:tcPr>
+            <w:tcW w:w="2170" w:type="dxa"/>
+            <w:tcBorders>
+              <w:top w:val="single" w:sz="4" w:space="0" w:color="BFBFBF"/>
+              <w:left w:val="single" w:sz="4" w:space="0" w:color="BFBFBF"/>
+              <w:bottom w:val="single" w:sz="4" w:space="0" w:color="BFBFBF"/>
+              <w:right w:val="single" w:sz="4" w:space="0" w:color="BFBFBF"/>
+            </w:tcBorders>
+          </w:tcPr>
+          <w:p>
+            <w:pPr>
+              <w:pStyle w:val="Normal"/>
+              <w:spacing w:before="0" w:after="20"/>
+              <w:rPr/>
+            </w:pPr>
+            <w:r>
+              <w:rPr>
+                <w:sz w:val="19"/>
+                <w:szCs w:val="19"/>
+              </w:rPr>
+              <w:t>1/4 (25 %)</w:t>
+            </w:r>
+          </w:p>
+          <w:p>
+            <w:pPr>
+              <w:pStyle w:val="Normal"/>
+              <w:spacing w:before="0" w:after="20"/>
+              <w:rPr/>
+            </w:pPr>
+            <w:r>
+              <w:rPr>
+                <w:sz w:val="19"/>
+                <w:szCs w:val="19"/>
+              </w:rPr>
+              <w:t>razón 1.03</w:t>
+            </w:r>
+          </w:p>
+        </w:tc>
+        <w:tc>
+          <w:tcPr>
+            <w:tcW w:w="2169" w:type="dxa"/>
+            <w:tcBorders>
+              <w:top w:val="single" w:sz="4" w:space="0" w:color="BFBFBF"/>
+              <w:left w:val="single" w:sz="4" w:space="0" w:color="BFBFBF"/>
+              <w:bottom w:val="single" w:sz="4" w:space="0" w:color="BFBFBF"/>
+              <w:right w:val="single" w:sz="4" w:space="0" w:color="BFBFBF"/>
+            </w:tcBorders>
+          </w:tcPr>
+          <w:p>
+            <w:pPr>
+              <w:pStyle w:val="Normal"/>
+              <w:spacing w:before="0" w:after="20"/>
+              <w:rPr/>
+            </w:pPr>
+            <w:r>
+              <w:rPr>
+                <w:sz w:val="19"/>
+                <w:szCs w:val="19"/>
+              </w:rPr>
+              <w:t>1/4 (25 %)</w:t>
+            </w:r>
+          </w:p>
+          <w:p>
+            <w:pPr>
+              <w:pStyle w:val="Normal"/>
+              <w:spacing w:before="0" w:after="20"/>
+              <w:rPr/>
+            </w:pPr>
+            <w:r>
+              <w:rPr>
+                <w:sz w:val="19"/>
+                <w:szCs w:val="19"/>
+              </w:rPr>
+              <w:t>razón 1.03</w:t>
+            </w:r>
+          </w:p>
+        </w:tc>
+      </w:tr>
+      <w:tr>
+        <w:trPr/>
+        <w:tc>
+          <w:tcPr>
+            <w:tcW w:w="1499" w:type="dxa"/>
+            <w:tcBorders>
+              <w:top w:val="single" w:sz="4" w:space="0" w:color="BFBFBF"/>
+              <w:left w:val="single" w:sz="4" w:space="0" w:color="BFBFBF"/>
+              <w:bottom w:val="single" w:sz="4" w:space="0" w:color="BFBFBF"/>
+              <w:right w:val="single" w:sz="4" w:space="0" w:color="BFBFBF"/>
+            </w:tcBorders>
+          </w:tcPr>
+          <w:p>
+            <w:pPr>
+              <w:pStyle w:val="Normal"/>
+              <w:spacing w:before="0" w:after="20"/>
+              <w:rPr/>
+            </w:pPr>
+            <w:r>
+              <w:rPr>
+                <w:sz w:val="19"/>
+                <w:szCs w:val="19"/>
+              </w:rPr>
+              <w:t>21 días</w:t>
+            </w:r>
+          </w:p>
+        </w:tc>
+        <w:tc>
+          <w:tcPr>
+            <w:tcW w:w="1501" w:type="dxa"/>
+            <w:tcBorders>
+              <w:top w:val="single" w:sz="4" w:space="0" w:color="BFBFBF"/>
+              <w:left w:val="single" w:sz="4" w:space="0" w:color="BFBFBF"/>
+              <w:bottom w:val="single" w:sz="4" w:space="0" w:color="BFBFBF"/>
+              <w:right w:val="single" w:sz="4" w:space="0" w:color="BFBFBF"/>
+            </w:tcBorders>
+          </w:tcPr>
+          <w:p>
+            <w:pPr>
+              <w:pStyle w:val="Normal"/>
+              <w:spacing w:before="0" w:after="20"/>
+              <w:rPr/>
+            </w:pPr>
+            <w:r>
+              <w:rPr>
+                <w:sz w:val="19"/>
+                <w:szCs w:val="19"/>
+              </w:rPr>
+              <w:t>29.7 %</w:t>
+            </w:r>
+          </w:p>
+        </w:tc>
+        <w:tc>
+          <w:tcPr>
+            <w:tcW w:w="2299" w:type="dxa"/>
+            <w:tcBorders>
+              <w:top w:val="single" w:sz="4" w:space="0" w:color="BFBFBF"/>
+              <w:left w:val="single" w:sz="4" w:space="0" w:color="BFBFBF"/>
+              <w:bottom w:val="single" w:sz="4" w:space="0" w:color="BFBFBF"/>
+              <w:right w:val="single" w:sz="4" w:space="0" w:color="BFBFBF"/>
+            </w:tcBorders>
+          </w:tcPr>
+          <w:p>
+            <w:pPr>
+              <w:pStyle w:val="Normal"/>
+              <w:spacing w:before="0" w:after="20"/>
+              <w:rPr/>
+            </w:pPr>
+            <w:r>
+              <w:rPr>
+                <w:sz w:val="19"/>
+                <w:szCs w:val="19"/>
+              </w:rPr>
+              <w:t>2/4 (50 %)</w:t>
+            </w:r>
+          </w:p>
+          <w:p>
+            <w:pPr>
+              <w:pStyle w:val="Normal"/>
+              <w:spacing w:before="0" w:after="20"/>
+              <w:rPr/>
+            </w:pPr>
+            <w:r>
+              <w:rPr>
+                <w:sz w:val="19"/>
+                <w:szCs w:val="19"/>
+              </w:rPr>
+              <w:t>razón 1.68</w:t>
+            </w:r>
+          </w:p>
+        </w:tc>
+        <w:tc>
+          <w:tcPr>
+            <w:tcW w:w="2170" w:type="dxa"/>
+            <w:tcBorders>
+              <w:top w:val="single" w:sz="4" w:space="0" w:color="BFBFBF"/>
+              <w:left w:val="single" w:sz="4" w:space="0" w:color="BFBFBF"/>
+              <w:bottom w:val="single" w:sz="4" w:space="0" w:color="BFBFBF"/>
+              <w:right w:val="single" w:sz="4" w:space="0" w:color="BFBFBF"/>
+            </w:tcBorders>
+          </w:tcPr>
+          <w:p>
+            <w:pPr>
+              <w:pStyle w:val="Normal"/>
+              <w:spacing w:before="0" w:after="20"/>
+              <w:rPr/>
+            </w:pPr>
+            <w:r>
+              <w:rPr>
+                <w:sz w:val="19"/>
+                <w:szCs w:val="19"/>
+              </w:rPr>
+              <w:t>1/4 (25 %)</w:t>
+            </w:r>
+          </w:p>
+          <w:p>
+            <w:pPr>
+              <w:pStyle w:val="Normal"/>
+              <w:spacing w:before="0" w:after="20"/>
+              <w:rPr/>
+            </w:pPr>
+            <w:r>
+              <w:rPr>
+                <w:sz w:val="19"/>
+                <w:szCs w:val="19"/>
+              </w:rPr>
+              <w:t>razón 0.84</w:t>
+            </w:r>
+          </w:p>
+        </w:tc>
+        <w:tc>
+          <w:tcPr>
+            <w:tcW w:w="2169" w:type="dxa"/>
+            <w:tcBorders>
+              <w:top w:val="single" w:sz="4" w:space="0" w:color="BFBFBF"/>
+              <w:left w:val="single" w:sz="4" w:space="0" w:color="BFBFBF"/>
+              <w:bottom w:val="single" w:sz="4" w:space="0" w:color="BFBFBF"/>
+              <w:right w:val="single" w:sz="4" w:space="0" w:color="BFBFBF"/>
+            </w:tcBorders>
+          </w:tcPr>
+          <w:p>
+            <w:pPr>
+              <w:pStyle w:val="Normal"/>
+              <w:spacing w:before="0" w:after="20"/>
+              <w:rPr/>
+            </w:pPr>
+            <w:r>
+              <w:rPr>
+                <w:sz w:val="19"/>
+                <w:szCs w:val="19"/>
+              </w:rPr>
+              <w:t>1/4 (25 %)</w:t>
+            </w:r>
+          </w:p>
+          <w:p>
+            <w:pPr>
+              <w:pStyle w:val="Normal"/>
+              <w:spacing w:before="0" w:after="20"/>
+              <w:rPr/>
+            </w:pPr>
+            <w:r>
+              <w:rPr>
+                <w:sz w:val="19"/>
+                <w:szCs w:val="19"/>
+              </w:rPr>
+              <w:t>razón 0.84</w:t>
             </w:r>
           </w:p>
         </w:tc>
@@ -20424,7 +21510,7 @@
         <w:rPr/>
         <w:drawing>
           <wp:inline distT="0" distB="0" distL="0" distR="0">
-            <wp:extent cx="5715000" cy="2933700"/>
+            <wp:extent cx="5715000" cy="3114675"/>
             <wp:effectExtent l="0" t="0" r="0" b="0"/>
             <wp:docPr id="11" name="web_evaluacion.png" descr="Figura 11&#10;Sección «Evaluación del modelo» en la página, con los incidentes sin fecha al pie."/>
             <wp:cNvGraphicFramePr>
@@ -20448,7 +21534,7 @@
                   <pic:spPr bwMode="auto">
                     <a:xfrm>
                       <a:off x="0" y="0"/>
-                      <a:ext cx="5715000" cy="2933700"/>
+                      <a:ext cx="5715000" cy="3114675"/>
                     </a:xfrm>
                     <a:prstGeom prst="rect">
                       <a:avLst/>
@@ -20494,7 +21580,7 @@
         <w:pStyle w:val="Heading2"/>
         <w:rPr/>
       </w:pPr>
-      <w:bookmarkStart w:id="48" w:name="__RefHeading___Toc2667_1251848270"/>
+      <w:bookmarkStart w:id="48" w:name="__RefHeading___Toc2829_3501254244"/>
       <w:bookmarkEnd w:id="48"/>
       <w:r>
         <w:rPr/>
@@ -20524,7 +21610,18 @@
       </w:r>
       <w:r>
         <w:rPr/>
-        <w:t xml:space="preserve"> ningún ataque hacktivista cae dentro; con </w:t>
+        <w:t xml:space="preserve"> (la del semáforo) </w:t>
+      </w:r>
+      <w:r>
+        <w:rPr>
+          <w:b/>
+          <w:bCs/>
+        </w:rPr>
+        <w:t>ningún</w:t>
+      </w:r>
+      <w:r>
+        <w:rPr/>
+        <w:t xml:space="preserve"> ataque hacktivista cae dentro de una ventana. Con </w:t>
       </w:r>
       <w:r>
         <w:rPr>
@@ -20535,18 +21632,81 @@
       </w:r>
       <w:r>
         <w:rPr/>
-        <w:t xml:space="preserve">, 3 de 5 (razón superior a 3). Esto sugiere que, si existe relación, el hacktivismo </w:t>
+        <w:t xml:space="preserve">, la razón de los hacktivistas es de alrededor de </w:t>
       </w:r>
       <w:r>
         <w:rPr>
           <w:b/>
           <w:bCs/>
         </w:rPr>
-        <w:t>no reacciona en una semana</w:t>
-      </w:r>
-      <w:r>
-        <w:rPr/>
-        <w:t>, sino en dos o tres. Es una hipótesis a confirmar con más datos.</w:t>
+        <w:t>2</w:t>
+      </w:r>
+      <w:r>
+        <w:rPr/>
+        <w:t xml:space="preserve"> (1,92 con todos los incidentes y 1,68 solo con los de confianza media o alta), mientras que la de los cibercriminales queda </w:t>
+      </w:r>
+      <w:r>
+        <w:rPr>
+          <w:b/>
+          <w:bCs/>
+        </w:rPr>
+        <w:t>por debajo de 1</w:t>
+      </w:r>
+      <w:r>
+        <w:rPr/>
+        <w:t xml:space="preserve"> (0,75 y 0,84).</w:t>
+      </w:r>
+    </w:p>
+    <w:p>
+      <w:pPr>
+        <w:pStyle w:val="ListParagraph"/>
+        <w:numPr>
+          <w:ilvl w:val="0"/>
+          <w:numId w:val="3"/>
+        </w:numPr>
+        <w:spacing w:before="0" w:after="60"/>
+        <w:rPr/>
+      </w:pPr>
+      <w:r>
+        <w:rPr/>
+        <w:t>El patrón se mantiene en las dos variantes, lo que sugiere que no depende de los datos más débiles (</w:t>
+      </w:r>
+      <w:r>
+        <w:rPr>
+          <w:b/>
+          <w:bCs/>
+        </w:rPr>
+        <w:t>robustez</w:t>
+      </w:r>
+      <w:r>
+        <w:rPr/>
+        <w:t>).</w:t>
+      </w:r>
+    </w:p>
+    <w:p>
+      <w:pPr>
+        <w:pStyle w:val="ListParagraph"/>
+        <w:numPr>
+          <w:ilvl w:val="0"/>
+          <w:numId w:val="3"/>
+        </w:numPr>
+        <w:spacing w:before="0" w:after="60"/>
+        <w:rPr/>
+      </w:pPr>
+      <w:r>
+        <w:rPr/>
+        <w:t xml:space="preserve">Lectura preliminar: si existe relación entre geopolítica y hacktivismo contra Argentina, la reacción no es inmediata, sino que ocurre en un plazo de </w:t>
+      </w:r>
+      <w:r>
+        <w:rPr>
+          <w:b/>
+          <w:bCs/>
+        </w:rPr>
+        <w:t>dos a tres semanas</w:t>
+      </w:r>
+      <w:r>
+        <w:rPr/>
+        <w:t>. Dos casos lo ilustran: LulzSec Muslims (16 días después de la visita a Israel de 2024) y el intento de DDoS a la Cancillería (19 días después del ingreso al Board of Peace). Esto pone en discusión la ventana de 7 días fijada en los requisitos iniciales.</w:t>
       </w:r>
     </w:p>
     <w:p>
@@ -20614,7 +21774,7 @@
         <w:pStyle w:val="Heading2"/>
         <w:rPr/>
       </w:pPr>
-      <w:bookmarkStart w:id="49" w:name="__RefHeading___Toc2669_1251848270"/>
+      <w:bookmarkStart w:id="49" w:name="__RefHeading___Toc2831_3501254244"/>
       <w:bookmarkEnd w:id="49"/>
       <w:r>
         <w:rPr/>
@@ -20805,7 +21965,7 @@
         <w:pStyle w:val="Heading1"/>
         <w:rPr/>
       </w:pPr>
-      <w:bookmarkStart w:id="50" w:name="__RefHeading___Toc2671_1251848270"/>
+      <w:bookmarkStart w:id="50" w:name="__RefHeading___Toc2833_3501254244"/>
       <w:bookmarkEnd w:id="50"/>
       <w:r>
         <w:rPr/>
@@ -23435,6 +24595,315 @@
           </w:p>
         </w:tc>
       </w:tr>
+      <w:tr>
+        <w:trPr/>
+        <w:tc>
+          <w:tcPr>
+            <w:tcW w:w="1250" w:type="dxa"/>
+            <w:tcBorders>
+              <w:top w:val="single" w:sz="4" w:space="0" w:color="BFBFBF"/>
+              <w:left w:val="single" w:sz="4" w:space="0" w:color="BFBFBF"/>
+              <w:bottom w:val="single" w:sz="4" w:space="0" w:color="BFBFBF"/>
+              <w:right w:val="single" w:sz="4" w:space="0" w:color="BFBFBF"/>
+            </w:tcBorders>
+          </w:tcPr>
+          <w:p>
+            <w:pPr>
+              <w:pStyle w:val="Normal"/>
+              <w:spacing w:before="0" w:after="20"/>
+              <w:rPr/>
+            </w:pPr>
+            <w:r>
+              <w:rPr>
+                <w:sz w:val="19"/>
+                <w:szCs w:val="19"/>
+              </w:rPr>
+              <w:t>14/10/2026</w:t>
+            </w:r>
+          </w:p>
+        </w:tc>
+        <w:tc>
+          <w:tcPr>
+            <w:tcW w:w="1650" w:type="dxa"/>
+            <w:tcBorders>
+              <w:top w:val="single" w:sz="4" w:space="0" w:color="BFBFBF"/>
+              <w:left w:val="single" w:sz="4" w:space="0" w:color="BFBFBF"/>
+              <w:bottom w:val="single" w:sz="4" w:space="0" w:color="BFBFBF"/>
+              <w:right w:val="single" w:sz="4" w:space="0" w:color="BFBFBF"/>
+            </w:tcBorders>
+          </w:tcPr>
+          <w:p>
+            <w:pPr>
+              <w:pStyle w:val="Normal"/>
+              <w:spacing w:before="0" w:after="20"/>
+              <w:rPr/>
+            </w:pPr>
+            <w:r>
+              <w:rPr>
+                <w:sz w:val="19"/>
+                <w:szCs w:val="19"/>
+              </w:rPr>
+              <w:t>Configuración</w:t>
+            </w:r>
+          </w:p>
+        </w:tc>
+        <w:tc>
+          <w:tcPr>
+            <w:tcW w:w="2299" w:type="dxa"/>
+            <w:tcBorders>
+              <w:top w:val="single" w:sz="4" w:space="0" w:color="BFBFBF"/>
+              <w:left w:val="single" w:sz="4" w:space="0" w:color="BFBFBF"/>
+              <w:bottom w:val="single" w:sz="4" w:space="0" w:color="BFBFBF"/>
+              <w:right w:val="single" w:sz="4" w:space="0" w:color="BFBFBF"/>
+            </w:tcBorders>
+          </w:tcPr>
+          <w:p>
+            <w:pPr>
+              <w:pStyle w:val="Normal"/>
+              <w:spacing w:before="0" w:after="20"/>
+              <w:rPr/>
+            </w:pPr>
+            <w:r>
+              <w:rPr>
+                <w:sz w:val="19"/>
+                <w:szCs w:val="19"/>
+              </w:rPr>
+              <w:t>Pull Request #2 fusionado</w:t>
+            </w:r>
+          </w:p>
+        </w:tc>
+        <w:tc>
+          <w:tcPr>
+            <w:tcW w:w="4438" w:type="dxa"/>
+            <w:tcBorders>
+              <w:top w:val="single" w:sz="4" w:space="0" w:color="BFBFBF"/>
+              <w:left w:val="single" w:sz="4" w:space="0" w:color="BFBFBF"/>
+              <w:bottom w:val="single" w:sz="4" w:space="0" w:color="BFBFBF"/>
+              <w:right w:val="single" w:sz="4" w:space="0" w:color="BFBFBF"/>
+            </w:tcBorders>
+          </w:tcPr>
+          <w:p>
+            <w:pPr>
+              <w:pStyle w:val="Normal"/>
+              <w:spacing w:before="0" w:after="20"/>
+              <w:rPr/>
+            </w:pPr>
+            <w:r>
+              <w:rPr>
+                <w:sz w:val="19"/>
+                <w:szCs w:val="19"/>
+              </w:rPr>
+              <w:t>El autor fusionó el PR con los 13 incidentes, la evaluación del modelo y el período extendido. Antes se resolvió un conflicto en web/datos.json causado por las actualizaciones automáticas de main.</w:t>
+            </w:r>
+          </w:p>
+        </w:tc>
+      </w:tr>
+      <w:tr>
+        <w:trPr/>
+        <w:tc>
+          <w:tcPr>
+            <w:tcW w:w="1250" w:type="dxa"/>
+            <w:tcBorders>
+              <w:top w:val="single" w:sz="4" w:space="0" w:color="BFBFBF"/>
+              <w:left w:val="single" w:sz="4" w:space="0" w:color="BFBFBF"/>
+              <w:bottom w:val="single" w:sz="4" w:space="0" w:color="BFBFBF"/>
+              <w:right w:val="single" w:sz="4" w:space="0" w:color="BFBFBF"/>
+            </w:tcBorders>
+          </w:tcPr>
+          <w:p>
+            <w:pPr>
+              <w:pStyle w:val="Normal"/>
+              <w:spacing w:before="0" w:after="20"/>
+              <w:rPr/>
+            </w:pPr>
+            <w:r>
+              <w:rPr>
+                <w:sz w:val="19"/>
+                <w:szCs w:val="19"/>
+              </w:rPr>
+              <w:t>14/10/2026</w:t>
+            </w:r>
+          </w:p>
+        </w:tc>
+        <w:tc>
+          <w:tcPr>
+            <w:tcW w:w="1650" w:type="dxa"/>
+            <w:tcBorders>
+              <w:top w:val="single" w:sz="4" w:space="0" w:color="BFBFBF"/>
+              <w:left w:val="single" w:sz="4" w:space="0" w:color="BFBFBF"/>
+              <w:bottom w:val="single" w:sz="4" w:space="0" w:color="BFBFBF"/>
+              <w:right w:val="single" w:sz="4" w:space="0" w:color="BFBFBF"/>
+            </w:tcBorders>
+          </w:tcPr>
+          <w:p>
+            <w:pPr>
+              <w:pStyle w:val="Normal"/>
+              <w:spacing w:before="0" w:after="20"/>
+              <w:rPr/>
+            </w:pPr>
+            <w:r>
+              <w:rPr>
+                <w:sz w:val="19"/>
+                <w:szCs w:val="19"/>
+              </w:rPr>
+              <w:t>Decisión</w:t>
+            </w:r>
+          </w:p>
+        </w:tc>
+        <w:tc>
+          <w:tcPr>
+            <w:tcW w:w="2299" w:type="dxa"/>
+            <w:tcBorders>
+              <w:top w:val="single" w:sz="4" w:space="0" w:color="BFBFBF"/>
+              <w:left w:val="single" w:sz="4" w:space="0" w:color="BFBFBF"/>
+              <w:bottom w:val="single" w:sz="4" w:space="0" w:color="BFBFBF"/>
+              <w:right w:val="single" w:sz="4" w:space="0" w:color="BFBFBF"/>
+            </w:tcBorders>
+          </w:tcPr>
+          <w:p>
+            <w:pPr>
+              <w:pStyle w:val="Normal"/>
+              <w:spacing w:before="0" w:after="20"/>
+              <w:rPr/>
+            </w:pPr>
+            <w:r>
+              <w:rPr>
+                <w:sz w:val="19"/>
+                <w:szCs w:val="19"/>
+              </w:rPr>
+              <w:t>Carga de la segunda lista con filtro por confianza</w:t>
+            </w:r>
+          </w:p>
+        </w:tc>
+        <w:tc>
+          <w:tcPr>
+            <w:tcW w:w="4438" w:type="dxa"/>
+            <w:tcBorders>
+              <w:top w:val="single" w:sz="4" w:space="0" w:color="BFBFBF"/>
+              <w:left w:val="single" w:sz="4" w:space="0" w:color="BFBFBF"/>
+              <w:bottom w:val="single" w:sz="4" w:space="0" w:color="BFBFBF"/>
+              <w:right w:val="single" w:sz="4" w:space="0" w:color="BFBFBF"/>
+            </w:tcBorders>
+          </w:tcPr>
+          <w:p>
+            <w:pPr>
+              <w:pStyle w:val="Normal"/>
+              <w:spacing w:before="0" w:after="20"/>
+              <w:rPr/>
+            </w:pPr>
+            <w:r>
+              <w:rPr>
+                <w:sz w:val="19"/>
+                <w:szCs w:val="19"/>
+              </w:rPr>
+              <w:t>El autor eligió cargar todos los candidatos (opción A) para mantener el mismo criterio en todo el período y no vaciar el grupo de comparación. Se agregó a la evaluación una segunda variante que solo usa incidentes de confianza media o alta.</w:t>
+            </w:r>
+          </w:p>
+        </w:tc>
+      </w:tr>
+      <w:tr>
+        <w:trPr/>
+        <w:tc>
+          <w:tcPr>
+            <w:tcW w:w="1250" w:type="dxa"/>
+            <w:tcBorders>
+              <w:top w:val="single" w:sz="4" w:space="0" w:color="BFBFBF"/>
+              <w:left w:val="single" w:sz="4" w:space="0" w:color="BFBFBF"/>
+              <w:bottom w:val="single" w:sz="4" w:space="0" w:color="BFBFBF"/>
+              <w:right w:val="single" w:sz="4" w:space="0" w:color="BFBFBF"/>
+            </w:tcBorders>
+          </w:tcPr>
+          <w:p>
+            <w:pPr>
+              <w:pStyle w:val="Normal"/>
+              <w:spacing w:before="0" w:after="20"/>
+              <w:rPr/>
+            </w:pPr>
+            <w:r>
+              <w:rPr>
+                <w:sz w:val="19"/>
+                <w:szCs w:val="19"/>
+              </w:rPr>
+              <w:t>14/10/2026</w:t>
+            </w:r>
+          </w:p>
+        </w:tc>
+        <w:tc>
+          <w:tcPr>
+            <w:tcW w:w="1650" w:type="dxa"/>
+            <w:tcBorders>
+              <w:top w:val="single" w:sz="4" w:space="0" w:color="BFBFBF"/>
+              <w:left w:val="single" w:sz="4" w:space="0" w:color="BFBFBF"/>
+              <w:bottom w:val="single" w:sz="4" w:space="0" w:color="BFBFBF"/>
+              <w:right w:val="single" w:sz="4" w:space="0" w:color="BFBFBF"/>
+            </w:tcBorders>
+          </w:tcPr>
+          <w:p>
+            <w:pPr>
+              <w:pStyle w:val="Normal"/>
+              <w:spacing w:before="0" w:after="20"/>
+              <w:rPr/>
+            </w:pPr>
+            <w:r>
+              <w:rPr>
+                <w:sz w:val="19"/>
+                <w:szCs w:val="19"/>
+              </w:rPr>
+              <w:t>Resultado</w:t>
+            </w:r>
+          </w:p>
+        </w:tc>
+        <w:tc>
+          <w:tcPr>
+            <w:tcW w:w="2299" w:type="dxa"/>
+            <w:tcBorders>
+              <w:top w:val="single" w:sz="4" w:space="0" w:color="BFBFBF"/>
+              <w:left w:val="single" w:sz="4" w:space="0" w:color="BFBFBF"/>
+              <w:bottom w:val="single" w:sz="4" w:space="0" w:color="BFBFBF"/>
+              <w:right w:val="single" w:sz="4" w:space="0" w:color="BFBFBF"/>
+            </w:tcBorders>
+          </w:tcPr>
+          <w:p>
+            <w:pPr>
+              <w:pStyle w:val="Normal"/>
+              <w:spacing w:before="0" w:after="20"/>
+              <w:rPr/>
+            </w:pPr>
+            <w:r>
+              <w:rPr>
+                <w:sz w:val="19"/>
+                <w:szCs w:val="19"/>
+              </w:rPr>
+              <w:t>Resultados con 23 incidentes y 16 hechos clave</w:t>
+            </w:r>
+          </w:p>
+        </w:tc>
+        <w:tc>
+          <w:tcPr>
+            <w:tcW w:w="4438" w:type="dxa"/>
+            <w:tcBorders>
+              <w:top w:val="single" w:sz="4" w:space="0" w:color="BFBFBF"/>
+              <w:left w:val="single" w:sz="4" w:space="0" w:color="BFBFBF"/>
+              <w:bottom w:val="single" w:sz="4" w:space="0" w:color="BFBFBF"/>
+              <w:right w:val="single" w:sz="4" w:space="0" w:color="BFBFBF"/>
+            </w:tcBorders>
+          </w:tcPr>
+          <w:p>
+            <w:pPr>
+              <w:pStyle w:val="Normal"/>
+              <w:spacing w:before="0" w:after="20"/>
+              <w:rPr/>
+            </w:pPr>
+            <w:r>
+              <w:rPr>
+                <w:sz w:val="19"/>
+                <w:szCs w:val="19"/>
+              </w:rPr>
+              <w:t>Con ventana de 21 días, los hacktivistas tienen una razón de 1,92 (todos los incidentes) y 1,68 (solo confianza media/alta), frente a 0,75 y 0,84 de los cibercriminales. Con 7 días, ningún ataque hacktivista cae dentro de las ventanas. El patrón se mantiene en ambas variantes.</w:t>
+            </w:r>
+          </w:p>
+        </w:tc>
+      </w:tr>
     </w:tbl>
     <w:p>
       <w:pPr>
@@ -23444,7 +24913,7 @@
       <w:r>
         <w:br w:type="page"/>
       </w:r>
-      <w:bookmarkStart w:id="51" w:name="__RefHeading___Toc2673_1251848270"/>
+      <w:bookmarkStart w:id="51" w:name="__RefHeading___Toc2835_3501254244"/>
       <w:bookmarkEnd w:id="51"/>
       <w:r>
         <w:rPr/>
@@ -24773,7 +26242,7 @@
         <w:sz w:val="16"/>
         <w:szCs w:val="16"/>
       </w:rPr>
-      <w:t xml:space="preserve"> · Versión 0.4 (14/10/2026)</w:t>
+      <w:t xml:space="preserve"> · Versión 0.5 (14/10/2026)</w:t>
     </w:r>
   </w:p>
 </w:ftr>
@@ -24821,7 +26290,7 @@
         <w:sz w:val="16"/>
         <w:szCs w:val="16"/>
       </w:rPr>
-      <w:t xml:space="preserve"> · Versión 0.4 (14/10/2026)</w:t>
+      <w:t xml:space="preserve"> · Versión 0.5 (14/10/2026)</w:t>
     </w:r>
   </w:p>
 </w:ftr>

</xml_diff>

<commit_message>
Incidentes verificados por el autor, variante 'solo verificados' y depuración de duplicados
- 10 incidentes verificados con código Almirantazgo; confianza derivada del código (D30)
- Evaluación: variante 'solo verificados' y un evento por día en noticias detectadas (D31)
- Web: etiqueta 'verificado' con el código; selector con tres variantes
- Planilla con los códigos precargados; 18 pruebas; decisiones D30-D32; memoria v0.7

Co-Authored-By: Claude Opus 5.5 <noreply@anthropic.com>
Claude-Session: https://claude.ai/code/session_011eMYWh6VDWd8LKxBrkPUCG
</commit_message>
<xml_diff>
--- a/memoria/Memoria_TFM.docx
+++ b/memoria/Memoria_TFM.docx
@@ -145,7 +145,7 @@
           <w:sz w:val="20"/>
           <w:szCs w:val="20"/>
         </w:rPr>
-        <w:t>Versión 0.6 · 17/10/2026</w:t>
+        <w:t>Versión 0.7 · 18/10/2026</w:t>
       </w:r>
     </w:p>
     <w:p>
@@ -852,6 +852,84 @@
                 <w:szCs w:val="19"/>
               </w:rPr>
               <w:t>Metodología de verificación (Código Almirantazgo, corroboración y evidencia técnica) y planilla de verificación para el autor.</w:t>
+            </w:r>
+          </w:p>
+        </w:tc>
+      </w:tr>
+      <w:tr>
+        <w:trPr/>
+        <w:tc>
+          <w:tcPr>
+            <w:tcW w:w="1099" w:type="dxa"/>
+            <w:tcBorders>
+              <w:top w:val="single" w:sz="4" w:space="0" w:color="BFBFBF"/>
+              <w:left w:val="single" w:sz="4" w:space="0" w:color="BFBFBF"/>
+              <w:bottom w:val="single" w:sz="4" w:space="0" w:color="BFBFBF"/>
+              <w:right w:val="single" w:sz="4" w:space="0" w:color="BFBFBF"/>
+            </w:tcBorders>
+          </w:tcPr>
+          <w:p>
+            <w:pPr>
+              <w:pStyle w:val="Normal"/>
+              <w:spacing w:before="0" w:after="20"/>
+              <w:rPr/>
+            </w:pPr>
+            <w:r>
+              <w:rPr>
+                <w:sz w:val="19"/>
+                <w:szCs w:val="19"/>
+              </w:rPr>
+              <w:t>0.7</w:t>
+            </w:r>
+          </w:p>
+        </w:tc>
+        <w:tc>
+          <w:tcPr>
+            <w:tcW w:w="1401" w:type="dxa"/>
+            <w:tcBorders>
+              <w:top w:val="single" w:sz="4" w:space="0" w:color="BFBFBF"/>
+              <w:left w:val="single" w:sz="4" w:space="0" w:color="BFBFBF"/>
+              <w:bottom w:val="single" w:sz="4" w:space="0" w:color="BFBFBF"/>
+              <w:right w:val="single" w:sz="4" w:space="0" w:color="BFBFBF"/>
+            </w:tcBorders>
+          </w:tcPr>
+          <w:p>
+            <w:pPr>
+              <w:pStyle w:val="Normal"/>
+              <w:spacing w:before="0" w:after="20"/>
+              <w:rPr/>
+            </w:pPr>
+            <w:r>
+              <w:rPr>
+                <w:sz w:val="19"/>
+                <w:szCs w:val="19"/>
+              </w:rPr>
+              <w:t>18/10/2026</w:t>
+            </w:r>
+          </w:p>
+        </w:tc>
+        <w:tc>
+          <w:tcPr>
+            <w:tcW w:w="7138" w:type="dxa"/>
+            <w:tcBorders>
+              <w:top w:val="single" w:sz="4" w:space="0" w:color="BFBFBF"/>
+              <w:left w:val="single" w:sz="4" w:space="0" w:color="BFBFBF"/>
+              <w:bottom w:val="single" w:sz="4" w:space="0" w:color="BFBFBF"/>
+              <w:right w:val="single" w:sz="4" w:space="0" w:color="BFBFBF"/>
+            </w:tcBorders>
+          </w:tcPr>
+          <w:p>
+            <w:pPr>
+              <w:pStyle w:val="Normal"/>
+              <w:spacing w:before="0" w:after="20"/>
+              <w:rPr/>
+            </w:pPr>
+            <w:r>
+              <w:rPr>
+                <w:sz w:val="19"/>
+                <w:szCs w:val="19"/>
+              </w:rPr>
+              <w:t>Primeros 10 incidentes verificados por el autor (Código Almirantazgo), variante de evaluación 'solo verificados' y depuración de noticias duplicadas.</w:t>
             </w:r>
           </w:p>
         </w:tc>
@@ -942,7 +1020,7 @@
             </w:rPr>
             <w:fldChar w:fldCharType="separate"/>
           </w:r>
-          <w:hyperlink w:anchor="__RefHeading___Toc2855_2833890792">
+          <w:hyperlink w:anchor="__RefHeading___Toc3051_1723578586">
             <w:r>
               <w:rPr>
                 <w:rStyle w:val="IndexLink"/>
@@ -962,7 +1040,7 @@
             </w:tabs>
             <w:rPr/>
           </w:pPr>
-          <w:hyperlink w:anchor="__RefHeading___Toc2857_2833890792">
+          <w:hyperlink w:anchor="__RefHeading___Toc3053_1723578586">
             <w:r>
               <w:rPr>
                 <w:rStyle w:val="IndexLink"/>
@@ -982,7 +1060,7 @@
             </w:tabs>
             <w:rPr/>
           </w:pPr>
-          <w:hyperlink w:anchor="__RefHeading___Toc2859_2833890792">
+          <w:hyperlink w:anchor="__RefHeading___Toc3055_1723578586">
             <w:r>
               <w:rPr>
                 <w:rStyle w:val="IndexLink"/>
@@ -1002,7 +1080,7 @@
             </w:tabs>
             <w:rPr/>
           </w:pPr>
-          <w:hyperlink w:anchor="__RefHeading___Toc2861_2833890792">
+          <w:hyperlink w:anchor="__RefHeading___Toc3057_1723578586">
             <w:r>
               <w:rPr>
                 <w:rStyle w:val="IndexLink"/>
@@ -1022,7 +1100,7 @@
             </w:tabs>
             <w:rPr/>
           </w:pPr>
-          <w:hyperlink w:anchor="__RefHeading___Toc2863_2833890792">
+          <w:hyperlink w:anchor="__RefHeading___Toc3059_1723578586">
             <w:r>
               <w:rPr>
                 <w:rStyle w:val="IndexLink"/>
@@ -1042,7 +1120,7 @@
             </w:tabs>
             <w:rPr/>
           </w:pPr>
-          <w:hyperlink w:anchor="__RefHeading___Toc2865_2833890792">
+          <w:hyperlink w:anchor="__RefHeading___Toc3061_1723578586">
             <w:r>
               <w:rPr>
                 <w:rStyle w:val="IndexLink"/>
@@ -1062,7 +1140,7 @@
             </w:tabs>
             <w:rPr/>
           </w:pPr>
-          <w:hyperlink w:anchor="__RefHeading___Toc2867_2833890792">
+          <w:hyperlink w:anchor="__RefHeading___Toc3063_1723578586">
             <w:r>
               <w:rPr>
                 <w:rStyle w:val="IndexLink"/>
@@ -1082,7 +1160,7 @@
             </w:tabs>
             <w:rPr/>
           </w:pPr>
-          <w:hyperlink w:anchor="__RefHeading___Toc2869_2833890792">
+          <w:hyperlink w:anchor="__RefHeading___Toc3065_1723578586">
             <w:r>
               <w:rPr>
                 <w:rStyle w:val="IndexLink"/>
@@ -1102,7 +1180,7 @@
             </w:tabs>
             <w:rPr/>
           </w:pPr>
-          <w:hyperlink w:anchor="__RefHeading___Toc2871_2833890792">
+          <w:hyperlink w:anchor="__RefHeading___Toc3067_1723578586">
             <w:r>
               <w:rPr>
                 <w:rStyle w:val="IndexLink"/>
@@ -1122,7 +1200,7 @@
             </w:tabs>
             <w:rPr/>
           </w:pPr>
-          <w:hyperlink w:anchor="__RefHeading___Toc2873_2833890792">
+          <w:hyperlink w:anchor="__RefHeading___Toc3069_1723578586">
             <w:r>
               <w:rPr>
                 <w:rStyle w:val="IndexLink"/>
@@ -1142,7 +1220,7 @@
             </w:tabs>
             <w:rPr/>
           </w:pPr>
-          <w:hyperlink w:anchor="__RefHeading___Toc2875_2833890792">
+          <w:hyperlink w:anchor="__RefHeading___Toc3071_1723578586">
             <w:r>
               <w:rPr>
                 <w:rStyle w:val="IndexLink"/>
@@ -1162,7 +1240,7 @@
             </w:tabs>
             <w:rPr/>
           </w:pPr>
-          <w:hyperlink w:anchor="__RefHeading___Toc2877_2833890792">
+          <w:hyperlink w:anchor="__RefHeading___Toc3073_1723578586">
             <w:r>
               <w:rPr>
                 <w:rStyle w:val="IndexLink"/>
@@ -1182,7 +1260,7 @@
             </w:tabs>
             <w:rPr/>
           </w:pPr>
-          <w:hyperlink w:anchor="__RefHeading___Toc2879_2833890792">
+          <w:hyperlink w:anchor="__RefHeading___Toc3075_1723578586">
             <w:r>
               <w:rPr>
                 <w:rStyle w:val="IndexLink"/>
@@ -1202,7 +1280,7 @@
             </w:tabs>
             <w:rPr/>
           </w:pPr>
-          <w:hyperlink w:anchor="__RefHeading___Toc2881_2833890792">
+          <w:hyperlink w:anchor="__RefHeading___Toc3077_1723578586">
             <w:r>
               <w:rPr>
                 <w:rStyle w:val="IndexLink"/>
@@ -1222,7 +1300,7 @@
             </w:tabs>
             <w:rPr/>
           </w:pPr>
-          <w:hyperlink w:anchor="__RefHeading___Toc2883_2833890792">
+          <w:hyperlink w:anchor="__RefHeading___Toc3079_1723578586">
             <w:r>
               <w:rPr>
                 <w:rStyle w:val="IndexLink"/>
@@ -1242,7 +1320,7 @@
             </w:tabs>
             <w:rPr/>
           </w:pPr>
-          <w:hyperlink w:anchor="__RefHeading___Toc2885_2833890792">
+          <w:hyperlink w:anchor="__RefHeading___Toc3081_1723578586">
             <w:r>
               <w:rPr>
                 <w:rStyle w:val="IndexLink"/>
@@ -1262,7 +1340,7 @@
             </w:tabs>
             <w:rPr/>
           </w:pPr>
-          <w:hyperlink w:anchor="__RefHeading___Toc2887_2833890792">
+          <w:hyperlink w:anchor="__RefHeading___Toc3083_1723578586">
             <w:r>
               <w:rPr>
                 <w:rStyle w:val="IndexLink"/>
@@ -1282,7 +1360,7 @@
             </w:tabs>
             <w:rPr/>
           </w:pPr>
-          <w:hyperlink w:anchor="__RefHeading___Toc2889_2833890792">
+          <w:hyperlink w:anchor="__RefHeading___Toc3085_1723578586">
             <w:r>
               <w:rPr>
                 <w:rStyle w:val="IndexLink"/>
@@ -1302,7 +1380,7 @@
             </w:tabs>
             <w:rPr/>
           </w:pPr>
-          <w:hyperlink w:anchor="__RefHeading___Toc2891_2833890792">
+          <w:hyperlink w:anchor="__RefHeading___Toc3087_1723578586">
             <w:r>
               <w:rPr>
                 <w:rStyle w:val="IndexLink"/>
@@ -1322,7 +1400,7 @@
             </w:tabs>
             <w:rPr/>
           </w:pPr>
-          <w:hyperlink w:anchor="__RefHeading___Toc2893_2833890792">
+          <w:hyperlink w:anchor="__RefHeading___Toc3089_1723578586">
             <w:r>
               <w:rPr>
                 <w:rStyle w:val="IndexLink"/>
@@ -1342,7 +1420,7 @@
             </w:tabs>
             <w:rPr/>
           </w:pPr>
-          <w:hyperlink w:anchor="__RefHeading___Toc2895_2833890792">
+          <w:hyperlink w:anchor="__RefHeading___Toc3091_1723578586">
             <w:r>
               <w:rPr>
                 <w:rStyle w:val="IndexLink"/>
@@ -1362,7 +1440,7 @@
             </w:tabs>
             <w:rPr/>
           </w:pPr>
-          <w:hyperlink w:anchor="__RefHeading___Toc2897_2833890792">
+          <w:hyperlink w:anchor="__RefHeading___Toc3093_1723578586">
             <w:r>
               <w:rPr>
                 <w:rStyle w:val="IndexLink"/>
@@ -1382,7 +1460,7 @@
             </w:tabs>
             <w:rPr/>
           </w:pPr>
-          <w:hyperlink w:anchor="__RefHeading___Toc2899_2833890792">
+          <w:hyperlink w:anchor="__RefHeading___Toc3095_1723578586">
             <w:r>
               <w:rPr>
                 <w:rStyle w:val="IndexLink"/>
@@ -1402,7 +1480,7 @@
             </w:tabs>
             <w:rPr/>
           </w:pPr>
-          <w:hyperlink w:anchor="__RefHeading___Toc2901_2833890792">
+          <w:hyperlink w:anchor="__RefHeading___Toc3097_1723578586">
             <w:r>
               <w:rPr>
                 <w:rStyle w:val="IndexLink"/>
@@ -1422,7 +1500,7 @@
             </w:tabs>
             <w:rPr/>
           </w:pPr>
-          <w:hyperlink w:anchor="__RefHeading___Toc2903_2833890792">
+          <w:hyperlink w:anchor="__RefHeading___Toc3099_1723578586">
             <w:r>
               <w:rPr>
                 <w:rStyle w:val="IndexLink"/>
@@ -1442,7 +1520,7 @@
             </w:tabs>
             <w:rPr/>
           </w:pPr>
-          <w:hyperlink w:anchor="__RefHeading___Toc2905_2833890792">
+          <w:hyperlink w:anchor="__RefHeading___Toc3101_1723578586">
             <w:r>
               <w:rPr>
                 <w:rStyle w:val="IndexLink"/>
@@ -1462,7 +1540,7 @@
             </w:tabs>
             <w:rPr/>
           </w:pPr>
-          <w:hyperlink w:anchor="__RefHeading___Toc2907_2833890792">
+          <w:hyperlink w:anchor="__RefHeading___Toc3103_1723578586">
             <w:r>
               <w:rPr>
                 <w:rStyle w:val="IndexLink"/>
@@ -1482,7 +1560,7 @@
             </w:tabs>
             <w:rPr/>
           </w:pPr>
-          <w:hyperlink w:anchor="__RefHeading___Toc2909_2833890792">
+          <w:hyperlink w:anchor="__RefHeading___Toc3105_1723578586">
             <w:r>
               <w:rPr>
                 <w:rStyle w:val="IndexLink"/>
@@ -1502,7 +1580,7 @@
             </w:tabs>
             <w:rPr/>
           </w:pPr>
-          <w:hyperlink w:anchor="__RefHeading___Toc2911_2833890792">
+          <w:hyperlink w:anchor="__RefHeading___Toc3107_1723578586">
             <w:r>
               <w:rPr>
                 <w:rStyle w:val="IndexLink"/>
@@ -1522,7 +1600,7 @@
             </w:tabs>
             <w:rPr/>
           </w:pPr>
-          <w:hyperlink w:anchor="__RefHeading___Toc2913_2833890792">
+          <w:hyperlink w:anchor="__RefHeading___Toc3109_1723578586">
             <w:r>
               <w:rPr>
                 <w:rStyle w:val="IndexLink"/>
@@ -1542,7 +1620,7 @@
             </w:tabs>
             <w:rPr/>
           </w:pPr>
-          <w:hyperlink w:anchor="__RefHeading___Toc2915_2833890792">
+          <w:hyperlink w:anchor="__RefHeading___Toc3111_1723578586">
             <w:r>
               <w:rPr>
                 <w:rStyle w:val="IndexLink"/>
@@ -1562,7 +1640,7 @@
             </w:tabs>
             <w:rPr/>
           </w:pPr>
-          <w:hyperlink w:anchor="__RefHeading___Toc2917_2833890792">
+          <w:hyperlink w:anchor="__RefHeading___Toc3113_1723578586">
             <w:r>
               <w:rPr>
                 <w:rStyle w:val="IndexLink"/>
@@ -1582,7 +1660,7 @@
             </w:tabs>
             <w:rPr/>
           </w:pPr>
-          <w:hyperlink w:anchor="__RefHeading___Toc2919_2833890792">
+          <w:hyperlink w:anchor="__RefHeading___Toc3115_1723578586">
             <w:r>
               <w:rPr>
                 <w:rStyle w:val="IndexLink"/>
@@ -1602,7 +1680,7 @@
             </w:tabs>
             <w:rPr/>
           </w:pPr>
-          <w:hyperlink w:anchor="__RefHeading___Toc2921_2833890792">
+          <w:hyperlink w:anchor="__RefHeading___Toc3117_1723578586">
             <w:r>
               <w:rPr>
                 <w:rStyle w:val="IndexLink"/>
@@ -1622,7 +1700,7 @@
             </w:tabs>
             <w:rPr/>
           </w:pPr>
-          <w:hyperlink w:anchor="__RefHeading___Toc2923_2833890792">
+          <w:hyperlink w:anchor="__RefHeading___Toc3119_1723578586">
             <w:r>
               <w:rPr>
                 <w:rStyle w:val="IndexLink"/>
@@ -1642,7 +1720,7 @@
             </w:tabs>
             <w:rPr/>
           </w:pPr>
-          <w:hyperlink w:anchor="__RefHeading___Toc2925_2833890792">
+          <w:hyperlink w:anchor="__RefHeading___Toc3121_1723578586">
             <w:r>
               <w:rPr>
                 <w:rStyle w:val="IndexLink"/>
@@ -1662,7 +1740,7 @@
             </w:tabs>
             <w:rPr/>
           </w:pPr>
-          <w:hyperlink w:anchor="__RefHeading___Toc2927_2833890792">
+          <w:hyperlink w:anchor="__RefHeading___Toc3123_1723578586">
             <w:r>
               <w:rPr>
                 <w:rStyle w:val="IndexLink"/>
@@ -1682,7 +1760,7 @@
             </w:tabs>
             <w:rPr/>
           </w:pPr>
-          <w:hyperlink w:anchor="__RefHeading___Toc2929_2833890792">
+          <w:hyperlink w:anchor="__RefHeading___Toc3125_1723578586">
             <w:r>
               <w:rPr>
                 <w:rStyle w:val="IndexLink"/>
@@ -1702,7 +1780,7 @@
             </w:tabs>
             <w:rPr/>
           </w:pPr>
-          <w:hyperlink w:anchor="__RefHeading___Toc2931_2833890792">
+          <w:hyperlink w:anchor="__RefHeading___Toc3127_1723578586">
             <w:r>
               <w:rPr>
                 <w:rStyle w:val="IndexLink"/>
@@ -1722,7 +1800,7 @@
             </w:tabs>
             <w:rPr/>
           </w:pPr>
-          <w:hyperlink w:anchor="__RefHeading___Toc2933_2833890792">
+          <w:hyperlink w:anchor="__RefHeading___Toc3129_1723578586">
             <w:r>
               <w:rPr>
                 <w:rStyle w:val="IndexLink"/>
@@ -1742,7 +1820,7 @@
             </w:tabs>
             <w:rPr/>
           </w:pPr>
-          <w:hyperlink w:anchor="__RefHeading___Toc2935_2833890792">
+          <w:hyperlink w:anchor="__RefHeading___Toc3131_1723578586">
             <w:r>
               <w:rPr>
                 <w:rStyle w:val="IndexLink"/>
@@ -1762,7 +1840,7 @@
             </w:tabs>
             <w:rPr/>
           </w:pPr>
-          <w:hyperlink w:anchor="__RefHeading___Toc2937_2833890792">
+          <w:hyperlink w:anchor="__RefHeading___Toc3133_1723578586">
             <w:r>
               <w:rPr>
                 <w:rStyle w:val="IndexLink"/>
@@ -1782,7 +1860,7 @@
             </w:tabs>
             <w:rPr/>
           </w:pPr>
-          <w:hyperlink w:anchor="__RefHeading___Toc2939_2833890792">
+          <w:hyperlink w:anchor="__RefHeading___Toc3135_1723578586">
             <w:r>
               <w:rPr>
                 <w:rStyle w:val="IndexLink"/>
@@ -1802,7 +1880,7 @@
             </w:tabs>
             <w:rPr/>
           </w:pPr>
-          <w:hyperlink w:anchor="__RefHeading___Toc2941_2833890792">
+          <w:hyperlink w:anchor="__RefHeading___Toc3137_1723578586">
             <w:r>
               <w:rPr>
                 <w:rStyle w:val="IndexLink"/>
@@ -1822,7 +1900,7 @@
             </w:tabs>
             <w:rPr/>
           </w:pPr>
-          <w:hyperlink w:anchor="__RefHeading___Toc2943_2833890792">
+          <w:hyperlink w:anchor="__RefHeading___Toc3139_1723578586">
             <w:r>
               <w:rPr>
                 <w:rStyle w:val="IndexLink"/>
@@ -1842,7 +1920,7 @@
             </w:tabs>
             <w:rPr/>
           </w:pPr>
-          <w:hyperlink w:anchor="__RefHeading___Toc2945_2833890792">
+          <w:hyperlink w:anchor="__RefHeading___Toc3141_1723578586">
             <w:r>
               <w:rPr>
                 <w:rStyle w:val="IndexLink"/>
@@ -1862,7 +1940,7 @@
             </w:tabs>
             <w:rPr/>
           </w:pPr>
-          <w:hyperlink w:anchor="__RefHeading___Toc2947_2833890792">
+          <w:hyperlink w:anchor="__RefHeading___Toc3143_1723578586">
             <w:r>
               <w:rPr>
                 <w:rStyle w:val="IndexLink"/>
@@ -1882,7 +1960,7 @@
             </w:tabs>
             <w:rPr/>
           </w:pPr>
-          <w:hyperlink w:anchor="__RefHeading___Toc2949_2833890792">
+          <w:hyperlink w:anchor="__RefHeading___Toc3145_1723578586">
             <w:r>
               <w:rPr>
                 <w:rStyle w:val="IndexLink"/>
@@ -1902,7 +1980,7 @@
             </w:tabs>
             <w:rPr/>
           </w:pPr>
-          <w:hyperlink w:anchor="__RefHeading___Toc2951_2833890792">
+          <w:hyperlink w:anchor="__RefHeading___Toc3147_1723578586">
             <w:r>
               <w:rPr>
                 <w:rStyle w:val="IndexLink"/>
@@ -1922,7 +2000,7 @@
             </w:tabs>
             <w:rPr/>
           </w:pPr>
-          <w:hyperlink w:anchor="__RefHeading___Toc2953_2833890792">
+          <w:hyperlink w:anchor="__RefHeading___Toc3149_1723578586">
             <w:r>
               <w:rPr>
                 <w:rStyle w:val="IndexLink"/>
@@ -1942,14 +2020,14 @@
             </w:tabs>
             <w:rPr/>
           </w:pPr>
-          <w:hyperlink w:anchor="__RefHeading___Toc2955_2833890792">
+          <w:hyperlink w:anchor="__RefHeading___Toc3151_1723578586">
             <w:r>
               <w:rPr>
                 <w:rStyle w:val="IndexLink"/>
               </w:rPr>
               <w:t>15.4. Extensión del período hasta la actualidad</w:t>
               <w:tab/>
-              <w:t>28</w:t>
+              <w:t>29</w:t>
             </w:r>
           </w:hyperlink>
         </w:p>
@@ -1962,7 +2040,7 @@
             </w:tabs>
             <w:rPr/>
           </w:pPr>
-          <w:hyperlink w:anchor="__RefHeading___Toc2957_2833890792">
+          <w:hyperlink w:anchor="__RefHeading___Toc3153_1723578586">
             <w:r>
               <w:rPr>
                 <w:rStyle w:val="IndexLink"/>
@@ -1982,14 +2060,14 @@
             </w:tabs>
             <w:rPr/>
           </w:pPr>
-          <w:hyperlink w:anchor="__RefHeading___Toc2959_2833890792">
+          <w:hyperlink w:anchor="__RefHeading___Toc3155_1723578586">
             <w:r>
               <w:rPr>
                 <w:rStyle w:val="IndexLink"/>
               </w:rPr>
               <w:t>Anexo B. Glosario</w:t>
               <w:tab/>
-              <w:t>33</w:t>
+              <w:t>34</w:t>
             </w:r>
           </w:hyperlink>
           <w:r>
@@ -2018,7 +2096,7 @@
         <w:pStyle w:val="Heading1"/>
         <w:rPr/>
       </w:pPr>
-      <w:bookmarkStart w:id="0" w:name="__RefHeading___Toc2855_2833890792"/>
+      <w:bookmarkStart w:id="0" w:name="__RefHeading___Toc3051_1723578586"/>
       <w:bookmarkEnd w:id="0"/>
       <w:r>
         <w:rPr/>
@@ -2030,7 +2108,7 @@
         <w:pStyle w:val="Heading2"/>
         <w:rPr/>
       </w:pPr>
-      <w:bookmarkStart w:id="1" w:name="__RefHeading___Toc2857_2833890792"/>
+      <w:bookmarkStart w:id="1" w:name="__RefHeading___Toc3053_1723578586"/>
       <w:bookmarkEnd w:id="1"/>
       <w:r>
         <w:rPr/>
@@ -2086,7 +2164,7 @@
         <w:pStyle w:val="Heading2"/>
         <w:rPr/>
       </w:pPr>
-      <w:bookmarkStart w:id="2" w:name="__RefHeading___Toc2859_2833890792"/>
+      <w:bookmarkStart w:id="2" w:name="__RefHeading___Toc3055_1723578586"/>
       <w:bookmarkEnd w:id="2"/>
       <w:r>
         <w:rPr/>
@@ -2188,7 +2266,7 @@
         <w:pStyle w:val="Heading2"/>
         <w:rPr/>
       </w:pPr>
-      <w:bookmarkStart w:id="3" w:name="__RefHeading___Toc2861_2833890792"/>
+      <w:bookmarkStart w:id="3" w:name="__RefHeading___Toc3057_1723578586"/>
       <w:bookmarkEnd w:id="3"/>
       <w:r>
         <w:rPr/>
@@ -2225,7 +2303,7 @@
         <w:pStyle w:val="Heading1"/>
         <w:rPr/>
       </w:pPr>
-      <w:bookmarkStart w:id="4" w:name="__RefHeading___Toc2863_2833890792"/>
+      <w:bookmarkStart w:id="4" w:name="__RefHeading___Toc3059_1723578586"/>
       <w:bookmarkEnd w:id="4"/>
       <w:r>
         <w:rPr/>
@@ -2237,7 +2315,7 @@
         <w:pStyle w:val="Heading2"/>
         <w:rPr/>
       </w:pPr>
-      <w:bookmarkStart w:id="5" w:name="__RefHeading___Toc2865_2833890792"/>
+      <w:bookmarkStart w:id="5" w:name="__RefHeading___Toc3061_1723578586"/>
       <w:bookmarkEnd w:id="5"/>
       <w:r>
         <w:rPr/>
@@ -2271,7 +2349,7 @@
         <w:pStyle w:val="Heading2"/>
         <w:rPr/>
       </w:pPr>
-      <w:bookmarkStart w:id="6" w:name="__RefHeading___Toc2867_2833890792"/>
+      <w:bookmarkStart w:id="6" w:name="__RefHeading___Toc3063_1723578586"/>
       <w:bookmarkEnd w:id="6"/>
       <w:r>
         <w:rPr/>
@@ -2535,7 +2613,7 @@
         <w:pStyle w:val="Heading2"/>
         <w:rPr/>
       </w:pPr>
-      <w:bookmarkStart w:id="7" w:name="__RefHeading___Toc2869_2833890792"/>
+      <w:bookmarkStart w:id="7" w:name="__RefHeading___Toc3065_1723578586"/>
       <w:bookmarkEnd w:id="7"/>
       <w:r>
         <w:rPr/>
@@ -2949,7 +3027,7 @@
       <w:r>
         <w:br w:type="page"/>
       </w:r>
-      <w:bookmarkStart w:id="8" w:name="__RefHeading___Toc2871_2833890792"/>
+      <w:bookmarkStart w:id="8" w:name="__RefHeading___Toc3067_1723578586"/>
       <w:bookmarkEnd w:id="8"/>
       <w:r>
         <w:rPr/>
@@ -3533,7 +3611,7 @@
       <w:r>
         <w:br w:type="page"/>
       </w:r>
-      <w:bookmarkStart w:id="9" w:name="__RefHeading___Toc2873_2833890792"/>
+      <w:bookmarkStart w:id="9" w:name="__RefHeading___Toc3069_1723578586"/>
       <w:bookmarkEnd w:id="9"/>
       <w:r>
         <w:rPr/>
@@ -3767,7 +3845,7 @@
         <w:pStyle w:val="Heading2"/>
         <w:rPr/>
       </w:pPr>
-      <w:bookmarkStart w:id="10" w:name="__RefHeading___Toc2875_2833890792"/>
+      <w:bookmarkStart w:id="10" w:name="__RefHeading___Toc3071_1723578586"/>
       <w:bookmarkEnd w:id="10"/>
       <w:r>
         <w:rPr/>
@@ -4074,7 +4152,7 @@
         <w:pStyle w:val="Heading1"/>
         <w:rPr/>
       </w:pPr>
-      <w:bookmarkStart w:id="11" w:name="__RefHeading___Toc2877_2833890792"/>
+      <w:bookmarkStart w:id="11" w:name="__RefHeading___Toc3073_1723578586"/>
       <w:bookmarkEnd w:id="11"/>
       <w:r>
         <w:rPr/>
@@ -4086,7 +4164,7 @@
         <w:pStyle w:val="Heading2"/>
         <w:rPr/>
       </w:pPr>
-      <w:bookmarkStart w:id="12" w:name="__RefHeading___Toc2879_2833890792"/>
+      <w:bookmarkStart w:id="12" w:name="__RefHeading___Toc3075_1723578586"/>
       <w:bookmarkEnd w:id="12"/>
       <w:r>
         <w:rPr/>
@@ -4876,7 +4954,7 @@
         <w:pStyle w:val="Heading2"/>
         <w:rPr/>
       </w:pPr>
-      <w:bookmarkStart w:id="13" w:name="__RefHeading___Toc2881_2833890792"/>
+      <w:bookmarkStart w:id="13" w:name="__RefHeading___Toc3077_1723578586"/>
       <w:bookmarkEnd w:id="13"/>
       <w:r>
         <w:rPr/>
@@ -5054,7 +5132,7 @@
         <w:pStyle w:val="Heading2"/>
         <w:rPr/>
       </w:pPr>
-      <w:bookmarkStart w:id="14" w:name="__RefHeading___Toc2883_2833890792"/>
+      <w:bookmarkStart w:id="14" w:name="__RefHeading___Toc3079_1723578586"/>
       <w:bookmarkEnd w:id="14"/>
       <w:r>
         <w:rPr/>
@@ -5544,7 +5622,7 @@
         <w:pStyle w:val="Heading2"/>
         <w:rPr/>
       </w:pPr>
-      <w:bookmarkStart w:id="15" w:name="__RefHeading___Toc2885_2833890792"/>
+      <w:bookmarkStart w:id="15" w:name="__RefHeading___Toc3081_1723578586"/>
       <w:bookmarkEnd w:id="15"/>
       <w:r>
         <w:rPr/>
@@ -6539,7 +6617,7 @@
         <w:pStyle w:val="Heading1"/>
         <w:rPr/>
       </w:pPr>
-      <w:bookmarkStart w:id="16" w:name="__RefHeading___Toc2887_2833890792"/>
+      <w:bookmarkStart w:id="16" w:name="__RefHeading___Toc3083_1723578586"/>
       <w:bookmarkEnd w:id="16"/>
       <w:r>
         <w:rPr/>
@@ -6551,7 +6629,7 @@
         <w:pStyle w:val="Heading2"/>
         <w:rPr/>
       </w:pPr>
-      <w:bookmarkStart w:id="17" w:name="__RefHeading___Toc2889_2833890792"/>
+      <w:bookmarkStart w:id="17" w:name="__RefHeading___Toc3085_1723578586"/>
       <w:bookmarkEnd w:id="17"/>
       <w:r>
         <w:rPr/>
@@ -6826,7 +6904,7 @@
         <w:pStyle w:val="Heading2"/>
         <w:rPr/>
       </w:pPr>
-      <w:bookmarkStart w:id="18" w:name="__RefHeading___Toc2891_2833890792"/>
+      <w:bookmarkStart w:id="18" w:name="__RefHeading___Toc3087_1723578586"/>
       <w:bookmarkEnd w:id="18"/>
       <w:r>
         <w:rPr/>
@@ -6924,7 +7002,7 @@
         <w:pStyle w:val="Heading2"/>
         <w:rPr/>
       </w:pPr>
-      <w:bookmarkStart w:id="19" w:name="__RefHeading___Toc2893_2833890792"/>
+      <w:bookmarkStart w:id="19" w:name="__RefHeading___Toc3089_1723578586"/>
       <w:bookmarkEnd w:id="19"/>
       <w:r>
         <w:rPr/>
@@ -7430,7 +7508,7 @@
       <w:r>
         <w:br w:type="page"/>
       </w:r>
-      <w:bookmarkStart w:id="20" w:name="__RefHeading___Toc2895_2833890792"/>
+      <w:bookmarkStart w:id="20" w:name="__RefHeading___Toc3091_1723578586"/>
       <w:bookmarkEnd w:id="20"/>
       <w:r>
         <w:rPr/>
@@ -7442,7 +7520,7 @@
         <w:pStyle w:val="Heading2"/>
         <w:rPr/>
       </w:pPr>
-      <w:bookmarkStart w:id="21" w:name="__RefHeading___Toc2897_2833890792"/>
+      <w:bookmarkStart w:id="21" w:name="__RefHeading___Toc3093_1723578586"/>
       <w:bookmarkEnd w:id="21"/>
       <w:r>
         <w:rPr/>
@@ -7608,7 +7686,7 @@
         <w:pStyle w:val="Heading2"/>
         <w:rPr/>
       </w:pPr>
-      <w:bookmarkStart w:id="22" w:name="__RefHeading___Toc2899_2833890792"/>
+      <w:bookmarkStart w:id="22" w:name="__RefHeading___Toc3095_1723578586"/>
       <w:bookmarkEnd w:id="22"/>
       <w:r>
         <w:rPr/>
@@ -8142,7 +8220,7 @@
         <w:pStyle w:val="Heading2"/>
         <w:rPr/>
       </w:pPr>
-      <w:bookmarkStart w:id="23" w:name="__RefHeading___Toc2901_2833890792"/>
+      <w:bookmarkStart w:id="23" w:name="__RefHeading___Toc3097_1723578586"/>
       <w:bookmarkEnd w:id="23"/>
       <w:r>
         <w:rPr/>
@@ -8580,7 +8658,7 @@
       <w:r>
         <w:br w:type="page"/>
       </w:r>
-      <w:bookmarkStart w:id="24" w:name="__RefHeading___Toc2903_2833890792"/>
+      <w:bookmarkStart w:id="24" w:name="__RefHeading___Toc3099_1723578586"/>
       <w:bookmarkEnd w:id="24"/>
       <w:r>
         <w:rPr/>
@@ -8680,7 +8758,7 @@
         <w:pStyle w:val="Heading2"/>
         <w:rPr/>
       </w:pPr>
-      <w:bookmarkStart w:id="25" w:name="__RefHeading___Toc2905_2833890792"/>
+      <w:bookmarkStart w:id="25" w:name="__RefHeading___Toc3101_1723578586"/>
       <w:bookmarkEnd w:id="25"/>
       <w:r>
         <w:rPr/>
@@ -9146,7 +9224,7 @@
         <w:pStyle w:val="Heading1"/>
         <w:rPr/>
       </w:pPr>
-      <w:bookmarkStart w:id="26" w:name="__RefHeading___Toc2907_2833890792"/>
+      <w:bookmarkStart w:id="26" w:name="__RefHeading___Toc3103_1723578586"/>
       <w:bookmarkEnd w:id="26"/>
       <w:r>
         <w:rPr/>
@@ -9158,7 +9236,7 @@
         <w:pStyle w:val="Heading2"/>
         <w:rPr/>
       </w:pPr>
-      <w:bookmarkStart w:id="27" w:name="__RefHeading___Toc2909_2833890792"/>
+      <w:bookmarkStart w:id="27" w:name="__RefHeading___Toc3105_1723578586"/>
       <w:bookmarkEnd w:id="27"/>
       <w:r>
         <w:rPr/>
@@ -9515,7 +9593,7 @@
         <w:pStyle w:val="Heading2"/>
         <w:rPr/>
       </w:pPr>
-      <w:bookmarkStart w:id="28" w:name="__RefHeading___Toc2911_2833890792"/>
+      <w:bookmarkStart w:id="28" w:name="__RefHeading___Toc3107_1723578586"/>
       <w:bookmarkEnd w:id="28"/>
       <w:r>
         <w:rPr/>
@@ -9803,7 +9881,7 @@
         <w:pStyle w:val="Heading2"/>
         <w:rPr/>
       </w:pPr>
-      <w:bookmarkStart w:id="29" w:name="__RefHeading___Toc2913_2833890792"/>
+      <w:bookmarkStart w:id="29" w:name="__RefHeading___Toc3109_1723578586"/>
       <w:bookmarkEnd w:id="29"/>
       <w:r>
         <w:rPr/>
@@ -10006,7 +10084,7 @@
         <w:pStyle w:val="Heading1"/>
         <w:rPr/>
       </w:pPr>
-      <w:bookmarkStart w:id="30" w:name="__RefHeading___Toc2915_2833890792"/>
+      <w:bookmarkStart w:id="30" w:name="__RefHeading___Toc3111_1723578586"/>
       <w:bookmarkEnd w:id="30"/>
       <w:r>
         <w:rPr/>
@@ -10018,7 +10096,7 @@
         <w:pStyle w:val="Heading2"/>
         <w:rPr/>
       </w:pPr>
-      <w:bookmarkStart w:id="31" w:name="__RefHeading___Toc2917_2833890792"/>
+      <w:bookmarkStart w:id="31" w:name="__RefHeading___Toc3113_1723578586"/>
       <w:bookmarkEnd w:id="31"/>
       <w:r>
         <w:rPr/>
@@ -10045,7 +10123,7 @@
       </w:r>
       <w:r>
         <w:rPr/>
-        <w:t xml:space="preserve"> contiene 16 pruebas que se ejecutan antes de cada revisión. Si alguna falla, la revisión se detiene y la web publicada no cambia.</w:t>
+        <w:t xml:space="preserve"> contiene 18 pruebas que se ejecutan antes de cada revisión. Si alguna falla, la revisión se detiene y la web publicada no cambia.</w:t>
       </w:r>
     </w:p>
     <w:tbl>
@@ -10982,7 +11060,7 @@
         <w:pStyle w:val="Heading2"/>
         <w:rPr/>
       </w:pPr>
-      <w:bookmarkStart w:id="32" w:name="__RefHeading___Toc2919_2833890792"/>
+      <w:bookmarkStart w:id="32" w:name="__RefHeading___Toc3115_1723578586"/>
       <w:bookmarkEnd w:id="32"/>
       <w:r>
         <w:rPr/>
@@ -11576,7 +11654,7 @@
       <w:r>
         <w:br w:type="page"/>
       </w:r>
-      <w:bookmarkStart w:id="33" w:name="__RefHeading___Toc2921_2833890792"/>
+      <w:bookmarkStart w:id="33" w:name="__RefHeading___Toc3117_1723578586"/>
       <w:bookmarkEnd w:id="33"/>
       <w:r>
         <w:rPr/>
@@ -12404,7 +12482,7 @@
       <w:r>
         <w:br w:type="page"/>
       </w:r>
-      <w:bookmarkStart w:id="34" w:name="__RefHeading___Toc2923_2833890792"/>
+      <w:bookmarkStart w:id="34" w:name="__RefHeading___Toc3119_1723578586"/>
       <w:bookmarkEnd w:id="34"/>
       <w:r>
         <w:rPr/>
@@ -14182,6 +14260,240 @@
           </w:p>
         </w:tc>
       </w:tr>
+      <w:tr>
+        <w:trPr/>
+        <w:tc>
+          <w:tcPr>
+            <w:tcW w:w="1099" w:type="dxa"/>
+            <w:tcBorders>
+              <w:top w:val="single" w:sz="4" w:space="0" w:color="BFBFBF"/>
+              <w:left w:val="single" w:sz="4" w:space="0" w:color="BFBFBF"/>
+              <w:bottom w:val="single" w:sz="4" w:space="0" w:color="BFBFBF"/>
+              <w:right w:val="single" w:sz="4" w:space="0" w:color="BFBFBF"/>
+            </w:tcBorders>
+          </w:tcPr>
+          <w:p>
+            <w:pPr>
+              <w:pStyle w:val="Normal"/>
+              <w:spacing w:before="0" w:after="20"/>
+              <w:rPr/>
+            </w:pPr>
+            <w:r>
+              <w:rPr>
+                <w:sz w:val="19"/>
+                <w:szCs w:val="19"/>
+              </w:rPr>
+              <w:t>D30</w:t>
+            </w:r>
+          </w:p>
+        </w:tc>
+        <w:tc>
+          <w:tcPr>
+            <w:tcW w:w="4600" w:type="dxa"/>
+            <w:tcBorders>
+              <w:top w:val="single" w:sz="4" w:space="0" w:color="BFBFBF"/>
+              <w:left w:val="single" w:sz="4" w:space="0" w:color="BFBFBF"/>
+              <w:bottom w:val="single" w:sz="4" w:space="0" w:color="BFBFBF"/>
+              <w:right w:val="single" w:sz="4" w:space="0" w:color="BFBFBF"/>
+            </w:tcBorders>
+          </w:tcPr>
+          <w:p>
+            <w:pPr>
+              <w:pStyle w:val="Normal"/>
+              <w:spacing w:before="0" w:after="20"/>
+              <w:rPr/>
+            </w:pPr>
+            <w:r>
+              <w:rPr>
+                <w:sz w:val="19"/>
+                <w:szCs w:val="19"/>
+              </w:rPr>
+              <w:t>Verificación del autor y confianza derivada del código</w:t>
+            </w:r>
+          </w:p>
+        </w:tc>
+        <w:tc>
+          <w:tcPr>
+            <w:tcW w:w="3939" w:type="dxa"/>
+            <w:tcBorders>
+              <w:top w:val="single" w:sz="4" w:space="0" w:color="BFBFBF"/>
+              <w:left w:val="single" w:sz="4" w:space="0" w:color="BFBFBF"/>
+              <w:bottom w:val="single" w:sz="4" w:space="0" w:color="BFBFBF"/>
+              <w:right w:val="single" w:sz="4" w:space="0" w:color="BFBFBF"/>
+            </w:tcBorders>
+          </w:tcPr>
+          <w:p>
+            <w:pPr>
+              <w:pStyle w:val="Normal"/>
+              <w:spacing w:before="0" w:after="20"/>
+              <w:rPr/>
+            </w:pPr>
+            <w:r>
+              <w:rPr>
+                <w:sz w:val="19"/>
+                <w:szCs w:val="19"/>
+              </w:rPr>
+              <w:t>El análisis del autor reemplaza la estimación inicial</w:t>
+            </w:r>
+          </w:p>
+        </w:tc>
+      </w:tr>
+      <w:tr>
+        <w:trPr/>
+        <w:tc>
+          <w:tcPr>
+            <w:tcW w:w="1099" w:type="dxa"/>
+            <w:tcBorders>
+              <w:top w:val="single" w:sz="4" w:space="0" w:color="BFBFBF"/>
+              <w:left w:val="single" w:sz="4" w:space="0" w:color="BFBFBF"/>
+              <w:bottom w:val="single" w:sz="4" w:space="0" w:color="BFBFBF"/>
+              <w:right w:val="single" w:sz="4" w:space="0" w:color="BFBFBF"/>
+            </w:tcBorders>
+          </w:tcPr>
+          <w:p>
+            <w:pPr>
+              <w:pStyle w:val="Normal"/>
+              <w:spacing w:before="0" w:after="20"/>
+              <w:rPr/>
+            </w:pPr>
+            <w:r>
+              <w:rPr>
+                <w:sz w:val="19"/>
+                <w:szCs w:val="19"/>
+              </w:rPr>
+              <w:t>D31</w:t>
+            </w:r>
+          </w:p>
+        </w:tc>
+        <w:tc>
+          <w:tcPr>
+            <w:tcW w:w="4600" w:type="dxa"/>
+            <w:tcBorders>
+              <w:top w:val="single" w:sz="4" w:space="0" w:color="BFBFBF"/>
+              <w:left w:val="single" w:sz="4" w:space="0" w:color="BFBFBF"/>
+              <w:bottom w:val="single" w:sz="4" w:space="0" w:color="BFBFBF"/>
+              <w:right w:val="single" w:sz="4" w:space="0" w:color="BFBFBF"/>
+            </w:tcBorders>
+          </w:tcPr>
+          <w:p>
+            <w:pPr>
+              <w:pStyle w:val="Normal"/>
+              <w:spacing w:before="0" w:after="20"/>
+              <w:rPr/>
+            </w:pPr>
+            <w:r>
+              <w:rPr>
+                <w:sz w:val="19"/>
+                <w:szCs w:val="19"/>
+              </w:rPr>
+              <w:t>Un evento por día en noticias detectadas</w:t>
+            </w:r>
+          </w:p>
+        </w:tc>
+        <w:tc>
+          <w:tcPr>
+            <w:tcW w:w="3939" w:type="dxa"/>
+            <w:tcBorders>
+              <w:top w:val="single" w:sz="4" w:space="0" w:color="BFBFBF"/>
+              <w:left w:val="single" w:sz="4" w:space="0" w:color="BFBFBF"/>
+              <w:bottom w:val="single" w:sz="4" w:space="0" w:color="BFBFBF"/>
+              <w:right w:val="single" w:sz="4" w:space="0" w:color="BFBFBF"/>
+            </w:tcBorders>
+          </w:tcPr>
+          <w:p>
+            <w:pPr>
+              <w:pStyle w:val="Normal"/>
+              <w:spacing w:before="0" w:after="20"/>
+              <w:rPr/>
+            </w:pPr>
+            <w:r>
+              <w:rPr>
+                <w:sz w:val="19"/>
+                <w:szCs w:val="19"/>
+              </w:rPr>
+              <w:t>Evitar contar varias veces el mismo ataque</w:t>
+            </w:r>
+          </w:p>
+        </w:tc>
+      </w:tr>
+      <w:tr>
+        <w:trPr/>
+        <w:tc>
+          <w:tcPr>
+            <w:tcW w:w="1099" w:type="dxa"/>
+            <w:tcBorders>
+              <w:top w:val="single" w:sz="4" w:space="0" w:color="BFBFBF"/>
+              <w:left w:val="single" w:sz="4" w:space="0" w:color="BFBFBF"/>
+              <w:bottom w:val="single" w:sz="4" w:space="0" w:color="BFBFBF"/>
+              <w:right w:val="single" w:sz="4" w:space="0" w:color="BFBFBF"/>
+            </w:tcBorders>
+          </w:tcPr>
+          <w:p>
+            <w:pPr>
+              <w:pStyle w:val="Normal"/>
+              <w:spacing w:before="0" w:after="20"/>
+              <w:rPr/>
+            </w:pPr>
+            <w:r>
+              <w:rPr>
+                <w:sz w:val="19"/>
+                <w:szCs w:val="19"/>
+              </w:rPr>
+              <w:t>D32</w:t>
+            </w:r>
+          </w:p>
+        </w:tc>
+        <w:tc>
+          <w:tcPr>
+            <w:tcW w:w="4600" w:type="dxa"/>
+            <w:tcBorders>
+              <w:top w:val="single" w:sz="4" w:space="0" w:color="BFBFBF"/>
+              <w:left w:val="single" w:sz="4" w:space="0" w:color="BFBFBF"/>
+              <w:bottom w:val="single" w:sz="4" w:space="0" w:color="BFBFBF"/>
+              <w:right w:val="single" w:sz="4" w:space="0" w:color="BFBFBF"/>
+            </w:tcBorders>
+          </w:tcPr>
+          <w:p>
+            <w:pPr>
+              <w:pStyle w:val="Normal"/>
+              <w:spacing w:before="0" w:after="20"/>
+              <w:rPr/>
+            </w:pPr>
+            <w:r>
+              <w:rPr>
+                <w:sz w:val="19"/>
+                <w:szCs w:val="19"/>
+              </w:rPr>
+              <w:t>Resultados que cambian con el histórico</w:t>
+            </w:r>
+          </w:p>
+        </w:tc>
+        <w:tc>
+          <w:tcPr>
+            <w:tcW w:w="3939" w:type="dxa"/>
+            <w:tcBorders>
+              <w:top w:val="single" w:sz="4" w:space="0" w:color="BFBFBF"/>
+              <w:left w:val="single" w:sz="4" w:space="0" w:color="BFBFBF"/>
+              <w:bottom w:val="single" w:sz="4" w:space="0" w:color="BFBFBF"/>
+              <w:right w:val="single" w:sz="4" w:space="0" w:color="BFBFBF"/>
+            </w:tcBorders>
+          </w:tcPr>
+          <w:p>
+            <w:pPr>
+              <w:pStyle w:val="Normal"/>
+              <w:spacing w:before="0" w:after="20"/>
+              <w:rPr/>
+            </w:pPr>
+            <w:r>
+              <w:rPr>
+                <w:sz w:val="19"/>
+                <w:szCs w:val="19"/>
+              </w:rPr>
+              <w:t>Interpretación prudente y recalibración</w:t>
+            </w:r>
+          </w:p>
+        </w:tc>
+      </w:tr>
     </w:tbl>
     <w:p>
       <w:pPr>
@@ -14191,7 +14503,7 @@
       <w:r>
         <w:br w:type="page"/>
       </w:r>
-      <w:bookmarkStart w:id="35" w:name="__RefHeading___Toc2925_2833890792"/>
+      <w:bookmarkStart w:id="35" w:name="__RefHeading___Toc3121_1723578586"/>
       <w:bookmarkEnd w:id="35"/>
       <w:r>
         <w:rPr/>
@@ -14203,7 +14515,7 @@
         <w:pStyle w:val="Heading2"/>
         <w:rPr/>
       </w:pPr>
-      <w:bookmarkStart w:id="36" w:name="__RefHeading___Toc2927_2833890792"/>
+      <w:bookmarkStart w:id="36" w:name="__RefHeading___Toc3123_1723578586"/>
       <w:bookmarkEnd w:id="36"/>
       <w:r>
         <w:rPr/>
@@ -14279,7 +14591,7 @@
         <w:pStyle w:val="Heading2"/>
         <w:rPr/>
       </w:pPr>
-      <w:bookmarkStart w:id="37" w:name="__RefHeading___Toc2929_2833890792"/>
+      <w:bookmarkStart w:id="37" w:name="__RefHeading___Toc3125_1723578586"/>
       <w:bookmarkEnd w:id="37"/>
       <w:r>
         <w:rPr/>
@@ -14407,11 +14719,11 @@
           <w:b/>
           <w:bCs/>
         </w:rPr>
-        <w:t>Verificar los 23 incidentes y los 16 hechos clave cargados</w:t>
-      </w:r>
-      <w:r>
-        <w:rPr/>
-        <w:t xml:space="preserve"> con la planilla de verificación (sección 14.6) y averiguar las fechas de REM y Stucx Team.</w:t>
+        <w:t>Completar la verificación:</w:t>
+      </w:r>
+      <w:r>
+        <w:rPr/>
+        <w:t xml:space="preserve"> quedan 13 incidentes (entre ellos 6 de los 7 hacktivistas) y los 16 hechos clave (sección 14.6). Averiguar las fechas de REM y Stucx Team.</w:t>
       </w:r>
     </w:p>
     <w:p>
@@ -14419,7 +14731,7 @@
         <w:pStyle w:val="Heading2"/>
         <w:rPr/>
       </w:pPr>
-      <w:bookmarkStart w:id="38" w:name="__RefHeading___Toc2931_2833890792"/>
+      <w:bookmarkStart w:id="38" w:name="__RefHeading___Toc3127_1723578586"/>
       <w:bookmarkEnd w:id="38"/>
       <w:r>
         <w:rPr/>
@@ -14500,7 +14812,7 @@
         <w:pStyle w:val="Heading1"/>
         <w:rPr/>
       </w:pPr>
-      <w:bookmarkStart w:id="39" w:name="__RefHeading___Toc2933_2833890792"/>
+      <w:bookmarkStart w:id="39" w:name="__RefHeading___Toc3129_1723578586"/>
       <w:bookmarkEnd w:id="39"/>
       <w:r>
         <w:rPr/>
@@ -14512,7 +14824,7 @@
         <w:pStyle w:val="Heading2"/>
         <w:rPr/>
       </w:pPr>
-      <w:bookmarkStart w:id="40" w:name="__RefHeading___Toc2935_2833890792"/>
+      <w:bookmarkStart w:id="40" w:name="__RefHeading___Toc3131_1723578586"/>
       <w:bookmarkEnd w:id="40"/>
       <w:r>
         <w:rPr/>
@@ -14535,7 +14847,7 @@
         <w:pStyle w:val="Heading2"/>
         <w:rPr/>
       </w:pPr>
-      <w:bookmarkStart w:id="41" w:name="__RefHeading___Toc2937_2833890792"/>
+      <w:bookmarkStart w:id="41" w:name="__RefHeading___Toc3133_1723578586"/>
       <w:bookmarkEnd w:id="41"/>
       <w:r>
         <w:rPr/>
@@ -14647,7 +14959,7 @@
         <w:pStyle w:val="Heading2"/>
         <w:rPr/>
       </w:pPr>
-      <w:bookmarkStart w:id="42" w:name="__RefHeading___Toc2939_2833890792"/>
+      <w:bookmarkStart w:id="42" w:name="__RefHeading___Toc3135_1723578586"/>
       <w:bookmarkEnd w:id="42"/>
       <w:r>
         <w:rPr/>
@@ -16927,7 +17239,7 @@
         <w:pStyle w:val="Heading2"/>
         <w:rPr/>
       </w:pPr>
-      <w:bookmarkStart w:id="43" w:name="__RefHeading___Toc2941_2833890792"/>
+      <w:bookmarkStart w:id="43" w:name="__RefHeading___Toc3137_1723578586"/>
       <w:bookmarkEnd w:id="43"/>
       <w:r>
         <w:rPr/>
@@ -17050,7 +17362,7 @@
         <w:pStyle w:val="Heading2"/>
         <w:rPr/>
       </w:pPr>
-      <w:bookmarkStart w:id="44" w:name="__RefHeading___Toc2943_2833890792"/>
+      <w:bookmarkStart w:id="44" w:name="__RefHeading___Toc3139_1723578586"/>
       <w:bookmarkEnd w:id="44"/>
       <w:r>
         <w:rPr/>
@@ -19699,7 +20011,7 @@
         <w:pStyle w:val="Heading2"/>
         <w:rPr/>
       </w:pPr>
-      <w:bookmarkStart w:id="45" w:name="__RefHeading___Toc2945_2833890792"/>
+      <w:bookmarkStart w:id="45" w:name="__RefHeading___Toc3141_1723578586"/>
       <w:bookmarkEnd w:id="45"/>
       <w:r>
         <w:rPr/>
@@ -20322,7 +20634,7 @@
         <w:pStyle w:val="Heading1"/>
         <w:rPr/>
       </w:pPr>
-      <w:bookmarkStart w:id="46" w:name="__RefHeading___Toc2947_2833890792"/>
+      <w:bookmarkStart w:id="46" w:name="__RefHeading___Toc3143_1723578586"/>
       <w:bookmarkEnd w:id="46"/>
       <w:r>
         <w:rPr/>
@@ -20334,7 +20646,7 @@
         <w:pStyle w:val="Heading2"/>
         <w:rPr/>
       </w:pPr>
-      <w:bookmarkStart w:id="47" w:name="__RefHeading___Toc2949_2833890792"/>
+      <w:bookmarkStart w:id="47" w:name="__RefHeading___Toc3145_1723578586"/>
       <w:bookmarkEnd w:id="47"/>
       <w:r>
         <w:rPr/>
@@ -20456,7 +20768,7 @@
         <w:pStyle w:val="Heading2"/>
         <w:rPr/>
       </w:pPr>
-      <w:bookmarkStart w:id="48" w:name="__RefHeading___Toc2951_2833890792"/>
+      <w:bookmarkStart w:id="48" w:name="__RefHeading___Toc3147_1723578586"/>
       <w:bookmarkEnd w:id="48"/>
       <w:r>
         <w:rPr/>
@@ -20471,7 +20783,7 @@
       </w:pPr>
       <w:r>
         <w:rPr/>
-        <w:t>Período evaluado: 2023-08-01 a 2026-10-17 (1174 días, 101 días detonantes). Datos al 2026-10-17.</w:t>
+        <w:t>Período evaluado: 2023-08-01 a 2026-10-18 (1175 días, 107 días detonantes). Datos al 2026-10-18.</w:t>
       </w:r>
     </w:p>
     <w:p>
@@ -20702,7 +21014,7 @@
                 <w:sz w:val="19"/>
                 <w:szCs w:val="19"/>
               </w:rPr>
-              <w:t>17.6 %</w:t>
+              <w:t>18.8 %</w:t>
             </w:r>
           </w:p>
         </w:tc>
@@ -20741,7 +21053,7 @@
                 <w:sz w:val="19"/>
                 <w:szCs w:val="19"/>
               </w:rPr>
-              <w:t>razón 0.81</w:t>
+              <w:t>razón 0.76</w:t>
             </w:r>
           </w:p>
         </w:tc>
@@ -20780,7 +21092,7 @@
                 <w:sz w:val="19"/>
                 <w:szCs w:val="19"/>
               </w:rPr>
-              <w:t>razón 0.63</w:t>
+              <w:t>razón 0.59</w:t>
             </w:r>
           </w:p>
         </w:tc>
@@ -20819,7 +21131,7 @@
                 <w:sz w:val="19"/>
                 <w:szCs w:val="19"/>
               </w:rPr>
-              <w:t>razón 2.27</w:t>
+              <w:t>razón 2.13</w:t>
             </w:r>
           </w:p>
         </w:tc>
@@ -20872,7 +21184,7 @@
                 <w:sz w:val="19"/>
                 <w:szCs w:val="19"/>
               </w:rPr>
-              <w:t>23.9 %</w:t>
+              <w:t>25.4 %</w:t>
             </w:r>
           </w:p>
         </w:tc>
@@ -20911,7 +21223,7 @@
                 <w:sz w:val="19"/>
                 <w:szCs w:val="19"/>
               </w:rPr>
-              <w:t>razón 0.6</w:t>
+              <w:t>razón 0.56</w:t>
             </w:r>
           </w:p>
         </w:tc>
@@ -20950,7 +21262,7 @@
                 <w:sz w:val="19"/>
                 <w:szCs w:val="19"/>
               </w:rPr>
-              <w:t>razón 0.93</w:t>
+              <w:t>razón 0.87</w:t>
             </w:r>
           </w:p>
         </w:tc>
@@ -20989,7 +21301,7 @@
                 <w:sz w:val="19"/>
                 <w:szCs w:val="19"/>
               </w:rPr>
-              <w:t>razón 1.68</w:t>
+              <w:t>razón 1.57</w:t>
             </w:r>
           </w:p>
         </w:tc>
@@ -21042,7 +21354,7 @@
                 <w:sz w:val="19"/>
                 <w:szCs w:val="19"/>
               </w:rPr>
-              <w:t>30.9 %</w:t>
+              <w:t>32.5 %</w:t>
             </w:r>
           </w:p>
         </w:tc>
@@ -21081,7 +21393,7 @@
                 <w:sz w:val="19"/>
                 <w:szCs w:val="19"/>
               </w:rPr>
-              <w:t>razón 0.92</w:t>
+              <w:t>razón 0.88</w:t>
             </w:r>
           </w:p>
         </w:tc>
@@ -21106,21 +21418,21 @@
                 <w:sz w:val="19"/>
                 <w:szCs w:val="19"/>
               </w:rPr>
-              <w:t>2/9 (22.2 %)</w:t>
-            </w:r>
-          </w:p>
-          <w:p>
-            <w:pPr>
-              <w:pStyle w:val="Normal"/>
-              <w:spacing w:before="0" w:after="20"/>
-              <w:rPr/>
-            </w:pPr>
-            <w:r>
-              <w:rPr>
-                <w:sz w:val="19"/>
-                <w:szCs w:val="19"/>
-              </w:rPr>
-              <w:t>razón 0.72</w:t>
+              <w:t>3/9 (33.3 %)</w:t>
+            </w:r>
+          </w:p>
+          <w:p>
+            <w:pPr>
+              <w:pStyle w:val="Normal"/>
+              <w:spacing w:before="0" w:after="20"/>
+              <w:rPr/>
+            </w:pPr>
+            <w:r>
+              <w:rPr>
+                <w:sz w:val="19"/>
+                <w:szCs w:val="19"/>
+              </w:rPr>
+              <w:t>razón 1.03</w:t>
             </w:r>
           </w:p>
         </w:tc>
@@ -21159,7 +21471,7 @@
                 <w:sz w:val="19"/>
                 <w:szCs w:val="19"/>
               </w:rPr>
-              <w:t>razón 1.29</w:t>
+              <w:t>razón 1.23</w:t>
             </w:r>
           </w:p>
         </w:tc>
@@ -21212,7 +21524,7 @@
                 <w:sz w:val="19"/>
                 <w:szCs w:val="19"/>
               </w:rPr>
-              <w:t>35.3 %</w:t>
+              <w:t>36.3 %</w:t>
             </w:r>
           </w:p>
         </w:tc>
@@ -21251,7 +21563,7 @@
                 <w:sz w:val="19"/>
                 <w:szCs w:val="19"/>
               </w:rPr>
-              <w:t>razón 1.62</w:t>
+              <w:t>razón 1.57</w:t>
             </w:r>
           </w:p>
         </w:tc>
@@ -21276,21 +21588,21 @@
                 <w:sz w:val="19"/>
                 <w:szCs w:val="19"/>
               </w:rPr>
-              <w:t>2/9 (22.2 %)</w:t>
-            </w:r>
-          </w:p>
-          <w:p>
-            <w:pPr>
-              <w:pStyle w:val="Normal"/>
-              <w:spacing w:before="0" w:after="20"/>
-              <w:rPr/>
-            </w:pPr>
-            <w:r>
-              <w:rPr>
-                <w:sz w:val="19"/>
-                <w:szCs w:val="19"/>
-              </w:rPr>
-              <w:t>razón 0.63</w:t>
+              <w:t>3/9 (33.3 %)</w:t>
+            </w:r>
+          </w:p>
+          <w:p>
+            <w:pPr>
+              <w:pStyle w:val="Normal"/>
+              <w:spacing w:before="0" w:after="20"/>
+              <w:rPr/>
+            </w:pPr>
+            <w:r>
+              <w:rPr>
+                <w:sz w:val="19"/>
+                <w:szCs w:val="19"/>
+              </w:rPr>
+              <w:t>razón 0.92</w:t>
             </w:r>
           </w:p>
         </w:tc>
@@ -21329,7 +21641,7 @@
                 <w:sz w:val="19"/>
                 <w:szCs w:val="19"/>
               </w:rPr>
-              <w:t>razón 1.13</w:t>
+              <w:t>razón 1.1</w:t>
             </w:r>
           </w:p>
         </w:tc>
@@ -21573,7 +21885,7 @@
                 <w:sz w:val="19"/>
                 <w:szCs w:val="19"/>
               </w:rPr>
-              <w:t>17.6 %</w:t>
+              <w:t>18.8 %</w:t>
             </w:r>
           </w:p>
         </w:tc>
@@ -21612,7 +21924,7 @@
                 <w:sz w:val="19"/>
                 <w:szCs w:val="19"/>
               </w:rPr>
-              <w:t>razón 1.42</w:t>
+              <w:t>razón 1.33</w:t>
             </w:r>
           </w:p>
         </w:tc>
@@ -21637,21 +21949,21 @@
                 <w:sz w:val="19"/>
                 <w:szCs w:val="19"/>
               </w:rPr>
-              <w:t>1/4 (25 %)</w:t>
-            </w:r>
-          </w:p>
-          <w:p>
-            <w:pPr>
-              <w:pStyle w:val="Normal"/>
-              <w:spacing w:before="0" w:after="20"/>
-              <w:rPr/>
-            </w:pPr>
-            <w:r>
-              <w:rPr>
-                <w:sz w:val="19"/>
-                <w:szCs w:val="19"/>
-              </w:rPr>
-              <w:t>razón 1.42</w:t>
+              <w:t>1/6 (16.7 %)</w:t>
+            </w:r>
+          </w:p>
+          <w:p>
+            <w:pPr>
+              <w:pStyle w:val="Normal"/>
+              <w:spacing w:before="0" w:after="20"/>
+              <w:rPr/>
+            </w:pPr>
+            <w:r>
+              <w:rPr>
+                <w:sz w:val="19"/>
+                <w:szCs w:val="19"/>
+              </w:rPr>
+              <w:t>razón 0.89</w:t>
             </w:r>
           </w:p>
         </w:tc>
@@ -21690,7 +22002,7 @@
                 <w:sz w:val="19"/>
                 <w:szCs w:val="19"/>
               </w:rPr>
-              <w:t>razón 2.84</w:t>
+              <w:t>razón 2.66</w:t>
             </w:r>
           </w:p>
         </w:tc>
@@ -21743,7 +22055,7 @@
                 <w:sz w:val="19"/>
                 <w:szCs w:val="19"/>
               </w:rPr>
-              <w:t>23.9 %</w:t>
+              <w:t>25.4 %</w:t>
             </w:r>
           </w:p>
         </w:tc>
@@ -21782,7 +22094,7 @@
                 <w:sz w:val="19"/>
                 <w:szCs w:val="19"/>
               </w:rPr>
-              <w:t>razón 1.05</w:t>
+              <w:t>razón 0.98</w:t>
             </w:r>
           </w:p>
         </w:tc>
@@ -21807,21 +22119,21 @@
                 <w:sz w:val="19"/>
                 <w:szCs w:val="19"/>
               </w:rPr>
-              <w:t>1/4 (25 %)</w:t>
-            </w:r>
-          </w:p>
-          <w:p>
-            <w:pPr>
-              <w:pStyle w:val="Normal"/>
-              <w:spacing w:before="0" w:after="20"/>
-              <w:rPr/>
-            </w:pPr>
-            <w:r>
-              <w:rPr>
-                <w:sz w:val="19"/>
-                <w:szCs w:val="19"/>
-              </w:rPr>
-              <w:t>razón 1.05</w:t>
+              <w:t>2/6 (33.3 %)</w:t>
+            </w:r>
+          </w:p>
+          <w:p>
+            <w:pPr>
+              <w:pStyle w:val="Normal"/>
+              <w:spacing w:before="0" w:after="20"/>
+              <w:rPr/>
+            </w:pPr>
+            <w:r>
+              <w:rPr>
+                <w:sz w:val="19"/>
+                <w:szCs w:val="19"/>
+              </w:rPr>
+              <w:t>razón 1.31</w:t>
             </w:r>
           </w:p>
         </w:tc>
@@ -21860,7 +22172,7 @@
                 <w:sz w:val="19"/>
                 <w:szCs w:val="19"/>
               </w:rPr>
-              <w:t>razón 2.1</w:t>
+              <w:t>razón 1.96</w:t>
             </w:r>
           </w:p>
         </w:tc>
@@ -21913,7 +22225,7 @@
                 <w:sz w:val="19"/>
                 <w:szCs w:val="19"/>
               </w:rPr>
-              <w:t>30.9 %</w:t>
+              <w:t>32.5 %</w:t>
             </w:r>
           </w:p>
         </w:tc>
@@ -21952,7 +22264,7 @@
                 <w:sz w:val="19"/>
                 <w:szCs w:val="19"/>
               </w:rPr>
-              <w:t>razón 0.81</w:t>
+              <w:t>razón 0.77</w:t>
             </w:r>
           </w:p>
         </w:tc>
@@ -21977,21 +22289,21 @@
                 <w:sz w:val="19"/>
                 <w:szCs w:val="19"/>
               </w:rPr>
-              <w:t>1/4 (25 %)</w:t>
-            </w:r>
-          </w:p>
-          <w:p>
-            <w:pPr>
-              <w:pStyle w:val="Normal"/>
-              <w:spacing w:before="0" w:after="20"/>
-              <w:rPr/>
-            </w:pPr>
-            <w:r>
-              <w:rPr>
-                <w:sz w:val="19"/>
-                <w:szCs w:val="19"/>
-              </w:rPr>
-              <w:t>razón 0.81</w:t>
+              <w:t>3/6 (50 %)</w:t>
+            </w:r>
+          </w:p>
+          <w:p>
+            <w:pPr>
+              <w:pStyle w:val="Normal"/>
+              <w:spacing w:before="0" w:after="20"/>
+              <w:rPr/>
+            </w:pPr>
+            <w:r>
+              <w:rPr>
+                <w:sz w:val="19"/>
+                <w:szCs w:val="19"/>
+              </w:rPr>
+              <w:t>razón 1.54</w:t>
             </w:r>
           </w:p>
         </w:tc>
@@ -22030,7 +22342,7 @@
                 <w:sz w:val="19"/>
                 <w:szCs w:val="19"/>
               </w:rPr>
-              <w:t>razón 1.62</w:t>
+              <w:t>razón 1.54</w:t>
             </w:r>
           </w:p>
         </w:tc>
@@ -22083,7 +22395,7 @@
                 <w:sz w:val="19"/>
                 <w:szCs w:val="19"/>
               </w:rPr>
-              <w:t>35.3 %</w:t>
+              <w:t>36.3 %</w:t>
             </w:r>
           </w:p>
         </w:tc>
@@ -22122,7 +22434,7 @@
                 <w:sz w:val="19"/>
                 <w:szCs w:val="19"/>
               </w:rPr>
-              <w:t>razón 1.41</w:t>
+              <w:t>razón 1.38</w:t>
             </w:r>
           </w:p>
         </w:tc>
@@ -22147,21 +22459,21 @@
                 <w:sz w:val="19"/>
                 <w:szCs w:val="19"/>
               </w:rPr>
-              <w:t>1/4 (25 %)</w:t>
-            </w:r>
-          </w:p>
-          <w:p>
-            <w:pPr>
-              <w:pStyle w:val="Normal"/>
-              <w:spacing w:before="0" w:after="20"/>
-              <w:rPr/>
-            </w:pPr>
-            <w:r>
-              <w:rPr>
-                <w:sz w:val="19"/>
-                <w:szCs w:val="19"/>
-              </w:rPr>
-              <w:t>razón 0.71</w:t>
+              <w:t>3/6 (50 %)</w:t>
+            </w:r>
+          </w:p>
+          <w:p>
+            <w:pPr>
+              <w:pStyle w:val="Normal"/>
+              <w:spacing w:before="0" w:after="20"/>
+              <w:rPr/>
+            </w:pPr>
+            <w:r>
+              <w:rPr>
+                <w:sz w:val="19"/>
+                <w:szCs w:val="19"/>
+              </w:rPr>
+              <w:t>razón 1.38</w:t>
             </w:r>
           </w:p>
         </w:tc>
@@ -22200,7 +22512,878 @@
                 <w:sz w:val="19"/>
                 <w:szCs w:val="19"/>
               </w:rPr>
-              <w:t>razón 1.41</w:t>
+              <w:t>razón 1.38</w:t>
+            </w:r>
+          </w:p>
+        </w:tc>
+      </w:tr>
+    </w:tbl>
+    <w:p>
+      <w:pPr>
+        <w:pStyle w:val="Normal"/>
+        <w:spacing w:before="0" w:after="120"/>
+        <w:rPr/>
+      </w:pPr>
+      <w:r>
+        <w:rPr/>
+      </w:r>
+    </w:p>
+    <w:p>
+      <w:pPr>
+        <w:pStyle w:val="Heading3"/>
+        <w:rPr/>
+      </w:pPr>
+      <w:r>
+        <w:rPr/>
+        <w:t>Solo incidentes verificados por el autor</w:t>
+      </w:r>
+    </w:p>
+    <w:tbl>
+      <w:tblPr>
+        <w:tblW w:w="9638" w:type="dxa"/>
+        <w:jc w:val="left"/>
+        <w:tblInd w:w="0" w:type="dxa"/>
+        <w:tblLayout w:type="fixed"/>
+        <w:tblCellMar>
+          <w:top w:w="60" w:type="dxa"/>
+          <w:left w:w="100" w:type="dxa"/>
+          <w:bottom w:w="60" w:type="dxa"/>
+          <w:right w:w="100" w:type="dxa"/>
+        </w:tblCellMar>
+      </w:tblPr>
+      <w:tblGrid>
+        <w:gridCol w:w="1499"/>
+        <w:gridCol w:w="1501"/>
+        <w:gridCol w:w="2299"/>
+        <w:gridCol w:w="2170"/>
+        <w:gridCol w:w="2169"/>
+      </w:tblGrid>
+      <w:tr>
+        <w:trPr>
+          <w:tblHeader w:val="true"/>
+        </w:trPr>
+        <w:tc>
+          <w:tcPr>
+            <w:tcW w:w="1499" w:type="dxa"/>
+            <w:tcBorders>
+              <w:top w:val="single" w:sz="4" w:space="0" w:color="BFBFBF"/>
+              <w:left w:val="single" w:sz="4" w:space="0" w:color="BFBFBF"/>
+              <w:bottom w:val="single" w:sz="4" w:space="0" w:color="BFBFBF"/>
+              <w:right w:val="single" w:sz="4" w:space="0" w:color="BFBFBF"/>
+            </w:tcBorders>
+            <w:shd w:fill="1F4E79" w:val="clear"/>
+          </w:tcPr>
+          <w:p>
+            <w:pPr>
+              <w:pStyle w:val="Normal"/>
+              <w:spacing w:before="0" w:after="20"/>
+              <w:rPr/>
+            </w:pPr>
+            <w:r>
+              <w:rPr>
+                <w:b/>
+                <w:bCs/>
+                <w:color w:val="FFFFFF"/>
+                <w:sz w:val="19"/>
+                <w:szCs w:val="19"/>
+              </w:rPr>
+              <w:t>Ventana</w:t>
+            </w:r>
+          </w:p>
+        </w:tc>
+        <w:tc>
+          <w:tcPr>
+            <w:tcW w:w="1501" w:type="dxa"/>
+            <w:tcBorders>
+              <w:top w:val="single" w:sz="4" w:space="0" w:color="BFBFBF"/>
+              <w:left w:val="single" w:sz="4" w:space="0" w:color="BFBFBF"/>
+              <w:bottom w:val="single" w:sz="4" w:space="0" w:color="BFBFBF"/>
+              <w:right w:val="single" w:sz="4" w:space="0" w:color="BFBFBF"/>
+            </w:tcBorders>
+            <w:shd w:fill="1F4E79" w:val="clear"/>
+          </w:tcPr>
+          <w:p>
+            <w:pPr>
+              <w:pStyle w:val="Normal"/>
+              <w:spacing w:before="0" w:after="20"/>
+              <w:rPr/>
+            </w:pPr>
+            <w:r>
+              <w:rPr>
+                <w:b/>
+                <w:bCs/>
+                <w:color w:val="FFFFFF"/>
+                <w:sz w:val="19"/>
+                <w:szCs w:val="19"/>
+              </w:rPr>
+              <w:t>Cobertura</w:t>
+            </w:r>
+          </w:p>
+        </w:tc>
+        <w:tc>
+          <w:tcPr>
+            <w:tcW w:w="2299" w:type="dxa"/>
+            <w:tcBorders>
+              <w:top w:val="single" w:sz="4" w:space="0" w:color="BFBFBF"/>
+              <w:left w:val="single" w:sz="4" w:space="0" w:color="BFBFBF"/>
+              <w:bottom w:val="single" w:sz="4" w:space="0" w:color="BFBFBF"/>
+              <w:right w:val="single" w:sz="4" w:space="0" w:color="BFBFBF"/>
+            </w:tcBorders>
+            <w:shd w:fill="1F4E79" w:val="clear"/>
+          </w:tcPr>
+          <w:p>
+            <w:pPr>
+              <w:pStyle w:val="Normal"/>
+              <w:spacing w:before="0" w:after="20"/>
+              <w:rPr/>
+            </w:pPr>
+            <w:r>
+              <w:rPr>
+                <w:b/>
+                <w:bCs/>
+                <w:color w:val="FFFFFF"/>
+                <w:sz w:val="19"/>
+                <w:szCs w:val="19"/>
+              </w:rPr>
+              <w:t>Hacktivista</w:t>
+            </w:r>
+          </w:p>
+        </w:tc>
+        <w:tc>
+          <w:tcPr>
+            <w:tcW w:w="2170" w:type="dxa"/>
+            <w:tcBorders>
+              <w:top w:val="single" w:sz="4" w:space="0" w:color="BFBFBF"/>
+              <w:left w:val="single" w:sz="4" w:space="0" w:color="BFBFBF"/>
+              <w:bottom w:val="single" w:sz="4" w:space="0" w:color="BFBFBF"/>
+              <w:right w:val="single" w:sz="4" w:space="0" w:color="BFBFBF"/>
+            </w:tcBorders>
+            <w:shd w:fill="1F4E79" w:val="clear"/>
+          </w:tcPr>
+          <w:p>
+            <w:pPr>
+              <w:pStyle w:val="Normal"/>
+              <w:spacing w:before="0" w:after="20"/>
+              <w:rPr/>
+            </w:pPr>
+            <w:r>
+              <w:rPr>
+                <w:b/>
+                <w:bCs/>
+                <w:color w:val="FFFFFF"/>
+                <w:sz w:val="19"/>
+                <w:szCs w:val="19"/>
+              </w:rPr>
+              <w:t>Cibercriminal</w:t>
+            </w:r>
+          </w:p>
+        </w:tc>
+        <w:tc>
+          <w:tcPr>
+            <w:tcW w:w="2169" w:type="dxa"/>
+            <w:tcBorders>
+              <w:top w:val="single" w:sz="4" w:space="0" w:color="BFBFBF"/>
+              <w:left w:val="single" w:sz="4" w:space="0" w:color="BFBFBF"/>
+              <w:bottom w:val="single" w:sz="4" w:space="0" w:color="BFBFBF"/>
+              <w:right w:val="single" w:sz="4" w:space="0" w:color="BFBFBF"/>
+            </w:tcBorders>
+            <w:shd w:fill="1F4E79" w:val="clear"/>
+          </w:tcPr>
+          <w:p>
+            <w:pPr>
+              <w:pStyle w:val="Normal"/>
+              <w:spacing w:before="0" w:after="20"/>
+              <w:rPr/>
+            </w:pPr>
+            <w:r>
+              <w:rPr>
+                <w:b/>
+                <w:bCs/>
+                <w:color w:val="FFFFFF"/>
+                <w:sz w:val="19"/>
+                <w:szCs w:val="19"/>
+              </w:rPr>
+              <w:t>Desconocido</w:t>
+            </w:r>
+          </w:p>
+        </w:tc>
+      </w:tr>
+      <w:tr>
+        <w:trPr/>
+        <w:tc>
+          <w:tcPr>
+            <w:tcW w:w="1499" w:type="dxa"/>
+            <w:tcBorders>
+              <w:top w:val="single" w:sz="4" w:space="0" w:color="BFBFBF"/>
+              <w:left w:val="single" w:sz="4" w:space="0" w:color="BFBFBF"/>
+              <w:bottom w:val="single" w:sz="4" w:space="0" w:color="BFBFBF"/>
+              <w:right w:val="single" w:sz="4" w:space="0" w:color="BFBFBF"/>
+            </w:tcBorders>
+          </w:tcPr>
+          <w:p>
+            <w:pPr>
+              <w:pStyle w:val="Normal"/>
+              <w:spacing w:before="0" w:after="20"/>
+              <w:rPr/>
+            </w:pPr>
+            <w:r>
+              <w:rPr>
+                <w:sz w:val="19"/>
+                <w:szCs w:val="19"/>
+              </w:rPr>
+              <w:t>3 días</w:t>
+            </w:r>
+          </w:p>
+        </w:tc>
+        <w:tc>
+          <w:tcPr>
+            <w:tcW w:w="1501" w:type="dxa"/>
+            <w:tcBorders>
+              <w:top w:val="single" w:sz="4" w:space="0" w:color="BFBFBF"/>
+              <w:left w:val="single" w:sz="4" w:space="0" w:color="BFBFBF"/>
+              <w:bottom w:val="single" w:sz="4" w:space="0" w:color="BFBFBF"/>
+              <w:right w:val="single" w:sz="4" w:space="0" w:color="BFBFBF"/>
+            </w:tcBorders>
+          </w:tcPr>
+          <w:p>
+            <w:pPr>
+              <w:pStyle w:val="Normal"/>
+              <w:spacing w:before="0" w:after="20"/>
+              <w:rPr/>
+            </w:pPr>
+            <w:r>
+              <w:rPr>
+                <w:sz w:val="19"/>
+                <w:szCs w:val="19"/>
+              </w:rPr>
+              <w:t>18.8 %</w:t>
+            </w:r>
+          </w:p>
+        </w:tc>
+        <w:tc>
+          <w:tcPr>
+            <w:tcW w:w="2299" w:type="dxa"/>
+            <w:tcBorders>
+              <w:top w:val="single" w:sz="4" w:space="0" w:color="BFBFBF"/>
+              <w:left w:val="single" w:sz="4" w:space="0" w:color="BFBFBF"/>
+              <w:bottom w:val="single" w:sz="4" w:space="0" w:color="BFBFBF"/>
+              <w:right w:val="single" w:sz="4" w:space="0" w:color="BFBFBF"/>
+            </w:tcBorders>
+          </w:tcPr>
+          <w:p>
+            <w:pPr>
+              <w:pStyle w:val="Normal"/>
+              <w:spacing w:before="0" w:after="20"/>
+              <w:rPr/>
+            </w:pPr>
+            <w:r>
+              <w:rPr>
+                <w:sz w:val="19"/>
+                <w:szCs w:val="19"/>
+              </w:rPr>
+              <w:t>0/1 (0 %)</w:t>
+            </w:r>
+          </w:p>
+          <w:p>
+            <w:pPr>
+              <w:pStyle w:val="Normal"/>
+              <w:spacing w:before="0" w:after="20"/>
+              <w:rPr/>
+            </w:pPr>
+            <w:r>
+              <w:rPr>
+                <w:sz w:val="19"/>
+                <w:szCs w:val="19"/>
+              </w:rPr>
+              <w:t>razón 0</w:t>
+            </w:r>
+          </w:p>
+        </w:tc>
+        <w:tc>
+          <w:tcPr>
+            <w:tcW w:w="2170" w:type="dxa"/>
+            <w:tcBorders>
+              <w:top w:val="single" w:sz="4" w:space="0" w:color="BFBFBF"/>
+              <w:left w:val="single" w:sz="4" w:space="0" w:color="BFBFBF"/>
+              <w:bottom w:val="single" w:sz="4" w:space="0" w:color="BFBFBF"/>
+              <w:right w:val="single" w:sz="4" w:space="0" w:color="BFBFBF"/>
+            </w:tcBorders>
+          </w:tcPr>
+          <w:p>
+            <w:pPr>
+              <w:pStyle w:val="Normal"/>
+              <w:spacing w:before="0" w:after="20"/>
+              <w:rPr/>
+            </w:pPr>
+            <w:r>
+              <w:rPr>
+                <w:sz w:val="19"/>
+                <w:szCs w:val="19"/>
+              </w:rPr>
+              <w:t>0/6 (0 %)</w:t>
+            </w:r>
+          </w:p>
+          <w:p>
+            <w:pPr>
+              <w:pStyle w:val="Normal"/>
+              <w:spacing w:before="0" w:after="20"/>
+              <w:rPr/>
+            </w:pPr>
+            <w:r>
+              <w:rPr>
+                <w:sz w:val="19"/>
+                <w:szCs w:val="19"/>
+              </w:rPr>
+              <w:t>razón 0</w:t>
+            </w:r>
+          </w:p>
+        </w:tc>
+        <w:tc>
+          <w:tcPr>
+            <w:tcW w:w="2169" w:type="dxa"/>
+            <w:tcBorders>
+              <w:top w:val="single" w:sz="4" w:space="0" w:color="BFBFBF"/>
+              <w:left w:val="single" w:sz="4" w:space="0" w:color="BFBFBF"/>
+              <w:bottom w:val="single" w:sz="4" w:space="0" w:color="BFBFBF"/>
+              <w:right w:val="single" w:sz="4" w:space="0" w:color="BFBFBF"/>
+            </w:tcBorders>
+          </w:tcPr>
+          <w:p>
+            <w:pPr>
+              <w:pStyle w:val="Normal"/>
+              <w:spacing w:before="0" w:after="20"/>
+              <w:rPr/>
+            </w:pPr>
+            <w:r>
+              <w:rPr>
+                <w:sz w:val="19"/>
+                <w:szCs w:val="19"/>
+              </w:rPr>
+              <w:t>1/3 (33.3 %)</w:t>
+            </w:r>
+          </w:p>
+          <w:p>
+            <w:pPr>
+              <w:pStyle w:val="Normal"/>
+              <w:spacing w:before="0" w:after="20"/>
+              <w:rPr/>
+            </w:pPr>
+            <w:r>
+              <w:rPr>
+                <w:sz w:val="19"/>
+                <w:szCs w:val="19"/>
+              </w:rPr>
+              <w:t>razón 1.77</w:t>
+            </w:r>
+          </w:p>
+        </w:tc>
+      </w:tr>
+      <w:tr>
+        <w:trPr/>
+        <w:tc>
+          <w:tcPr>
+            <w:tcW w:w="1499" w:type="dxa"/>
+            <w:tcBorders>
+              <w:top w:val="single" w:sz="4" w:space="0" w:color="BFBFBF"/>
+              <w:left w:val="single" w:sz="4" w:space="0" w:color="BFBFBF"/>
+              <w:bottom w:val="single" w:sz="4" w:space="0" w:color="BFBFBF"/>
+              <w:right w:val="single" w:sz="4" w:space="0" w:color="BFBFBF"/>
+            </w:tcBorders>
+          </w:tcPr>
+          <w:p>
+            <w:pPr>
+              <w:pStyle w:val="Normal"/>
+              <w:spacing w:before="0" w:after="20"/>
+              <w:rPr/>
+            </w:pPr>
+            <w:r>
+              <w:rPr>
+                <w:sz w:val="19"/>
+                <w:szCs w:val="19"/>
+              </w:rPr>
+              <w:t>7 días</w:t>
+            </w:r>
+          </w:p>
+        </w:tc>
+        <w:tc>
+          <w:tcPr>
+            <w:tcW w:w="1501" w:type="dxa"/>
+            <w:tcBorders>
+              <w:top w:val="single" w:sz="4" w:space="0" w:color="BFBFBF"/>
+              <w:left w:val="single" w:sz="4" w:space="0" w:color="BFBFBF"/>
+              <w:bottom w:val="single" w:sz="4" w:space="0" w:color="BFBFBF"/>
+              <w:right w:val="single" w:sz="4" w:space="0" w:color="BFBFBF"/>
+            </w:tcBorders>
+          </w:tcPr>
+          <w:p>
+            <w:pPr>
+              <w:pStyle w:val="Normal"/>
+              <w:spacing w:before="0" w:after="20"/>
+              <w:rPr/>
+            </w:pPr>
+            <w:r>
+              <w:rPr>
+                <w:sz w:val="19"/>
+                <w:szCs w:val="19"/>
+              </w:rPr>
+              <w:t>25.4 %</w:t>
+            </w:r>
+          </w:p>
+        </w:tc>
+        <w:tc>
+          <w:tcPr>
+            <w:tcW w:w="2299" w:type="dxa"/>
+            <w:tcBorders>
+              <w:top w:val="single" w:sz="4" w:space="0" w:color="BFBFBF"/>
+              <w:left w:val="single" w:sz="4" w:space="0" w:color="BFBFBF"/>
+              <w:bottom w:val="single" w:sz="4" w:space="0" w:color="BFBFBF"/>
+              <w:right w:val="single" w:sz="4" w:space="0" w:color="BFBFBF"/>
+            </w:tcBorders>
+          </w:tcPr>
+          <w:p>
+            <w:pPr>
+              <w:pStyle w:val="Normal"/>
+              <w:spacing w:before="0" w:after="20"/>
+              <w:rPr/>
+            </w:pPr>
+            <w:r>
+              <w:rPr>
+                <w:sz w:val="19"/>
+                <w:szCs w:val="19"/>
+              </w:rPr>
+              <w:t>0/1 (0 %)</w:t>
+            </w:r>
+          </w:p>
+          <w:p>
+            <w:pPr>
+              <w:pStyle w:val="Normal"/>
+              <w:spacing w:before="0" w:after="20"/>
+              <w:rPr/>
+            </w:pPr>
+            <w:r>
+              <w:rPr>
+                <w:sz w:val="19"/>
+                <w:szCs w:val="19"/>
+              </w:rPr>
+              <w:t>razón 0</w:t>
+            </w:r>
+          </w:p>
+        </w:tc>
+        <w:tc>
+          <w:tcPr>
+            <w:tcW w:w="2170" w:type="dxa"/>
+            <w:tcBorders>
+              <w:top w:val="single" w:sz="4" w:space="0" w:color="BFBFBF"/>
+              <w:left w:val="single" w:sz="4" w:space="0" w:color="BFBFBF"/>
+              <w:bottom w:val="single" w:sz="4" w:space="0" w:color="BFBFBF"/>
+              <w:right w:val="single" w:sz="4" w:space="0" w:color="BFBFBF"/>
+            </w:tcBorders>
+          </w:tcPr>
+          <w:p>
+            <w:pPr>
+              <w:pStyle w:val="Normal"/>
+              <w:spacing w:before="0" w:after="20"/>
+              <w:rPr/>
+            </w:pPr>
+            <w:r>
+              <w:rPr>
+                <w:sz w:val="19"/>
+                <w:szCs w:val="19"/>
+              </w:rPr>
+              <w:t>1/6 (16.7 %)</w:t>
+            </w:r>
+          </w:p>
+          <w:p>
+            <w:pPr>
+              <w:pStyle w:val="Normal"/>
+              <w:spacing w:before="0" w:after="20"/>
+              <w:rPr/>
+            </w:pPr>
+            <w:r>
+              <w:rPr>
+                <w:sz w:val="19"/>
+                <w:szCs w:val="19"/>
+              </w:rPr>
+              <w:t>razón 0.65</w:t>
+            </w:r>
+          </w:p>
+        </w:tc>
+        <w:tc>
+          <w:tcPr>
+            <w:tcW w:w="2169" w:type="dxa"/>
+            <w:tcBorders>
+              <w:top w:val="single" w:sz="4" w:space="0" w:color="BFBFBF"/>
+              <w:left w:val="single" w:sz="4" w:space="0" w:color="BFBFBF"/>
+              <w:bottom w:val="single" w:sz="4" w:space="0" w:color="BFBFBF"/>
+              <w:right w:val="single" w:sz="4" w:space="0" w:color="BFBFBF"/>
+            </w:tcBorders>
+          </w:tcPr>
+          <w:p>
+            <w:pPr>
+              <w:pStyle w:val="Normal"/>
+              <w:spacing w:before="0" w:after="20"/>
+              <w:rPr/>
+            </w:pPr>
+            <w:r>
+              <w:rPr>
+                <w:sz w:val="19"/>
+                <w:szCs w:val="19"/>
+              </w:rPr>
+              <w:t>1/3 (33.3 %)</w:t>
+            </w:r>
+          </w:p>
+          <w:p>
+            <w:pPr>
+              <w:pStyle w:val="Normal"/>
+              <w:spacing w:before="0" w:after="20"/>
+              <w:rPr/>
+            </w:pPr>
+            <w:r>
+              <w:rPr>
+                <w:sz w:val="19"/>
+                <w:szCs w:val="19"/>
+              </w:rPr>
+              <w:t>razón 1.31</w:t>
+            </w:r>
+          </w:p>
+        </w:tc>
+      </w:tr>
+      <w:tr>
+        <w:trPr/>
+        <w:tc>
+          <w:tcPr>
+            <w:tcW w:w="1499" w:type="dxa"/>
+            <w:tcBorders>
+              <w:top w:val="single" w:sz="4" w:space="0" w:color="BFBFBF"/>
+              <w:left w:val="single" w:sz="4" w:space="0" w:color="BFBFBF"/>
+              <w:bottom w:val="single" w:sz="4" w:space="0" w:color="BFBFBF"/>
+              <w:right w:val="single" w:sz="4" w:space="0" w:color="BFBFBF"/>
+            </w:tcBorders>
+          </w:tcPr>
+          <w:p>
+            <w:pPr>
+              <w:pStyle w:val="Normal"/>
+              <w:spacing w:before="0" w:after="20"/>
+              <w:rPr/>
+            </w:pPr>
+            <w:r>
+              <w:rPr>
+                <w:sz w:val="19"/>
+                <w:szCs w:val="19"/>
+              </w:rPr>
+              <w:t>14 días</w:t>
+            </w:r>
+          </w:p>
+        </w:tc>
+        <w:tc>
+          <w:tcPr>
+            <w:tcW w:w="1501" w:type="dxa"/>
+            <w:tcBorders>
+              <w:top w:val="single" w:sz="4" w:space="0" w:color="BFBFBF"/>
+              <w:left w:val="single" w:sz="4" w:space="0" w:color="BFBFBF"/>
+              <w:bottom w:val="single" w:sz="4" w:space="0" w:color="BFBFBF"/>
+              <w:right w:val="single" w:sz="4" w:space="0" w:color="BFBFBF"/>
+            </w:tcBorders>
+          </w:tcPr>
+          <w:p>
+            <w:pPr>
+              <w:pStyle w:val="Normal"/>
+              <w:spacing w:before="0" w:after="20"/>
+              <w:rPr/>
+            </w:pPr>
+            <w:r>
+              <w:rPr>
+                <w:sz w:val="19"/>
+                <w:szCs w:val="19"/>
+              </w:rPr>
+              <w:t>32.5 %</w:t>
+            </w:r>
+          </w:p>
+        </w:tc>
+        <w:tc>
+          <w:tcPr>
+            <w:tcW w:w="2299" w:type="dxa"/>
+            <w:tcBorders>
+              <w:top w:val="single" w:sz="4" w:space="0" w:color="BFBFBF"/>
+              <w:left w:val="single" w:sz="4" w:space="0" w:color="BFBFBF"/>
+              <w:bottom w:val="single" w:sz="4" w:space="0" w:color="BFBFBF"/>
+              <w:right w:val="single" w:sz="4" w:space="0" w:color="BFBFBF"/>
+            </w:tcBorders>
+          </w:tcPr>
+          <w:p>
+            <w:pPr>
+              <w:pStyle w:val="Normal"/>
+              <w:spacing w:before="0" w:after="20"/>
+              <w:rPr/>
+            </w:pPr>
+            <w:r>
+              <w:rPr>
+                <w:sz w:val="19"/>
+                <w:szCs w:val="19"/>
+              </w:rPr>
+              <w:t>0/1 (0 %)</w:t>
+            </w:r>
+          </w:p>
+          <w:p>
+            <w:pPr>
+              <w:pStyle w:val="Normal"/>
+              <w:spacing w:before="0" w:after="20"/>
+              <w:rPr/>
+            </w:pPr>
+            <w:r>
+              <w:rPr>
+                <w:sz w:val="19"/>
+                <w:szCs w:val="19"/>
+              </w:rPr>
+              <w:t>razón 0</w:t>
+            </w:r>
+          </w:p>
+        </w:tc>
+        <w:tc>
+          <w:tcPr>
+            <w:tcW w:w="2170" w:type="dxa"/>
+            <w:tcBorders>
+              <w:top w:val="single" w:sz="4" w:space="0" w:color="BFBFBF"/>
+              <w:left w:val="single" w:sz="4" w:space="0" w:color="BFBFBF"/>
+              <w:bottom w:val="single" w:sz="4" w:space="0" w:color="BFBFBF"/>
+              <w:right w:val="single" w:sz="4" w:space="0" w:color="BFBFBF"/>
+            </w:tcBorders>
+          </w:tcPr>
+          <w:p>
+            <w:pPr>
+              <w:pStyle w:val="Normal"/>
+              <w:spacing w:before="0" w:after="20"/>
+              <w:rPr/>
+            </w:pPr>
+            <w:r>
+              <w:rPr>
+                <w:sz w:val="19"/>
+                <w:szCs w:val="19"/>
+              </w:rPr>
+              <w:t>1/6 (16.7 %)</w:t>
+            </w:r>
+          </w:p>
+          <w:p>
+            <w:pPr>
+              <w:pStyle w:val="Normal"/>
+              <w:spacing w:before="0" w:after="20"/>
+              <w:rPr/>
+            </w:pPr>
+            <w:r>
+              <w:rPr>
+                <w:sz w:val="19"/>
+                <w:szCs w:val="19"/>
+              </w:rPr>
+              <w:t>razón 0.51</w:t>
+            </w:r>
+          </w:p>
+        </w:tc>
+        <w:tc>
+          <w:tcPr>
+            <w:tcW w:w="2169" w:type="dxa"/>
+            <w:tcBorders>
+              <w:top w:val="single" w:sz="4" w:space="0" w:color="BFBFBF"/>
+              <w:left w:val="single" w:sz="4" w:space="0" w:color="BFBFBF"/>
+              <w:bottom w:val="single" w:sz="4" w:space="0" w:color="BFBFBF"/>
+              <w:right w:val="single" w:sz="4" w:space="0" w:color="BFBFBF"/>
+            </w:tcBorders>
+          </w:tcPr>
+          <w:p>
+            <w:pPr>
+              <w:pStyle w:val="Normal"/>
+              <w:spacing w:before="0" w:after="20"/>
+              <w:rPr/>
+            </w:pPr>
+            <w:r>
+              <w:rPr>
+                <w:sz w:val="19"/>
+                <w:szCs w:val="19"/>
+              </w:rPr>
+              <w:t>1/3 (33.3 %)</w:t>
+            </w:r>
+          </w:p>
+          <w:p>
+            <w:pPr>
+              <w:pStyle w:val="Normal"/>
+              <w:spacing w:before="0" w:after="20"/>
+              <w:rPr/>
+            </w:pPr>
+            <w:r>
+              <w:rPr>
+                <w:sz w:val="19"/>
+                <w:szCs w:val="19"/>
+              </w:rPr>
+              <w:t>razón 1.03</w:t>
+            </w:r>
+          </w:p>
+        </w:tc>
+      </w:tr>
+      <w:tr>
+        <w:trPr/>
+        <w:tc>
+          <w:tcPr>
+            <w:tcW w:w="1499" w:type="dxa"/>
+            <w:tcBorders>
+              <w:top w:val="single" w:sz="4" w:space="0" w:color="BFBFBF"/>
+              <w:left w:val="single" w:sz="4" w:space="0" w:color="BFBFBF"/>
+              <w:bottom w:val="single" w:sz="4" w:space="0" w:color="BFBFBF"/>
+              <w:right w:val="single" w:sz="4" w:space="0" w:color="BFBFBF"/>
+            </w:tcBorders>
+          </w:tcPr>
+          <w:p>
+            <w:pPr>
+              <w:pStyle w:val="Normal"/>
+              <w:spacing w:before="0" w:after="20"/>
+              <w:rPr/>
+            </w:pPr>
+            <w:r>
+              <w:rPr>
+                <w:sz w:val="19"/>
+                <w:szCs w:val="19"/>
+              </w:rPr>
+              <w:t>21 días</w:t>
+            </w:r>
+          </w:p>
+        </w:tc>
+        <w:tc>
+          <w:tcPr>
+            <w:tcW w:w="1501" w:type="dxa"/>
+            <w:tcBorders>
+              <w:top w:val="single" w:sz="4" w:space="0" w:color="BFBFBF"/>
+              <w:left w:val="single" w:sz="4" w:space="0" w:color="BFBFBF"/>
+              <w:bottom w:val="single" w:sz="4" w:space="0" w:color="BFBFBF"/>
+              <w:right w:val="single" w:sz="4" w:space="0" w:color="BFBFBF"/>
+            </w:tcBorders>
+          </w:tcPr>
+          <w:p>
+            <w:pPr>
+              <w:pStyle w:val="Normal"/>
+              <w:spacing w:before="0" w:after="20"/>
+              <w:rPr/>
+            </w:pPr>
+            <w:r>
+              <w:rPr>
+                <w:sz w:val="19"/>
+                <w:szCs w:val="19"/>
+              </w:rPr>
+              <w:t>36.3 %</w:t>
+            </w:r>
+          </w:p>
+        </w:tc>
+        <w:tc>
+          <w:tcPr>
+            <w:tcW w:w="2299" w:type="dxa"/>
+            <w:tcBorders>
+              <w:top w:val="single" w:sz="4" w:space="0" w:color="BFBFBF"/>
+              <w:left w:val="single" w:sz="4" w:space="0" w:color="BFBFBF"/>
+              <w:bottom w:val="single" w:sz="4" w:space="0" w:color="BFBFBF"/>
+              <w:right w:val="single" w:sz="4" w:space="0" w:color="BFBFBF"/>
+            </w:tcBorders>
+          </w:tcPr>
+          <w:p>
+            <w:pPr>
+              <w:pStyle w:val="Normal"/>
+              <w:spacing w:before="0" w:after="20"/>
+              <w:rPr/>
+            </w:pPr>
+            <w:r>
+              <w:rPr>
+                <w:sz w:val="19"/>
+                <w:szCs w:val="19"/>
+              </w:rPr>
+              <w:t>1/1 (100 %)</w:t>
+            </w:r>
+          </w:p>
+          <w:p>
+            <w:pPr>
+              <w:pStyle w:val="Normal"/>
+              <w:spacing w:before="0" w:after="20"/>
+              <w:rPr/>
+            </w:pPr>
+            <w:r>
+              <w:rPr>
+                <w:sz w:val="19"/>
+                <w:szCs w:val="19"/>
+              </w:rPr>
+              <w:t>razón 2.75</w:t>
+            </w:r>
+          </w:p>
+        </w:tc>
+        <w:tc>
+          <w:tcPr>
+            <w:tcW w:w="2170" w:type="dxa"/>
+            <w:tcBorders>
+              <w:top w:val="single" w:sz="4" w:space="0" w:color="BFBFBF"/>
+              <w:left w:val="single" w:sz="4" w:space="0" w:color="BFBFBF"/>
+              <w:bottom w:val="single" w:sz="4" w:space="0" w:color="BFBFBF"/>
+              <w:right w:val="single" w:sz="4" w:space="0" w:color="BFBFBF"/>
+            </w:tcBorders>
+          </w:tcPr>
+          <w:p>
+            <w:pPr>
+              <w:pStyle w:val="Normal"/>
+              <w:spacing w:before="0" w:after="20"/>
+              <w:rPr/>
+            </w:pPr>
+            <w:r>
+              <w:rPr>
+                <w:sz w:val="19"/>
+                <w:szCs w:val="19"/>
+              </w:rPr>
+              <w:t>1/6 (16.7 %)</w:t>
+            </w:r>
+          </w:p>
+          <w:p>
+            <w:pPr>
+              <w:pStyle w:val="Normal"/>
+              <w:spacing w:before="0" w:after="20"/>
+              <w:rPr/>
+            </w:pPr>
+            <w:r>
+              <w:rPr>
+                <w:sz w:val="19"/>
+                <w:szCs w:val="19"/>
+              </w:rPr>
+              <w:t>razón 0.46</w:t>
+            </w:r>
+          </w:p>
+        </w:tc>
+        <w:tc>
+          <w:tcPr>
+            <w:tcW w:w="2169" w:type="dxa"/>
+            <w:tcBorders>
+              <w:top w:val="single" w:sz="4" w:space="0" w:color="BFBFBF"/>
+              <w:left w:val="single" w:sz="4" w:space="0" w:color="BFBFBF"/>
+              <w:bottom w:val="single" w:sz="4" w:space="0" w:color="BFBFBF"/>
+              <w:right w:val="single" w:sz="4" w:space="0" w:color="BFBFBF"/>
+            </w:tcBorders>
+          </w:tcPr>
+          <w:p>
+            <w:pPr>
+              <w:pStyle w:val="Normal"/>
+              <w:spacing w:before="0" w:after="20"/>
+              <w:rPr/>
+            </w:pPr>
+            <w:r>
+              <w:rPr>
+                <w:sz w:val="19"/>
+                <w:szCs w:val="19"/>
+              </w:rPr>
+              <w:t>1/3 (33.3 %)</w:t>
+            </w:r>
+          </w:p>
+          <w:p>
+            <w:pPr>
+              <w:pStyle w:val="Normal"/>
+              <w:spacing w:before="0" w:after="20"/>
+              <w:rPr/>
+            </w:pPr>
+            <w:r>
+              <w:rPr>
+                <w:sz w:val="19"/>
+                <w:szCs w:val="19"/>
+              </w:rPr>
+              <w:t>razón 0.92</w:t>
             </w:r>
           </w:p>
         </w:tc>
@@ -22298,11 +23481,390 @@
         <w:pStyle w:val="Heading2"/>
         <w:rPr/>
       </w:pPr>
-      <w:bookmarkStart w:id="49" w:name="__RefHeading___Toc2953_2833890792"/>
+      <w:bookmarkStart w:id="49" w:name="__RefHeading___Toc3149_1723578586"/>
       <w:bookmarkEnd w:id="49"/>
       <w:r>
         <w:rPr/>
         <w:t>15.3. Lectura de los resultados</w:t>
+      </w:r>
+    </w:p>
+    <w:p>
+      <w:pPr>
+        <w:pStyle w:val="Normal"/>
+        <w:spacing w:lineRule="exact" w:line="290" w:before="0" w:after="120"/>
+        <w:rPr/>
+      </w:pPr>
+      <w:r>
+        <w:rPr/>
+        <w:t xml:space="preserve">Los resultados </w:t>
+      </w:r>
+      <w:r>
+        <w:rPr>
+          <w:b/>
+          <w:bCs/>
+        </w:rPr>
+        <w:t>cambian a medida que se completa el histórico de GDELT</w:t>
+      </w:r>
+      <w:r>
+        <w:rPr/>
+        <w:t xml:space="preserve"> (decisión D32). Conviene leerlos como una foto de cada momento:</w:t>
+      </w:r>
+    </w:p>
+    <w:tbl>
+      <w:tblPr>
+        <w:tblW w:w="9638" w:type="dxa"/>
+        <w:jc w:val="left"/>
+        <w:tblInd w:w="0" w:type="dxa"/>
+        <w:tblLayout w:type="fixed"/>
+        <w:tblCellMar>
+          <w:top w:w="60" w:type="dxa"/>
+          <w:left w:w="100" w:type="dxa"/>
+          <w:bottom w:w="60" w:type="dxa"/>
+          <w:right w:w="100" w:type="dxa"/>
+        </w:tblCellMar>
+      </w:tblPr>
+      <w:tblGrid>
+        <w:gridCol w:w="1400"/>
+        <w:gridCol w:w="2999"/>
+        <w:gridCol w:w="2701"/>
+        <w:gridCol w:w="2537"/>
+      </w:tblGrid>
+      <w:tr>
+        <w:trPr>
+          <w:tblHeader w:val="true"/>
+        </w:trPr>
+        <w:tc>
+          <w:tcPr>
+            <w:tcW w:w="1400" w:type="dxa"/>
+            <w:tcBorders>
+              <w:top w:val="single" w:sz="4" w:space="0" w:color="BFBFBF"/>
+              <w:left w:val="single" w:sz="4" w:space="0" w:color="BFBFBF"/>
+              <w:bottom w:val="single" w:sz="4" w:space="0" w:color="BFBFBF"/>
+              <w:right w:val="single" w:sz="4" w:space="0" w:color="BFBFBF"/>
+            </w:tcBorders>
+            <w:shd w:fill="1F4E79" w:val="clear"/>
+          </w:tcPr>
+          <w:p>
+            <w:pPr>
+              <w:pStyle w:val="Normal"/>
+              <w:spacing w:before="0" w:after="20"/>
+              <w:rPr/>
+            </w:pPr>
+            <w:r>
+              <w:rPr>
+                <w:b/>
+                <w:bCs/>
+                <w:color w:val="FFFFFF"/>
+                <w:sz w:val="19"/>
+                <w:szCs w:val="19"/>
+              </w:rPr>
+              <w:t>Fecha</w:t>
+            </w:r>
+          </w:p>
+        </w:tc>
+        <w:tc>
+          <w:tcPr>
+            <w:tcW w:w="2999" w:type="dxa"/>
+            <w:tcBorders>
+              <w:top w:val="single" w:sz="4" w:space="0" w:color="BFBFBF"/>
+              <w:left w:val="single" w:sz="4" w:space="0" w:color="BFBFBF"/>
+              <w:bottom w:val="single" w:sz="4" w:space="0" w:color="BFBFBF"/>
+              <w:right w:val="single" w:sz="4" w:space="0" w:color="BFBFBF"/>
+            </w:tcBorders>
+            <w:shd w:fill="1F4E79" w:val="clear"/>
+          </w:tcPr>
+          <w:p>
+            <w:pPr>
+              <w:pStyle w:val="Normal"/>
+              <w:spacing w:before="0" w:after="20"/>
+              <w:rPr/>
+            </w:pPr>
+            <w:r>
+              <w:rPr>
+                <w:b/>
+                <w:bCs/>
+                <w:color w:val="FFFFFF"/>
+                <w:sz w:val="19"/>
+                <w:szCs w:val="19"/>
+              </w:rPr>
+              <w:t>Datos</w:t>
+            </w:r>
+          </w:p>
+        </w:tc>
+        <w:tc>
+          <w:tcPr>
+            <w:tcW w:w="2701" w:type="dxa"/>
+            <w:tcBorders>
+              <w:top w:val="single" w:sz="4" w:space="0" w:color="BFBFBF"/>
+              <w:left w:val="single" w:sz="4" w:space="0" w:color="BFBFBF"/>
+              <w:bottom w:val="single" w:sz="4" w:space="0" w:color="BFBFBF"/>
+              <w:right w:val="single" w:sz="4" w:space="0" w:color="BFBFBF"/>
+            </w:tcBorders>
+            <w:shd w:fill="1F4E79" w:val="clear"/>
+          </w:tcPr>
+          <w:p>
+            <w:pPr>
+              <w:pStyle w:val="Normal"/>
+              <w:spacing w:before="0" w:after="20"/>
+              <w:rPr/>
+            </w:pPr>
+            <w:r>
+              <w:rPr>
+                <w:b/>
+                <w:bCs/>
+                <w:color w:val="FFFFFF"/>
+                <w:sz w:val="19"/>
+                <w:szCs w:val="19"/>
+              </w:rPr>
+              <w:t>Hacktivistas (21 días)</w:t>
+            </w:r>
+          </w:p>
+        </w:tc>
+        <w:tc>
+          <w:tcPr>
+            <w:tcW w:w="2537" w:type="dxa"/>
+            <w:tcBorders>
+              <w:top w:val="single" w:sz="4" w:space="0" w:color="BFBFBF"/>
+              <w:left w:val="single" w:sz="4" w:space="0" w:color="BFBFBF"/>
+              <w:bottom w:val="single" w:sz="4" w:space="0" w:color="BFBFBF"/>
+              <w:right w:val="single" w:sz="4" w:space="0" w:color="BFBFBF"/>
+            </w:tcBorders>
+            <w:shd w:fill="1F4E79" w:val="clear"/>
+          </w:tcPr>
+          <w:p>
+            <w:pPr>
+              <w:pStyle w:val="Normal"/>
+              <w:spacing w:before="0" w:after="20"/>
+              <w:rPr/>
+            </w:pPr>
+            <w:r>
+              <w:rPr>
+                <w:b/>
+                <w:bCs/>
+                <w:color w:val="FFFFFF"/>
+                <w:sz w:val="19"/>
+                <w:szCs w:val="19"/>
+              </w:rPr>
+              <w:t>Cibercriminales (21 días)</w:t>
+            </w:r>
+          </w:p>
+        </w:tc>
+      </w:tr>
+      <w:tr>
+        <w:trPr/>
+        <w:tc>
+          <w:tcPr>
+            <w:tcW w:w="1400" w:type="dxa"/>
+            <w:tcBorders>
+              <w:top w:val="single" w:sz="4" w:space="0" w:color="BFBFBF"/>
+              <w:left w:val="single" w:sz="4" w:space="0" w:color="BFBFBF"/>
+              <w:bottom w:val="single" w:sz="4" w:space="0" w:color="BFBFBF"/>
+              <w:right w:val="single" w:sz="4" w:space="0" w:color="BFBFBF"/>
+            </w:tcBorders>
+          </w:tcPr>
+          <w:p>
+            <w:pPr>
+              <w:pStyle w:val="Normal"/>
+              <w:spacing w:before="0" w:after="20"/>
+              <w:rPr/>
+            </w:pPr>
+            <w:r>
+              <w:rPr>
+                <w:sz w:val="19"/>
+                <w:szCs w:val="19"/>
+              </w:rPr>
+              <w:t>14/10/2026</w:t>
+            </w:r>
+          </w:p>
+        </w:tc>
+        <w:tc>
+          <w:tcPr>
+            <w:tcW w:w="2999" w:type="dxa"/>
+            <w:tcBorders>
+              <w:top w:val="single" w:sz="4" w:space="0" w:color="BFBFBF"/>
+              <w:left w:val="single" w:sz="4" w:space="0" w:color="BFBFBF"/>
+              <w:bottom w:val="single" w:sz="4" w:space="0" w:color="BFBFBF"/>
+              <w:right w:val="single" w:sz="4" w:space="0" w:color="BFBFBF"/>
+            </w:tcBorders>
+          </w:tcPr>
+          <w:p>
+            <w:pPr>
+              <w:pStyle w:val="Normal"/>
+              <w:spacing w:before="0" w:after="20"/>
+              <w:rPr/>
+            </w:pPr>
+            <w:r>
+              <w:rPr>
+                <w:sz w:val="19"/>
+                <w:szCs w:val="19"/>
+              </w:rPr>
+              <w:t>~199 eventos geopolíticos; 23 incidentes</w:t>
+            </w:r>
+          </w:p>
+        </w:tc>
+        <w:tc>
+          <w:tcPr>
+            <w:tcW w:w="2701" w:type="dxa"/>
+            <w:tcBorders>
+              <w:top w:val="single" w:sz="4" w:space="0" w:color="BFBFBF"/>
+              <w:left w:val="single" w:sz="4" w:space="0" w:color="BFBFBF"/>
+              <w:bottom w:val="single" w:sz="4" w:space="0" w:color="BFBFBF"/>
+              <w:right w:val="single" w:sz="4" w:space="0" w:color="BFBFBF"/>
+            </w:tcBorders>
+          </w:tcPr>
+          <w:p>
+            <w:pPr>
+              <w:pStyle w:val="Normal"/>
+              <w:spacing w:before="0" w:after="20"/>
+              <w:rPr/>
+            </w:pPr>
+            <w:r>
+              <w:rPr>
+                <w:sz w:val="19"/>
+                <w:szCs w:val="19"/>
+              </w:rPr>
+              <w:t>razón 1,92 (todos) · 1,68 (media/alta)</w:t>
+            </w:r>
+          </w:p>
+        </w:tc>
+        <w:tc>
+          <w:tcPr>
+            <w:tcW w:w="2537" w:type="dxa"/>
+            <w:tcBorders>
+              <w:top w:val="single" w:sz="4" w:space="0" w:color="BFBFBF"/>
+              <w:left w:val="single" w:sz="4" w:space="0" w:color="BFBFBF"/>
+              <w:bottom w:val="single" w:sz="4" w:space="0" w:color="BFBFBF"/>
+              <w:right w:val="single" w:sz="4" w:space="0" w:color="BFBFBF"/>
+            </w:tcBorders>
+          </w:tcPr>
+          <w:p>
+            <w:pPr>
+              <w:pStyle w:val="Normal"/>
+              <w:spacing w:before="0" w:after="20"/>
+              <w:rPr/>
+            </w:pPr>
+            <w:r>
+              <w:rPr>
+                <w:sz w:val="19"/>
+                <w:szCs w:val="19"/>
+              </w:rPr>
+              <w:t>razón 0,75 · 0,84</w:t>
+            </w:r>
+          </w:p>
+        </w:tc>
+      </w:tr>
+      <w:tr>
+        <w:trPr/>
+        <w:tc>
+          <w:tcPr>
+            <w:tcW w:w="1400" w:type="dxa"/>
+            <w:tcBorders>
+              <w:top w:val="single" w:sz="4" w:space="0" w:color="BFBFBF"/>
+              <w:left w:val="single" w:sz="4" w:space="0" w:color="BFBFBF"/>
+              <w:bottom w:val="single" w:sz="4" w:space="0" w:color="BFBFBF"/>
+              <w:right w:val="single" w:sz="4" w:space="0" w:color="BFBFBF"/>
+            </w:tcBorders>
+          </w:tcPr>
+          <w:p>
+            <w:pPr>
+              <w:pStyle w:val="Normal"/>
+              <w:spacing w:before="0" w:after="20"/>
+              <w:rPr/>
+            </w:pPr>
+            <w:r>
+              <w:rPr>
+                <w:sz w:val="19"/>
+                <w:szCs w:val="19"/>
+              </w:rPr>
+              <w:t>18/10/2026</w:t>
+            </w:r>
+          </w:p>
+        </w:tc>
+        <w:tc>
+          <w:tcPr>
+            <w:tcW w:w="2999" w:type="dxa"/>
+            <w:tcBorders>
+              <w:top w:val="single" w:sz="4" w:space="0" w:color="BFBFBF"/>
+              <w:left w:val="single" w:sz="4" w:space="0" w:color="BFBFBF"/>
+              <w:bottom w:val="single" w:sz="4" w:space="0" w:color="BFBFBF"/>
+              <w:right w:val="single" w:sz="4" w:space="0" w:color="BFBFBF"/>
+            </w:tcBorders>
+          </w:tcPr>
+          <w:p>
+            <w:pPr>
+              <w:pStyle w:val="Normal"/>
+              <w:spacing w:before="0" w:after="20"/>
+              <w:rPr/>
+            </w:pPr>
+            <w:r>
+              <w:rPr>
+                <w:sz w:val="19"/>
+                <w:szCs w:val="19"/>
+              </w:rPr>
+              <w:t>~691 eventos geopolíticos; 10 incidentes verificados</w:t>
+            </w:r>
+          </w:p>
+        </w:tc>
+        <w:tc>
+          <w:tcPr>
+            <w:tcW w:w="2701" w:type="dxa"/>
+            <w:tcBorders>
+              <w:top w:val="single" w:sz="4" w:space="0" w:color="BFBFBF"/>
+              <w:left w:val="single" w:sz="4" w:space="0" w:color="BFBFBF"/>
+              <w:bottom w:val="single" w:sz="4" w:space="0" w:color="BFBFBF"/>
+              <w:right w:val="single" w:sz="4" w:space="0" w:color="BFBFBF"/>
+            </w:tcBorders>
+          </w:tcPr>
+          <w:p>
+            <w:pPr>
+              <w:pStyle w:val="Normal"/>
+              <w:spacing w:before="0" w:after="20"/>
+              <w:rPr/>
+            </w:pPr>
+            <w:r>
+              <w:rPr>
+                <w:sz w:val="19"/>
+                <w:szCs w:val="19"/>
+              </w:rPr>
+              <w:t>razón 1,57 (todos) · 1,38 (media/alta)</w:t>
+            </w:r>
+          </w:p>
+        </w:tc>
+        <w:tc>
+          <w:tcPr>
+            <w:tcW w:w="2537" w:type="dxa"/>
+            <w:tcBorders>
+              <w:top w:val="single" w:sz="4" w:space="0" w:color="BFBFBF"/>
+              <w:left w:val="single" w:sz="4" w:space="0" w:color="BFBFBF"/>
+              <w:bottom w:val="single" w:sz="4" w:space="0" w:color="BFBFBF"/>
+              <w:right w:val="single" w:sz="4" w:space="0" w:color="BFBFBF"/>
+            </w:tcBorders>
+          </w:tcPr>
+          <w:p>
+            <w:pPr>
+              <w:pStyle w:val="Normal"/>
+              <w:spacing w:before="0" w:after="20"/>
+              <w:rPr/>
+            </w:pPr>
+            <w:r>
+              <w:rPr>
+                <w:sz w:val="19"/>
+                <w:szCs w:val="19"/>
+              </w:rPr>
+              <w:t>razón 0,92 · 1,38</w:t>
+            </w:r>
+          </w:p>
+        </w:tc>
+      </w:tr>
+    </w:tbl>
+    <w:p>
+      <w:pPr>
+        <w:pStyle w:val="Normal"/>
+        <w:spacing w:before="0" w:after="120"/>
+        <w:rPr/>
+      </w:pPr>
+      <w:r>
+        <w:rPr/>
       </w:r>
     </w:p>
     <w:p>
@@ -22317,62 +23879,14 @@
       </w:pPr>
       <w:r>
         <w:rPr/>
-        <w:t xml:space="preserve">Con la ventana de </w:t>
+        <w:t xml:space="preserve">Con más noticias detonantes, las ventanas cubren más días (con 21 días, cerca del 36 % del período). Así la ventaja de los hacktivistas se achica y, con confianza media o alta, se iguala a la de los cibercriminales. </w:t>
       </w:r>
       <w:r>
         <w:rPr>
           <w:b/>
           <w:bCs/>
         </w:rPr>
-        <w:t>7 días</w:t>
-      </w:r>
-      <w:r>
-        <w:rPr/>
-        <w:t xml:space="preserve"> (la del semáforo) </w:t>
-      </w:r>
-      <w:r>
-        <w:rPr>
-          <w:b/>
-          <w:bCs/>
-        </w:rPr>
-        <w:t>ningún</w:t>
-      </w:r>
-      <w:r>
-        <w:rPr/>
-        <w:t xml:space="preserve"> ataque hacktivista cae dentro de una ventana. Con </w:t>
-      </w:r>
-      <w:r>
-        <w:rPr>
-          <w:b/>
-          <w:bCs/>
-        </w:rPr>
-        <w:t>21 días</w:t>
-      </w:r>
-      <w:r>
-        <w:rPr/>
-        <w:t xml:space="preserve">, la razón de los hacktivistas es de alrededor de </w:t>
-      </w:r>
-      <w:r>
-        <w:rPr>
-          <w:b/>
-          <w:bCs/>
-        </w:rPr>
-        <w:t>2</w:t>
-      </w:r>
-      <w:r>
-        <w:rPr/>
-        <w:t xml:space="preserve"> (1,92 con todos los incidentes y 1,68 solo con los de confianza media o alta), mientras que la de los cibercriminales queda </w:t>
-      </w:r>
-      <w:r>
-        <w:rPr>
-          <w:b/>
-          <w:bCs/>
-        </w:rPr>
-        <w:t>por debajo de 1</w:t>
-      </w:r>
-      <w:r>
-        <w:rPr/>
-        <w:t xml:space="preserve"> (0,75 y 0,84).</w:t>
+        <w:t>La hipótesis no puede confirmarse con los datos actuales.</w:t>
       </w:r>
     </w:p>
     <w:p>
@@ -22387,18 +23901,18 @@
       </w:pPr>
       <w:r>
         <w:rPr/>
-        <w:t>El patrón se mantiene en las dos variantes, lo que sugiere que no depende de los datos más débiles (</w:t>
+        <w:t xml:space="preserve">Con solo los incidentes </w:t>
       </w:r>
       <w:r>
         <w:rPr>
           <w:b/>
           <w:bCs/>
         </w:rPr>
-        <w:t>robustez</w:t>
-      </w:r>
-      <w:r>
-        <w:rPr/>
-        <w:t>).</w:t>
+        <w:t>verificados</w:t>
+      </w:r>
+      <w:r>
+        <w:rPr/>
+        <w:t xml:space="preserve"> hay un único ataque hacktivista (Cancillería, 05/02/2026): cae dentro de la ventana de 21 días, pero un caso no permite conclusiones.</w:t>
       </w:r>
     </w:p>
     <w:p>
@@ -22413,18 +23927,18 @@
       </w:pPr>
       <w:r>
         <w:rPr/>
-        <w:t xml:space="preserve">Lectura preliminar: si existe relación entre geopolítica y hacktivismo contra Argentina, la reacción no es inmediata, sino que ocurre en un plazo de </w:t>
+        <w:t xml:space="preserve">Dos casos siguen ilustrando una posible reacción a las </w:t>
       </w:r>
       <w:r>
         <w:rPr>
           <w:b/>
           <w:bCs/>
         </w:rPr>
-        <w:t>dos a tres semanas</w:t>
-      </w:r>
-      <w:r>
-        <w:rPr/>
-        <w:t>. Dos casos lo ilustran: LulzSec Muslims (16 días después de la visita a Israel de 2024) y el intento de DDoS a la Cancillería (19 días después del ingreso al Board of Peace). Esto pone en discusión la ventana de 7 días fijada en los requisitos iniciales.</w:t>
+        <w:t>dos o tres semanas</w:t>
+      </w:r>
+      <w:r>
+        <w:rPr/>
+        <w:t>: LulzSec Muslims (16 días después de la visita a Israel de 2024) y el intento de DDoS a la Cancillería (19 días después del ingreso al Board of Peace).</w:t>
       </w:r>
     </w:p>
     <w:p>
@@ -22439,18 +23953,40 @@
       </w:pPr>
       <w:r>
         <w:rPr/>
-        <w:t xml:space="preserve">El defacement de argentina.gob.ar (19/10/2023), de motivación política interna, cae dentro de la ventana abierta tras el 7 de octubre de 2023 y pone el semáforo en rojo: es un </w:t>
+        <w:t xml:space="preserve">Si la cobertura sigue creciendo al completarse el histórico, habrá que </w:t>
       </w:r>
       <w:r>
         <w:rPr>
           <w:b/>
           <w:bCs/>
         </w:rPr>
-        <w:t>falso positivo</w:t>
-      </w:r>
-      <w:r>
-        <w:rPr/>
-        <w:t xml:space="preserve"> que muestra el límite de un modelo basado solo en fechas.</w:t>
+        <w:t>recalibrar el umbral de detonante</w:t>
+      </w:r>
+      <w:r>
+        <w:rPr/>
+        <w:t xml:space="preserve"> (por ejemplo, exigir 3 fuentes distintas por día) para que las ventanas sigan siendo selectivas.</w:t>
+      </w:r>
+    </w:p>
+    <w:p>
+      <w:pPr>
+        <w:pStyle w:val="ListParagraph"/>
+        <w:numPr>
+          <w:ilvl w:val="0"/>
+          <w:numId w:val="3"/>
+        </w:numPr>
+        <w:spacing w:before="0" w:after="60"/>
+        <w:rPr/>
+      </w:pPr>
+      <w:r>
+        <w:rPr>
+          <w:b/>
+          <w:bCs/>
+        </w:rPr>
+        <w:t>Falsos positivos observados:</w:t>
+      </w:r>
+      <w:r>
+        <w:rPr/>
+        <w:t xml:space="preserve"> el defacement de argentina.gob.ar (19/10/2023), de motivación interna, dentro de la ventana posterior al 7 de octubre; y una noticia sobre la detención de personas que amenazaron con bombas, clasificada como ataque por las palabras clave.</w:t>
       </w:r>
     </w:p>
     <w:p>
@@ -22492,7 +24028,7 @@
         <w:pStyle w:val="Heading2"/>
         <w:rPr/>
       </w:pPr>
-      <w:bookmarkStart w:id="50" w:name="__RefHeading___Toc2955_2833890792"/>
+      <w:bookmarkStart w:id="50" w:name="__RefHeading___Toc3151_1723578586"/>
       <w:bookmarkEnd w:id="50"/>
       <w:r>
         <w:rPr/>
@@ -22683,7 +24219,7 @@
         <w:pStyle w:val="Heading1"/>
         <w:rPr/>
       </w:pPr>
-      <w:bookmarkStart w:id="51" w:name="__RefHeading___Toc2957_2833890792"/>
+      <w:bookmarkStart w:id="51" w:name="__RefHeading___Toc3153_1723578586"/>
       <w:bookmarkEnd w:id="51"/>
       <w:r>
         <w:rPr/>
@@ -26034,6 +27570,315 @@
           </w:p>
         </w:tc>
       </w:tr>
+      <w:tr>
+        <w:trPr/>
+        <w:tc>
+          <w:tcPr>
+            <w:tcW w:w="1250" w:type="dxa"/>
+            <w:tcBorders>
+              <w:top w:val="single" w:sz="4" w:space="0" w:color="BFBFBF"/>
+              <w:left w:val="single" w:sz="4" w:space="0" w:color="BFBFBF"/>
+              <w:bottom w:val="single" w:sz="4" w:space="0" w:color="BFBFBF"/>
+              <w:right w:val="single" w:sz="4" w:space="0" w:color="BFBFBF"/>
+            </w:tcBorders>
+          </w:tcPr>
+          <w:p>
+            <w:pPr>
+              <w:pStyle w:val="Normal"/>
+              <w:spacing w:before="0" w:after="20"/>
+              <w:rPr/>
+            </w:pPr>
+            <w:r>
+              <w:rPr>
+                <w:sz w:val="19"/>
+                <w:szCs w:val="19"/>
+              </w:rPr>
+              <w:t>18/10/2026</w:t>
+            </w:r>
+          </w:p>
+        </w:tc>
+        <w:tc>
+          <w:tcPr>
+            <w:tcW w:w="1650" w:type="dxa"/>
+            <w:tcBorders>
+              <w:top w:val="single" w:sz="4" w:space="0" w:color="BFBFBF"/>
+              <w:left w:val="single" w:sz="4" w:space="0" w:color="BFBFBF"/>
+              <w:bottom w:val="single" w:sz="4" w:space="0" w:color="BFBFBF"/>
+              <w:right w:val="single" w:sz="4" w:space="0" w:color="BFBFBF"/>
+            </w:tcBorders>
+          </w:tcPr>
+          <w:p>
+            <w:pPr>
+              <w:pStyle w:val="Normal"/>
+              <w:spacing w:before="0" w:after="20"/>
+              <w:rPr/>
+            </w:pPr>
+            <w:r>
+              <w:rPr>
+                <w:sz w:val="19"/>
+                <w:szCs w:val="19"/>
+              </w:rPr>
+              <w:t>Verificación</w:t>
+            </w:r>
+          </w:p>
+        </w:tc>
+        <w:tc>
+          <w:tcPr>
+            <w:tcW w:w="2299" w:type="dxa"/>
+            <w:tcBorders>
+              <w:top w:val="single" w:sz="4" w:space="0" w:color="BFBFBF"/>
+              <w:left w:val="single" w:sz="4" w:space="0" w:color="BFBFBF"/>
+              <w:bottom w:val="single" w:sz="4" w:space="0" w:color="BFBFBF"/>
+              <w:right w:val="single" w:sz="4" w:space="0" w:color="BFBFBF"/>
+            </w:tcBorders>
+          </w:tcPr>
+          <w:p>
+            <w:pPr>
+              <w:pStyle w:val="Normal"/>
+              <w:spacing w:before="0" w:after="20"/>
+              <w:rPr/>
+            </w:pPr>
+            <w:r>
+              <w:rPr>
+                <w:sz w:val="19"/>
+                <w:szCs w:val="19"/>
+              </w:rPr>
+              <w:t>El autor verificó 10 incidentes</w:t>
+            </w:r>
+          </w:p>
+        </w:tc>
+        <w:tc>
+          <w:tcPr>
+            <w:tcW w:w="4438" w:type="dxa"/>
+            <w:tcBorders>
+              <w:top w:val="single" w:sz="4" w:space="0" w:color="BFBFBF"/>
+              <w:left w:val="single" w:sz="4" w:space="0" w:color="BFBFBF"/>
+              <w:bottom w:val="single" w:sz="4" w:space="0" w:color="BFBFBF"/>
+              <w:right w:val="single" w:sz="4" w:space="0" w:color="BFBFBF"/>
+            </w:tcBorders>
+          </w:tcPr>
+          <w:p>
+            <w:pPr>
+              <w:pStyle w:val="Normal"/>
+              <w:spacing w:before="0" w:after="20"/>
+              <w:rPr/>
+            </w:pPr>
+            <w:r>
+              <w:rPr>
+                <w:sz w:val="19"/>
+                <w:szCs w:val="19"/>
+              </w:rPr>
+              <w:t>Códigos asignados: INC-021 C3, INC-020 B2, INC-019 C4, INC-018 B2, INC-017 A1, INC-016 B4, INC-015 A1, INC-014 B3, INC-008 A1, INC-007 A1. Se marcaron como verificados y su confianza se derivó del código (decisión D30).</w:t>
+            </w:r>
+          </w:p>
+        </w:tc>
+      </w:tr>
+      <w:tr>
+        <w:trPr/>
+        <w:tc>
+          <w:tcPr>
+            <w:tcW w:w="1250" w:type="dxa"/>
+            <w:tcBorders>
+              <w:top w:val="single" w:sz="4" w:space="0" w:color="BFBFBF"/>
+              <w:left w:val="single" w:sz="4" w:space="0" w:color="BFBFBF"/>
+              <w:bottom w:val="single" w:sz="4" w:space="0" w:color="BFBFBF"/>
+              <w:right w:val="single" w:sz="4" w:space="0" w:color="BFBFBF"/>
+            </w:tcBorders>
+          </w:tcPr>
+          <w:p>
+            <w:pPr>
+              <w:pStyle w:val="Normal"/>
+              <w:spacing w:before="0" w:after="20"/>
+              <w:rPr/>
+            </w:pPr>
+            <w:r>
+              <w:rPr>
+                <w:sz w:val="19"/>
+                <w:szCs w:val="19"/>
+              </w:rPr>
+              <w:t>18/10/2026</w:t>
+            </w:r>
+          </w:p>
+        </w:tc>
+        <w:tc>
+          <w:tcPr>
+            <w:tcW w:w="1650" w:type="dxa"/>
+            <w:tcBorders>
+              <w:top w:val="single" w:sz="4" w:space="0" w:color="BFBFBF"/>
+              <w:left w:val="single" w:sz="4" w:space="0" w:color="BFBFBF"/>
+              <w:bottom w:val="single" w:sz="4" w:space="0" w:color="BFBFBF"/>
+              <w:right w:val="single" w:sz="4" w:space="0" w:color="BFBFBF"/>
+            </w:tcBorders>
+          </w:tcPr>
+          <w:p>
+            <w:pPr>
+              <w:pStyle w:val="Normal"/>
+              <w:spacing w:before="0" w:after="20"/>
+              <w:rPr/>
+            </w:pPr>
+            <w:r>
+              <w:rPr>
+                <w:sz w:val="19"/>
+                <w:szCs w:val="19"/>
+              </w:rPr>
+              <w:t>Desarrollo</w:t>
+            </w:r>
+          </w:p>
+        </w:tc>
+        <w:tc>
+          <w:tcPr>
+            <w:tcW w:w="2299" w:type="dxa"/>
+            <w:tcBorders>
+              <w:top w:val="single" w:sz="4" w:space="0" w:color="BFBFBF"/>
+              <w:left w:val="single" w:sz="4" w:space="0" w:color="BFBFBF"/>
+              <w:bottom w:val="single" w:sz="4" w:space="0" w:color="BFBFBF"/>
+              <w:right w:val="single" w:sz="4" w:space="0" w:color="BFBFBF"/>
+            </w:tcBorders>
+          </w:tcPr>
+          <w:p>
+            <w:pPr>
+              <w:pStyle w:val="Normal"/>
+              <w:spacing w:before="0" w:after="20"/>
+              <w:rPr/>
+            </w:pPr>
+            <w:r>
+              <w:rPr>
+                <w:sz w:val="19"/>
+                <w:szCs w:val="19"/>
+              </w:rPr>
+              <w:t>Evaluación 'solo verificados' y depuración de duplicados</w:t>
+            </w:r>
+          </w:p>
+        </w:tc>
+        <w:tc>
+          <w:tcPr>
+            <w:tcW w:w="4438" w:type="dxa"/>
+            <w:tcBorders>
+              <w:top w:val="single" w:sz="4" w:space="0" w:color="BFBFBF"/>
+              <w:left w:val="single" w:sz="4" w:space="0" w:color="BFBFBF"/>
+              <w:bottom w:val="single" w:sz="4" w:space="0" w:color="BFBFBF"/>
+              <w:right w:val="single" w:sz="4" w:space="0" w:color="BFBFBF"/>
+            </w:tcBorders>
+          </w:tcPr>
+          <w:p>
+            <w:pPr>
+              <w:pStyle w:val="Normal"/>
+              <w:spacing w:before="0" w:after="20"/>
+              <w:rPr/>
+            </w:pPr>
+            <w:r>
+              <w:rPr>
+                <w:sz w:val="19"/>
+                <w:szCs w:val="19"/>
+              </w:rPr>
+              <w:t>Nueva variante de la evaluación con los incidentes verificados. En el grupo detectado en noticias se cuenta un evento por día, porque cinco artículos italianos describían la misma filtración (D31). Se detectó un falso positivo del clasificador (detención por amenazas de bomba).</w:t>
+            </w:r>
+          </w:p>
+        </w:tc>
+      </w:tr>
+      <w:tr>
+        <w:trPr/>
+        <w:tc>
+          <w:tcPr>
+            <w:tcW w:w="1250" w:type="dxa"/>
+            <w:tcBorders>
+              <w:top w:val="single" w:sz="4" w:space="0" w:color="BFBFBF"/>
+              <w:left w:val="single" w:sz="4" w:space="0" w:color="BFBFBF"/>
+              <w:bottom w:val="single" w:sz="4" w:space="0" w:color="BFBFBF"/>
+              <w:right w:val="single" w:sz="4" w:space="0" w:color="BFBFBF"/>
+            </w:tcBorders>
+          </w:tcPr>
+          <w:p>
+            <w:pPr>
+              <w:pStyle w:val="Normal"/>
+              <w:spacing w:before="0" w:after="20"/>
+              <w:rPr/>
+            </w:pPr>
+            <w:r>
+              <w:rPr>
+                <w:sz w:val="19"/>
+                <w:szCs w:val="19"/>
+              </w:rPr>
+              <w:t>18/10/2026</w:t>
+            </w:r>
+          </w:p>
+        </w:tc>
+        <w:tc>
+          <w:tcPr>
+            <w:tcW w:w="1650" w:type="dxa"/>
+            <w:tcBorders>
+              <w:top w:val="single" w:sz="4" w:space="0" w:color="BFBFBF"/>
+              <w:left w:val="single" w:sz="4" w:space="0" w:color="BFBFBF"/>
+              <w:bottom w:val="single" w:sz="4" w:space="0" w:color="BFBFBF"/>
+              <w:right w:val="single" w:sz="4" w:space="0" w:color="BFBFBF"/>
+            </w:tcBorders>
+          </w:tcPr>
+          <w:p>
+            <w:pPr>
+              <w:pStyle w:val="Normal"/>
+              <w:spacing w:before="0" w:after="20"/>
+              <w:rPr/>
+            </w:pPr>
+            <w:r>
+              <w:rPr>
+                <w:sz w:val="19"/>
+                <w:szCs w:val="19"/>
+              </w:rPr>
+              <w:t>Resultado</w:t>
+            </w:r>
+          </w:p>
+        </w:tc>
+        <w:tc>
+          <w:tcPr>
+            <w:tcW w:w="2299" w:type="dxa"/>
+            <w:tcBorders>
+              <w:top w:val="single" w:sz="4" w:space="0" w:color="BFBFBF"/>
+              <w:left w:val="single" w:sz="4" w:space="0" w:color="BFBFBF"/>
+              <w:bottom w:val="single" w:sz="4" w:space="0" w:color="BFBFBF"/>
+              <w:right w:val="single" w:sz="4" w:space="0" w:color="BFBFBF"/>
+            </w:tcBorders>
+          </w:tcPr>
+          <w:p>
+            <w:pPr>
+              <w:pStyle w:val="Normal"/>
+              <w:spacing w:before="0" w:after="20"/>
+              <w:rPr/>
+            </w:pPr>
+            <w:r>
+              <w:rPr>
+                <w:sz w:val="19"/>
+                <w:szCs w:val="19"/>
+              </w:rPr>
+              <w:t>Resultados actualizados con más histórico de GDELT</w:t>
+            </w:r>
+          </w:p>
+        </w:tc>
+        <w:tc>
+          <w:tcPr>
+            <w:tcW w:w="4438" w:type="dxa"/>
+            <w:tcBorders>
+              <w:top w:val="single" w:sz="4" w:space="0" w:color="BFBFBF"/>
+              <w:left w:val="single" w:sz="4" w:space="0" w:color="BFBFBF"/>
+              <w:bottom w:val="single" w:sz="4" w:space="0" w:color="BFBFBF"/>
+              <w:right w:val="single" w:sz="4" w:space="0" w:color="BFBFBF"/>
+            </w:tcBorders>
+          </w:tcPr>
+          <w:p>
+            <w:pPr>
+              <w:pStyle w:val="Normal"/>
+              <w:spacing w:before="0" w:after="20"/>
+              <w:rPr/>
+            </w:pPr>
+            <w:r>
+              <w:rPr>
+                <w:sz w:val="19"/>
+                <w:szCs w:val="19"/>
+              </w:rPr>
+              <w:t>Con 127 tramos descargados (unos 28.000 artículos) los eventos geopolíticos pasaron de 199 a 691 y la cobertura de las ventanas aumentó. Con 21 días: hacktivistas razón 1,57 y cibercriminales 0,92 (todos); 1,38 para ambos (confianza media/alta); en 'solo verificados' hay un único incidente hacktivista, insuficiente para concluir (D32).</w:t>
+            </w:r>
+          </w:p>
+        </w:tc>
+      </w:tr>
     </w:tbl>
     <w:p>
       <w:pPr>
@@ -26043,7 +27888,7 @@
       <w:r>
         <w:br w:type="page"/>
       </w:r>
-      <w:bookmarkStart w:id="52" w:name="__RefHeading___Toc2959_2833890792"/>
+      <w:bookmarkStart w:id="52" w:name="__RefHeading___Toc3155_1723578586"/>
       <w:bookmarkEnd w:id="52"/>
       <w:r>
         <w:rPr/>
@@ -27360,7 +29205,7 @@
     </w:r>
     <w:r>
       <w:rPr/>
-      <w:t>33</w:t>
+      <w:t>34</w:t>
     </w:r>
     <w:r>
       <w:rPr/>
@@ -27372,7 +29217,7 @@
         <w:sz w:val="16"/>
         <w:szCs w:val="16"/>
       </w:rPr>
-      <w:t xml:space="preserve"> · Versión 0.6 (17/10/2026)</w:t>
+      <w:t xml:space="preserve"> · Versión 0.7 (18/10/2026)</w:t>
     </w:r>
   </w:p>
 </w:ftr>
@@ -27408,7 +29253,7 @@
     </w:r>
     <w:r>
       <w:rPr/>
-      <w:t>33</w:t>
+      <w:t>34</w:t>
     </w:r>
     <w:r>
       <w:rPr/>
@@ -27420,7 +29265,7 @@
         <w:sz w:val="16"/>
         <w:szCs w:val="16"/>
       </w:rPr>
-      <w:t xml:space="preserve"> · Versión 0.6 (17/10/2026)</w:t>
+      <w:t xml:space="preserve"> · Versión 0.7 (18/10/2026)</w:t>
     </w:r>
   </w:p>
 </w:ftr>

</xml_diff>

<commit_message>
Verificación de incidentes hacktivistas: 4 verificados y 2 descartados
- INC-002, INC-004, INC-005: D3; INC-006: D2
- INC-001 e INC-003 descartados (no relacionados con el Estado argentino): se listan con
  su motivo pero no entran al cálculo (D33)
- Planilla y memoria v0.8 actualizadas; 19 pruebas

Co-Authored-By: Claude Opus 5.5 <noreply@anthropic.com>
Claude-Session: https://claude.ai/code/session_011eMYWh6VDWd8LKxBrkPUCG
</commit_message>
<xml_diff>
--- a/memoria/Memoria_TFM.docx
+++ b/memoria/Memoria_TFM.docx
@@ -145,7 +145,7 @@
           <w:sz w:val="20"/>
           <w:szCs w:val="20"/>
         </w:rPr>
-        <w:t>Versión 0.7 · 18/10/2026</w:t>
+        <w:t>Versión 0.8 · 18/10/2026</w:t>
       </w:r>
     </w:p>
     <w:p>
@@ -930,6 +930,84 @@
                 <w:szCs w:val="19"/>
               </w:rPr>
               <w:t>Primeros 10 incidentes verificados por el autor (Código Almirantazgo), variante de evaluación 'solo verificados' y depuración de noticias duplicadas.</w:t>
+            </w:r>
+          </w:p>
+        </w:tc>
+      </w:tr>
+      <w:tr>
+        <w:trPr/>
+        <w:tc>
+          <w:tcPr>
+            <w:tcW w:w="1099" w:type="dxa"/>
+            <w:tcBorders>
+              <w:top w:val="single" w:sz="4" w:space="0" w:color="BFBFBF"/>
+              <w:left w:val="single" w:sz="4" w:space="0" w:color="BFBFBF"/>
+              <w:bottom w:val="single" w:sz="4" w:space="0" w:color="BFBFBF"/>
+              <w:right w:val="single" w:sz="4" w:space="0" w:color="BFBFBF"/>
+            </w:tcBorders>
+          </w:tcPr>
+          <w:p>
+            <w:pPr>
+              <w:pStyle w:val="Normal"/>
+              <w:spacing w:before="0" w:after="20"/>
+              <w:rPr/>
+            </w:pPr>
+            <w:r>
+              <w:rPr>
+                <w:sz w:val="19"/>
+                <w:szCs w:val="19"/>
+              </w:rPr>
+              <w:t>0.8</w:t>
+            </w:r>
+          </w:p>
+        </w:tc>
+        <w:tc>
+          <w:tcPr>
+            <w:tcW w:w="1401" w:type="dxa"/>
+            <w:tcBorders>
+              <w:top w:val="single" w:sz="4" w:space="0" w:color="BFBFBF"/>
+              <w:left w:val="single" w:sz="4" w:space="0" w:color="BFBFBF"/>
+              <w:bottom w:val="single" w:sz="4" w:space="0" w:color="BFBFBF"/>
+              <w:right w:val="single" w:sz="4" w:space="0" w:color="BFBFBF"/>
+            </w:tcBorders>
+          </w:tcPr>
+          <w:p>
+            <w:pPr>
+              <w:pStyle w:val="Normal"/>
+              <w:spacing w:before="0" w:after="20"/>
+              <w:rPr/>
+            </w:pPr>
+            <w:r>
+              <w:rPr>
+                <w:sz w:val="19"/>
+                <w:szCs w:val="19"/>
+              </w:rPr>
+              <w:t>18/10/2026</w:t>
+            </w:r>
+          </w:p>
+        </w:tc>
+        <w:tc>
+          <w:tcPr>
+            <w:tcW w:w="7138" w:type="dxa"/>
+            <w:tcBorders>
+              <w:top w:val="single" w:sz="4" w:space="0" w:color="BFBFBF"/>
+              <w:left w:val="single" w:sz="4" w:space="0" w:color="BFBFBF"/>
+              <w:bottom w:val="single" w:sz="4" w:space="0" w:color="BFBFBF"/>
+              <w:right w:val="single" w:sz="4" w:space="0" w:color="BFBFBF"/>
+            </w:tcBorders>
+          </w:tcPr>
+          <w:p>
+            <w:pPr>
+              <w:pStyle w:val="Normal"/>
+              <w:spacing w:before="0" w:after="20"/>
+              <w:rPr/>
+            </w:pPr>
+            <w:r>
+              <w:rPr>
+                <w:sz w:val="19"/>
+                <w:szCs w:val="19"/>
+              </w:rPr>
+              <w:t>Verificación de los incidentes hacktivistas: 4 verificados (fiabilidad D) y 2 descartados; resultados con la variante 'solo verificados'.</w:t>
             </w:r>
           </w:p>
         </w:tc>
@@ -1020,7 +1098,7 @@
             </w:rPr>
             <w:fldChar w:fldCharType="separate"/>
           </w:r>
-          <w:hyperlink w:anchor="__RefHeading___Toc3051_1723578586">
+          <w:hyperlink w:anchor="__RefHeading___Toc3123_1804765426">
             <w:r>
               <w:rPr>
                 <w:rStyle w:val="IndexLink"/>
@@ -1040,7 +1118,7 @@
             </w:tabs>
             <w:rPr/>
           </w:pPr>
-          <w:hyperlink w:anchor="__RefHeading___Toc3053_1723578586">
+          <w:hyperlink w:anchor="__RefHeading___Toc3125_1804765426">
             <w:r>
               <w:rPr>
                 <w:rStyle w:val="IndexLink"/>
@@ -1060,7 +1138,7 @@
             </w:tabs>
             <w:rPr/>
           </w:pPr>
-          <w:hyperlink w:anchor="__RefHeading___Toc3055_1723578586">
+          <w:hyperlink w:anchor="__RefHeading___Toc3127_1804765426">
             <w:r>
               <w:rPr>
                 <w:rStyle w:val="IndexLink"/>
@@ -1080,7 +1158,7 @@
             </w:tabs>
             <w:rPr/>
           </w:pPr>
-          <w:hyperlink w:anchor="__RefHeading___Toc3057_1723578586">
+          <w:hyperlink w:anchor="__RefHeading___Toc3129_1804765426">
             <w:r>
               <w:rPr>
                 <w:rStyle w:val="IndexLink"/>
@@ -1100,7 +1178,7 @@
             </w:tabs>
             <w:rPr/>
           </w:pPr>
-          <w:hyperlink w:anchor="__RefHeading___Toc3059_1723578586">
+          <w:hyperlink w:anchor="__RefHeading___Toc3131_1804765426">
             <w:r>
               <w:rPr>
                 <w:rStyle w:val="IndexLink"/>
@@ -1120,7 +1198,7 @@
             </w:tabs>
             <w:rPr/>
           </w:pPr>
-          <w:hyperlink w:anchor="__RefHeading___Toc3061_1723578586">
+          <w:hyperlink w:anchor="__RefHeading___Toc3133_1804765426">
             <w:r>
               <w:rPr>
                 <w:rStyle w:val="IndexLink"/>
@@ -1140,7 +1218,7 @@
             </w:tabs>
             <w:rPr/>
           </w:pPr>
-          <w:hyperlink w:anchor="__RefHeading___Toc3063_1723578586">
+          <w:hyperlink w:anchor="__RefHeading___Toc3135_1804765426">
             <w:r>
               <w:rPr>
                 <w:rStyle w:val="IndexLink"/>
@@ -1160,7 +1238,7 @@
             </w:tabs>
             <w:rPr/>
           </w:pPr>
-          <w:hyperlink w:anchor="__RefHeading___Toc3065_1723578586">
+          <w:hyperlink w:anchor="__RefHeading___Toc3137_1804765426">
             <w:r>
               <w:rPr>
                 <w:rStyle w:val="IndexLink"/>
@@ -1180,7 +1258,7 @@
             </w:tabs>
             <w:rPr/>
           </w:pPr>
-          <w:hyperlink w:anchor="__RefHeading___Toc3067_1723578586">
+          <w:hyperlink w:anchor="__RefHeading___Toc3139_1804765426">
             <w:r>
               <w:rPr>
                 <w:rStyle w:val="IndexLink"/>
@@ -1200,7 +1278,7 @@
             </w:tabs>
             <w:rPr/>
           </w:pPr>
-          <w:hyperlink w:anchor="__RefHeading___Toc3069_1723578586">
+          <w:hyperlink w:anchor="__RefHeading___Toc3141_1804765426">
             <w:r>
               <w:rPr>
                 <w:rStyle w:val="IndexLink"/>
@@ -1220,7 +1298,7 @@
             </w:tabs>
             <w:rPr/>
           </w:pPr>
-          <w:hyperlink w:anchor="__RefHeading___Toc3071_1723578586">
+          <w:hyperlink w:anchor="__RefHeading___Toc3143_1804765426">
             <w:r>
               <w:rPr>
                 <w:rStyle w:val="IndexLink"/>
@@ -1240,7 +1318,7 @@
             </w:tabs>
             <w:rPr/>
           </w:pPr>
-          <w:hyperlink w:anchor="__RefHeading___Toc3073_1723578586">
+          <w:hyperlink w:anchor="__RefHeading___Toc3145_1804765426">
             <w:r>
               <w:rPr>
                 <w:rStyle w:val="IndexLink"/>
@@ -1260,7 +1338,7 @@
             </w:tabs>
             <w:rPr/>
           </w:pPr>
-          <w:hyperlink w:anchor="__RefHeading___Toc3075_1723578586">
+          <w:hyperlink w:anchor="__RefHeading___Toc3147_1804765426">
             <w:r>
               <w:rPr>
                 <w:rStyle w:val="IndexLink"/>
@@ -1280,7 +1358,7 @@
             </w:tabs>
             <w:rPr/>
           </w:pPr>
-          <w:hyperlink w:anchor="__RefHeading___Toc3077_1723578586">
+          <w:hyperlink w:anchor="__RefHeading___Toc3149_1804765426">
             <w:r>
               <w:rPr>
                 <w:rStyle w:val="IndexLink"/>
@@ -1300,7 +1378,7 @@
             </w:tabs>
             <w:rPr/>
           </w:pPr>
-          <w:hyperlink w:anchor="__RefHeading___Toc3079_1723578586">
+          <w:hyperlink w:anchor="__RefHeading___Toc3151_1804765426">
             <w:r>
               <w:rPr>
                 <w:rStyle w:val="IndexLink"/>
@@ -1320,7 +1398,7 @@
             </w:tabs>
             <w:rPr/>
           </w:pPr>
-          <w:hyperlink w:anchor="__RefHeading___Toc3081_1723578586">
+          <w:hyperlink w:anchor="__RefHeading___Toc3153_1804765426">
             <w:r>
               <w:rPr>
                 <w:rStyle w:val="IndexLink"/>
@@ -1340,7 +1418,7 @@
             </w:tabs>
             <w:rPr/>
           </w:pPr>
-          <w:hyperlink w:anchor="__RefHeading___Toc3083_1723578586">
+          <w:hyperlink w:anchor="__RefHeading___Toc3155_1804765426">
             <w:r>
               <w:rPr>
                 <w:rStyle w:val="IndexLink"/>
@@ -1360,7 +1438,7 @@
             </w:tabs>
             <w:rPr/>
           </w:pPr>
-          <w:hyperlink w:anchor="__RefHeading___Toc3085_1723578586">
+          <w:hyperlink w:anchor="__RefHeading___Toc3157_1804765426">
             <w:r>
               <w:rPr>
                 <w:rStyle w:val="IndexLink"/>
@@ -1380,7 +1458,7 @@
             </w:tabs>
             <w:rPr/>
           </w:pPr>
-          <w:hyperlink w:anchor="__RefHeading___Toc3087_1723578586">
+          <w:hyperlink w:anchor="__RefHeading___Toc3159_1804765426">
             <w:r>
               <w:rPr>
                 <w:rStyle w:val="IndexLink"/>
@@ -1400,7 +1478,7 @@
             </w:tabs>
             <w:rPr/>
           </w:pPr>
-          <w:hyperlink w:anchor="__RefHeading___Toc3089_1723578586">
+          <w:hyperlink w:anchor="__RefHeading___Toc3161_1804765426">
             <w:r>
               <w:rPr>
                 <w:rStyle w:val="IndexLink"/>
@@ -1420,7 +1498,7 @@
             </w:tabs>
             <w:rPr/>
           </w:pPr>
-          <w:hyperlink w:anchor="__RefHeading___Toc3091_1723578586">
+          <w:hyperlink w:anchor="__RefHeading___Toc3163_1804765426">
             <w:r>
               <w:rPr>
                 <w:rStyle w:val="IndexLink"/>
@@ -1440,7 +1518,7 @@
             </w:tabs>
             <w:rPr/>
           </w:pPr>
-          <w:hyperlink w:anchor="__RefHeading___Toc3093_1723578586">
+          <w:hyperlink w:anchor="__RefHeading___Toc3165_1804765426">
             <w:r>
               <w:rPr>
                 <w:rStyle w:val="IndexLink"/>
@@ -1460,7 +1538,7 @@
             </w:tabs>
             <w:rPr/>
           </w:pPr>
-          <w:hyperlink w:anchor="__RefHeading___Toc3095_1723578586">
+          <w:hyperlink w:anchor="__RefHeading___Toc3167_1804765426">
             <w:r>
               <w:rPr>
                 <w:rStyle w:val="IndexLink"/>
@@ -1480,7 +1558,7 @@
             </w:tabs>
             <w:rPr/>
           </w:pPr>
-          <w:hyperlink w:anchor="__RefHeading___Toc3097_1723578586">
+          <w:hyperlink w:anchor="__RefHeading___Toc3169_1804765426">
             <w:r>
               <w:rPr>
                 <w:rStyle w:val="IndexLink"/>
@@ -1500,7 +1578,7 @@
             </w:tabs>
             <w:rPr/>
           </w:pPr>
-          <w:hyperlink w:anchor="__RefHeading___Toc3099_1723578586">
+          <w:hyperlink w:anchor="__RefHeading___Toc3171_1804765426">
             <w:r>
               <w:rPr>
                 <w:rStyle w:val="IndexLink"/>
@@ -1520,7 +1598,7 @@
             </w:tabs>
             <w:rPr/>
           </w:pPr>
-          <w:hyperlink w:anchor="__RefHeading___Toc3101_1723578586">
+          <w:hyperlink w:anchor="__RefHeading___Toc3173_1804765426">
             <w:r>
               <w:rPr>
                 <w:rStyle w:val="IndexLink"/>
@@ -1540,7 +1618,7 @@
             </w:tabs>
             <w:rPr/>
           </w:pPr>
-          <w:hyperlink w:anchor="__RefHeading___Toc3103_1723578586">
+          <w:hyperlink w:anchor="__RefHeading___Toc3175_1804765426">
             <w:r>
               <w:rPr>
                 <w:rStyle w:val="IndexLink"/>
@@ -1560,7 +1638,7 @@
             </w:tabs>
             <w:rPr/>
           </w:pPr>
-          <w:hyperlink w:anchor="__RefHeading___Toc3105_1723578586">
+          <w:hyperlink w:anchor="__RefHeading___Toc3177_1804765426">
             <w:r>
               <w:rPr>
                 <w:rStyle w:val="IndexLink"/>
@@ -1580,7 +1658,7 @@
             </w:tabs>
             <w:rPr/>
           </w:pPr>
-          <w:hyperlink w:anchor="__RefHeading___Toc3107_1723578586">
+          <w:hyperlink w:anchor="__RefHeading___Toc3179_1804765426">
             <w:r>
               <w:rPr>
                 <w:rStyle w:val="IndexLink"/>
@@ -1600,7 +1678,7 @@
             </w:tabs>
             <w:rPr/>
           </w:pPr>
-          <w:hyperlink w:anchor="__RefHeading___Toc3109_1723578586">
+          <w:hyperlink w:anchor="__RefHeading___Toc3181_1804765426">
             <w:r>
               <w:rPr>
                 <w:rStyle w:val="IndexLink"/>
@@ -1620,7 +1698,7 @@
             </w:tabs>
             <w:rPr/>
           </w:pPr>
-          <w:hyperlink w:anchor="__RefHeading___Toc3111_1723578586">
+          <w:hyperlink w:anchor="__RefHeading___Toc3183_1804765426">
             <w:r>
               <w:rPr>
                 <w:rStyle w:val="IndexLink"/>
@@ -1640,7 +1718,7 @@
             </w:tabs>
             <w:rPr/>
           </w:pPr>
-          <w:hyperlink w:anchor="__RefHeading___Toc3113_1723578586">
+          <w:hyperlink w:anchor="__RefHeading___Toc3185_1804765426">
             <w:r>
               <w:rPr>
                 <w:rStyle w:val="IndexLink"/>
@@ -1660,7 +1738,7 @@
             </w:tabs>
             <w:rPr/>
           </w:pPr>
-          <w:hyperlink w:anchor="__RefHeading___Toc3115_1723578586">
+          <w:hyperlink w:anchor="__RefHeading___Toc3187_1804765426">
             <w:r>
               <w:rPr>
                 <w:rStyle w:val="IndexLink"/>
@@ -1680,7 +1758,7 @@
             </w:tabs>
             <w:rPr/>
           </w:pPr>
-          <w:hyperlink w:anchor="__RefHeading___Toc3117_1723578586">
+          <w:hyperlink w:anchor="__RefHeading___Toc3189_1804765426">
             <w:r>
               <w:rPr>
                 <w:rStyle w:val="IndexLink"/>
@@ -1700,7 +1778,7 @@
             </w:tabs>
             <w:rPr/>
           </w:pPr>
-          <w:hyperlink w:anchor="__RefHeading___Toc3119_1723578586">
+          <w:hyperlink w:anchor="__RefHeading___Toc3191_1804765426">
             <w:r>
               <w:rPr>
                 <w:rStyle w:val="IndexLink"/>
@@ -1720,7 +1798,7 @@
             </w:tabs>
             <w:rPr/>
           </w:pPr>
-          <w:hyperlink w:anchor="__RefHeading___Toc3121_1723578586">
+          <w:hyperlink w:anchor="__RefHeading___Toc3193_1804765426">
             <w:r>
               <w:rPr>
                 <w:rStyle w:val="IndexLink"/>
@@ -1740,7 +1818,7 @@
             </w:tabs>
             <w:rPr/>
           </w:pPr>
-          <w:hyperlink w:anchor="__RefHeading___Toc3123_1723578586">
+          <w:hyperlink w:anchor="__RefHeading___Toc3195_1804765426">
             <w:r>
               <w:rPr>
                 <w:rStyle w:val="IndexLink"/>
@@ -1760,7 +1838,7 @@
             </w:tabs>
             <w:rPr/>
           </w:pPr>
-          <w:hyperlink w:anchor="__RefHeading___Toc3125_1723578586">
+          <w:hyperlink w:anchor="__RefHeading___Toc3197_1804765426">
             <w:r>
               <w:rPr>
                 <w:rStyle w:val="IndexLink"/>
@@ -1780,7 +1858,7 @@
             </w:tabs>
             <w:rPr/>
           </w:pPr>
-          <w:hyperlink w:anchor="__RefHeading___Toc3127_1723578586">
+          <w:hyperlink w:anchor="__RefHeading___Toc3199_1804765426">
             <w:r>
               <w:rPr>
                 <w:rStyle w:val="IndexLink"/>
@@ -1800,7 +1878,7 @@
             </w:tabs>
             <w:rPr/>
           </w:pPr>
-          <w:hyperlink w:anchor="__RefHeading___Toc3129_1723578586">
+          <w:hyperlink w:anchor="__RefHeading___Toc3201_1804765426">
             <w:r>
               <w:rPr>
                 <w:rStyle w:val="IndexLink"/>
@@ -1820,7 +1898,7 @@
             </w:tabs>
             <w:rPr/>
           </w:pPr>
-          <w:hyperlink w:anchor="__RefHeading___Toc3131_1723578586">
+          <w:hyperlink w:anchor="__RefHeading___Toc3203_1804765426">
             <w:r>
               <w:rPr>
                 <w:rStyle w:val="IndexLink"/>
@@ -1840,7 +1918,7 @@
             </w:tabs>
             <w:rPr/>
           </w:pPr>
-          <w:hyperlink w:anchor="__RefHeading___Toc3133_1723578586">
+          <w:hyperlink w:anchor="__RefHeading___Toc3205_1804765426">
             <w:r>
               <w:rPr>
                 <w:rStyle w:val="IndexLink"/>
@@ -1860,7 +1938,7 @@
             </w:tabs>
             <w:rPr/>
           </w:pPr>
-          <w:hyperlink w:anchor="__RefHeading___Toc3135_1723578586">
+          <w:hyperlink w:anchor="__RefHeading___Toc3207_1804765426">
             <w:r>
               <w:rPr>
                 <w:rStyle w:val="IndexLink"/>
@@ -1880,7 +1958,7 @@
             </w:tabs>
             <w:rPr/>
           </w:pPr>
-          <w:hyperlink w:anchor="__RefHeading___Toc3137_1723578586">
+          <w:hyperlink w:anchor="__RefHeading___Toc3209_1804765426">
             <w:r>
               <w:rPr>
                 <w:rStyle w:val="IndexLink"/>
@@ -1900,7 +1978,7 @@
             </w:tabs>
             <w:rPr/>
           </w:pPr>
-          <w:hyperlink w:anchor="__RefHeading___Toc3139_1723578586">
+          <w:hyperlink w:anchor="__RefHeading___Toc3211_1804765426">
             <w:r>
               <w:rPr>
                 <w:rStyle w:val="IndexLink"/>
@@ -1920,7 +1998,7 @@
             </w:tabs>
             <w:rPr/>
           </w:pPr>
-          <w:hyperlink w:anchor="__RefHeading___Toc3141_1723578586">
+          <w:hyperlink w:anchor="__RefHeading___Toc3213_1804765426">
             <w:r>
               <w:rPr>
                 <w:rStyle w:val="IndexLink"/>
@@ -1940,7 +2018,7 @@
             </w:tabs>
             <w:rPr/>
           </w:pPr>
-          <w:hyperlink w:anchor="__RefHeading___Toc3143_1723578586">
+          <w:hyperlink w:anchor="__RefHeading___Toc3215_1804765426">
             <w:r>
               <w:rPr>
                 <w:rStyle w:val="IndexLink"/>
@@ -1960,7 +2038,7 @@
             </w:tabs>
             <w:rPr/>
           </w:pPr>
-          <w:hyperlink w:anchor="__RefHeading___Toc3145_1723578586">
+          <w:hyperlink w:anchor="__RefHeading___Toc3217_1804765426">
             <w:r>
               <w:rPr>
                 <w:rStyle w:val="IndexLink"/>
@@ -1980,7 +2058,7 @@
             </w:tabs>
             <w:rPr/>
           </w:pPr>
-          <w:hyperlink w:anchor="__RefHeading___Toc3147_1723578586">
+          <w:hyperlink w:anchor="__RefHeading___Toc3219_1804765426">
             <w:r>
               <w:rPr>
                 <w:rStyle w:val="IndexLink"/>
@@ -2000,7 +2078,7 @@
             </w:tabs>
             <w:rPr/>
           </w:pPr>
-          <w:hyperlink w:anchor="__RefHeading___Toc3149_1723578586">
+          <w:hyperlink w:anchor="__RefHeading___Toc3221_1804765426">
             <w:r>
               <w:rPr>
                 <w:rStyle w:val="IndexLink"/>
@@ -2020,7 +2098,7 @@
             </w:tabs>
             <w:rPr/>
           </w:pPr>
-          <w:hyperlink w:anchor="__RefHeading___Toc3151_1723578586">
+          <w:hyperlink w:anchor="__RefHeading___Toc3223_1804765426">
             <w:r>
               <w:rPr>
                 <w:rStyle w:val="IndexLink"/>
@@ -2040,14 +2118,14 @@
             </w:tabs>
             <w:rPr/>
           </w:pPr>
-          <w:hyperlink w:anchor="__RefHeading___Toc3153_1723578586">
+          <w:hyperlink w:anchor="__RefHeading___Toc3225_1804765426">
             <w:r>
               <w:rPr>
                 <w:rStyle w:val="IndexLink"/>
               </w:rPr>
               <w:t>Anexo A. Bitácora del proyecto</w:t>
               <w:tab/>
-              <w:t>30</w:t>
+              <w:t>31</w:t>
             </w:r>
           </w:hyperlink>
         </w:p>
@@ -2060,14 +2138,14 @@
             </w:tabs>
             <w:rPr/>
           </w:pPr>
-          <w:hyperlink w:anchor="__RefHeading___Toc3155_1723578586">
+          <w:hyperlink w:anchor="__RefHeading___Toc3227_1804765426">
             <w:r>
               <w:rPr>
                 <w:rStyle w:val="IndexLink"/>
               </w:rPr>
               <w:t>Anexo B. Glosario</w:t>
               <w:tab/>
-              <w:t>34</w:t>
+              <w:t>35</w:t>
             </w:r>
           </w:hyperlink>
           <w:r>
@@ -2096,7 +2174,7 @@
         <w:pStyle w:val="Heading1"/>
         <w:rPr/>
       </w:pPr>
-      <w:bookmarkStart w:id="0" w:name="__RefHeading___Toc3051_1723578586"/>
+      <w:bookmarkStart w:id="0" w:name="__RefHeading___Toc3123_1804765426"/>
       <w:bookmarkEnd w:id="0"/>
       <w:r>
         <w:rPr/>
@@ -2108,7 +2186,7 @@
         <w:pStyle w:val="Heading2"/>
         <w:rPr/>
       </w:pPr>
-      <w:bookmarkStart w:id="1" w:name="__RefHeading___Toc3053_1723578586"/>
+      <w:bookmarkStart w:id="1" w:name="__RefHeading___Toc3125_1804765426"/>
       <w:bookmarkEnd w:id="1"/>
       <w:r>
         <w:rPr/>
@@ -2164,7 +2242,7 @@
         <w:pStyle w:val="Heading2"/>
         <w:rPr/>
       </w:pPr>
-      <w:bookmarkStart w:id="2" w:name="__RefHeading___Toc3055_1723578586"/>
+      <w:bookmarkStart w:id="2" w:name="__RefHeading___Toc3127_1804765426"/>
       <w:bookmarkEnd w:id="2"/>
       <w:r>
         <w:rPr/>
@@ -2266,7 +2344,7 @@
         <w:pStyle w:val="Heading2"/>
         <w:rPr/>
       </w:pPr>
-      <w:bookmarkStart w:id="3" w:name="__RefHeading___Toc3057_1723578586"/>
+      <w:bookmarkStart w:id="3" w:name="__RefHeading___Toc3129_1804765426"/>
       <w:bookmarkEnd w:id="3"/>
       <w:r>
         <w:rPr/>
@@ -2303,7 +2381,7 @@
         <w:pStyle w:val="Heading1"/>
         <w:rPr/>
       </w:pPr>
-      <w:bookmarkStart w:id="4" w:name="__RefHeading___Toc3059_1723578586"/>
+      <w:bookmarkStart w:id="4" w:name="__RefHeading___Toc3131_1804765426"/>
       <w:bookmarkEnd w:id="4"/>
       <w:r>
         <w:rPr/>
@@ -2315,7 +2393,7 @@
         <w:pStyle w:val="Heading2"/>
         <w:rPr/>
       </w:pPr>
-      <w:bookmarkStart w:id="5" w:name="__RefHeading___Toc3061_1723578586"/>
+      <w:bookmarkStart w:id="5" w:name="__RefHeading___Toc3133_1804765426"/>
       <w:bookmarkEnd w:id="5"/>
       <w:r>
         <w:rPr/>
@@ -2349,7 +2427,7 @@
         <w:pStyle w:val="Heading2"/>
         <w:rPr/>
       </w:pPr>
-      <w:bookmarkStart w:id="6" w:name="__RefHeading___Toc3063_1723578586"/>
+      <w:bookmarkStart w:id="6" w:name="__RefHeading___Toc3135_1804765426"/>
       <w:bookmarkEnd w:id="6"/>
       <w:r>
         <w:rPr/>
@@ -2613,7 +2691,7 @@
         <w:pStyle w:val="Heading2"/>
         <w:rPr/>
       </w:pPr>
-      <w:bookmarkStart w:id="7" w:name="__RefHeading___Toc3065_1723578586"/>
+      <w:bookmarkStart w:id="7" w:name="__RefHeading___Toc3137_1804765426"/>
       <w:bookmarkEnd w:id="7"/>
       <w:r>
         <w:rPr/>
@@ -3027,7 +3105,7 @@
       <w:r>
         <w:br w:type="page"/>
       </w:r>
-      <w:bookmarkStart w:id="8" w:name="__RefHeading___Toc3067_1723578586"/>
+      <w:bookmarkStart w:id="8" w:name="__RefHeading___Toc3139_1804765426"/>
       <w:bookmarkEnd w:id="8"/>
       <w:r>
         <w:rPr/>
@@ -3611,7 +3689,7 @@
       <w:r>
         <w:br w:type="page"/>
       </w:r>
-      <w:bookmarkStart w:id="9" w:name="__RefHeading___Toc3069_1723578586"/>
+      <w:bookmarkStart w:id="9" w:name="__RefHeading___Toc3141_1804765426"/>
       <w:bookmarkEnd w:id="9"/>
       <w:r>
         <w:rPr/>
@@ -3845,7 +3923,7 @@
         <w:pStyle w:val="Heading2"/>
         <w:rPr/>
       </w:pPr>
-      <w:bookmarkStart w:id="10" w:name="__RefHeading___Toc3071_1723578586"/>
+      <w:bookmarkStart w:id="10" w:name="__RefHeading___Toc3143_1804765426"/>
       <w:bookmarkEnd w:id="10"/>
       <w:r>
         <w:rPr/>
@@ -4152,7 +4230,7 @@
         <w:pStyle w:val="Heading1"/>
         <w:rPr/>
       </w:pPr>
-      <w:bookmarkStart w:id="11" w:name="__RefHeading___Toc3073_1723578586"/>
+      <w:bookmarkStart w:id="11" w:name="__RefHeading___Toc3145_1804765426"/>
       <w:bookmarkEnd w:id="11"/>
       <w:r>
         <w:rPr/>
@@ -4164,7 +4242,7 @@
         <w:pStyle w:val="Heading2"/>
         <w:rPr/>
       </w:pPr>
-      <w:bookmarkStart w:id="12" w:name="__RefHeading___Toc3075_1723578586"/>
+      <w:bookmarkStart w:id="12" w:name="__RefHeading___Toc3147_1804765426"/>
       <w:bookmarkEnd w:id="12"/>
       <w:r>
         <w:rPr/>
@@ -4954,7 +5032,7 @@
         <w:pStyle w:val="Heading2"/>
         <w:rPr/>
       </w:pPr>
-      <w:bookmarkStart w:id="13" w:name="__RefHeading___Toc3077_1723578586"/>
+      <w:bookmarkStart w:id="13" w:name="__RefHeading___Toc3149_1804765426"/>
       <w:bookmarkEnd w:id="13"/>
       <w:r>
         <w:rPr/>
@@ -5132,7 +5210,7 @@
         <w:pStyle w:val="Heading2"/>
         <w:rPr/>
       </w:pPr>
-      <w:bookmarkStart w:id="14" w:name="__RefHeading___Toc3079_1723578586"/>
+      <w:bookmarkStart w:id="14" w:name="__RefHeading___Toc3151_1804765426"/>
       <w:bookmarkEnd w:id="14"/>
       <w:r>
         <w:rPr/>
@@ -5622,7 +5700,7 @@
         <w:pStyle w:val="Heading2"/>
         <w:rPr/>
       </w:pPr>
-      <w:bookmarkStart w:id="15" w:name="__RefHeading___Toc3081_1723578586"/>
+      <w:bookmarkStart w:id="15" w:name="__RefHeading___Toc3153_1804765426"/>
       <w:bookmarkEnd w:id="15"/>
       <w:r>
         <w:rPr/>
@@ -6617,7 +6695,7 @@
         <w:pStyle w:val="Heading1"/>
         <w:rPr/>
       </w:pPr>
-      <w:bookmarkStart w:id="16" w:name="__RefHeading___Toc3083_1723578586"/>
+      <w:bookmarkStart w:id="16" w:name="__RefHeading___Toc3155_1804765426"/>
       <w:bookmarkEnd w:id="16"/>
       <w:r>
         <w:rPr/>
@@ -6629,7 +6707,7 @@
         <w:pStyle w:val="Heading2"/>
         <w:rPr/>
       </w:pPr>
-      <w:bookmarkStart w:id="17" w:name="__RefHeading___Toc3085_1723578586"/>
+      <w:bookmarkStart w:id="17" w:name="__RefHeading___Toc3157_1804765426"/>
       <w:bookmarkEnd w:id="17"/>
       <w:r>
         <w:rPr/>
@@ -6904,7 +6982,7 @@
         <w:pStyle w:val="Heading2"/>
         <w:rPr/>
       </w:pPr>
-      <w:bookmarkStart w:id="18" w:name="__RefHeading___Toc3087_1723578586"/>
+      <w:bookmarkStart w:id="18" w:name="__RefHeading___Toc3159_1804765426"/>
       <w:bookmarkEnd w:id="18"/>
       <w:r>
         <w:rPr/>
@@ -7002,7 +7080,7 @@
         <w:pStyle w:val="Heading2"/>
         <w:rPr/>
       </w:pPr>
-      <w:bookmarkStart w:id="19" w:name="__RefHeading___Toc3089_1723578586"/>
+      <w:bookmarkStart w:id="19" w:name="__RefHeading___Toc3161_1804765426"/>
       <w:bookmarkEnd w:id="19"/>
       <w:r>
         <w:rPr/>
@@ -7508,7 +7586,7 @@
       <w:r>
         <w:br w:type="page"/>
       </w:r>
-      <w:bookmarkStart w:id="20" w:name="__RefHeading___Toc3091_1723578586"/>
+      <w:bookmarkStart w:id="20" w:name="__RefHeading___Toc3163_1804765426"/>
       <w:bookmarkEnd w:id="20"/>
       <w:r>
         <w:rPr/>
@@ -7520,7 +7598,7 @@
         <w:pStyle w:val="Heading2"/>
         <w:rPr/>
       </w:pPr>
-      <w:bookmarkStart w:id="21" w:name="__RefHeading___Toc3093_1723578586"/>
+      <w:bookmarkStart w:id="21" w:name="__RefHeading___Toc3165_1804765426"/>
       <w:bookmarkEnd w:id="21"/>
       <w:r>
         <w:rPr/>
@@ -7686,7 +7764,7 @@
         <w:pStyle w:val="Heading2"/>
         <w:rPr/>
       </w:pPr>
-      <w:bookmarkStart w:id="22" w:name="__RefHeading___Toc3095_1723578586"/>
+      <w:bookmarkStart w:id="22" w:name="__RefHeading___Toc3167_1804765426"/>
       <w:bookmarkEnd w:id="22"/>
       <w:r>
         <w:rPr/>
@@ -8220,7 +8298,7 @@
         <w:pStyle w:val="Heading2"/>
         <w:rPr/>
       </w:pPr>
-      <w:bookmarkStart w:id="23" w:name="__RefHeading___Toc3097_1723578586"/>
+      <w:bookmarkStart w:id="23" w:name="__RefHeading___Toc3169_1804765426"/>
       <w:bookmarkEnd w:id="23"/>
       <w:r>
         <w:rPr/>
@@ -8658,7 +8736,7 @@
       <w:r>
         <w:br w:type="page"/>
       </w:r>
-      <w:bookmarkStart w:id="24" w:name="__RefHeading___Toc3099_1723578586"/>
+      <w:bookmarkStart w:id="24" w:name="__RefHeading___Toc3171_1804765426"/>
       <w:bookmarkEnd w:id="24"/>
       <w:r>
         <w:rPr/>
@@ -8758,7 +8836,7 @@
         <w:pStyle w:val="Heading2"/>
         <w:rPr/>
       </w:pPr>
-      <w:bookmarkStart w:id="25" w:name="__RefHeading___Toc3101_1723578586"/>
+      <w:bookmarkStart w:id="25" w:name="__RefHeading___Toc3173_1804765426"/>
       <w:bookmarkEnd w:id="25"/>
       <w:r>
         <w:rPr/>
@@ -9224,7 +9302,7 @@
         <w:pStyle w:val="Heading1"/>
         <w:rPr/>
       </w:pPr>
-      <w:bookmarkStart w:id="26" w:name="__RefHeading___Toc3103_1723578586"/>
+      <w:bookmarkStart w:id="26" w:name="__RefHeading___Toc3175_1804765426"/>
       <w:bookmarkEnd w:id="26"/>
       <w:r>
         <w:rPr/>
@@ -9236,7 +9314,7 @@
         <w:pStyle w:val="Heading2"/>
         <w:rPr/>
       </w:pPr>
-      <w:bookmarkStart w:id="27" w:name="__RefHeading___Toc3105_1723578586"/>
+      <w:bookmarkStart w:id="27" w:name="__RefHeading___Toc3177_1804765426"/>
       <w:bookmarkEnd w:id="27"/>
       <w:r>
         <w:rPr/>
@@ -9593,7 +9671,7 @@
         <w:pStyle w:val="Heading2"/>
         <w:rPr/>
       </w:pPr>
-      <w:bookmarkStart w:id="28" w:name="__RefHeading___Toc3107_1723578586"/>
+      <w:bookmarkStart w:id="28" w:name="__RefHeading___Toc3179_1804765426"/>
       <w:bookmarkEnd w:id="28"/>
       <w:r>
         <w:rPr/>
@@ -9881,7 +9959,7 @@
         <w:pStyle w:val="Heading2"/>
         <w:rPr/>
       </w:pPr>
-      <w:bookmarkStart w:id="29" w:name="__RefHeading___Toc3109_1723578586"/>
+      <w:bookmarkStart w:id="29" w:name="__RefHeading___Toc3181_1804765426"/>
       <w:bookmarkEnd w:id="29"/>
       <w:r>
         <w:rPr/>
@@ -10084,7 +10162,7 @@
         <w:pStyle w:val="Heading1"/>
         <w:rPr/>
       </w:pPr>
-      <w:bookmarkStart w:id="30" w:name="__RefHeading___Toc3111_1723578586"/>
+      <w:bookmarkStart w:id="30" w:name="__RefHeading___Toc3183_1804765426"/>
       <w:bookmarkEnd w:id="30"/>
       <w:r>
         <w:rPr/>
@@ -10096,7 +10174,7 @@
         <w:pStyle w:val="Heading2"/>
         <w:rPr/>
       </w:pPr>
-      <w:bookmarkStart w:id="31" w:name="__RefHeading___Toc3113_1723578586"/>
+      <w:bookmarkStart w:id="31" w:name="__RefHeading___Toc3185_1804765426"/>
       <w:bookmarkEnd w:id="31"/>
       <w:r>
         <w:rPr/>
@@ -10123,7 +10201,7 @@
       </w:r>
       <w:r>
         <w:rPr/>
-        <w:t xml:space="preserve"> contiene 18 pruebas que se ejecutan antes de cada revisión. Si alguna falla, la revisión se detiene y la web publicada no cambia.</w:t>
+        <w:t xml:space="preserve"> contiene 19 pruebas que se ejecutan antes de cada revisión. Si alguna falla, la revisión se detiene y la web publicada no cambia.</w:t>
       </w:r>
     </w:p>
     <w:tbl>
@@ -11060,7 +11138,7 @@
         <w:pStyle w:val="Heading2"/>
         <w:rPr/>
       </w:pPr>
-      <w:bookmarkStart w:id="32" w:name="__RefHeading___Toc3115_1723578586"/>
+      <w:bookmarkStart w:id="32" w:name="__RefHeading___Toc3187_1804765426"/>
       <w:bookmarkEnd w:id="32"/>
       <w:r>
         <w:rPr/>
@@ -11654,7 +11732,7 @@
       <w:r>
         <w:br w:type="page"/>
       </w:r>
-      <w:bookmarkStart w:id="33" w:name="__RefHeading___Toc3117_1723578586"/>
+      <w:bookmarkStart w:id="33" w:name="__RefHeading___Toc3189_1804765426"/>
       <w:bookmarkEnd w:id="33"/>
       <w:r>
         <w:rPr/>
@@ -12482,7 +12560,7 @@
       <w:r>
         <w:br w:type="page"/>
       </w:r>
-      <w:bookmarkStart w:id="34" w:name="__RefHeading___Toc3119_1723578586"/>
+      <w:bookmarkStart w:id="34" w:name="__RefHeading___Toc3191_1804765426"/>
       <w:bookmarkEnd w:id="34"/>
       <w:r>
         <w:rPr/>
@@ -14494,6 +14572,84 @@
           </w:p>
         </w:tc>
       </w:tr>
+      <w:tr>
+        <w:trPr/>
+        <w:tc>
+          <w:tcPr>
+            <w:tcW w:w="1099" w:type="dxa"/>
+            <w:tcBorders>
+              <w:top w:val="single" w:sz="4" w:space="0" w:color="BFBFBF"/>
+              <w:left w:val="single" w:sz="4" w:space="0" w:color="BFBFBF"/>
+              <w:bottom w:val="single" w:sz="4" w:space="0" w:color="BFBFBF"/>
+              <w:right w:val="single" w:sz="4" w:space="0" w:color="BFBFBF"/>
+            </w:tcBorders>
+          </w:tcPr>
+          <w:p>
+            <w:pPr>
+              <w:pStyle w:val="Normal"/>
+              <w:spacing w:before="0" w:after="20"/>
+              <w:rPr/>
+            </w:pPr>
+            <w:r>
+              <w:rPr>
+                <w:sz w:val="19"/>
+                <w:szCs w:val="19"/>
+              </w:rPr>
+              <w:t>D33</w:t>
+            </w:r>
+          </w:p>
+        </w:tc>
+        <w:tc>
+          <w:tcPr>
+            <w:tcW w:w="4600" w:type="dxa"/>
+            <w:tcBorders>
+              <w:top w:val="single" w:sz="4" w:space="0" w:color="BFBFBF"/>
+              <w:left w:val="single" w:sz="4" w:space="0" w:color="BFBFBF"/>
+              <w:bottom w:val="single" w:sz="4" w:space="0" w:color="BFBFBF"/>
+              <w:right w:val="single" w:sz="4" w:space="0" w:color="BFBFBF"/>
+            </w:tcBorders>
+          </w:tcPr>
+          <w:p>
+            <w:pPr>
+              <w:pStyle w:val="Normal"/>
+              <w:spacing w:before="0" w:after="20"/>
+              <w:rPr/>
+            </w:pPr>
+            <w:r>
+              <w:rPr>
+                <w:sz w:val="19"/>
+                <w:szCs w:val="19"/>
+              </w:rPr>
+              <w:t>Incidentes descartados con motivo, fuera del cálculo</w:t>
+            </w:r>
+          </w:p>
+        </w:tc>
+        <w:tc>
+          <w:tcPr>
+            <w:tcW w:w="3939" w:type="dxa"/>
+            <w:tcBorders>
+              <w:top w:val="single" w:sz="4" w:space="0" w:color="BFBFBF"/>
+              <w:left w:val="single" w:sz="4" w:space="0" w:color="BFBFBF"/>
+              <w:bottom w:val="single" w:sz="4" w:space="0" w:color="BFBFBF"/>
+              <w:right w:val="single" w:sz="4" w:space="0" w:color="BFBFBF"/>
+            </w:tcBorders>
+          </w:tcPr>
+          <w:p>
+            <w:pPr>
+              <w:pStyle w:val="Normal"/>
+              <w:spacing w:before="0" w:after="20"/>
+              <w:rPr/>
+            </w:pPr>
+            <w:r>
+              <w:rPr>
+                <w:sz w:val="19"/>
+                <w:szCs w:val="19"/>
+              </w:rPr>
+              <w:t>Trazabilidad del análisis</w:t>
+            </w:r>
+          </w:p>
+        </w:tc>
+      </w:tr>
     </w:tbl>
     <w:p>
       <w:pPr>
@@ -14503,7 +14659,7 @@
       <w:r>
         <w:br w:type="page"/>
       </w:r>
-      <w:bookmarkStart w:id="35" w:name="__RefHeading___Toc3121_1723578586"/>
+      <w:bookmarkStart w:id="35" w:name="__RefHeading___Toc3193_1804765426"/>
       <w:bookmarkEnd w:id="35"/>
       <w:r>
         <w:rPr/>
@@ -14515,7 +14671,7 @@
         <w:pStyle w:val="Heading2"/>
         <w:rPr/>
       </w:pPr>
-      <w:bookmarkStart w:id="36" w:name="__RefHeading___Toc3123_1723578586"/>
+      <w:bookmarkStart w:id="36" w:name="__RefHeading___Toc3195_1804765426"/>
       <w:bookmarkEnd w:id="36"/>
       <w:r>
         <w:rPr/>
@@ -14591,7 +14747,7 @@
         <w:pStyle w:val="Heading2"/>
         <w:rPr/>
       </w:pPr>
-      <w:bookmarkStart w:id="37" w:name="__RefHeading___Toc3125_1723578586"/>
+      <w:bookmarkStart w:id="37" w:name="__RefHeading___Toc3197_1804765426"/>
       <w:bookmarkEnd w:id="37"/>
       <w:r>
         <w:rPr/>
@@ -14723,7 +14879,7 @@
       </w:r>
       <w:r>
         <w:rPr/>
-        <w:t xml:space="preserve"> quedan 13 incidentes (entre ellos 6 de los 7 hacktivistas) y los 16 hechos clave (sección 14.6). Averiguar las fechas de REM y Stucx Team.</w:t>
+        <w:t xml:space="preserve"> quedan 7 incidentes (entre ellos INC-022, AFA, e INC-013, Stucx Team, sin fecha) y los 16 hechos clave (sección 14.6).</w:t>
       </w:r>
     </w:p>
     <w:p>
@@ -14731,7 +14887,7 @@
         <w:pStyle w:val="Heading2"/>
         <w:rPr/>
       </w:pPr>
-      <w:bookmarkStart w:id="38" w:name="__RefHeading___Toc3127_1723578586"/>
+      <w:bookmarkStart w:id="38" w:name="__RefHeading___Toc3199_1804765426"/>
       <w:bookmarkEnd w:id="38"/>
       <w:r>
         <w:rPr/>
@@ -14812,7 +14968,7 @@
         <w:pStyle w:val="Heading1"/>
         <w:rPr/>
       </w:pPr>
-      <w:bookmarkStart w:id="39" w:name="__RefHeading___Toc3129_1723578586"/>
+      <w:bookmarkStart w:id="39" w:name="__RefHeading___Toc3201_1804765426"/>
       <w:bookmarkEnd w:id="39"/>
       <w:r>
         <w:rPr/>
@@ -14824,7 +14980,7 @@
         <w:pStyle w:val="Heading2"/>
         <w:rPr/>
       </w:pPr>
-      <w:bookmarkStart w:id="40" w:name="__RefHeading___Toc3131_1723578586"/>
+      <w:bookmarkStart w:id="40" w:name="__RefHeading___Toc3203_1804765426"/>
       <w:bookmarkEnd w:id="40"/>
       <w:r>
         <w:rPr/>
@@ -14847,7 +15003,7 @@
         <w:pStyle w:val="Heading2"/>
         <w:rPr/>
       </w:pPr>
-      <w:bookmarkStart w:id="41" w:name="__RefHeading___Toc3133_1723578586"/>
+      <w:bookmarkStart w:id="41" w:name="__RefHeading___Toc3205_1804765426"/>
       <w:bookmarkEnd w:id="41"/>
       <w:r>
         <w:rPr/>
@@ -14959,7 +15115,7 @@
         <w:pStyle w:val="Heading2"/>
         <w:rPr/>
       </w:pPr>
-      <w:bookmarkStart w:id="42" w:name="__RefHeading___Toc3135_1723578586"/>
+      <w:bookmarkStart w:id="42" w:name="__RefHeading___Toc3207_1804765426"/>
       <w:bookmarkEnd w:id="42"/>
       <w:r>
         <w:rPr/>
@@ -17239,7 +17395,7 @@
         <w:pStyle w:val="Heading2"/>
         <w:rPr/>
       </w:pPr>
-      <w:bookmarkStart w:id="43" w:name="__RefHeading___Toc3137_1723578586"/>
+      <w:bookmarkStart w:id="43" w:name="__RefHeading___Toc3209_1804765426"/>
       <w:bookmarkEnd w:id="43"/>
       <w:r>
         <w:rPr/>
@@ -17362,7 +17518,7 @@
         <w:pStyle w:val="Heading2"/>
         <w:rPr/>
       </w:pPr>
-      <w:bookmarkStart w:id="44" w:name="__RefHeading___Toc3139_1723578586"/>
+      <w:bookmarkStart w:id="44" w:name="__RefHeading___Toc3211_1804765426"/>
       <w:bookmarkEnd w:id="44"/>
       <w:r>
         <w:rPr/>
@@ -20011,7 +20167,7 @@
         <w:pStyle w:val="Heading2"/>
         <w:rPr/>
       </w:pPr>
-      <w:bookmarkStart w:id="45" w:name="__RefHeading___Toc3141_1723578586"/>
+      <w:bookmarkStart w:id="45" w:name="__RefHeading___Toc3213_1804765426"/>
       <w:bookmarkEnd w:id="45"/>
       <w:r>
         <w:rPr/>
@@ -20634,7 +20790,7 @@
         <w:pStyle w:val="Heading1"/>
         <w:rPr/>
       </w:pPr>
-      <w:bookmarkStart w:id="46" w:name="__RefHeading___Toc3143_1723578586"/>
+      <w:bookmarkStart w:id="46" w:name="__RefHeading___Toc3215_1804765426"/>
       <w:bookmarkEnd w:id="46"/>
       <w:r>
         <w:rPr/>
@@ -20646,7 +20802,7 @@
         <w:pStyle w:val="Heading2"/>
         <w:rPr/>
       </w:pPr>
-      <w:bookmarkStart w:id="47" w:name="__RefHeading___Toc3145_1723578586"/>
+      <w:bookmarkStart w:id="47" w:name="__RefHeading___Toc3217_1804765426"/>
       <w:bookmarkEnd w:id="47"/>
       <w:r>
         <w:rPr/>
@@ -20768,7 +20924,7 @@
         <w:pStyle w:val="Heading2"/>
         <w:rPr/>
       </w:pPr>
-      <w:bookmarkStart w:id="48" w:name="__RefHeading___Toc3147_1723578586"/>
+      <w:bookmarkStart w:id="48" w:name="__RefHeading___Toc3219_1804765426"/>
       <w:bookmarkEnd w:id="48"/>
       <w:r>
         <w:rPr/>
@@ -21039,21 +21195,21 @@
                 <w:sz w:val="19"/>
                 <w:szCs w:val="19"/>
               </w:rPr>
-              <w:t>1/7 (14.3 %)</w:t>
-            </w:r>
-          </w:p>
-          <w:p>
-            <w:pPr>
-              <w:pStyle w:val="Normal"/>
-              <w:spacing w:before="0" w:after="20"/>
-              <w:rPr/>
-            </w:pPr>
-            <w:r>
-              <w:rPr>
-                <w:sz w:val="19"/>
-                <w:szCs w:val="19"/>
-              </w:rPr>
-              <w:t>razón 0.76</w:t>
+              <w:t>1/6 (16.7 %)</w:t>
+            </w:r>
+          </w:p>
+          <w:p>
+            <w:pPr>
+              <w:pStyle w:val="Normal"/>
+              <w:spacing w:before="0" w:after="20"/>
+              <w:rPr/>
+            </w:pPr>
+            <w:r>
+              <w:rPr>
+                <w:sz w:val="19"/>
+                <w:szCs w:val="19"/>
+              </w:rPr>
+              <w:t>razón 0.89</w:t>
             </w:r>
           </w:p>
         </w:tc>
@@ -21209,21 +21365,21 @@
                 <w:sz w:val="19"/>
                 <w:szCs w:val="19"/>
               </w:rPr>
-              <w:t>1/7 (14.3 %)</w:t>
-            </w:r>
-          </w:p>
-          <w:p>
-            <w:pPr>
-              <w:pStyle w:val="Normal"/>
-              <w:spacing w:before="0" w:after="20"/>
-              <w:rPr/>
-            </w:pPr>
-            <w:r>
-              <w:rPr>
-                <w:sz w:val="19"/>
-                <w:szCs w:val="19"/>
-              </w:rPr>
-              <w:t>razón 0.56</w:t>
+              <w:t>1/6 (16.7 %)</w:t>
+            </w:r>
+          </w:p>
+          <w:p>
+            <w:pPr>
+              <w:pStyle w:val="Normal"/>
+              <w:spacing w:before="0" w:after="20"/>
+              <w:rPr/>
+            </w:pPr>
+            <w:r>
+              <w:rPr>
+                <w:sz w:val="19"/>
+                <w:szCs w:val="19"/>
+              </w:rPr>
+              <w:t>razón 0.65</w:t>
             </w:r>
           </w:p>
         </w:tc>
@@ -21379,21 +21535,21 @@
                 <w:sz w:val="19"/>
                 <w:szCs w:val="19"/>
               </w:rPr>
-              <w:t>2/7 (28.6 %)</w:t>
-            </w:r>
-          </w:p>
-          <w:p>
-            <w:pPr>
-              <w:pStyle w:val="Normal"/>
-              <w:spacing w:before="0" w:after="20"/>
-              <w:rPr/>
-            </w:pPr>
-            <w:r>
-              <w:rPr>
-                <w:sz w:val="19"/>
-                <w:szCs w:val="19"/>
-              </w:rPr>
-              <w:t>razón 0.88</w:t>
+              <w:t>2/6 (33.3 %)</w:t>
+            </w:r>
+          </w:p>
+          <w:p>
+            <w:pPr>
+              <w:pStyle w:val="Normal"/>
+              <w:spacing w:before="0" w:after="20"/>
+              <w:rPr/>
+            </w:pPr>
+            <w:r>
+              <w:rPr>
+                <w:sz w:val="19"/>
+                <w:szCs w:val="19"/>
+              </w:rPr>
+              <w:t>razón 1.03</w:t>
             </w:r>
           </w:p>
         </w:tc>
@@ -21549,21 +21705,21 @@
                 <w:sz w:val="19"/>
                 <w:szCs w:val="19"/>
               </w:rPr>
-              <w:t>4/7 (57.1 %)</w:t>
-            </w:r>
-          </w:p>
-          <w:p>
-            <w:pPr>
-              <w:pStyle w:val="Normal"/>
-              <w:spacing w:before="0" w:after="20"/>
-              <w:rPr/>
-            </w:pPr>
-            <w:r>
-              <w:rPr>
-                <w:sz w:val="19"/>
-                <w:szCs w:val="19"/>
-              </w:rPr>
-              <w:t>razón 1.57</w:t>
+              <w:t>4/6 (66.7 %)</w:t>
+            </w:r>
+          </w:p>
+          <w:p>
+            <w:pPr>
+              <w:pStyle w:val="Normal"/>
+              <w:spacing w:before="0" w:after="20"/>
+              <w:rPr/>
+            </w:pPr>
+            <w:r>
+              <w:rPr>
+                <w:sz w:val="19"/>
+                <w:szCs w:val="19"/>
+              </w:rPr>
+              <w:t>razón 1.83</w:t>
             </w:r>
           </w:p>
         </w:tc>
@@ -21910,21 +22066,21 @@
                 <w:sz w:val="19"/>
                 <w:szCs w:val="19"/>
               </w:rPr>
-              <w:t>1/4 (25 %)</w:t>
-            </w:r>
-          </w:p>
-          <w:p>
-            <w:pPr>
-              <w:pStyle w:val="Normal"/>
-              <w:spacing w:before="0" w:after="20"/>
-              <w:rPr/>
-            </w:pPr>
-            <w:r>
-              <w:rPr>
-                <w:sz w:val="19"/>
-                <w:szCs w:val="19"/>
-              </w:rPr>
-              <w:t>razón 1.33</w:t>
+              <w:t>0/2 (0 %)</w:t>
+            </w:r>
+          </w:p>
+          <w:p>
+            <w:pPr>
+              <w:pStyle w:val="Normal"/>
+              <w:spacing w:before="0" w:after="20"/>
+              <w:rPr/>
+            </w:pPr>
+            <w:r>
+              <w:rPr>
+                <w:sz w:val="19"/>
+                <w:szCs w:val="19"/>
+              </w:rPr>
+              <w:t>razón 0</w:t>
             </w:r>
           </w:p>
         </w:tc>
@@ -22080,21 +22236,21 @@
                 <w:sz w:val="19"/>
                 <w:szCs w:val="19"/>
               </w:rPr>
-              <w:t>1/4 (25 %)</w:t>
-            </w:r>
-          </w:p>
-          <w:p>
-            <w:pPr>
-              <w:pStyle w:val="Normal"/>
-              <w:spacing w:before="0" w:after="20"/>
-              <w:rPr/>
-            </w:pPr>
-            <w:r>
-              <w:rPr>
-                <w:sz w:val="19"/>
-                <w:szCs w:val="19"/>
-              </w:rPr>
-              <w:t>razón 0.98</w:t>
+              <w:t>0/2 (0 %)</w:t>
+            </w:r>
+          </w:p>
+          <w:p>
+            <w:pPr>
+              <w:pStyle w:val="Normal"/>
+              <w:spacing w:before="0" w:after="20"/>
+              <w:rPr/>
+            </w:pPr>
+            <w:r>
+              <w:rPr>
+                <w:sz w:val="19"/>
+                <w:szCs w:val="19"/>
+              </w:rPr>
+              <w:t>razón 0</w:t>
             </w:r>
           </w:p>
         </w:tc>
@@ -22250,21 +22406,21 @@
                 <w:sz w:val="19"/>
                 <w:szCs w:val="19"/>
               </w:rPr>
-              <w:t>1/4 (25 %)</w:t>
-            </w:r>
-          </w:p>
-          <w:p>
-            <w:pPr>
-              <w:pStyle w:val="Normal"/>
-              <w:spacing w:before="0" w:after="20"/>
-              <w:rPr/>
-            </w:pPr>
-            <w:r>
-              <w:rPr>
-                <w:sz w:val="19"/>
-                <w:szCs w:val="19"/>
-              </w:rPr>
-              <w:t>razón 0.77</w:t>
+              <w:t>0/2 (0 %)</w:t>
+            </w:r>
+          </w:p>
+          <w:p>
+            <w:pPr>
+              <w:pStyle w:val="Normal"/>
+              <w:spacing w:before="0" w:after="20"/>
+              <w:rPr/>
+            </w:pPr>
+            <w:r>
+              <w:rPr>
+                <w:sz w:val="19"/>
+                <w:szCs w:val="19"/>
+              </w:rPr>
+              <w:t>razón 0</w:t>
             </w:r>
           </w:p>
         </w:tc>
@@ -22420,7 +22576,7 @@
                 <w:sz w:val="19"/>
                 <w:szCs w:val="19"/>
               </w:rPr>
-              <w:t>2/4 (50 %)</w:t>
+              <w:t>1/2 (50 %)</w:t>
             </w:r>
           </w:p>
           <w:p>
@@ -22781,21 +22937,21 @@
                 <w:sz w:val="19"/>
                 <w:szCs w:val="19"/>
               </w:rPr>
-              <w:t>0/1 (0 %)</w:t>
-            </w:r>
-          </w:p>
-          <w:p>
-            <w:pPr>
-              <w:pStyle w:val="Normal"/>
-              <w:spacing w:before="0" w:after="20"/>
-              <w:rPr/>
-            </w:pPr>
-            <w:r>
-              <w:rPr>
-                <w:sz w:val="19"/>
-                <w:szCs w:val="19"/>
-              </w:rPr>
-              <w:t>razón 0</w:t>
+              <w:t>1/5 (20 %)</w:t>
+            </w:r>
+          </w:p>
+          <w:p>
+            <w:pPr>
+              <w:pStyle w:val="Normal"/>
+              <w:spacing w:before="0" w:after="20"/>
+              <w:rPr/>
+            </w:pPr>
+            <w:r>
+              <w:rPr>
+                <w:sz w:val="19"/>
+                <w:szCs w:val="19"/>
+              </w:rPr>
+              <w:t>razón 1.06</w:t>
             </w:r>
           </w:p>
         </w:tc>
@@ -22951,21 +23107,21 @@
                 <w:sz w:val="19"/>
                 <w:szCs w:val="19"/>
               </w:rPr>
-              <w:t>0/1 (0 %)</w:t>
-            </w:r>
-          </w:p>
-          <w:p>
-            <w:pPr>
-              <w:pStyle w:val="Normal"/>
-              <w:spacing w:before="0" w:after="20"/>
-              <w:rPr/>
-            </w:pPr>
-            <w:r>
-              <w:rPr>
-                <w:sz w:val="19"/>
-                <w:szCs w:val="19"/>
-              </w:rPr>
-              <w:t>razón 0</w:t>
+              <w:t>1/5 (20 %)</w:t>
+            </w:r>
+          </w:p>
+          <w:p>
+            <w:pPr>
+              <w:pStyle w:val="Normal"/>
+              <w:spacing w:before="0" w:after="20"/>
+              <w:rPr/>
+            </w:pPr>
+            <w:r>
+              <w:rPr>
+                <w:sz w:val="19"/>
+                <w:szCs w:val="19"/>
+              </w:rPr>
+              <w:t>razón 0.79</w:t>
             </w:r>
           </w:p>
         </w:tc>
@@ -23121,21 +23277,21 @@
                 <w:sz w:val="19"/>
                 <w:szCs w:val="19"/>
               </w:rPr>
-              <w:t>0/1 (0 %)</w:t>
-            </w:r>
-          </w:p>
-          <w:p>
-            <w:pPr>
-              <w:pStyle w:val="Normal"/>
-              <w:spacing w:before="0" w:after="20"/>
-              <w:rPr/>
-            </w:pPr>
-            <w:r>
-              <w:rPr>
-                <w:sz w:val="19"/>
-                <w:szCs w:val="19"/>
-              </w:rPr>
-              <w:t>razón 0</w:t>
+              <w:t>2/5 (40 %)</w:t>
+            </w:r>
+          </w:p>
+          <w:p>
+            <w:pPr>
+              <w:pStyle w:val="Normal"/>
+              <w:spacing w:before="0" w:after="20"/>
+              <w:rPr/>
+            </w:pPr>
+            <w:r>
+              <w:rPr>
+                <w:sz w:val="19"/>
+                <w:szCs w:val="19"/>
+              </w:rPr>
+              <w:t>razón 1.23</w:t>
             </w:r>
           </w:p>
         </w:tc>
@@ -23291,21 +23447,21 @@
                 <w:sz w:val="19"/>
                 <w:szCs w:val="19"/>
               </w:rPr>
-              <w:t>1/1 (100 %)</w:t>
-            </w:r>
-          </w:p>
-          <w:p>
-            <w:pPr>
-              <w:pStyle w:val="Normal"/>
-              <w:spacing w:before="0" w:after="20"/>
-              <w:rPr/>
-            </w:pPr>
-            <w:r>
-              <w:rPr>
-                <w:sz w:val="19"/>
-                <w:szCs w:val="19"/>
-              </w:rPr>
-              <w:t>razón 2.75</w:t>
+              <w:t>4/5 (80 %)</w:t>
+            </w:r>
+          </w:p>
+          <w:p>
+            <w:pPr>
+              <w:pStyle w:val="Normal"/>
+              <w:spacing w:before="0" w:after="20"/>
+              <w:rPr/>
+            </w:pPr>
+            <w:r>
+              <w:rPr>
+                <w:sz w:val="19"/>
+                <w:szCs w:val="19"/>
+              </w:rPr>
+              <w:t>razón 2.2</w:t>
             </w:r>
           </w:p>
         </w:tc>
@@ -23411,7 +23567,7 @@
         <w:rPr/>
         <w:drawing>
           <wp:inline distT="0" distB="0" distL="0" distR="0">
-            <wp:extent cx="5715000" cy="3114675"/>
+            <wp:extent cx="5715000" cy="3352800"/>
             <wp:effectExtent l="0" t="0" r="0" b="0"/>
             <wp:docPr id="11" name="web_evaluacion.png" descr="Figura 11&#10;Sección «Evaluación del modelo» en la página, con los incidentes sin fecha al pie."/>
             <wp:cNvGraphicFramePr>
@@ -23435,7 +23591,7 @@
                   <pic:spPr bwMode="auto">
                     <a:xfrm>
                       <a:off x="0" y="0"/>
-                      <a:ext cx="5715000" cy="3114675"/>
+                      <a:ext cx="5715000" cy="3352800"/>
                     </a:xfrm>
                     <a:prstGeom prst="rect">
                       <a:avLst/>
@@ -23481,7 +23637,7 @@
         <w:pStyle w:val="Heading2"/>
         <w:rPr/>
       </w:pPr>
-      <w:bookmarkStart w:id="49" w:name="__RefHeading___Toc3149_1723578586"/>
+      <w:bookmarkStart w:id="49" w:name="__RefHeading___Toc3221_1804765426"/>
       <w:bookmarkEnd w:id="49"/>
       <w:r>
         <w:rPr/>
@@ -23776,7 +23932,7 @@
                 <w:sz w:val="19"/>
                 <w:szCs w:val="19"/>
               </w:rPr>
-              <w:t>18/10/2026</w:t>
+              <w:t>18/10/2026 (mañana)</w:t>
             </w:r>
           </w:p>
         </w:tc>
@@ -23852,6 +24008,109 @@
                 <w:szCs w:val="19"/>
               </w:rPr>
               <w:t>razón 0,92 · 1,38</w:t>
+            </w:r>
+          </w:p>
+        </w:tc>
+      </w:tr>
+      <w:tr>
+        <w:trPr/>
+        <w:tc>
+          <w:tcPr>
+            <w:tcW w:w="1400" w:type="dxa"/>
+            <w:tcBorders>
+              <w:top w:val="single" w:sz="4" w:space="0" w:color="BFBFBF"/>
+              <w:left w:val="single" w:sz="4" w:space="0" w:color="BFBFBF"/>
+              <w:bottom w:val="single" w:sz="4" w:space="0" w:color="BFBFBF"/>
+              <w:right w:val="single" w:sz="4" w:space="0" w:color="BFBFBF"/>
+            </w:tcBorders>
+          </w:tcPr>
+          <w:p>
+            <w:pPr>
+              <w:pStyle w:val="Normal"/>
+              <w:spacing w:before="0" w:after="20"/>
+              <w:rPr/>
+            </w:pPr>
+            <w:r>
+              <w:rPr>
+                <w:sz w:val="19"/>
+                <w:szCs w:val="19"/>
+              </w:rPr>
+              <w:t>18/10/2026 (tarde)</w:t>
+            </w:r>
+          </w:p>
+        </w:tc>
+        <w:tc>
+          <w:tcPr>
+            <w:tcW w:w="2999" w:type="dxa"/>
+            <w:tcBorders>
+              <w:top w:val="single" w:sz="4" w:space="0" w:color="BFBFBF"/>
+              <w:left w:val="single" w:sz="4" w:space="0" w:color="BFBFBF"/>
+              <w:bottom w:val="single" w:sz="4" w:space="0" w:color="BFBFBF"/>
+              <w:right w:val="single" w:sz="4" w:space="0" w:color="BFBFBF"/>
+            </w:tcBorders>
+          </w:tcPr>
+          <w:p>
+            <w:pPr>
+              <w:pStyle w:val="Normal"/>
+              <w:spacing w:before="0" w:after="20"/>
+              <w:rPr/>
+            </w:pPr>
+            <w:r>
+              <w:rPr>
+                <w:sz w:val="19"/>
+                <w:szCs w:val="19"/>
+              </w:rPr>
+              <w:t>16 verificados, 2 descartados</w:t>
+            </w:r>
+          </w:p>
+        </w:tc>
+        <w:tc>
+          <w:tcPr>
+            <w:tcW w:w="2701" w:type="dxa"/>
+            <w:tcBorders>
+              <w:top w:val="single" w:sz="4" w:space="0" w:color="BFBFBF"/>
+              <w:left w:val="single" w:sz="4" w:space="0" w:color="BFBFBF"/>
+              <w:bottom w:val="single" w:sz="4" w:space="0" w:color="BFBFBF"/>
+              <w:right w:val="single" w:sz="4" w:space="0" w:color="BFBFBF"/>
+            </w:tcBorders>
+          </w:tcPr>
+          <w:p>
+            <w:pPr>
+              <w:pStyle w:val="Normal"/>
+              <w:spacing w:before="0" w:after="20"/>
+              <w:rPr/>
+            </w:pPr>
+            <w:r>
+              <w:rPr>
+                <w:sz w:val="19"/>
+                <w:szCs w:val="19"/>
+              </w:rPr>
+              <w:t>razón 1,83 (todos) · 2,20 (solo verificados)</w:t>
+            </w:r>
+          </w:p>
+        </w:tc>
+        <w:tc>
+          <w:tcPr>
+            <w:tcW w:w="2537" w:type="dxa"/>
+            <w:tcBorders>
+              <w:top w:val="single" w:sz="4" w:space="0" w:color="BFBFBF"/>
+              <w:left w:val="single" w:sz="4" w:space="0" w:color="BFBFBF"/>
+              <w:bottom w:val="single" w:sz="4" w:space="0" w:color="BFBFBF"/>
+              <w:right w:val="single" w:sz="4" w:space="0" w:color="BFBFBF"/>
+            </w:tcBorders>
+          </w:tcPr>
+          <w:p>
+            <w:pPr>
+              <w:pStyle w:val="Normal"/>
+              <w:spacing w:before="0" w:after="20"/>
+              <w:rPr/>
+            </w:pPr>
+            <w:r>
+              <w:rPr>
+                <w:sz w:val="19"/>
+                <w:szCs w:val="19"/>
+              </w:rPr>
+              <w:t>razón 0,92 · 0,46</w:t>
             </w:r>
           </w:p>
         </w:tc>
@@ -23912,7 +24171,51 @@
       </w:r>
       <w:r>
         <w:rPr/>
-        <w:t xml:space="preserve"> hay un único ataque hacktivista (Cancillería, 05/02/2026): cae dentro de la ventana de 21 días, pero un caso no permite conclusiones.</w:t>
+        <w:t xml:space="preserve"> (16, tras descartar 2), los hacktivistas caen dentro de las ventanas de 21 días en 4 de 5 casos (razón 2,20), frente a 1 de 6 de los cibercriminales (razón 0,46). Es la diferencia más clara obtenida hasta ahora.</w:t>
+      </w:r>
+    </w:p>
+    <w:p>
+      <w:pPr>
+        <w:pStyle w:val="ListParagraph"/>
+        <w:numPr>
+          <w:ilvl w:val="0"/>
+          <w:numId w:val="3"/>
+        </w:numPr>
+        <w:spacing w:before="0" w:after="60"/>
+        <w:rPr/>
+      </w:pPr>
+      <w:r>
+        <w:rPr>
+          <w:b/>
+          <w:bCs/>
+        </w:rPr>
+        <w:t>Pero</w:t>
+      </w:r>
+      <w:r>
+        <w:rPr/>
+        <w:t xml:space="preserve"> 4 de esos 5 hacktivistas se apoyan en fuentes de fiabilidad </w:t>
+      </w:r>
+      <w:r>
+        <w:rPr>
+          <w:b/>
+          <w:bCs/>
+        </w:rPr>
+        <w:t>D</w:t>
+      </w:r>
+      <w:r>
+        <w:rPr/>
+        <w:t xml:space="preserve"> (no siempre fiable): por eso, con la variante de confianza media o alta casi no quedan hacktivistas para comparar. El resultado es </w:t>
+      </w:r>
+      <w:r>
+        <w:rPr>
+          <w:b/>
+          <w:bCs/>
+        </w:rPr>
+        <w:t>indicativo, no concluyente</w:t>
+      </w:r>
+      <w:r>
+        <w:rPr/>
+        <w:t>, y muestra la limitación central del tema: hay pocas fuentes fiables sobre hacktivismo, que se anuncia sobre todo en Telegram y X (decisión D33).</w:t>
       </w:r>
     </w:p>
     <w:p>
@@ -24028,7 +24331,7 @@
         <w:pStyle w:val="Heading2"/>
         <w:rPr/>
       </w:pPr>
-      <w:bookmarkStart w:id="50" w:name="__RefHeading___Toc3151_1723578586"/>
+      <w:bookmarkStart w:id="50" w:name="__RefHeading___Toc3223_1804765426"/>
       <w:bookmarkEnd w:id="50"/>
       <w:r>
         <w:rPr/>
@@ -24219,7 +24522,7 @@
         <w:pStyle w:val="Heading1"/>
         <w:rPr/>
       </w:pPr>
-      <w:bookmarkStart w:id="51" w:name="__RefHeading___Toc3153_1723578586"/>
+      <w:bookmarkStart w:id="51" w:name="__RefHeading___Toc3225_1804765426"/>
       <w:bookmarkEnd w:id="51"/>
       <w:r>
         <w:rPr/>
@@ -27879,6 +28182,315 @@
           </w:p>
         </w:tc>
       </w:tr>
+      <w:tr>
+        <w:trPr/>
+        <w:tc>
+          <w:tcPr>
+            <w:tcW w:w="1250" w:type="dxa"/>
+            <w:tcBorders>
+              <w:top w:val="single" w:sz="4" w:space="0" w:color="BFBFBF"/>
+              <w:left w:val="single" w:sz="4" w:space="0" w:color="BFBFBF"/>
+              <w:bottom w:val="single" w:sz="4" w:space="0" w:color="BFBFBF"/>
+              <w:right w:val="single" w:sz="4" w:space="0" w:color="BFBFBF"/>
+            </w:tcBorders>
+          </w:tcPr>
+          <w:p>
+            <w:pPr>
+              <w:pStyle w:val="Normal"/>
+              <w:spacing w:before="0" w:after="20"/>
+              <w:rPr/>
+            </w:pPr>
+            <w:r>
+              <w:rPr>
+                <w:sz w:val="19"/>
+                <w:szCs w:val="19"/>
+              </w:rPr>
+              <w:t>18/10/2026</w:t>
+            </w:r>
+          </w:p>
+        </w:tc>
+        <w:tc>
+          <w:tcPr>
+            <w:tcW w:w="1650" w:type="dxa"/>
+            <w:tcBorders>
+              <w:top w:val="single" w:sz="4" w:space="0" w:color="BFBFBF"/>
+              <w:left w:val="single" w:sz="4" w:space="0" w:color="BFBFBF"/>
+              <w:bottom w:val="single" w:sz="4" w:space="0" w:color="BFBFBF"/>
+              <w:right w:val="single" w:sz="4" w:space="0" w:color="BFBFBF"/>
+            </w:tcBorders>
+          </w:tcPr>
+          <w:p>
+            <w:pPr>
+              <w:pStyle w:val="Normal"/>
+              <w:spacing w:before="0" w:after="20"/>
+              <w:rPr/>
+            </w:pPr>
+            <w:r>
+              <w:rPr>
+                <w:sz w:val="19"/>
+                <w:szCs w:val="19"/>
+              </w:rPr>
+              <w:t>Configuración</w:t>
+            </w:r>
+          </w:p>
+        </w:tc>
+        <w:tc>
+          <w:tcPr>
+            <w:tcW w:w="2299" w:type="dxa"/>
+            <w:tcBorders>
+              <w:top w:val="single" w:sz="4" w:space="0" w:color="BFBFBF"/>
+              <w:left w:val="single" w:sz="4" w:space="0" w:color="BFBFBF"/>
+              <w:bottom w:val="single" w:sz="4" w:space="0" w:color="BFBFBF"/>
+              <w:right w:val="single" w:sz="4" w:space="0" w:color="BFBFBF"/>
+            </w:tcBorders>
+          </w:tcPr>
+          <w:p>
+            <w:pPr>
+              <w:pStyle w:val="Normal"/>
+              <w:spacing w:before="0" w:after="20"/>
+              <w:rPr/>
+            </w:pPr>
+            <w:r>
+              <w:rPr>
+                <w:sz w:val="19"/>
+                <w:szCs w:val="19"/>
+              </w:rPr>
+              <w:t>Pull Request #4 fusionado</w:t>
+            </w:r>
+          </w:p>
+        </w:tc>
+        <w:tc>
+          <w:tcPr>
+            <w:tcW w:w="4438" w:type="dxa"/>
+            <w:tcBorders>
+              <w:top w:val="single" w:sz="4" w:space="0" w:color="BFBFBF"/>
+              <w:left w:val="single" w:sz="4" w:space="0" w:color="BFBFBF"/>
+              <w:bottom w:val="single" w:sz="4" w:space="0" w:color="BFBFBF"/>
+              <w:right w:val="single" w:sz="4" w:space="0" w:color="BFBFBF"/>
+            </w:tcBorders>
+          </w:tcPr>
+          <w:p>
+            <w:pPr>
+              <w:pStyle w:val="Normal"/>
+              <w:spacing w:before="0" w:after="20"/>
+              <w:rPr/>
+            </w:pPr>
+            <w:r>
+              <w:rPr>
+                <w:sz w:val="19"/>
+                <w:szCs w:val="19"/>
+              </w:rPr>
+              <w:t>El autor fusionó el PR con los primeros 10 incidentes verificados y la variante 'solo verificados'.</w:t>
+            </w:r>
+          </w:p>
+        </w:tc>
+      </w:tr>
+      <w:tr>
+        <w:trPr/>
+        <w:tc>
+          <w:tcPr>
+            <w:tcW w:w="1250" w:type="dxa"/>
+            <w:tcBorders>
+              <w:top w:val="single" w:sz="4" w:space="0" w:color="BFBFBF"/>
+              <w:left w:val="single" w:sz="4" w:space="0" w:color="BFBFBF"/>
+              <w:bottom w:val="single" w:sz="4" w:space="0" w:color="BFBFBF"/>
+              <w:right w:val="single" w:sz="4" w:space="0" w:color="BFBFBF"/>
+            </w:tcBorders>
+          </w:tcPr>
+          <w:p>
+            <w:pPr>
+              <w:pStyle w:val="Normal"/>
+              <w:spacing w:before="0" w:after="20"/>
+              <w:rPr/>
+            </w:pPr>
+            <w:r>
+              <w:rPr>
+                <w:sz w:val="19"/>
+                <w:szCs w:val="19"/>
+              </w:rPr>
+              <w:t>18/10/2026</w:t>
+            </w:r>
+          </w:p>
+        </w:tc>
+        <w:tc>
+          <w:tcPr>
+            <w:tcW w:w="1650" w:type="dxa"/>
+            <w:tcBorders>
+              <w:top w:val="single" w:sz="4" w:space="0" w:color="BFBFBF"/>
+              <w:left w:val="single" w:sz="4" w:space="0" w:color="BFBFBF"/>
+              <w:bottom w:val="single" w:sz="4" w:space="0" w:color="BFBFBF"/>
+              <w:right w:val="single" w:sz="4" w:space="0" w:color="BFBFBF"/>
+            </w:tcBorders>
+          </w:tcPr>
+          <w:p>
+            <w:pPr>
+              <w:pStyle w:val="Normal"/>
+              <w:spacing w:before="0" w:after="20"/>
+              <w:rPr/>
+            </w:pPr>
+            <w:r>
+              <w:rPr>
+                <w:sz w:val="19"/>
+                <w:szCs w:val="19"/>
+              </w:rPr>
+              <w:t>Verificación</w:t>
+            </w:r>
+          </w:p>
+        </w:tc>
+        <w:tc>
+          <w:tcPr>
+            <w:tcW w:w="2299" w:type="dxa"/>
+            <w:tcBorders>
+              <w:top w:val="single" w:sz="4" w:space="0" w:color="BFBFBF"/>
+              <w:left w:val="single" w:sz="4" w:space="0" w:color="BFBFBF"/>
+              <w:bottom w:val="single" w:sz="4" w:space="0" w:color="BFBFBF"/>
+              <w:right w:val="single" w:sz="4" w:space="0" w:color="BFBFBF"/>
+            </w:tcBorders>
+          </w:tcPr>
+          <w:p>
+            <w:pPr>
+              <w:pStyle w:val="Normal"/>
+              <w:spacing w:before="0" w:after="20"/>
+              <w:rPr/>
+            </w:pPr>
+            <w:r>
+              <w:rPr>
+                <w:sz w:val="19"/>
+                <w:szCs w:val="19"/>
+              </w:rPr>
+              <w:t>Verificación de incidentes hacktivistas</w:t>
+            </w:r>
+          </w:p>
+        </w:tc>
+        <w:tc>
+          <w:tcPr>
+            <w:tcW w:w="4438" w:type="dxa"/>
+            <w:tcBorders>
+              <w:top w:val="single" w:sz="4" w:space="0" w:color="BFBFBF"/>
+              <w:left w:val="single" w:sz="4" w:space="0" w:color="BFBFBF"/>
+              <w:bottom w:val="single" w:sz="4" w:space="0" w:color="BFBFBF"/>
+              <w:right w:val="single" w:sz="4" w:space="0" w:color="BFBFBF"/>
+            </w:tcBorders>
+          </w:tcPr>
+          <w:p>
+            <w:pPr>
+              <w:pStyle w:val="Normal"/>
+              <w:spacing w:before="0" w:after="20"/>
+              <w:rPr/>
+            </w:pPr>
+            <w:r>
+              <w:rPr>
+                <w:sz w:val="19"/>
+                <w:szCs w:val="19"/>
+              </w:rPr>
+              <w:t>INC-002, INC-004 e INC-005: D3; INC-006: D2. INC-001 (Cyber Dragonz) e INC-003 (REM) descartados por no guardar relación con el Estado argentino (D33). Queda pendiente INC-022 (AFA).</w:t>
+            </w:r>
+          </w:p>
+        </w:tc>
+      </w:tr>
+      <w:tr>
+        <w:trPr/>
+        <w:tc>
+          <w:tcPr>
+            <w:tcW w:w="1250" w:type="dxa"/>
+            <w:tcBorders>
+              <w:top w:val="single" w:sz="4" w:space="0" w:color="BFBFBF"/>
+              <w:left w:val="single" w:sz="4" w:space="0" w:color="BFBFBF"/>
+              <w:bottom w:val="single" w:sz="4" w:space="0" w:color="BFBFBF"/>
+              <w:right w:val="single" w:sz="4" w:space="0" w:color="BFBFBF"/>
+            </w:tcBorders>
+          </w:tcPr>
+          <w:p>
+            <w:pPr>
+              <w:pStyle w:val="Normal"/>
+              <w:spacing w:before="0" w:after="20"/>
+              <w:rPr/>
+            </w:pPr>
+            <w:r>
+              <w:rPr>
+                <w:sz w:val="19"/>
+                <w:szCs w:val="19"/>
+              </w:rPr>
+              <w:t>18/10/2026</w:t>
+            </w:r>
+          </w:p>
+        </w:tc>
+        <w:tc>
+          <w:tcPr>
+            <w:tcW w:w="1650" w:type="dxa"/>
+            <w:tcBorders>
+              <w:top w:val="single" w:sz="4" w:space="0" w:color="BFBFBF"/>
+              <w:left w:val="single" w:sz="4" w:space="0" w:color="BFBFBF"/>
+              <w:bottom w:val="single" w:sz="4" w:space="0" w:color="BFBFBF"/>
+              <w:right w:val="single" w:sz="4" w:space="0" w:color="BFBFBF"/>
+            </w:tcBorders>
+          </w:tcPr>
+          <w:p>
+            <w:pPr>
+              <w:pStyle w:val="Normal"/>
+              <w:spacing w:before="0" w:after="20"/>
+              <w:rPr/>
+            </w:pPr>
+            <w:r>
+              <w:rPr>
+                <w:sz w:val="19"/>
+                <w:szCs w:val="19"/>
+              </w:rPr>
+              <w:t>Resultado</w:t>
+            </w:r>
+          </w:p>
+        </w:tc>
+        <w:tc>
+          <w:tcPr>
+            <w:tcW w:w="2299" w:type="dxa"/>
+            <w:tcBorders>
+              <w:top w:val="single" w:sz="4" w:space="0" w:color="BFBFBF"/>
+              <w:left w:val="single" w:sz="4" w:space="0" w:color="BFBFBF"/>
+              <w:bottom w:val="single" w:sz="4" w:space="0" w:color="BFBFBF"/>
+              <w:right w:val="single" w:sz="4" w:space="0" w:color="BFBFBF"/>
+            </w:tcBorders>
+          </w:tcPr>
+          <w:p>
+            <w:pPr>
+              <w:pStyle w:val="Normal"/>
+              <w:spacing w:before="0" w:after="20"/>
+              <w:rPr/>
+            </w:pPr>
+            <w:r>
+              <w:rPr>
+                <w:sz w:val="19"/>
+                <w:szCs w:val="19"/>
+              </w:rPr>
+              <w:t>Resultados con incidentes verificados</w:t>
+            </w:r>
+          </w:p>
+        </w:tc>
+        <w:tc>
+          <w:tcPr>
+            <w:tcW w:w="4438" w:type="dxa"/>
+            <w:tcBorders>
+              <w:top w:val="single" w:sz="4" w:space="0" w:color="BFBFBF"/>
+              <w:left w:val="single" w:sz="4" w:space="0" w:color="BFBFBF"/>
+              <w:bottom w:val="single" w:sz="4" w:space="0" w:color="BFBFBF"/>
+              <w:right w:val="single" w:sz="4" w:space="0" w:color="BFBFBF"/>
+            </w:tcBorders>
+          </w:tcPr>
+          <w:p>
+            <w:pPr>
+              <w:pStyle w:val="Normal"/>
+              <w:spacing w:before="0" w:after="20"/>
+              <w:rPr/>
+            </w:pPr>
+            <w:r>
+              <w:rPr>
+                <w:sz w:val="19"/>
+                <w:szCs w:val="19"/>
+              </w:rPr>
+              <w:t>Solo verificados, ventana de 21 días: hacktivistas 4 de 5 dentro de ventanas (razón 2,20) frente a cibercriminales 1 de 6 (razón 0,46). Con 14 días: 1,23 frente a 0,51. Cuatro de los cinco hacktivistas verificados tienen fuentes de fiabilidad D: resultado indicativo, no concluyente.</w:t>
+            </w:r>
+          </w:p>
+        </w:tc>
+      </w:tr>
     </w:tbl>
     <w:p>
       <w:pPr>
@@ -27888,7 +28500,7 @@
       <w:r>
         <w:br w:type="page"/>
       </w:r>
-      <w:bookmarkStart w:id="52" w:name="__RefHeading___Toc3155_1723578586"/>
+      <w:bookmarkStart w:id="52" w:name="__RefHeading___Toc3227_1804765426"/>
       <w:bookmarkEnd w:id="52"/>
       <w:r>
         <w:rPr/>
@@ -29205,7 +29817,7 @@
     </w:r>
     <w:r>
       <w:rPr/>
-      <w:t>34</w:t>
+      <w:t>35</w:t>
     </w:r>
     <w:r>
       <w:rPr/>
@@ -29217,7 +29829,7 @@
         <w:sz w:val="16"/>
         <w:szCs w:val="16"/>
       </w:rPr>
-      <w:t xml:space="preserve"> · Versión 0.7 (18/10/2026)</w:t>
+      <w:t xml:space="preserve"> · Versión 0.8 (18/10/2026)</w:t>
     </w:r>
   </w:p>
 </w:ftr>
@@ -29253,7 +29865,7 @@
     </w:r>
     <w:r>
       <w:rPr/>
-      <w:t>34</w:t>
+      <w:t>35</w:t>
     </w:r>
     <w:r>
       <w:rPr/>
@@ -29265,7 +29877,7 @@
         <w:sz w:val="16"/>
         <w:szCs w:val="16"/>
       </w:rPr>
-      <w:t xml:space="preserve"> · Versión 0.7 (18/10/2026)</w:t>
+      <w:t xml:space="preserve"> · Versión 0.8 (18/10/2026)</w:t>
     </w:r>
   </w:p>
 </w:ftr>

</xml_diff>

<commit_message>
INC-022 verificado (B1) y descartado: la AFA no es un organismo del Estado
Co-Authored-By: Claude Opus 5.5 <noreply@anthropic.com>
Claude-Session: https://claude.ai/code/session_011eMYWh6VDWd8LKxBrkPUCG
</commit_message>
<xml_diff>
--- a/memoria/Memoria_TFM.docx
+++ b/memoria/Memoria_TFM.docx
@@ -1098,7 +1098,7 @@
             </w:rPr>
             <w:fldChar w:fldCharType="separate"/>
           </w:r>
-          <w:hyperlink w:anchor="__RefHeading___Toc3123_1804765426">
+          <w:hyperlink w:anchor="__RefHeading___Toc3135_1040945781">
             <w:r>
               <w:rPr>
                 <w:rStyle w:val="IndexLink"/>
@@ -1118,7 +1118,7 @@
             </w:tabs>
             <w:rPr/>
           </w:pPr>
-          <w:hyperlink w:anchor="__RefHeading___Toc3125_1804765426">
+          <w:hyperlink w:anchor="__RefHeading___Toc3137_1040945781">
             <w:r>
               <w:rPr>
                 <w:rStyle w:val="IndexLink"/>
@@ -1138,7 +1138,7 @@
             </w:tabs>
             <w:rPr/>
           </w:pPr>
-          <w:hyperlink w:anchor="__RefHeading___Toc3127_1804765426">
+          <w:hyperlink w:anchor="__RefHeading___Toc3139_1040945781">
             <w:r>
               <w:rPr>
                 <w:rStyle w:val="IndexLink"/>
@@ -1158,7 +1158,7 @@
             </w:tabs>
             <w:rPr/>
           </w:pPr>
-          <w:hyperlink w:anchor="__RefHeading___Toc3129_1804765426">
+          <w:hyperlink w:anchor="__RefHeading___Toc3141_1040945781">
             <w:r>
               <w:rPr>
                 <w:rStyle w:val="IndexLink"/>
@@ -1178,7 +1178,7 @@
             </w:tabs>
             <w:rPr/>
           </w:pPr>
-          <w:hyperlink w:anchor="__RefHeading___Toc3131_1804765426">
+          <w:hyperlink w:anchor="__RefHeading___Toc3143_1040945781">
             <w:r>
               <w:rPr>
                 <w:rStyle w:val="IndexLink"/>
@@ -1198,7 +1198,7 @@
             </w:tabs>
             <w:rPr/>
           </w:pPr>
-          <w:hyperlink w:anchor="__RefHeading___Toc3133_1804765426">
+          <w:hyperlink w:anchor="__RefHeading___Toc3145_1040945781">
             <w:r>
               <w:rPr>
                 <w:rStyle w:val="IndexLink"/>
@@ -1218,7 +1218,7 @@
             </w:tabs>
             <w:rPr/>
           </w:pPr>
-          <w:hyperlink w:anchor="__RefHeading___Toc3135_1804765426">
+          <w:hyperlink w:anchor="__RefHeading___Toc3147_1040945781">
             <w:r>
               <w:rPr>
                 <w:rStyle w:val="IndexLink"/>
@@ -1238,7 +1238,7 @@
             </w:tabs>
             <w:rPr/>
           </w:pPr>
-          <w:hyperlink w:anchor="__RefHeading___Toc3137_1804765426">
+          <w:hyperlink w:anchor="__RefHeading___Toc3149_1040945781">
             <w:r>
               <w:rPr>
                 <w:rStyle w:val="IndexLink"/>
@@ -1258,7 +1258,7 @@
             </w:tabs>
             <w:rPr/>
           </w:pPr>
-          <w:hyperlink w:anchor="__RefHeading___Toc3139_1804765426">
+          <w:hyperlink w:anchor="__RefHeading___Toc3151_1040945781">
             <w:r>
               <w:rPr>
                 <w:rStyle w:val="IndexLink"/>
@@ -1278,7 +1278,7 @@
             </w:tabs>
             <w:rPr/>
           </w:pPr>
-          <w:hyperlink w:anchor="__RefHeading___Toc3141_1804765426">
+          <w:hyperlink w:anchor="__RefHeading___Toc3153_1040945781">
             <w:r>
               <w:rPr>
                 <w:rStyle w:val="IndexLink"/>
@@ -1298,7 +1298,7 @@
             </w:tabs>
             <w:rPr/>
           </w:pPr>
-          <w:hyperlink w:anchor="__RefHeading___Toc3143_1804765426">
+          <w:hyperlink w:anchor="__RefHeading___Toc3155_1040945781">
             <w:r>
               <w:rPr>
                 <w:rStyle w:val="IndexLink"/>
@@ -1318,7 +1318,7 @@
             </w:tabs>
             <w:rPr/>
           </w:pPr>
-          <w:hyperlink w:anchor="__RefHeading___Toc3145_1804765426">
+          <w:hyperlink w:anchor="__RefHeading___Toc3157_1040945781">
             <w:r>
               <w:rPr>
                 <w:rStyle w:val="IndexLink"/>
@@ -1338,7 +1338,7 @@
             </w:tabs>
             <w:rPr/>
           </w:pPr>
-          <w:hyperlink w:anchor="__RefHeading___Toc3147_1804765426">
+          <w:hyperlink w:anchor="__RefHeading___Toc3159_1040945781">
             <w:r>
               <w:rPr>
                 <w:rStyle w:val="IndexLink"/>
@@ -1358,7 +1358,7 @@
             </w:tabs>
             <w:rPr/>
           </w:pPr>
-          <w:hyperlink w:anchor="__RefHeading___Toc3149_1804765426">
+          <w:hyperlink w:anchor="__RefHeading___Toc3161_1040945781">
             <w:r>
               <w:rPr>
                 <w:rStyle w:val="IndexLink"/>
@@ -1378,7 +1378,7 @@
             </w:tabs>
             <w:rPr/>
           </w:pPr>
-          <w:hyperlink w:anchor="__RefHeading___Toc3151_1804765426">
+          <w:hyperlink w:anchor="__RefHeading___Toc3163_1040945781">
             <w:r>
               <w:rPr>
                 <w:rStyle w:val="IndexLink"/>
@@ -1398,7 +1398,7 @@
             </w:tabs>
             <w:rPr/>
           </w:pPr>
-          <w:hyperlink w:anchor="__RefHeading___Toc3153_1804765426">
+          <w:hyperlink w:anchor="__RefHeading___Toc3165_1040945781">
             <w:r>
               <w:rPr>
                 <w:rStyle w:val="IndexLink"/>
@@ -1418,7 +1418,7 @@
             </w:tabs>
             <w:rPr/>
           </w:pPr>
-          <w:hyperlink w:anchor="__RefHeading___Toc3155_1804765426">
+          <w:hyperlink w:anchor="__RefHeading___Toc3167_1040945781">
             <w:r>
               <w:rPr>
                 <w:rStyle w:val="IndexLink"/>
@@ -1438,7 +1438,7 @@
             </w:tabs>
             <w:rPr/>
           </w:pPr>
-          <w:hyperlink w:anchor="__RefHeading___Toc3157_1804765426">
+          <w:hyperlink w:anchor="__RefHeading___Toc3169_1040945781">
             <w:r>
               <w:rPr>
                 <w:rStyle w:val="IndexLink"/>
@@ -1458,7 +1458,7 @@
             </w:tabs>
             <w:rPr/>
           </w:pPr>
-          <w:hyperlink w:anchor="__RefHeading___Toc3159_1804765426">
+          <w:hyperlink w:anchor="__RefHeading___Toc3171_1040945781">
             <w:r>
               <w:rPr>
                 <w:rStyle w:val="IndexLink"/>
@@ -1478,7 +1478,7 @@
             </w:tabs>
             <w:rPr/>
           </w:pPr>
-          <w:hyperlink w:anchor="__RefHeading___Toc3161_1804765426">
+          <w:hyperlink w:anchor="__RefHeading___Toc3173_1040945781">
             <w:r>
               <w:rPr>
                 <w:rStyle w:val="IndexLink"/>
@@ -1498,7 +1498,7 @@
             </w:tabs>
             <w:rPr/>
           </w:pPr>
-          <w:hyperlink w:anchor="__RefHeading___Toc3163_1804765426">
+          <w:hyperlink w:anchor="__RefHeading___Toc3175_1040945781">
             <w:r>
               <w:rPr>
                 <w:rStyle w:val="IndexLink"/>
@@ -1518,7 +1518,7 @@
             </w:tabs>
             <w:rPr/>
           </w:pPr>
-          <w:hyperlink w:anchor="__RefHeading___Toc3165_1804765426">
+          <w:hyperlink w:anchor="__RefHeading___Toc3177_1040945781">
             <w:r>
               <w:rPr>
                 <w:rStyle w:val="IndexLink"/>
@@ -1538,7 +1538,7 @@
             </w:tabs>
             <w:rPr/>
           </w:pPr>
-          <w:hyperlink w:anchor="__RefHeading___Toc3167_1804765426">
+          <w:hyperlink w:anchor="__RefHeading___Toc3179_1040945781">
             <w:r>
               <w:rPr>
                 <w:rStyle w:val="IndexLink"/>
@@ -1558,7 +1558,7 @@
             </w:tabs>
             <w:rPr/>
           </w:pPr>
-          <w:hyperlink w:anchor="__RefHeading___Toc3169_1804765426">
+          <w:hyperlink w:anchor="__RefHeading___Toc3181_1040945781">
             <w:r>
               <w:rPr>
                 <w:rStyle w:val="IndexLink"/>
@@ -1578,7 +1578,7 @@
             </w:tabs>
             <w:rPr/>
           </w:pPr>
-          <w:hyperlink w:anchor="__RefHeading___Toc3171_1804765426">
+          <w:hyperlink w:anchor="__RefHeading___Toc3183_1040945781">
             <w:r>
               <w:rPr>
                 <w:rStyle w:val="IndexLink"/>
@@ -1598,7 +1598,7 @@
             </w:tabs>
             <w:rPr/>
           </w:pPr>
-          <w:hyperlink w:anchor="__RefHeading___Toc3173_1804765426">
+          <w:hyperlink w:anchor="__RefHeading___Toc3185_1040945781">
             <w:r>
               <w:rPr>
                 <w:rStyle w:val="IndexLink"/>
@@ -1618,7 +1618,7 @@
             </w:tabs>
             <w:rPr/>
           </w:pPr>
-          <w:hyperlink w:anchor="__RefHeading___Toc3175_1804765426">
+          <w:hyperlink w:anchor="__RefHeading___Toc3187_1040945781">
             <w:r>
               <w:rPr>
                 <w:rStyle w:val="IndexLink"/>
@@ -1638,7 +1638,7 @@
             </w:tabs>
             <w:rPr/>
           </w:pPr>
-          <w:hyperlink w:anchor="__RefHeading___Toc3177_1804765426">
+          <w:hyperlink w:anchor="__RefHeading___Toc3189_1040945781">
             <w:r>
               <w:rPr>
                 <w:rStyle w:val="IndexLink"/>
@@ -1658,7 +1658,7 @@
             </w:tabs>
             <w:rPr/>
           </w:pPr>
-          <w:hyperlink w:anchor="__RefHeading___Toc3179_1804765426">
+          <w:hyperlink w:anchor="__RefHeading___Toc3191_1040945781">
             <w:r>
               <w:rPr>
                 <w:rStyle w:val="IndexLink"/>
@@ -1678,7 +1678,7 @@
             </w:tabs>
             <w:rPr/>
           </w:pPr>
-          <w:hyperlink w:anchor="__RefHeading___Toc3181_1804765426">
+          <w:hyperlink w:anchor="__RefHeading___Toc3193_1040945781">
             <w:r>
               <w:rPr>
                 <w:rStyle w:val="IndexLink"/>
@@ -1698,7 +1698,7 @@
             </w:tabs>
             <w:rPr/>
           </w:pPr>
-          <w:hyperlink w:anchor="__RefHeading___Toc3183_1804765426">
+          <w:hyperlink w:anchor="__RefHeading___Toc3195_1040945781">
             <w:r>
               <w:rPr>
                 <w:rStyle w:val="IndexLink"/>
@@ -1718,7 +1718,7 @@
             </w:tabs>
             <w:rPr/>
           </w:pPr>
-          <w:hyperlink w:anchor="__RefHeading___Toc3185_1804765426">
+          <w:hyperlink w:anchor="__RefHeading___Toc3197_1040945781">
             <w:r>
               <w:rPr>
                 <w:rStyle w:val="IndexLink"/>
@@ -1738,7 +1738,7 @@
             </w:tabs>
             <w:rPr/>
           </w:pPr>
-          <w:hyperlink w:anchor="__RefHeading___Toc3187_1804765426">
+          <w:hyperlink w:anchor="__RefHeading___Toc3199_1040945781">
             <w:r>
               <w:rPr>
                 <w:rStyle w:val="IndexLink"/>
@@ -1758,7 +1758,7 @@
             </w:tabs>
             <w:rPr/>
           </w:pPr>
-          <w:hyperlink w:anchor="__RefHeading___Toc3189_1804765426">
+          <w:hyperlink w:anchor="__RefHeading___Toc3201_1040945781">
             <w:r>
               <w:rPr>
                 <w:rStyle w:val="IndexLink"/>
@@ -1778,7 +1778,7 @@
             </w:tabs>
             <w:rPr/>
           </w:pPr>
-          <w:hyperlink w:anchor="__RefHeading___Toc3191_1804765426">
+          <w:hyperlink w:anchor="__RefHeading___Toc3203_1040945781">
             <w:r>
               <w:rPr>
                 <w:rStyle w:val="IndexLink"/>
@@ -1798,7 +1798,7 @@
             </w:tabs>
             <w:rPr/>
           </w:pPr>
-          <w:hyperlink w:anchor="__RefHeading___Toc3193_1804765426">
+          <w:hyperlink w:anchor="__RefHeading___Toc3205_1040945781">
             <w:r>
               <w:rPr>
                 <w:rStyle w:val="IndexLink"/>
@@ -1818,7 +1818,7 @@
             </w:tabs>
             <w:rPr/>
           </w:pPr>
-          <w:hyperlink w:anchor="__RefHeading___Toc3195_1804765426">
+          <w:hyperlink w:anchor="__RefHeading___Toc3207_1040945781">
             <w:r>
               <w:rPr>
                 <w:rStyle w:val="IndexLink"/>
@@ -1838,7 +1838,7 @@
             </w:tabs>
             <w:rPr/>
           </w:pPr>
-          <w:hyperlink w:anchor="__RefHeading___Toc3197_1804765426">
+          <w:hyperlink w:anchor="__RefHeading___Toc3209_1040945781">
             <w:r>
               <w:rPr>
                 <w:rStyle w:val="IndexLink"/>
@@ -1858,7 +1858,7 @@
             </w:tabs>
             <w:rPr/>
           </w:pPr>
-          <w:hyperlink w:anchor="__RefHeading___Toc3199_1804765426">
+          <w:hyperlink w:anchor="__RefHeading___Toc3211_1040945781">
             <w:r>
               <w:rPr>
                 <w:rStyle w:val="IndexLink"/>
@@ -1878,7 +1878,7 @@
             </w:tabs>
             <w:rPr/>
           </w:pPr>
-          <w:hyperlink w:anchor="__RefHeading___Toc3201_1804765426">
+          <w:hyperlink w:anchor="__RefHeading___Toc3213_1040945781">
             <w:r>
               <w:rPr>
                 <w:rStyle w:val="IndexLink"/>
@@ -1898,7 +1898,7 @@
             </w:tabs>
             <w:rPr/>
           </w:pPr>
-          <w:hyperlink w:anchor="__RefHeading___Toc3203_1804765426">
+          <w:hyperlink w:anchor="__RefHeading___Toc3215_1040945781">
             <w:r>
               <w:rPr>
                 <w:rStyle w:val="IndexLink"/>
@@ -1918,7 +1918,7 @@
             </w:tabs>
             <w:rPr/>
           </w:pPr>
-          <w:hyperlink w:anchor="__RefHeading___Toc3205_1804765426">
+          <w:hyperlink w:anchor="__RefHeading___Toc3217_1040945781">
             <w:r>
               <w:rPr>
                 <w:rStyle w:val="IndexLink"/>
@@ -1938,7 +1938,7 @@
             </w:tabs>
             <w:rPr/>
           </w:pPr>
-          <w:hyperlink w:anchor="__RefHeading___Toc3207_1804765426">
+          <w:hyperlink w:anchor="__RefHeading___Toc3219_1040945781">
             <w:r>
               <w:rPr>
                 <w:rStyle w:val="IndexLink"/>
@@ -1958,7 +1958,7 @@
             </w:tabs>
             <w:rPr/>
           </w:pPr>
-          <w:hyperlink w:anchor="__RefHeading___Toc3209_1804765426">
+          <w:hyperlink w:anchor="__RefHeading___Toc3221_1040945781">
             <w:r>
               <w:rPr>
                 <w:rStyle w:val="IndexLink"/>
@@ -1978,7 +1978,7 @@
             </w:tabs>
             <w:rPr/>
           </w:pPr>
-          <w:hyperlink w:anchor="__RefHeading___Toc3211_1804765426">
+          <w:hyperlink w:anchor="__RefHeading___Toc3223_1040945781">
             <w:r>
               <w:rPr>
                 <w:rStyle w:val="IndexLink"/>
@@ -1998,7 +1998,7 @@
             </w:tabs>
             <w:rPr/>
           </w:pPr>
-          <w:hyperlink w:anchor="__RefHeading___Toc3213_1804765426">
+          <w:hyperlink w:anchor="__RefHeading___Toc3225_1040945781">
             <w:r>
               <w:rPr>
                 <w:rStyle w:val="IndexLink"/>
@@ -2018,7 +2018,7 @@
             </w:tabs>
             <w:rPr/>
           </w:pPr>
-          <w:hyperlink w:anchor="__RefHeading___Toc3215_1804765426">
+          <w:hyperlink w:anchor="__RefHeading___Toc3227_1040945781">
             <w:r>
               <w:rPr>
                 <w:rStyle w:val="IndexLink"/>
@@ -2038,7 +2038,7 @@
             </w:tabs>
             <w:rPr/>
           </w:pPr>
-          <w:hyperlink w:anchor="__RefHeading___Toc3217_1804765426">
+          <w:hyperlink w:anchor="__RefHeading___Toc3229_1040945781">
             <w:r>
               <w:rPr>
                 <w:rStyle w:val="IndexLink"/>
@@ -2058,7 +2058,7 @@
             </w:tabs>
             <w:rPr/>
           </w:pPr>
-          <w:hyperlink w:anchor="__RefHeading___Toc3219_1804765426">
+          <w:hyperlink w:anchor="__RefHeading___Toc3231_1040945781">
             <w:r>
               <w:rPr>
                 <w:rStyle w:val="IndexLink"/>
@@ -2078,7 +2078,7 @@
             </w:tabs>
             <w:rPr/>
           </w:pPr>
-          <w:hyperlink w:anchor="__RefHeading___Toc3221_1804765426">
+          <w:hyperlink w:anchor="__RefHeading___Toc3233_1040945781">
             <w:r>
               <w:rPr>
                 <w:rStyle w:val="IndexLink"/>
@@ -2098,7 +2098,7 @@
             </w:tabs>
             <w:rPr/>
           </w:pPr>
-          <w:hyperlink w:anchor="__RefHeading___Toc3223_1804765426">
+          <w:hyperlink w:anchor="__RefHeading___Toc3235_1040945781">
             <w:r>
               <w:rPr>
                 <w:rStyle w:val="IndexLink"/>
@@ -2118,7 +2118,7 @@
             </w:tabs>
             <w:rPr/>
           </w:pPr>
-          <w:hyperlink w:anchor="__RefHeading___Toc3225_1804765426">
+          <w:hyperlink w:anchor="__RefHeading___Toc3237_1040945781">
             <w:r>
               <w:rPr>
                 <w:rStyle w:val="IndexLink"/>
@@ -2138,7 +2138,7 @@
             </w:tabs>
             <w:rPr/>
           </w:pPr>
-          <w:hyperlink w:anchor="__RefHeading___Toc3227_1804765426">
+          <w:hyperlink w:anchor="__RefHeading___Toc3239_1040945781">
             <w:r>
               <w:rPr>
                 <w:rStyle w:val="IndexLink"/>
@@ -2174,7 +2174,7 @@
         <w:pStyle w:val="Heading1"/>
         <w:rPr/>
       </w:pPr>
-      <w:bookmarkStart w:id="0" w:name="__RefHeading___Toc3123_1804765426"/>
+      <w:bookmarkStart w:id="0" w:name="__RefHeading___Toc3135_1040945781"/>
       <w:bookmarkEnd w:id="0"/>
       <w:r>
         <w:rPr/>
@@ -2186,7 +2186,7 @@
         <w:pStyle w:val="Heading2"/>
         <w:rPr/>
       </w:pPr>
-      <w:bookmarkStart w:id="1" w:name="__RefHeading___Toc3125_1804765426"/>
+      <w:bookmarkStart w:id="1" w:name="__RefHeading___Toc3137_1040945781"/>
       <w:bookmarkEnd w:id="1"/>
       <w:r>
         <w:rPr/>
@@ -2242,7 +2242,7 @@
         <w:pStyle w:val="Heading2"/>
         <w:rPr/>
       </w:pPr>
-      <w:bookmarkStart w:id="2" w:name="__RefHeading___Toc3127_1804765426"/>
+      <w:bookmarkStart w:id="2" w:name="__RefHeading___Toc3139_1040945781"/>
       <w:bookmarkEnd w:id="2"/>
       <w:r>
         <w:rPr/>
@@ -2344,7 +2344,7 @@
         <w:pStyle w:val="Heading2"/>
         <w:rPr/>
       </w:pPr>
-      <w:bookmarkStart w:id="3" w:name="__RefHeading___Toc3129_1804765426"/>
+      <w:bookmarkStart w:id="3" w:name="__RefHeading___Toc3141_1040945781"/>
       <w:bookmarkEnd w:id="3"/>
       <w:r>
         <w:rPr/>
@@ -2381,7 +2381,7 @@
         <w:pStyle w:val="Heading1"/>
         <w:rPr/>
       </w:pPr>
-      <w:bookmarkStart w:id="4" w:name="__RefHeading___Toc3131_1804765426"/>
+      <w:bookmarkStart w:id="4" w:name="__RefHeading___Toc3143_1040945781"/>
       <w:bookmarkEnd w:id="4"/>
       <w:r>
         <w:rPr/>
@@ -2393,7 +2393,7 @@
         <w:pStyle w:val="Heading2"/>
         <w:rPr/>
       </w:pPr>
-      <w:bookmarkStart w:id="5" w:name="__RefHeading___Toc3133_1804765426"/>
+      <w:bookmarkStart w:id="5" w:name="__RefHeading___Toc3145_1040945781"/>
       <w:bookmarkEnd w:id="5"/>
       <w:r>
         <w:rPr/>
@@ -2427,7 +2427,7 @@
         <w:pStyle w:val="Heading2"/>
         <w:rPr/>
       </w:pPr>
-      <w:bookmarkStart w:id="6" w:name="__RefHeading___Toc3135_1804765426"/>
+      <w:bookmarkStart w:id="6" w:name="__RefHeading___Toc3147_1040945781"/>
       <w:bookmarkEnd w:id="6"/>
       <w:r>
         <w:rPr/>
@@ -2691,7 +2691,7 @@
         <w:pStyle w:val="Heading2"/>
         <w:rPr/>
       </w:pPr>
-      <w:bookmarkStart w:id="7" w:name="__RefHeading___Toc3137_1804765426"/>
+      <w:bookmarkStart w:id="7" w:name="__RefHeading___Toc3149_1040945781"/>
       <w:bookmarkEnd w:id="7"/>
       <w:r>
         <w:rPr/>
@@ -3105,7 +3105,7 @@
       <w:r>
         <w:br w:type="page"/>
       </w:r>
-      <w:bookmarkStart w:id="8" w:name="__RefHeading___Toc3139_1804765426"/>
+      <w:bookmarkStart w:id="8" w:name="__RefHeading___Toc3151_1040945781"/>
       <w:bookmarkEnd w:id="8"/>
       <w:r>
         <w:rPr/>
@@ -3689,7 +3689,7 @@
       <w:r>
         <w:br w:type="page"/>
       </w:r>
-      <w:bookmarkStart w:id="9" w:name="__RefHeading___Toc3141_1804765426"/>
+      <w:bookmarkStart w:id="9" w:name="__RefHeading___Toc3153_1040945781"/>
       <w:bookmarkEnd w:id="9"/>
       <w:r>
         <w:rPr/>
@@ -3923,7 +3923,7 @@
         <w:pStyle w:val="Heading2"/>
         <w:rPr/>
       </w:pPr>
-      <w:bookmarkStart w:id="10" w:name="__RefHeading___Toc3143_1804765426"/>
+      <w:bookmarkStart w:id="10" w:name="__RefHeading___Toc3155_1040945781"/>
       <w:bookmarkEnd w:id="10"/>
       <w:r>
         <w:rPr/>
@@ -4230,7 +4230,7 @@
         <w:pStyle w:val="Heading1"/>
         <w:rPr/>
       </w:pPr>
-      <w:bookmarkStart w:id="11" w:name="__RefHeading___Toc3145_1804765426"/>
+      <w:bookmarkStart w:id="11" w:name="__RefHeading___Toc3157_1040945781"/>
       <w:bookmarkEnd w:id="11"/>
       <w:r>
         <w:rPr/>
@@ -4242,7 +4242,7 @@
         <w:pStyle w:val="Heading2"/>
         <w:rPr/>
       </w:pPr>
-      <w:bookmarkStart w:id="12" w:name="__RefHeading___Toc3147_1804765426"/>
+      <w:bookmarkStart w:id="12" w:name="__RefHeading___Toc3159_1040945781"/>
       <w:bookmarkEnd w:id="12"/>
       <w:r>
         <w:rPr/>
@@ -5032,7 +5032,7 @@
         <w:pStyle w:val="Heading2"/>
         <w:rPr/>
       </w:pPr>
-      <w:bookmarkStart w:id="13" w:name="__RefHeading___Toc3149_1804765426"/>
+      <w:bookmarkStart w:id="13" w:name="__RefHeading___Toc3161_1040945781"/>
       <w:bookmarkEnd w:id="13"/>
       <w:r>
         <w:rPr/>
@@ -5210,7 +5210,7 @@
         <w:pStyle w:val="Heading2"/>
         <w:rPr/>
       </w:pPr>
-      <w:bookmarkStart w:id="14" w:name="__RefHeading___Toc3151_1804765426"/>
+      <w:bookmarkStart w:id="14" w:name="__RefHeading___Toc3163_1040945781"/>
       <w:bookmarkEnd w:id="14"/>
       <w:r>
         <w:rPr/>
@@ -5700,7 +5700,7 @@
         <w:pStyle w:val="Heading2"/>
         <w:rPr/>
       </w:pPr>
-      <w:bookmarkStart w:id="15" w:name="__RefHeading___Toc3153_1804765426"/>
+      <w:bookmarkStart w:id="15" w:name="__RefHeading___Toc3165_1040945781"/>
       <w:bookmarkEnd w:id="15"/>
       <w:r>
         <w:rPr/>
@@ -6695,7 +6695,7 @@
         <w:pStyle w:val="Heading1"/>
         <w:rPr/>
       </w:pPr>
-      <w:bookmarkStart w:id="16" w:name="__RefHeading___Toc3155_1804765426"/>
+      <w:bookmarkStart w:id="16" w:name="__RefHeading___Toc3167_1040945781"/>
       <w:bookmarkEnd w:id="16"/>
       <w:r>
         <w:rPr/>
@@ -6707,7 +6707,7 @@
         <w:pStyle w:val="Heading2"/>
         <w:rPr/>
       </w:pPr>
-      <w:bookmarkStart w:id="17" w:name="__RefHeading___Toc3157_1804765426"/>
+      <w:bookmarkStart w:id="17" w:name="__RefHeading___Toc3169_1040945781"/>
       <w:bookmarkEnd w:id="17"/>
       <w:r>
         <w:rPr/>
@@ -6982,7 +6982,7 @@
         <w:pStyle w:val="Heading2"/>
         <w:rPr/>
       </w:pPr>
-      <w:bookmarkStart w:id="18" w:name="__RefHeading___Toc3159_1804765426"/>
+      <w:bookmarkStart w:id="18" w:name="__RefHeading___Toc3171_1040945781"/>
       <w:bookmarkEnd w:id="18"/>
       <w:r>
         <w:rPr/>
@@ -7080,7 +7080,7 @@
         <w:pStyle w:val="Heading2"/>
         <w:rPr/>
       </w:pPr>
-      <w:bookmarkStart w:id="19" w:name="__RefHeading___Toc3161_1804765426"/>
+      <w:bookmarkStart w:id="19" w:name="__RefHeading___Toc3173_1040945781"/>
       <w:bookmarkEnd w:id="19"/>
       <w:r>
         <w:rPr/>
@@ -7586,7 +7586,7 @@
       <w:r>
         <w:br w:type="page"/>
       </w:r>
-      <w:bookmarkStart w:id="20" w:name="__RefHeading___Toc3163_1804765426"/>
+      <w:bookmarkStart w:id="20" w:name="__RefHeading___Toc3175_1040945781"/>
       <w:bookmarkEnd w:id="20"/>
       <w:r>
         <w:rPr/>
@@ -7598,7 +7598,7 @@
         <w:pStyle w:val="Heading2"/>
         <w:rPr/>
       </w:pPr>
-      <w:bookmarkStart w:id="21" w:name="__RefHeading___Toc3165_1804765426"/>
+      <w:bookmarkStart w:id="21" w:name="__RefHeading___Toc3177_1040945781"/>
       <w:bookmarkEnd w:id="21"/>
       <w:r>
         <w:rPr/>
@@ -7764,7 +7764,7 @@
         <w:pStyle w:val="Heading2"/>
         <w:rPr/>
       </w:pPr>
-      <w:bookmarkStart w:id="22" w:name="__RefHeading___Toc3167_1804765426"/>
+      <w:bookmarkStart w:id="22" w:name="__RefHeading___Toc3179_1040945781"/>
       <w:bookmarkEnd w:id="22"/>
       <w:r>
         <w:rPr/>
@@ -8298,7 +8298,7 @@
         <w:pStyle w:val="Heading2"/>
         <w:rPr/>
       </w:pPr>
-      <w:bookmarkStart w:id="23" w:name="__RefHeading___Toc3169_1804765426"/>
+      <w:bookmarkStart w:id="23" w:name="__RefHeading___Toc3181_1040945781"/>
       <w:bookmarkEnd w:id="23"/>
       <w:r>
         <w:rPr/>
@@ -8736,7 +8736,7 @@
       <w:r>
         <w:br w:type="page"/>
       </w:r>
-      <w:bookmarkStart w:id="24" w:name="__RefHeading___Toc3171_1804765426"/>
+      <w:bookmarkStart w:id="24" w:name="__RefHeading___Toc3183_1040945781"/>
       <w:bookmarkEnd w:id="24"/>
       <w:r>
         <w:rPr/>
@@ -8836,7 +8836,7 @@
         <w:pStyle w:val="Heading2"/>
         <w:rPr/>
       </w:pPr>
-      <w:bookmarkStart w:id="25" w:name="__RefHeading___Toc3173_1804765426"/>
+      <w:bookmarkStart w:id="25" w:name="__RefHeading___Toc3185_1040945781"/>
       <w:bookmarkEnd w:id="25"/>
       <w:r>
         <w:rPr/>
@@ -9302,7 +9302,7 @@
         <w:pStyle w:val="Heading1"/>
         <w:rPr/>
       </w:pPr>
-      <w:bookmarkStart w:id="26" w:name="__RefHeading___Toc3175_1804765426"/>
+      <w:bookmarkStart w:id="26" w:name="__RefHeading___Toc3187_1040945781"/>
       <w:bookmarkEnd w:id="26"/>
       <w:r>
         <w:rPr/>
@@ -9314,7 +9314,7 @@
         <w:pStyle w:val="Heading2"/>
         <w:rPr/>
       </w:pPr>
-      <w:bookmarkStart w:id="27" w:name="__RefHeading___Toc3177_1804765426"/>
+      <w:bookmarkStart w:id="27" w:name="__RefHeading___Toc3189_1040945781"/>
       <w:bookmarkEnd w:id="27"/>
       <w:r>
         <w:rPr/>
@@ -9671,7 +9671,7 @@
         <w:pStyle w:val="Heading2"/>
         <w:rPr/>
       </w:pPr>
-      <w:bookmarkStart w:id="28" w:name="__RefHeading___Toc3179_1804765426"/>
+      <w:bookmarkStart w:id="28" w:name="__RefHeading___Toc3191_1040945781"/>
       <w:bookmarkEnd w:id="28"/>
       <w:r>
         <w:rPr/>
@@ -9959,7 +9959,7 @@
         <w:pStyle w:val="Heading2"/>
         <w:rPr/>
       </w:pPr>
-      <w:bookmarkStart w:id="29" w:name="__RefHeading___Toc3181_1804765426"/>
+      <w:bookmarkStart w:id="29" w:name="__RefHeading___Toc3193_1040945781"/>
       <w:bookmarkEnd w:id="29"/>
       <w:r>
         <w:rPr/>
@@ -10162,7 +10162,7 @@
         <w:pStyle w:val="Heading1"/>
         <w:rPr/>
       </w:pPr>
-      <w:bookmarkStart w:id="30" w:name="__RefHeading___Toc3183_1804765426"/>
+      <w:bookmarkStart w:id="30" w:name="__RefHeading___Toc3195_1040945781"/>
       <w:bookmarkEnd w:id="30"/>
       <w:r>
         <w:rPr/>
@@ -10174,7 +10174,7 @@
         <w:pStyle w:val="Heading2"/>
         <w:rPr/>
       </w:pPr>
-      <w:bookmarkStart w:id="31" w:name="__RefHeading___Toc3185_1804765426"/>
+      <w:bookmarkStart w:id="31" w:name="__RefHeading___Toc3197_1040945781"/>
       <w:bookmarkEnd w:id="31"/>
       <w:r>
         <w:rPr/>
@@ -11138,7 +11138,7 @@
         <w:pStyle w:val="Heading2"/>
         <w:rPr/>
       </w:pPr>
-      <w:bookmarkStart w:id="32" w:name="__RefHeading___Toc3187_1804765426"/>
+      <w:bookmarkStart w:id="32" w:name="__RefHeading___Toc3199_1040945781"/>
       <w:bookmarkEnd w:id="32"/>
       <w:r>
         <w:rPr/>
@@ -11732,7 +11732,7 @@
       <w:r>
         <w:br w:type="page"/>
       </w:r>
-      <w:bookmarkStart w:id="33" w:name="__RefHeading___Toc3189_1804765426"/>
+      <w:bookmarkStart w:id="33" w:name="__RefHeading___Toc3201_1040945781"/>
       <w:bookmarkEnd w:id="33"/>
       <w:r>
         <w:rPr/>
@@ -12560,7 +12560,7 @@
       <w:r>
         <w:br w:type="page"/>
       </w:r>
-      <w:bookmarkStart w:id="34" w:name="__RefHeading___Toc3191_1804765426"/>
+      <w:bookmarkStart w:id="34" w:name="__RefHeading___Toc3203_1040945781"/>
       <w:bookmarkEnd w:id="34"/>
       <w:r>
         <w:rPr/>
@@ -14659,7 +14659,7 @@
       <w:r>
         <w:br w:type="page"/>
       </w:r>
-      <w:bookmarkStart w:id="35" w:name="__RefHeading___Toc3193_1804765426"/>
+      <w:bookmarkStart w:id="35" w:name="__RefHeading___Toc3205_1040945781"/>
       <w:bookmarkEnd w:id="35"/>
       <w:r>
         <w:rPr/>
@@ -14671,7 +14671,7 @@
         <w:pStyle w:val="Heading2"/>
         <w:rPr/>
       </w:pPr>
-      <w:bookmarkStart w:id="36" w:name="__RefHeading___Toc3195_1804765426"/>
+      <w:bookmarkStart w:id="36" w:name="__RefHeading___Toc3207_1040945781"/>
       <w:bookmarkEnd w:id="36"/>
       <w:r>
         <w:rPr/>
@@ -14747,7 +14747,7 @@
         <w:pStyle w:val="Heading2"/>
         <w:rPr/>
       </w:pPr>
-      <w:bookmarkStart w:id="37" w:name="__RefHeading___Toc3197_1804765426"/>
+      <w:bookmarkStart w:id="37" w:name="__RefHeading___Toc3209_1040945781"/>
       <w:bookmarkEnd w:id="37"/>
       <w:r>
         <w:rPr/>
@@ -14879,7 +14879,7 @@
       </w:r>
       <w:r>
         <w:rPr/>
-        <w:t xml:space="preserve"> quedan 7 incidentes (entre ellos INC-022, AFA, e INC-013, Stucx Team, sin fecha) y los 16 hechos clave (sección 14.6).</w:t>
+        <w:t xml:space="preserve"> quedan 6 incidentes (entre ellos INC-013, Stucx Team, sin fecha) y los 16 hechos clave (sección 14.6). Todos los hacktivistas con fecha ya están verificados.</w:t>
       </w:r>
     </w:p>
     <w:p>
@@ -14887,7 +14887,7 @@
         <w:pStyle w:val="Heading2"/>
         <w:rPr/>
       </w:pPr>
-      <w:bookmarkStart w:id="38" w:name="__RefHeading___Toc3199_1804765426"/>
+      <w:bookmarkStart w:id="38" w:name="__RefHeading___Toc3211_1040945781"/>
       <w:bookmarkEnd w:id="38"/>
       <w:r>
         <w:rPr/>
@@ -14968,7 +14968,7 @@
         <w:pStyle w:val="Heading1"/>
         <w:rPr/>
       </w:pPr>
-      <w:bookmarkStart w:id="39" w:name="__RefHeading___Toc3201_1804765426"/>
+      <w:bookmarkStart w:id="39" w:name="__RefHeading___Toc3213_1040945781"/>
       <w:bookmarkEnd w:id="39"/>
       <w:r>
         <w:rPr/>
@@ -14980,7 +14980,7 @@
         <w:pStyle w:val="Heading2"/>
         <w:rPr/>
       </w:pPr>
-      <w:bookmarkStart w:id="40" w:name="__RefHeading___Toc3203_1804765426"/>
+      <w:bookmarkStart w:id="40" w:name="__RefHeading___Toc3215_1040945781"/>
       <w:bookmarkEnd w:id="40"/>
       <w:r>
         <w:rPr/>
@@ -15003,7 +15003,7 @@
         <w:pStyle w:val="Heading2"/>
         <w:rPr/>
       </w:pPr>
-      <w:bookmarkStart w:id="41" w:name="__RefHeading___Toc3205_1804765426"/>
+      <w:bookmarkStart w:id="41" w:name="__RefHeading___Toc3217_1040945781"/>
       <w:bookmarkEnd w:id="41"/>
       <w:r>
         <w:rPr/>
@@ -15115,7 +15115,7 @@
         <w:pStyle w:val="Heading2"/>
         <w:rPr/>
       </w:pPr>
-      <w:bookmarkStart w:id="42" w:name="__RefHeading___Toc3207_1804765426"/>
+      <w:bookmarkStart w:id="42" w:name="__RefHeading___Toc3219_1040945781"/>
       <w:bookmarkEnd w:id="42"/>
       <w:r>
         <w:rPr/>
@@ -17395,7 +17395,7 @@
         <w:pStyle w:val="Heading2"/>
         <w:rPr/>
       </w:pPr>
-      <w:bookmarkStart w:id="43" w:name="__RefHeading___Toc3209_1804765426"/>
+      <w:bookmarkStart w:id="43" w:name="__RefHeading___Toc3221_1040945781"/>
       <w:bookmarkEnd w:id="43"/>
       <w:r>
         <w:rPr/>
@@ -17518,7 +17518,7 @@
         <w:pStyle w:val="Heading2"/>
         <w:rPr/>
       </w:pPr>
-      <w:bookmarkStart w:id="44" w:name="__RefHeading___Toc3211_1804765426"/>
+      <w:bookmarkStart w:id="44" w:name="__RefHeading___Toc3223_1040945781"/>
       <w:bookmarkEnd w:id="44"/>
       <w:r>
         <w:rPr/>
@@ -20167,7 +20167,7 @@
         <w:pStyle w:val="Heading2"/>
         <w:rPr/>
       </w:pPr>
-      <w:bookmarkStart w:id="45" w:name="__RefHeading___Toc3213_1804765426"/>
+      <w:bookmarkStart w:id="45" w:name="__RefHeading___Toc3225_1040945781"/>
       <w:bookmarkEnd w:id="45"/>
       <w:r>
         <w:rPr/>
@@ -20790,7 +20790,7 @@
         <w:pStyle w:val="Heading1"/>
         <w:rPr/>
       </w:pPr>
-      <w:bookmarkStart w:id="46" w:name="__RefHeading___Toc3215_1804765426"/>
+      <w:bookmarkStart w:id="46" w:name="__RefHeading___Toc3227_1040945781"/>
       <w:bookmarkEnd w:id="46"/>
       <w:r>
         <w:rPr/>
@@ -20802,7 +20802,7 @@
         <w:pStyle w:val="Heading2"/>
         <w:rPr/>
       </w:pPr>
-      <w:bookmarkStart w:id="47" w:name="__RefHeading___Toc3217_1804765426"/>
+      <w:bookmarkStart w:id="47" w:name="__RefHeading___Toc3229_1040945781"/>
       <w:bookmarkEnd w:id="47"/>
       <w:r>
         <w:rPr/>
@@ -20924,7 +20924,7 @@
         <w:pStyle w:val="Heading2"/>
         <w:rPr/>
       </w:pPr>
-      <w:bookmarkStart w:id="48" w:name="__RefHeading___Toc3219_1804765426"/>
+      <w:bookmarkStart w:id="48" w:name="__RefHeading___Toc3231_1040945781"/>
       <w:bookmarkEnd w:id="48"/>
       <w:r>
         <w:rPr/>
@@ -21195,21 +21195,21 @@
                 <w:sz w:val="19"/>
                 <w:szCs w:val="19"/>
               </w:rPr>
-              <w:t>1/6 (16.7 %)</w:t>
-            </w:r>
-          </w:p>
-          <w:p>
-            <w:pPr>
-              <w:pStyle w:val="Normal"/>
-              <w:spacing w:before="0" w:after="20"/>
-              <w:rPr/>
-            </w:pPr>
-            <w:r>
-              <w:rPr>
-                <w:sz w:val="19"/>
-                <w:szCs w:val="19"/>
-              </w:rPr>
-              <w:t>razón 0.89</w:t>
+              <w:t>1/5 (20 %)</w:t>
+            </w:r>
+          </w:p>
+          <w:p>
+            <w:pPr>
+              <w:pStyle w:val="Normal"/>
+              <w:spacing w:before="0" w:after="20"/>
+              <w:rPr/>
+            </w:pPr>
+            <w:r>
+              <w:rPr>
+                <w:sz w:val="19"/>
+                <w:szCs w:val="19"/>
+              </w:rPr>
+              <w:t>razón 1.06</w:t>
             </w:r>
           </w:p>
         </w:tc>
@@ -21365,21 +21365,21 @@
                 <w:sz w:val="19"/>
                 <w:szCs w:val="19"/>
               </w:rPr>
-              <w:t>1/6 (16.7 %)</w:t>
-            </w:r>
-          </w:p>
-          <w:p>
-            <w:pPr>
-              <w:pStyle w:val="Normal"/>
-              <w:spacing w:before="0" w:after="20"/>
-              <w:rPr/>
-            </w:pPr>
-            <w:r>
-              <w:rPr>
-                <w:sz w:val="19"/>
-                <w:szCs w:val="19"/>
-              </w:rPr>
-              <w:t>razón 0.65</w:t>
+              <w:t>1/5 (20 %)</w:t>
+            </w:r>
+          </w:p>
+          <w:p>
+            <w:pPr>
+              <w:pStyle w:val="Normal"/>
+              <w:spacing w:before="0" w:after="20"/>
+              <w:rPr/>
+            </w:pPr>
+            <w:r>
+              <w:rPr>
+                <w:sz w:val="19"/>
+                <w:szCs w:val="19"/>
+              </w:rPr>
+              <w:t>razón 0.79</w:t>
             </w:r>
           </w:p>
         </w:tc>
@@ -21535,21 +21535,21 @@
                 <w:sz w:val="19"/>
                 <w:szCs w:val="19"/>
               </w:rPr>
-              <w:t>2/6 (33.3 %)</w:t>
-            </w:r>
-          </w:p>
-          <w:p>
-            <w:pPr>
-              <w:pStyle w:val="Normal"/>
-              <w:spacing w:before="0" w:after="20"/>
-              <w:rPr/>
-            </w:pPr>
-            <w:r>
-              <w:rPr>
-                <w:sz w:val="19"/>
-                <w:szCs w:val="19"/>
-              </w:rPr>
-              <w:t>razón 1.03</w:t>
+              <w:t>2/5 (40 %)</w:t>
+            </w:r>
+          </w:p>
+          <w:p>
+            <w:pPr>
+              <w:pStyle w:val="Normal"/>
+              <w:spacing w:before="0" w:after="20"/>
+              <w:rPr/>
+            </w:pPr>
+            <w:r>
+              <w:rPr>
+                <w:sz w:val="19"/>
+                <w:szCs w:val="19"/>
+              </w:rPr>
+              <w:t>razón 1.23</w:t>
             </w:r>
           </w:p>
         </w:tc>
@@ -21705,21 +21705,21 @@
                 <w:sz w:val="19"/>
                 <w:szCs w:val="19"/>
               </w:rPr>
-              <w:t>4/6 (66.7 %)</w:t>
-            </w:r>
-          </w:p>
-          <w:p>
-            <w:pPr>
-              <w:pStyle w:val="Normal"/>
-              <w:spacing w:before="0" w:after="20"/>
-              <w:rPr/>
-            </w:pPr>
-            <w:r>
-              <w:rPr>
-                <w:sz w:val="19"/>
-                <w:szCs w:val="19"/>
-              </w:rPr>
-              <w:t>razón 1.83</w:t>
+              <w:t>4/5 (80 %)</w:t>
+            </w:r>
+          </w:p>
+          <w:p>
+            <w:pPr>
+              <w:pStyle w:val="Normal"/>
+              <w:spacing w:before="0" w:after="20"/>
+              <w:rPr/>
+            </w:pPr>
+            <w:r>
+              <w:rPr>
+                <w:sz w:val="19"/>
+                <w:szCs w:val="19"/>
+              </w:rPr>
+              <w:t>razón 2.2</w:t>
             </w:r>
           </w:p>
         </w:tc>
@@ -22066,7 +22066,7 @@
                 <w:sz w:val="19"/>
                 <w:szCs w:val="19"/>
               </w:rPr>
-              <w:t>0/2 (0 %)</w:t>
+              <w:t>0/1 (0 %)</w:t>
             </w:r>
           </w:p>
           <w:p>
@@ -22236,7 +22236,7 @@
                 <w:sz w:val="19"/>
                 <w:szCs w:val="19"/>
               </w:rPr>
-              <w:t>0/2 (0 %)</w:t>
+              <w:t>0/1 (0 %)</w:t>
             </w:r>
           </w:p>
           <w:p>
@@ -22406,7 +22406,7 @@
                 <w:sz w:val="19"/>
                 <w:szCs w:val="19"/>
               </w:rPr>
-              <w:t>0/2 (0 %)</w:t>
+              <w:t>0/1 (0 %)</w:t>
             </w:r>
           </w:p>
           <w:p>
@@ -22576,21 +22576,21 @@
                 <w:sz w:val="19"/>
                 <w:szCs w:val="19"/>
               </w:rPr>
-              <w:t>1/2 (50 %)</w:t>
-            </w:r>
-          </w:p>
-          <w:p>
-            <w:pPr>
-              <w:pStyle w:val="Normal"/>
-              <w:spacing w:before="0" w:after="20"/>
-              <w:rPr/>
-            </w:pPr>
-            <w:r>
-              <w:rPr>
-                <w:sz w:val="19"/>
-                <w:szCs w:val="19"/>
-              </w:rPr>
-              <w:t>razón 1.38</w:t>
+              <w:t>1/1 (100 %)</w:t>
+            </w:r>
+          </w:p>
+          <w:p>
+            <w:pPr>
+              <w:pStyle w:val="Normal"/>
+              <w:spacing w:before="0" w:after="20"/>
+              <w:rPr/>
+            </w:pPr>
+            <w:r>
+              <w:rPr>
+                <w:sz w:val="19"/>
+                <w:szCs w:val="19"/>
+              </w:rPr>
+              <w:t>razón 2.75</w:t>
             </w:r>
           </w:p>
         </w:tc>
@@ -23637,7 +23637,7 @@
         <w:pStyle w:val="Heading2"/>
         <w:rPr/>
       </w:pPr>
-      <w:bookmarkStart w:id="49" w:name="__RefHeading___Toc3221_1804765426"/>
+      <w:bookmarkStart w:id="49" w:name="__RefHeading___Toc3233_1040945781"/>
       <w:bookmarkEnd w:id="49"/>
       <w:r>
         <w:rPr/>
@@ -24060,7 +24060,7 @@
                 <w:sz w:val="19"/>
                 <w:szCs w:val="19"/>
               </w:rPr>
-              <w:t>16 verificados, 2 descartados</w:t>
+              <w:t>16 verificados, 3 descartados</w:t>
             </w:r>
           </w:p>
         </w:tc>
@@ -24171,7 +24171,7 @@
       </w:r>
       <w:r>
         <w:rPr/>
-        <w:t xml:space="preserve"> (16, tras descartar 2), los hacktivistas caen dentro de las ventanas de 21 días en 4 de 5 casos (razón 2,20), frente a 1 de 6 de los cibercriminales (razón 0,46). Es la diferencia más clara obtenida hasta ahora.</w:t>
+        <w:t xml:space="preserve"> (tras descartar 3 que no guardaban relación con el Estado argentino: Cyber Dragonz, REM y el ataque a la AFA), los hacktivistas caen dentro de las ventanas de 21 días en 4 de 5 casos (razón 2,20), frente a 1 de 6 de los cibercriminales (razón 0,46). Es la diferencia más clara obtenida hasta ahora.</w:t>
       </w:r>
     </w:p>
     <w:p>
@@ -24331,7 +24331,7 @@
         <w:pStyle w:val="Heading2"/>
         <w:rPr/>
       </w:pPr>
-      <w:bookmarkStart w:id="50" w:name="__RefHeading___Toc3223_1804765426"/>
+      <w:bookmarkStart w:id="50" w:name="__RefHeading___Toc3235_1040945781"/>
       <w:bookmarkEnd w:id="50"/>
       <w:r>
         <w:rPr/>
@@ -24522,7 +24522,7 @@
         <w:pStyle w:val="Heading1"/>
         <w:rPr/>
       </w:pPr>
-      <w:bookmarkStart w:id="51" w:name="__RefHeading___Toc3225_1804765426"/>
+      <w:bookmarkStart w:id="51" w:name="__RefHeading___Toc3237_1040945781"/>
       <w:bookmarkEnd w:id="51"/>
       <w:r>
         <w:rPr/>
@@ -28491,6 +28491,109 @@
           </w:p>
         </w:tc>
       </w:tr>
+      <w:tr>
+        <w:trPr/>
+        <w:tc>
+          <w:tcPr>
+            <w:tcW w:w="1250" w:type="dxa"/>
+            <w:tcBorders>
+              <w:top w:val="single" w:sz="4" w:space="0" w:color="BFBFBF"/>
+              <w:left w:val="single" w:sz="4" w:space="0" w:color="BFBFBF"/>
+              <w:bottom w:val="single" w:sz="4" w:space="0" w:color="BFBFBF"/>
+              <w:right w:val="single" w:sz="4" w:space="0" w:color="BFBFBF"/>
+            </w:tcBorders>
+          </w:tcPr>
+          <w:p>
+            <w:pPr>
+              <w:pStyle w:val="Normal"/>
+              <w:spacing w:before="0" w:after="20"/>
+              <w:rPr/>
+            </w:pPr>
+            <w:r>
+              <w:rPr>
+                <w:sz w:val="19"/>
+                <w:szCs w:val="19"/>
+              </w:rPr>
+              <w:t>18/10/2026</w:t>
+            </w:r>
+          </w:p>
+        </w:tc>
+        <w:tc>
+          <w:tcPr>
+            <w:tcW w:w="1650" w:type="dxa"/>
+            <w:tcBorders>
+              <w:top w:val="single" w:sz="4" w:space="0" w:color="BFBFBF"/>
+              <w:left w:val="single" w:sz="4" w:space="0" w:color="BFBFBF"/>
+              <w:bottom w:val="single" w:sz="4" w:space="0" w:color="BFBFBF"/>
+              <w:right w:val="single" w:sz="4" w:space="0" w:color="BFBFBF"/>
+            </w:tcBorders>
+          </w:tcPr>
+          <w:p>
+            <w:pPr>
+              <w:pStyle w:val="Normal"/>
+              <w:spacing w:before="0" w:after="20"/>
+              <w:rPr/>
+            </w:pPr>
+            <w:r>
+              <w:rPr>
+                <w:sz w:val="19"/>
+                <w:szCs w:val="19"/>
+              </w:rPr>
+              <w:t>Verificación</w:t>
+            </w:r>
+          </w:p>
+        </w:tc>
+        <w:tc>
+          <w:tcPr>
+            <w:tcW w:w="2299" w:type="dxa"/>
+            <w:tcBorders>
+              <w:top w:val="single" w:sz="4" w:space="0" w:color="BFBFBF"/>
+              <w:left w:val="single" w:sz="4" w:space="0" w:color="BFBFBF"/>
+              <w:bottom w:val="single" w:sz="4" w:space="0" w:color="BFBFBF"/>
+              <w:right w:val="single" w:sz="4" w:space="0" w:color="BFBFBF"/>
+            </w:tcBorders>
+          </w:tcPr>
+          <w:p>
+            <w:pPr>
+              <w:pStyle w:val="Normal"/>
+              <w:spacing w:before="0" w:after="20"/>
+              <w:rPr/>
+            </w:pPr>
+            <w:r>
+              <w:rPr>
+                <w:sz w:val="19"/>
+                <w:szCs w:val="19"/>
+              </w:rPr>
+              <w:t>INC-022 descartado</w:t>
+            </w:r>
+          </w:p>
+        </w:tc>
+        <w:tc>
+          <w:tcPr>
+            <w:tcW w:w="4438" w:type="dxa"/>
+            <w:tcBorders>
+              <w:top w:val="single" w:sz="4" w:space="0" w:color="BFBFBF"/>
+              <w:left w:val="single" w:sz="4" w:space="0" w:color="BFBFBF"/>
+              <w:bottom w:val="single" w:sz="4" w:space="0" w:color="BFBFBF"/>
+              <w:right w:val="single" w:sz="4" w:space="0" w:color="BFBFBF"/>
+            </w:tcBorders>
+          </w:tcPr>
+          <w:p>
+            <w:pPr>
+              <w:pStyle w:val="Normal"/>
+              <w:spacing w:before="0" w:after="20"/>
+              <w:rPr/>
+            </w:pPr>
+            <w:r>
+              <w:rPr>
+                <w:sz w:val="19"/>
+                <w:szCs w:val="19"/>
+              </w:rPr>
+              <w:t>El autor descartó INC-022 (hackers de origen egipcio contra la AFA) por no guardar relación con el Estado argentino. Con esto quedan verificados todos los incidentes hacktivistas con fecha.</w:t>
+            </w:r>
+          </w:p>
+        </w:tc>
+      </w:tr>
     </w:tbl>
     <w:p>
       <w:pPr>
@@ -28500,7 +28603,7 @@
       <w:r>
         <w:br w:type="page"/>
       </w:r>
-      <w:bookmarkStart w:id="52" w:name="__RefHeading___Toc3227_1804765426"/>
+      <w:bookmarkStart w:id="52" w:name="__RefHeading___Toc3239_1040945781"/>
       <w:bookmarkEnd w:id="52"/>
       <w:r>
         <w:rPr/>

</xml_diff>

<commit_message>
Fuente nueva: canales públicos de Telegram de LulzSec Muslims y LulzSec Black (reclamos)
Lee la vista web pública t.me/s/<canal> sin cuenta. Los mensajes que mencionan
a Argentina, un dominio .ar o la bandera y tienen una señal de ataque se toman
como reclamos sin verificar, en un grupo aparte de la evaluación (D34).
Incluye pruebas, comando 'python -m monitor telegram' y paso de prueba en verificar.yml.

Co-Authored-By: Claude Opus 5.5 <noreply@anthropic.com>
Claude-Session: https://claude.ai/code/session_011eMYWh6VDWd8LKxBrkPUCG
</commit_message>
<xml_diff>
--- a/memoria/Memoria_TFM.docx
+++ b/memoria/Memoria_TFM.docx
@@ -1098,7 +1098,7 @@
             </w:rPr>
             <w:fldChar w:fldCharType="separate"/>
           </w:r>
-          <w:hyperlink w:anchor="__RefHeading___Toc3147_1774759734">
+          <w:hyperlink w:anchor="__RefHeading___Toc3195_3652871108">
             <w:r>
               <w:rPr>
                 <w:rStyle w:val="IndexLink"/>
@@ -1118,7 +1118,7 @@
             </w:tabs>
             <w:rPr/>
           </w:pPr>
-          <w:hyperlink w:anchor="__RefHeading___Toc3149_1774759734">
+          <w:hyperlink w:anchor="__RefHeading___Toc3197_3652871108">
             <w:r>
               <w:rPr>
                 <w:rStyle w:val="IndexLink"/>
@@ -1138,7 +1138,7 @@
             </w:tabs>
             <w:rPr/>
           </w:pPr>
-          <w:hyperlink w:anchor="__RefHeading___Toc3151_1774759734">
+          <w:hyperlink w:anchor="__RefHeading___Toc3199_3652871108">
             <w:r>
               <w:rPr>
                 <w:rStyle w:val="IndexLink"/>
@@ -1158,7 +1158,7 @@
             </w:tabs>
             <w:rPr/>
           </w:pPr>
-          <w:hyperlink w:anchor="__RefHeading___Toc3153_1774759734">
+          <w:hyperlink w:anchor="__RefHeading___Toc3201_3652871108">
             <w:r>
               <w:rPr>
                 <w:rStyle w:val="IndexLink"/>
@@ -1178,7 +1178,7 @@
             </w:tabs>
             <w:rPr/>
           </w:pPr>
-          <w:hyperlink w:anchor="__RefHeading___Toc3155_1774759734">
+          <w:hyperlink w:anchor="__RefHeading___Toc3203_3652871108">
             <w:r>
               <w:rPr>
                 <w:rStyle w:val="IndexLink"/>
@@ -1198,7 +1198,7 @@
             </w:tabs>
             <w:rPr/>
           </w:pPr>
-          <w:hyperlink w:anchor="__RefHeading___Toc3157_1774759734">
+          <w:hyperlink w:anchor="__RefHeading___Toc3205_3652871108">
             <w:r>
               <w:rPr>
                 <w:rStyle w:val="IndexLink"/>
@@ -1218,7 +1218,7 @@
             </w:tabs>
             <w:rPr/>
           </w:pPr>
-          <w:hyperlink w:anchor="__RefHeading___Toc3159_1774759734">
+          <w:hyperlink w:anchor="__RefHeading___Toc3207_3652871108">
             <w:r>
               <w:rPr>
                 <w:rStyle w:val="IndexLink"/>
@@ -1238,7 +1238,7 @@
             </w:tabs>
             <w:rPr/>
           </w:pPr>
-          <w:hyperlink w:anchor="__RefHeading___Toc3161_1774759734">
+          <w:hyperlink w:anchor="__RefHeading___Toc3209_3652871108">
             <w:r>
               <w:rPr>
                 <w:rStyle w:val="IndexLink"/>
@@ -1258,7 +1258,7 @@
             </w:tabs>
             <w:rPr/>
           </w:pPr>
-          <w:hyperlink w:anchor="__RefHeading___Toc3163_1774759734">
+          <w:hyperlink w:anchor="__RefHeading___Toc3211_3652871108">
             <w:r>
               <w:rPr>
                 <w:rStyle w:val="IndexLink"/>
@@ -1278,7 +1278,7 @@
             </w:tabs>
             <w:rPr/>
           </w:pPr>
-          <w:hyperlink w:anchor="__RefHeading___Toc3165_1774759734">
+          <w:hyperlink w:anchor="__RefHeading___Toc3213_3652871108">
             <w:r>
               <w:rPr>
                 <w:rStyle w:val="IndexLink"/>
@@ -1298,7 +1298,7 @@
             </w:tabs>
             <w:rPr/>
           </w:pPr>
-          <w:hyperlink w:anchor="__RefHeading___Toc3167_1774759734">
+          <w:hyperlink w:anchor="__RefHeading___Toc3215_3652871108">
             <w:r>
               <w:rPr>
                 <w:rStyle w:val="IndexLink"/>
@@ -1318,7 +1318,7 @@
             </w:tabs>
             <w:rPr/>
           </w:pPr>
-          <w:hyperlink w:anchor="__RefHeading___Toc3169_1774759734">
+          <w:hyperlink w:anchor="__RefHeading___Toc3217_3652871108">
             <w:r>
               <w:rPr>
                 <w:rStyle w:val="IndexLink"/>
@@ -1338,7 +1338,7 @@
             </w:tabs>
             <w:rPr/>
           </w:pPr>
-          <w:hyperlink w:anchor="__RefHeading___Toc3171_1774759734">
+          <w:hyperlink w:anchor="__RefHeading___Toc3219_3652871108">
             <w:r>
               <w:rPr>
                 <w:rStyle w:val="IndexLink"/>
@@ -1358,7 +1358,7 @@
             </w:tabs>
             <w:rPr/>
           </w:pPr>
-          <w:hyperlink w:anchor="__RefHeading___Toc3173_1774759734">
+          <w:hyperlink w:anchor="__RefHeading___Toc3221_3652871108">
             <w:r>
               <w:rPr>
                 <w:rStyle w:val="IndexLink"/>
@@ -1378,12 +1378,12 @@
             </w:tabs>
             <w:rPr/>
           </w:pPr>
-          <w:hyperlink w:anchor="__RefHeading___Toc3175_1774759734">
+          <w:hyperlink w:anchor="__RefHeading___Toc3223_3652871108">
             <w:r>
               <w:rPr>
                 <w:rStyle w:val="IndexLink"/>
               </w:rPr>
-              <w:t>5.3. Archivos de carga manual</w:t>
+              <w:t>5.3. Canales de Telegram de los grupos</w:t>
               <w:tab/>
               <w:t>9</w:t>
             </w:r>
@@ -1398,12 +1398,32 @@
             </w:tabs>
             <w:rPr/>
           </w:pPr>
-          <w:hyperlink w:anchor="__RefHeading___Toc3177_1774759734">
+          <w:hyperlink w:anchor="__RefHeading___Toc3225_3652871108">
             <w:r>
               <w:rPr>
                 <w:rStyle w:val="IndexLink"/>
               </w:rPr>
-              <w:t>5.4. Búsqueda inicial de incidentes (pendiente de validación)</w:t>
+              <w:t>5.4. Archivos de carga manual</w:t>
+              <w:tab/>
+              <w:t>10</w:t>
+            </w:r>
+          </w:hyperlink>
+        </w:p>
+        <w:p>
+          <w:pPr>
+            <w:pStyle w:val="TOC2"/>
+            <w:tabs>
+              <w:tab w:val="clear" w:pos="9355"/>
+              <w:tab w:val="right" w:pos="9637" w:leader="dot"/>
+            </w:tabs>
+            <w:rPr/>
+          </w:pPr>
+          <w:hyperlink w:anchor="__RefHeading___Toc3227_3652871108">
+            <w:r>
+              <w:rPr>
+                <w:rStyle w:val="IndexLink"/>
+              </w:rPr>
+              <w:t>5.5. Búsqueda inicial de incidentes (pendiente de validación)</w:t>
               <w:tab/>
               <w:t>10</w:t>
             </w:r>
@@ -1418,7 +1438,7 @@
             </w:tabs>
             <w:rPr/>
           </w:pPr>
-          <w:hyperlink w:anchor="__RefHeading___Toc3179_1774759734">
+          <w:hyperlink w:anchor="__RefHeading___Toc3229_3652871108">
             <w:r>
               <w:rPr>
                 <w:rStyle w:val="IndexLink"/>
@@ -1438,7 +1458,7 @@
             </w:tabs>
             <w:rPr/>
           </w:pPr>
-          <w:hyperlink w:anchor="__RefHeading___Toc3181_1774759734">
+          <w:hyperlink w:anchor="__RefHeading___Toc3231_3652871108">
             <w:r>
               <w:rPr>
                 <w:rStyle w:val="IndexLink"/>
@@ -1458,7 +1478,7 @@
             </w:tabs>
             <w:rPr/>
           </w:pPr>
-          <w:hyperlink w:anchor="__RefHeading___Toc3183_1774759734">
+          <w:hyperlink w:anchor="__RefHeading___Toc3233_3652871108">
             <w:r>
               <w:rPr>
                 <w:rStyle w:val="IndexLink"/>
@@ -1478,7 +1498,7 @@
             </w:tabs>
             <w:rPr/>
           </w:pPr>
-          <w:hyperlink w:anchor="__RefHeading___Toc3185_1774759734">
+          <w:hyperlink w:anchor="__RefHeading___Toc3235_3652871108">
             <w:r>
               <w:rPr>
                 <w:rStyle w:val="IndexLink"/>
@@ -1498,7 +1518,7 @@
             </w:tabs>
             <w:rPr/>
           </w:pPr>
-          <w:hyperlink w:anchor="__RefHeading___Toc3187_1774759734">
+          <w:hyperlink w:anchor="__RefHeading___Toc3237_3652871108">
             <w:r>
               <w:rPr>
                 <w:rStyle w:val="IndexLink"/>
@@ -1518,7 +1538,7 @@
             </w:tabs>
             <w:rPr/>
           </w:pPr>
-          <w:hyperlink w:anchor="__RefHeading___Toc3189_1774759734">
+          <w:hyperlink w:anchor="__RefHeading___Toc3239_3652871108">
             <w:r>
               <w:rPr>
                 <w:rStyle w:val="IndexLink"/>
@@ -1538,7 +1558,7 @@
             </w:tabs>
             <w:rPr/>
           </w:pPr>
-          <w:hyperlink w:anchor="__RefHeading___Toc3191_1774759734">
+          <w:hyperlink w:anchor="__RefHeading___Toc3241_3652871108">
             <w:r>
               <w:rPr>
                 <w:rStyle w:val="IndexLink"/>
@@ -1558,7 +1578,7 @@
             </w:tabs>
             <w:rPr/>
           </w:pPr>
-          <w:hyperlink w:anchor="__RefHeading___Toc3193_1774759734">
+          <w:hyperlink w:anchor="__RefHeading___Toc3243_3652871108">
             <w:r>
               <w:rPr>
                 <w:rStyle w:val="IndexLink"/>
@@ -1578,7 +1598,7 @@
             </w:tabs>
             <w:rPr/>
           </w:pPr>
-          <w:hyperlink w:anchor="__RefHeading___Toc3195_1774759734">
+          <w:hyperlink w:anchor="__RefHeading___Toc3245_3652871108">
             <w:r>
               <w:rPr>
                 <w:rStyle w:val="IndexLink"/>
@@ -1598,7 +1618,7 @@
             </w:tabs>
             <w:rPr/>
           </w:pPr>
-          <w:hyperlink w:anchor="__RefHeading___Toc3197_1774759734">
+          <w:hyperlink w:anchor="__RefHeading___Toc3247_3652871108">
             <w:r>
               <w:rPr>
                 <w:rStyle w:val="IndexLink"/>
@@ -1618,7 +1638,7 @@
             </w:tabs>
             <w:rPr/>
           </w:pPr>
-          <w:hyperlink w:anchor="__RefHeading___Toc3199_1774759734">
+          <w:hyperlink w:anchor="__RefHeading___Toc3249_3652871108">
             <w:r>
               <w:rPr>
                 <w:rStyle w:val="IndexLink"/>
@@ -1638,7 +1658,7 @@
             </w:tabs>
             <w:rPr/>
           </w:pPr>
-          <w:hyperlink w:anchor="__RefHeading___Toc3201_1774759734">
+          <w:hyperlink w:anchor="__RefHeading___Toc3251_3652871108">
             <w:r>
               <w:rPr>
                 <w:rStyle w:val="IndexLink"/>
@@ -1658,7 +1678,7 @@
             </w:tabs>
             <w:rPr/>
           </w:pPr>
-          <w:hyperlink w:anchor="__RefHeading___Toc3203_1774759734">
+          <w:hyperlink w:anchor="__RefHeading___Toc3253_3652871108">
             <w:r>
               <w:rPr>
                 <w:rStyle w:val="IndexLink"/>
@@ -1678,7 +1698,7 @@
             </w:tabs>
             <w:rPr/>
           </w:pPr>
-          <w:hyperlink w:anchor="__RefHeading___Toc3205_1774759734">
+          <w:hyperlink w:anchor="__RefHeading___Toc3255_3652871108">
             <w:r>
               <w:rPr>
                 <w:rStyle w:val="IndexLink"/>
@@ -1698,7 +1718,7 @@
             </w:tabs>
             <w:rPr/>
           </w:pPr>
-          <w:hyperlink w:anchor="__RefHeading___Toc3207_1774759734">
+          <w:hyperlink w:anchor="__RefHeading___Toc3257_3652871108">
             <w:r>
               <w:rPr>
                 <w:rStyle w:val="IndexLink"/>
@@ -1718,7 +1738,7 @@
             </w:tabs>
             <w:rPr/>
           </w:pPr>
-          <w:hyperlink w:anchor="__RefHeading___Toc3209_1774759734">
+          <w:hyperlink w:anchor="__RefHeading___Toc3259_3652871108">
             <w:r>
               <w:rPr>
                 <w:rStyle w:val="IndexLink"/>
@@ -1738,7 +1758,7 @@
             </w:tabs>
             <w:rPr/>
           </w:pPr>
-          <w:hyperlink w:anchor="__RefHeading___Toc3211_1774759734">
+          <w:hyperlink w:anchor="__RefHeading___Toc3261_3652871108">
             <w:r>
               <w:rPr>
                 <w:rStyle w:val="IndexLink"/>
@@ -1758,7 +1778,7 @@
             </w:tabs>
             <w:rPr/>
           </w:pPr>
-          <w:hyperlink w:anchor="__RefHeading___Toc3213_1774759734">
+          <w:hyperlink w:anchor="__RefHeading___Toc3263_3652871108">
             <w:r>
               <w:rPr>
                 <w:rStyle w:val="IndexLink"/>
@@ -1778,7 +1798,7 @@
             </w:tabs>
             <w:rPr/>
           </w:pPr>
-          <w:hyperlink w:anchor="__RefHeading___Toc3215_1774759734">
+          <w:hyperlink w:anchor="__RefHeading___Toc3265_3652871108">
             <w:r>
               <w:rPr>
                 <w:rStyle w:val="IndexLink"/>
@@ -1798,7 +1818,7 @@
             </w:tabs>
             <w:rPr/>
           </w:pPr>
-          <w:hyperlink w:anchor="__RefHeading___Toc3217_1774759734">
+          <w:hyperlink w:anchor="__RefHeading___Toc3267_3652871108">
             <w:r>
               <w:rPr>
                 <w:rStyle w:val="IndexLink"/>
@@ -1818,7 +1838,7 @@
             </w:tabs>
             <w:rPr/>
           </w:pPr>
-          <w:hyperlink w:anchor="__RefHeading___Toc3219_1774759734">
+          <w:hyperlink w:anchor="__RefHeading___Toc3269_3652871108">
             <w:r>
               <w:rPr>
                 <w:rStyle w:val="IndexLink"/>
@@ -1838,7 +1858,7 @@
             </w:tabs>
             <w:rPr/>
           </w:pPr>
-          <w:hyperlink w:anchor="__RefHeading___Toc3221_1774759734">
+          <w:hyperlink w:anchor="__RefHeading___Toc3271_3652871108">
             <w:r>
               <w:rPr>
                 <w:rStyle w:val="IndexLink"/>
@@ -1858,7 +1878,7 @@
             </w:tabs>
             <w:rPr/>
           </w:pPr>
-          <w:hyperlink w:anchor="__RefHeading___Toc3223_1774759734">
+          <w:hyperlink w:anchor="__RefHeading___Toc3273_3652871108">
             <w:r>
               <w:rPr>
                 <w:rStyle w:val="IndexLink"/>
@@ -1878,7 +1898,7 @@
             </w:tabs>
             <w:rPr/>
           </w:pPr>
-          <w:hyperlink w:anchor="__RefHeading___Toc3225_1774759734">
+          <w:hyperlink w:anchor="__RefHeading___Toc3275_3652871108">
             <w:r>
               <w:rPr>
                 <w:rStyle w:val="IndexLink"/>
@@ -1898,7 +1918,7 @@
             </w:tabs>
             <w:rPr/>
           </w:pPr>
-          <w:hyperlink w:anchor="__RefHeading___Toc3227_1774759734">
+          <w:hyperlink w:anchor="__RefHeading___Toc3277_3652871108">
             <w:r>
               <w:rPr>
                 <w:rStyle w:val="IndexLink"/>
@@ -1918,7 +1938,7 @@
             </w:tabs>
             <w:rPr/>
           </w:pPr>
-          <w:hyperlink w:anchor="__RefHeading___Toc3229_1774759734">
+          <w:hyperlink w:anchor="__RefHeading___Toc3279_3652871108">
             <w:r>
               <w:rPr>
                 <w:rStyle w:val="IndexLink"/>
@@ -1938,7 +1958,7 @@
             </w:tabs>
             <w:rPr/>
           </w:pPr>
-          <w:hyperlink w:anchor="__RefHeading___Toc3231_1774759734">
+          <w:hyperlink w:anchor="__RefHeading___Toc3281_3652871108">
             <w:r>
               <w:rPr>
                 <w:rStyle w:val="IndexLink"/>
@@ -1958,7 +1978,7 @@
             </w:tabs>
             <w:rPr/>
           </w:pPr>
-          <w:hyperlink w:anchor="__RefHeading___Toc3233_1774759734">
+          <w:hyperlink w:anchor="__RefHeading___Toc3283_3652871108">
             <w:r>
               <w:rPr>
                 <w:rStyle w:val="IndexLink"/>
@@ -1978,7 +1998,7 @@
             </w:tabs>
             <w:rPr/>
           </w:pPr>
-          <w:hyperlink w:anchor="__RefHeading___Toc3235_1774759734">
+          <w:hyperlink w:anchor="__RefHeading___Toc3285_3652871108">
             <w:r>
               <w:rPr>
                 <w:rStyle w:val="IndexLink"/>
@@ -1998,7 +2018,7 @@
             </w:tabs>
             <w:rPr/>
           </w:pPr>
-          <w:hyperlink w:anchor="__RefHeading___Toc3237_1774759734">
+          <w:hyperlink w:anchor="__RefHeading___Toc3287_3652871108">
             <w:r>
               <w:rPr>
                 <w:rStyle w:val="IndexLink"/>
@@ -2018,7 +2038,7 @@
             </w:tabs>
             <w:rPr/>
           </w:pPr>
-          <w:hyperlink w:anchor="__RefHeading___Toc3239_1774759734">
+          <w:hyperlink w:anchor="__RefHeading___Toc3289_3652871108">
             <w:r>
               <w:rPr>
                 <w:rStyle w:val="IndexLink"/>
@@ -2038,7 +2058,7 @@
             </w:tabs>
             <w:rPr/>
           </w:pPr>
-          <w:hyperlink w:anchor="__RefHeading___Toc3241_1774759734">
+          <w:hyperlink w:anchor="__RefHeading___Toc3291_3652871108">
             <w:r>
               <w:rPr>
                 <w:rStyle w:val="IndexLink"/>
@@ -2058,7 +2078,7 @@
             </w:tabs>
             <w:rPr/>
           </w:pPr>
-          <w:hyperlink w:anchor="__RefHeading___Toc3243_1774759734">
+          <w:hyperlink w:anchor="__RefHeading___Toc3293_3652871108">
             <w:r>
               <w:rPr>
                 <w:rStyle w:val="IndexLink"/>
@@ -2078,7 +2098,7 @@
             </w:tabs>
             <w:rPr/>
           </w:pPr>
-          <w:hyperlink w:anchor="__RefHeading___Toc3245_1774759734">
+          <w:hyperlink w:anchor="__RefHeading___Toc3295_3652871108">
             <w:r>
               <w:rPr>
                 <w:rStyle w:val="IndexLink"/>
@@ -2098,7 +2118,7 @@
             </w:tabs>
             <w:rPr/>
           </w:pPr>
-          <w:hyperlink w:anchor="__RefHeading___Toc3247_1774759734">
+          <w:hyperlink w:anchor="__RefHeading___Toc3297_3652871108">
             <w:r>
               <w:rPr>
                 <w:rStyle w:val="IndexLink"/>
@@ -2118,7 +2138,7 @@
             </w:tabs>
             <w:rPr/>
           </w:pPr>
-          <w:hyperlink w:anchor="__RefHeading___Toc3249_1774759734">
+          <w:hyperlink w:anchor="__RefHeading___Toc3299_3652871108">
             <w:r>
               <w:rPr>
                 <w:rStyle w:val="IndexLink"/>
@@ -2138,7 +2158,7 @@
             </w:tabs>
             <w:rPr/>
           </w:pPr>
-          <w:hyperlink w:anchor="__RefHeading___Toc3251_1774759734">
+          <w:hyperlink w:anchor="__RefHeading___Toc3301_3652871108">
             <w:r>
               <w:rPr>
                 <w:rStyle w:val="IndexLink"/>
@@ -2174,7 +2194,7 @@
         <w:pStyle w:val="Heading1"/>
         <w:rPr/>
       </w:pPr>
-      <w:bookmarkStart w:id="0" w:name="__RefHeading___Toc3147_1774759734"/>
+      <w:bookmarkStart w:id="0" w:name="__RefHeading___Toc3195_3652871108"/>
       <w:bookmarkEnd w:id="0"/>
       <w:r>
         <w:rPr/>
@@ -2186,7 +2206,7 @@
         <w:pStyle w:val="Heading2"/>
         <w:rPr/>
       </w:pPr>
-      <w:bookmarkStart w:id="1" w:name="__RefHeading___Toc3149_1774759734"/>
+      <w:bookmarkStart w:id="1" w:name="__RefHeading___Toc3197_3652871108"/>
       <w:bookmarkEnd w:id="1"/>
       <w:r>
         <w:rPr/>
@@ -2242,7 +2262,7 @@
         <w:pStyle w:val="Heading2"/>
         <w:rPr/>
       </w:pPr>
-      <w:bookmarkStart w:id="2" w:name="__RefHeading___Toc3151_1774759734"/>
+      <w:bookmarkStart w:id="2" w:name="__RefHeading___Toc3199_3652871108"/>
       <w:bookmarkEnd w:id="2"/>
       <w:r>
         <w:rPr/>
@@ -2344,7 +2364,7 @@
         <w:pStyle w:val="Heading2"/>
         <w:rPr/>
       </w:pPr>
-      <w:bookmarkStart w:id="3" w:name="__RefHeading___Toc3153_1774759734"/>
+      <w:bookmarkStart w:id="3" w:name="__RefHeading___Toc3201_3652871108"/>
       <w:bookmarkEnd w:id="3"/>
       <w:r>
         <w:rPr/>
@@ -2381,7 +2401,7 @@
         <w:pStyle w:val="Heading1"/>
         <w:rPr/>
       </w:pPr>
-      <w:bookmarkStart w:id="4" w:name="__RefHeading___Toc3155_1774759734"/>
+      <w:bookmarkStart w:id="4" w:name="__RefHeading___Toc3203_3652871108"/>
       <w:bookmarkEnd w:id="4"/>
       <w:r>
         <w:rPr/>
@@ -2393,7 +2413,7 @@
         <w:pStyle w:val="Heading2"/>
         <w:rPr/>
       </w:pPr>
-      <w:bookmarkStart w:id="5" w:name="__RefHeading___Toc3157_1774759734"/>
+      <w:bookmarkStart w:id="5" w:name="__RefHeading___Toc3205_3652871108"/>
       <w:bookmarkEnd w:id="5"/>
       <w:r>
         <w:rPr/>
@@ -2427,7 +2447,7 @@
         <w:pStyle w:val="Heading2"/>
         <w:rPr/>
       </w:pPr>
-      <w:bookmarkStart w:id="6" w:name="__RefHeading___Toc3159_1774759734"/>
+      <w:bookmarkStart w:id="6" w:name="__RefHeading___Toc3207_3652871108"/>
       <w:bookmarkEnd w:id="6"/>
       <w:r>
         <w:rPr/>
@@ -2691,7 +2711,7 @@
         <w:pStyle w:val="Heading2"/>
         <w:rPr/>
       </w:pPr>
-      <w:bookmarkStart w:id="7" w:name="__RefHeading___Toc3161_1774759734"/>
+      <w:bookmarkStart w:id="7" w:name="__RefHeading___Toc3209_3652871108"/>
       <w:bookmarkEnd w:id="7"/>
       <w:r>
         <w:rPr/>
@@ -3105,7 +3125,7 @@
       <w:r>
         <w:br w:type="page"/>
       </w:r>
-      <w:bookmarkStart w:id="8" w:name="__RefHeading___Toc3163_1774759734"/>
+      <w:bookmarkStart w:id="8" w:name="__RefHeading___Toc3211_3652871108"/>
       <w:bookmarkEnd w:id="8"/>
       <w:r>
         <w:rPr/>
@@ -3689,7 +3709,7 @@
       <w:r>
         <w:br w:type="page"/>
       </w:r>
-      <w:bookmarkStart w:id="9" w:name="__RefHeading___Toc3165_1774759734"/>
+      <w:bookmarkStart w:id="9" w:name="__RefHeading___Toc3213_3652871108"/>
       <w:bookmarkEnd w:id="9"/>
       <w:r>
         <w:rPr/>
@@ -3923,7 +3943,7 @@
         <w:pStyle w:val="Heading2"/>
         <w:rPr/>
       </w:pPr>
-      <w:bookmarkStart w:id="10" w:name="__RefHeading___Toc3167_1774759734"/>
+      <w:bookmarkStart w:id="10" w:name="__RefHeading___Toc3215_3652871108"/>
       <w:bookmarkEnd w:id="10"/>
       <w:r>
         <w:rPr/>
@@ -4230,7 +4250,7 @@
         <w:pStyle w:val="Heading1"/>
         <w:rPr/>
       </w:pPr>
-      <w:bookmarkStart w:id="11" w:name="__RefHeading___Toc3169_1774759734"/>
+      <w:bookmarkStart w:id="11" w:name="__RefHeading___Toc3217_3652871108"/>
       <w:bookmarkEnd w:id="11"/>
       <w:r>
         <w:rPr/>
@@ -4242,7 +4262,7 @@
         <w:pStyle w:val="Heading2"/>
         <w:rPr/>
       </w:pPr>
-      <w:bookmarkStart w:id="12" w:name="__RefHeading___Toc3171_1774759734"/>
+      <w:bookmarkStart w:id="12" w:name="__RefHeading___Toc3219_3652871108"/>
       <w:bookmarkEnd w:id="12"/>
       <w:r>
         <w:rPr/>
@@ -5005,6 +5025,84 @@
           </w:p>
         </w:tc>
       </w:tr>
+      <w:tr>
+        <w:trPr/>
+        <w:tc>
+          <w:tcPr>
+            <w:tcW w:w="2299" w:type="dxa"/>
+            <w:tcBorders>
+              <w:top w:val="single" w:sz="4" w:space="0" w:color="BFBFBF"/>
+              <w:left w:val="single" w:sz="4" w:space="0" w:color="BFBFBF"/>
+              <w:bottom w:val="single" w:sz="4" w:space="0" w:color="BFBFBF"/>
+              <w:right w:val="single" w:sz="4" w:space="0" w:color="BFBFBF"/>
+            </w:tcBorders>
+          </w:tcPr>
+          <w:p>
+            <w:pPr>
+              <w:pStyle w:val="Normal"/>
+              <w:spacing w:before="0" w:after="20"/>
+              <w:rPr/>
+            </w:pPr>
+            <w:r>
+              <w:rPr>
+                <w:sz w:val="19"/>
+                <w:szCs w:val="19"/>
+              </w:rPr>
+              <w:t>Telegram: LulzSec Muslims y LulzSec Black</w:t>
+            </w:r>
+          </w:p>
+        </w:tc>
+        <w:tc>
+          <w:tcPr>
+            <w:tcW w:w="2001" w:type="dxa"/>
+            <w:tcBorders>
+              <w:top w:val="single" w:sz="4" w:space="0" w:color="BFBFBF"/>
+              <w:left w:val="single" w:sz="4" w:space="0" w:color="BFBFBF"/>
+              <w:bottom w:val="single" w:sz="4" w:space="0" w:color="BFBFBF"/>
+              <w:right w:val="single" w:sz="4" w:space="0" w:color="BFBFBF"/>
+            </w:tcBorders>
+          </w:tcPr>
+          <w:p>
+            <w:pPr>
+              <w:pStyle w:val="Normal"/>
+              <w:spacing w:before="0" w:after="20"/>
+              <w:rPr/>
+            </w:pPr>
+            <w:r>
+              <w:rPr>
+                <w:sz w:val="19"/>
+                <w:szCs w:val="19"/>
+              </w:rPr>
+              <w:t>Canales públicos de los grupos (reclamos)</w:t>
+            </w:r>
+          </w:p>
+        </w:tc>
+        <w:tc>
+          <w:tcPr>
+            <w:tcW w:w="5338" w:type="dxa"/>
+            <w:tcBorders>
+              <w:top w:val="single" w:sz="4" w:space="0" w:color="BFBFBF"/>
+              <w:left w:val="single" w:sz="4" w:space="0" w:color="BFBFBF"/>
+              <w:bottom w:val="single" w:sz="4" w:space="0" w:color="BFBFBF"/>
+              <w:right w:val="single" w:sz="4" w:space="0" w:color="BFBFBF"/>
+            </w:tcBorders>
+          </w:tcPr>
+          <w:p>
+            <w:pPr>
+              <w:pStyle w:val="Normal"/>
+              <w:spacing w:before="0" w:after="20"/>
+              <w:rPr/>
+            </w:pPr>
+            <w:r>
+              <w:rPr>
+                <w:sz w:val="19"/>
+                <w:szCs w:val="19"/>
+              </w:rPr>
+              <w:t>Agregados el 30/10/2026 (decisión D34); se leen desde la vista web pública, sin cuenta.</w:t>
+            </w:r>
+          </w:p>
+        </w:tc>
+      </w:tr>
     </w:tbl>
     <w:p>
       <w:pPr>
@@ -5032,7 +5130,7 @@
         <w:pStyle w:val="Heading2"/>
         <w:rPr/>
       </w:pPr>
-      <w:bookmarkStart w:id="13" w:name="__RefHeading___Toc3173_1774759734"/>
+      <w:bookmarkStart w:id="13" w:name="__RefHeading___Toc3221_3652871108"/>
       <w:bookmarkEnd w:id="13"/>
       <w:r>
         <w:rPr/>
@@ -5210,11 +5308,134 @@
         <w:pStyle w:val="Heading2"/>
         <w:rPr/>
       </w:pPr>
-      <w:bookmarkStart w:id="14" w:name="__RefHeading___Toc3175_1774759734"/>
+      <w:bookmarkStart w:id="14" w:name="__RefHeading___Toc3223_3652871108"/>
       <w:bookmarkEnd w:id="14"/>
       <w:r>
         <w:rPr/>
-        <w:t>5.3. Archivos de carga manual</w:t>
+        <w:t>5.3. Canales de Telegram de los grupos</w:t>
+      </w:r>
+    </w:p>
+    <w:p>
+      <w:pPr>
+        <w:pStyle w:val="Normal"/>
+        <w:spacing w:lineRule="exact" w:line="290" w:before="0" w:after="120"/>
+        <w:rPr/>
+      </w:pPr>
+      <w:r>
+        <w:rPr/>
+        <w:t xml:space="preserve">Como el hacktivismo se anuncia sobre todo en Telegram, el autor identificó tres espacios: los canales públicos de </w:t>
+      </w:r>
+      <w:r>
+        <w:rPr>
+          <w:b/>
+          <w:bCs/>
+        </w:rPr>
+        <w:t>LulzSec Muslims</w:t>
+      </w:r>
+      <w:r>
+        <w:rPr/>
+        <w:t xml:space="preserve"> y </w:t>
+      </w:r>
+      <w:r>
+        <w:rPr>
+          <w:b/>
+          <w:bCs/>
+        </w:rPr>
+        <w:t>LulzSec Black</w:t>
+      </w:r>
+      <w:r>
+        <w:rPr/>
+        <w:t xml:space="preserve">, y un grupo privado. Se eligió monitorear solo los </w:t>
+      </w:r>
+      <w:r>
+        <w:rPr>
+          <w:b/>
+          <w:bCs/>
+        </w:rPr>
+        <w:t>canales públicos</w:t>
+      </w:r>
+      <w:r>
+        <w:rPr/>
+        <w:t>, leyendo su vista web (t.me/s/&lt;canal&gt;), la misma que ve cualquier persona sin iniciar sesión. El grupo privado quedó fuera porque exigiría entrar con una cuenta y publicar en un repositorio público contenido de un espacio cerrado (decisión D34).</w:t>
+      </w:r>
+    </w:p>
+    <w:p>
+      <w:pPr>
+        <w:pStyle w:val="ListParagraph"/>
+        <w:numPr>
+          <w:ilvl w:val="0"/>
+          <w:numId w:val="3"/>
+        </w:numPr>
+        <w:spacing w:before="0" w:after="60"/>
+        <w:rPr/>
+      </w:pPr>
+      <w:r>
+        <w:rPr/>
+        <w:t xml:space="preserve">Un mensaje cuenta como </w:t>
+      </w:r>
+      <w:r>
+        <w:rPr>
+          <w:b/>
+          <w:bCs/>
+        </w:rPr>
+        <w:t>ataque reclamado</w:t>
+      </w:r>
+      <w:r>
+        <w:rPr/>
+        <w:t xml:space="preserve"> si menciona a Argentina, un dominio .ar o la bandera argentina, y además tiene una señal de ataque (por ejemplo "down", un enlace a check-host o un término cibernético).</w:t>
+      </w:r>
+    </w:p>
+    <w:p>
+      <w:pPr>
+        <w:pStyle w:val="ListParagraph"/>
+        <w:numPr>
+          <w:ilvl w:val="0"/>
+          <w:numId w:val="3"/>
+        </w:numPr>
+        <w:spacing w:before="0" w:after="60"/>
+        <w:rPr/>
+      </w:pPr>
+      <w:r>
+        <w:rPr/>
+        <w:t xml:space="preserve">Es la palabra del propio grupo: se muestra como </w:t>
+      </w:r>
+      <w:r>
+        <w:rPr>
+          <w:b/>
+          <w:bCs/>
+        </w:rPr>
+        <w:t>reclamo sin verificar</w:t>
+      </w:r>
+      <w:r>
+        <w:rPr/>
+        <w:t xml:space="preserve"> y forma un grupo aparte en la evaluación. Para usarlo como incidente debe pasar por la verificación del autor.</w:t>
+      </w:r>
+    </w:p>
+    <w:p>
+      <w:pPr>
+        <w:pStyle w:val="ListParagraph"/>
+        <w:numPr>
+          <w:ilvl w:val="0"/>
+          <w:numId w:val="3"/>
+        </w:numPr>
+        <w:spacing w:before="0" w:after="60"/>
+        <w:rPr/>
+      </w:pPr>
+      <w:r>
+        <w:rPr/>
+        <w:t>Solo se guarda el texto recortado y el enlace al mensaje; nunca archivos ni enlaces de descarga.</w:t>
+      </w:r>
+    </w:p>
+    <w:p>
+      <w:pPr>
+        <w:pStyle w:val="Heading2"/>
+        <w:rPr/>
+      </w:pPr>
+      <w:bookmarkStart w:id="15" w:name="__RefHeading___Toc3225_3652871108"/>
+      <w:bookmarkEnd w:id="15"/>
+      <w:r>
+        <w:rPr/>
+        <w:t>5.4. Archivos de carga manual</w:t>
       </w:r>
     </w:p>
     <w:p>
@@ -5700,11 +5921,11 @@
         <w:pStyle w:val="Heading2"/>
         <w:rPr/>
       </w:pPr>
-      <w:bookmarkStart w:id="15" w:name="__RefHeading___Toc3177_1774759734"/>
-      <w:bookmarkEnd w:id="15"/>
-      <w:r>
-        <w:rPr/>
-        <w:t>5.4. Búsqueda inicial de incidentes (pendiente de validación)</w:t>
+      <w:bookmarkStart w:id="16" w:name="__RefHeading___Toc3227_3652871108"/>
+      <w:bookmarkEnd w:id="16"/>
+      <w:r>
+        <w:rPr/>
+        <w:t>5.5. Búsqueda inicial de incidentes (pendiente de validación)</w:t>
       </w:r>
     </w:p>
     <w:p>
@@ -6695,8 +6916,8 @@
         <w:pStyle w:val="Heading1"/>
         <w:rPr/>
       </w:pPr>
-      <w:bookmarkStart w:id="16" w:name="__RefHeading___Toc3179_1774759734"/>
-      <w:bookmarkEnd w:id="16"/>
+      <w:bookmarkStart w:id="17" w:name="__RefHeading___Toc3229_3652871108"/>
+      <w:bookmarkEnd w:id="17"/>
       <w:r>
         <w:rPr/>
         <w:t>6. Clasificación por reglas (Fase 1)</w:t>
@@ -6707,8 +6928,8 @@
         <w:pStyle w:val="Heading2"/>
         <w:rPr/>
       </w:pPr>
-      <w:bookmarkStart w:id="17" w:name="__RefHeading___Toc3181_1774759734"/>
-      <w:bookmarkEnd w:id="17"/>
+      <w:bookmarkStart w:id="18" w:name="__RefHeading___Toc3231_3652871108"/>
+      <w:bookmarkEnd w:id="18"/>
       <w:r>
         <w:rPr/>
         <w:t>6.1. Noticias geopolíticas</w:t>
@@ -6982,8 +7203,8 @@
         <w:pStyle w:val="Heading2"/>
         <w:rPr/>
       </w:pPr>
-      <w:bookmarkStart w:id="18" w:name="__RefHeading___Toc3183_1774759734"/>
-      <w:bookmarkEnd w:id="18"/>
+      <w:bookmarkStart w:id="19" w:name="__RefHeading___Toc3233_3652871108"/>
+      <w:bookmarkEnd w:id="19"/>
       <w:r>
         <w:rPr/>
         <w:t>6.2. Noticias de ataque</w:t>
@@ -7077,11 +7298,37 @@
     </w:p>
     <w:p>
       <w:pPr>
+        <w:pStyle w:val="ListParagraph"/>
+        <w:numPr>
+          <w:ilvl w:val="0"/>
+          <w:numId w:val="3"/>
+        </w:numPr>
+        <w:spacing w:before="0" w:after="60"/>
+        <w:rPr/>
+      </w:pPr>
+      <w:r>
+        <w:rPr/>
+        <w:t xml:space="preserve">Para los </w:t>
+      </w:r>
+      <w:r>
+        <w:rPr>
+          <w:b/>
+          <w:bCs/>
+        </w:rPr>
+        <w:t>mensajes de los canales de Telegram de los grupos</w:t>
+      </w:r>
+      <w:r>
+        <w:rPr/>
+        <w:t xml:space="preserve"> rige una regla propia: alcanza con que mencionen a Argentina, un dominio .ar o la bandera y tengan una señal de reclamo (como «down», «leak» o un enlace a check-host), porque el canal ya es el contexto cibernético (sección 5.3).</w:t>
+      </w:r>
+    </w:p>
+    <w:p>
+      <w:pPr>
         <w:pStyle w:val="Heading2"/>
         <w:rPr/>
       </w:pPr>
-      <w:bookmarkStart w:id="19" w:name="__RefHeading___Toc3185_1774759734"/>
-      <w:bookmarkEnd w:id="19"/>
+      <w:bookmarkStart w:id="20" w:name="__RefHeading___Toc3235_3652871108"/>
+      <w:bookmarkEnd w:id="20"/>
       <w:r>
         <w:rPr/>
         <w:t>6.3. Mapeo a MITRE ATT&amp;CK</w:t>
@@ -7586,8 +7833,8 @@
       <w:r>
         <w:br w:type="page"/>
       </w:r>
-      <w:bookmarkStart w:id="20" w:name="__RefHeading___Toc3187_1774759734"/>
-      <w:bookmarkEnd w:id="20"/>
+      <w:bookmarkStart w:id="21" w:name="__RefHeading___Toc3237_3652871108"/>
+      <w:bookmarkEnd w:id="21"/>
       <w:r>
         <w:rPr/>
         <w:t>7. El semáforo de alertas</w:t>
@@ -7598,8 +7845,8 @@
         <w:pStyle w:val="Heading2"/>
         <w:rPr/>
       </w:pPr>
-      <w:bookmarkStart w:id="21" w:name="__RefHeading___Toc3189_1774759734"/>
-      <w:bookmarkEnd w:id="21"/>
+      <w:bookmarkStart w:id="22" w:name="__RefHeading___Toc3239_3652871108"/>
+      <w:bookmarkEnd w:id="22"/>
       <w:r>
         <w:rPr/>
         <w:t>7.1. Reglas</w:t>
@@ -7764,8 +8011,8 @@
         <w:pStyle w:val="Heading2"/>
         <w:rPr/>
       </w:pPr>
-      <w:bookmarkStart w:id="22" w:name="__RefHeading___Toc3191_1774759734"/>
-      <w:bookmarkEnd w:id="22"/>
+      <w:bookmarkStart w:id="23" w:name="__RefHeading___Toc3241_3652871108"/>
+      <w:bookmarkEnd w:id="23"/>
       <w:r>
         <w:rPr/>
         <w:t>7.2. Ejemplo</w:t>
@@ -8298,8 +8545,8 @@
         <w:pStyle w:val="Heading2"/>
         <w:rPr/>
       </w:pPr>
-      <w:bookmarkStart w:id="23" w:name="__RefHeading___Toc3193_1774759734"/>
-      <w:bookmarkEnd w:id="23"/>
+      <w:bookmarkStart w:id="24" w:name="__RefHeading___Toc3243_3652871108"/>
+      <w:bookmarkEnd w:id="24"/>
       <w:r>
         <w:rPr/>
         <w:t>7.3. Parámetros configurables</w:t>
@@ -8736,8 +8983,8 @@
       <w:r>
         <w:br w:type="page"/>
       </w:r>
-      <w:bookmarkStart w:id="24" w:name="__RefHeading___Toc3195_1774759734"/>
-      <w:bookmarkEnd w:id="24"/>
+      <w:bookmarkStart w:id="25" w:name="__RefHeading___Toc3245_3652871108"/>
+      <w:bookmarkEnd w:id="25"/>
       <w:r>
         <w:rPr/>
         <w:t>8. La página web</w:t>
@@ -8836,8 +9083,8 @@
         <w:pStyle w:val="Heading2"/>
         <w:rPr/>
       </w:pPr>
-      <w:bookmarkStart w:id="25" w:name="__RefHeading___Toc3197_1774759734"/>
-      <w:bookmarkEnd w:id="25"/>
+      <w:bookmarkStart w:id="26" w:name="__RefHeading___Toc3247_3652871108"/>
+      <w:bookmarkEnd w:id="26"/>
       <w:r>
         <w:rPr/>
         <w:t>8.1. Componentes</w:t>
@@ -9302,8 +9549,8 @@
         <w:pStyle w:val="Heading1"/>
         <w:rPr/>
       </w:pPr>
-      <w:bookmarkStart w:id="26" w:name="__RefHeading___Toc3199_1774759734"/>
-      <w:bookmarkEnd w:id="26"/>
+      <w:bookmarkStart w:id="27" w:name="__RefHeading___Toc3249_3652871108"/>
+      <w:bookmarkEnd w:id="27"/>
       <w:r>
         <w:rPr/>
         <w:t>9. Automatización y puesta en marcha</w:t>
@@ -9314,8 +9561,8 @@
         <w:pStyle w:val="Heading2"/>
         <w:rPr/>
       </w:pPr>
-      <w:bookmarkStart w:id="27" w:name="__RefHeading___Toc3201_1774759734"/>
-      <w:bookmarkEnd w:id="27"/>
+      <w:bookmarkStart w:id="28" w:name="__RefHeading___Toc3251_3652871108"/>
+      <w:bookmarkEnd w:id="28"/>
       <w:r>
         <w:rPr/>
         <w:t>9.1. Workflows de GitHub Actions</w:t>
@@ -9671,8 +9918,8 @@
         <w:pStyle w:val="Heading2"/>
         <w:rPr/>
       </w:pPr>
-      <w:bookmarkStart w:id="28" w:name="__RefHeading___Toc3203_1774759734"/>
-      <w:bookmarkEnd w:id="28"/>
+      <w:bookmarkStart w:id="29" w:name="__RefHeading___Toc3253_3652871108"/>
+      <w:bookmarkEnd w:id="29"/>
       <w:r>
         <w:rPr/>
         <w:t>9.2. Configuración realizada por el autor</w:t>
@@ -9959,8 +10206,8 @@
         <w:pStyle w:val="Heading2"/>
         <w:rPr/>
       </w:pPr>
-      <w:bookmarkStart w:id="29" w:name="__RefHeading___Toc3205_1774759734"/>
-      <w:bookmarkEnd w:id="29"/>
+      <w:bookmarkStart w:id="30" w:name="__RefHeading___Toc3255_3652871108"/>
+      <w:bookmarkEnd w:id="30"/>
       <w:r>
         <w:rPr/>
         <w:t>9.3. Flujo de cambios con Pull Requests</w:t>
@@ -10162,8 +10409,8 @@
         <w:pStyle w:val="Heading1"/>
         <w:rPr/>
       </w:pPr>
-      <w:bookmarkStart w:id="30" w:name="__RefHeading___Toc3207_1774759734"/>
-      <w:bookmarkEnd w:id="30"/>
+      <w:bookmarkStart w:id="31" w:name="__RefHeading___Toc3257_3652871108"/>
+      <w:bookmarkEnd w:id="31"/>
       <w:r>
         <w:rPr/>
         <w:t>10. Pruebas y verificación</w:t>
@@ -10174,8 +10421,8 @@
         <w:pStyle w:val="Heading2"/>
         <w:rPr/>
       </w:pPr>
-      <w:bookmarkStart w:id="31" w:name="__RefHeading___Toc3209_1774759734"/>
-      <w:bookmarkEnd w:id="31"/>
+      <w:bookmarkStart w:id="32" w:name="__RefHeading___Toc3259_3652871108"/>
+      <w:bookmarkEnd w:id="32"/>
       <w:r>
         <w:rPr/>
         <w:t>10.1. Pruebas automáticas</w:t>
@@ -11138,8 +11385,8 @@
         <w:pStyle w:val="Heading2"/>
         <w:rPr/>
       </w:pPr>
-      <w:bookmarkStart w:id="32" w:name="__RefHeading___Toc3211_1774759734"/>
-      <w:bookmarkEnd w:id="32"/>
+      <w:bookmarkStart w:id="33" w:name="__RefHeading___Toc3261_3652871108"/>
+      <w:bookmarkEnd w:id="33"/>
       <w:r>
         <w:rPr/>
         <w:t>10.2. Verificaciones con datos reales</w:t>
@@ -11732,8 +11979,8 @@
       <w:r>
         <w:br w:type="page"/>
       </w:r>
-      <w:bookmarkStart w:id="33" w:name="__RefHeading___Toc3213_1774759734"/>
-      <w:bookmarkEnd w:id="33"/>
+      <w:bookmarkStart w:id="34" w:name="__RefHeading___Toc3263_3652871108"/>
+      <w:bookmarkEnd w:id="34"/>
       <w:r>
         <w:rPr/>
         <w:t>11. Problemas encontrados y soluciones</w:t>
@@ -12560,8 +12807,8 @@
       <w:r>
         <w:br w:type="page"/>
       </w:r>
-      <w:bookmarkStart w:id="34" w:name="__RefHeading___Toc3215_1774759734"/>
-      <w:bookmarkEnd w:id="34"/>
+      <w:bookmarkStart w:id="35" w:name="__RefHeading___Toc3265_3652871108"/>
+      <w:bookmarkEnd w:id="35"/>
       <w:r>
         <w:rPr/>
         <w:t>12. Decisiones técnicas</w:t>
@@ -14650,6 +14897,84 @@
           </w:p>
         </w:tc>
       </w:tr>
+      <w:tr>
+        <w:trPr/>
+        <w:tc>
+          <w:tcPr>
+            <w:tcW w:w="1099" w:type="dxa"/>
+            <w:tcBorders>
+              <w:top w:val="single" w:sz="4" w:space="0" w:color="BFBFBF"/>
+              <w:left w:val="single" w:sz="4" w:space="0" w:color="BFBFBF"/>
+              <w:bottom w:val="single" w:sz="4" w:space="0" w:color="BFBFBF"/>
+              <w:right w:val="single" w:sz="4" w:space="0" w:color="BFBFBF"/>
+            </w:tcBorders>
+          </w:tcPr>
+          <w:p>
+            <w:pPr>
+              <w:pStyle w:val="Normal"/>
+              <w:spacing w:before="0" w:after="20"/>
+              <w:rPr/>
+            </w:pPr>
+            <w:r>
+              <w:rPr>
+                <w:sz w:val="19"/>
+                <w:szCs w:val="19"/>
+              </w:rPr>
+              <w:t>D34</w:t>
+            </w:r>
+          </w:p>
+        </w:tc>
+        <w:tc>
+          <w:tcPr>
+            <w:tcW w:w="4600" w:type="dxa"/>
+            <w:tcBorders>
+              <w:top w:val="single" w:sz="4" w:space="0" w:color="BFBFBF"/>
+              <w:left w:val="single" w:sz="4" w:space="0" w:color="BFBFBF"/>
+              <w:bottom w:val="single" w:sz="4" w:space="0" w:color="BFBFBF"/>
+              <w:right w:val="single" w:sz="4" w:space="0" w:color="BFBFBF"/>
+            </w:tcBorders>
+          </w:tcPr>
+          <w:p>
+            <w:pPr>
+              <w:pStyle w:val="Normal"/>
+              <w:spacing w:before="0" w:after="20"/>
+              <w:rPr/>
+            </w:pPr>
+            <w:r>
+              <w:rPr>
+                <w:sz w:val="19"/>
+                <w:szCs w:val="19"/>
+              </w:rPr>
+              <w:t>Canales públicos de Telegram de los grupos como fuente de reclamos</w:t>
+            </w:r>
+          </w:p>
+        </w:tc>
+        <w:tc>
+          <w:tcPr>
+            <w:tcW w:w="3939" w:type="dxa"/>
+            <w:tcBorders>
+              <w:top w:val="single" w:sz="4" w:space="0" w:color="BFBFBF"/>
+              <w:left w:val="single" w:sz="4" w:space="0" w:color="BFBFBF"/>
+              <w:bottom w:val="single" w:sz="4" w:space="0" w:color="BFBFBF"/>
+              <w:right w:val="single" w:sz="4" w:space="0" w:color="BFBFBF"/>
+            </w:tcBorders>
+          </w:tcPr>
+          <w:p>
+            <w:pPr>
+              <w:pStyle w:val="Normal"/>
+              <w:spacing w:before="0" w:after="20"/>
+              <w:rPr/>
+            </w:pPr>
+            <w:r>
+              <w:rPr>
+                <w:sz w:val="19"/>
+                <w:szCs w:val="19"/>
+              </w:rPr>
+              <w:t>El hacktivismo se anuncia en Telegram</w:t>
+            </w:r>
+          </w:p>
+        </w:tc>
+      </w:tr>
     </w:tbl>
     <w:p>
       <w:pPr>
@@ -14659,8 +14984,8 @@
       <w:r>
         <w:br w:type="page"/>
       </w:r>
-      <w:bookmarkStart w:id="35" w:name="__RefHeading___Toc3217_1774759734"/>
-      <w:bookmarkEnd w:id="35"/>
+      <w:bookmarkStart w:id="36" w:name="__RefHeading___Toc3267_3652871108"/>
+      <w:bookmarkEnd w:id="36"/>
       <w:r>
         <w:rPr/>
         <w:t>13. Estado actual y próximos pasos</w:t>
@@ -14671,8 +14996,8 @@
         <w:pStyle w:val="Heading2"/>
         <w:rPr/>
       </w:pPr>
-      <w:bookmarkStart w:id="36" w:name="__RefHeading___Toc3219_1774759734"/>
-      <w:bookmarkEnd w:id="36"/>
+      <w:bookmarkStart w:id="37" w:name="__RefHeading___Toc3269_3652871108"/>
+      <w:bookmarkEnd w:id="37"/>
       <w:r>
         <w:rPr/>
         <w:t>13.1. Estado</w:t>
@@ -14747,8 +15072,8 @@
         <w:pStyle w:val="Heading2"/>
         <w:rPr/>
       </w:pPr>
-      <w:bookmarkStart w:id="37" w:name="__RefHeading___Toc3221_1774759734"/>
-      <w:bookmarkEnd w:id="37"/>
+      <w:bookmarkStart w:id="38" w:name="__RefHeading___Toc3271_3652871108"/>
+      <w:bookmarkEnd w:id="38"/>
       <w:r>
         <w:rPr/>
         <w:t>13.2. Tareas pendientes del autor</w:t>
@@ -14887,8 +15212,8 @@
         <w:pStyle w:val="Heading2"/>
         <w:rPr/>
       </w:pPr>
-      <w:bookmarkStart w:id="38" w:name="__RefHeading___Toc3223_1774759734"/>
-      <w:bookmarkEnd w:id="38"/>
+      <w:bookmarkStart w:id="39" w:name="__RefHeading___Toc3273_3652871108"/>
+      <w:bookmarkEnd w:id="39"/>
       <w:r>
         <w:rPr/>
         <w:t>13.3. Próximos pasos propuestos</w:t>
@@ -14968,8 +15293,8 @@
         <w:pStyle w:val="Heading1"/>
         <w:rPr/>
       </w:pPr>
-      <w:bookmarkStart w:id="39" w:name="__RefHeading___Toc3225_1774759734"/>
-      <w:bookmarkEnd w:id="39"/>
+      <w:bookmarkStart w:id="40" w:name="__RefHeading___Toc3275_3652871108"/>
+      <w:bookmarkEnd w:id="40"/>
       <w:r>
         <w:rPr/>
         <w:t>14. Búsqueda de incidentes y diseño de la evaluación</w:t>
@@ -14980,8 +15305,8 @@
         <w:pStyle w:val="Heading2"/>
         <w:rPr/>
       </w:pPr>
-      <w:bookmarkStart w:id="40" w:name="__RefHeading___Toc3227_1774759734"/>
-      <w:bookmarkEnd w:id="40"/>
+      <w:bookmarkStart w:id="41" w:name="__RefHeading___Toc3277_3652871108"/>
+      <w:bookmarkEnd w:id="41"/>
       <w:r>
         <w:rPr/>
         <w:t>14.1. Por qué hace falta cargar incidentes</w:t>
@@ -15003,8 +15328,8 @@
         <w:pStyle w:val="Heading2"/>
         <w:rPr/>
       </w:pPr>
-      <w:bookmarkStart w:id="41" w:name="__RefHeading___Toc3229_1774759734"/>
-      <w:bookmarkEnd w:id="41"/>
+      <w:bookmarkStart w:id="42" w:name="__RefHeading___Toc3279_3652871108"/>
+      <w:bookmarkEnd w:id="42"/>
       <w:r>
         <w:rPr/>
         <w:t>14.2. Grupo de comparación</w:t>
@@ -15115,8 +15440,8 @@
         <w:pStyle w:val="Heading2"/>
         <w:rPr/>
       </w:pPr>
-      <w:bookmarkStart w:id="42" w:name="__RefHeading___Toc3231_1774759734"/>
-      <w:bookmarkEnd w:id="42"/>
+      <w:bookmarkStart w:id="43" w:name="__RefHeading___Toc3281_3652871108"/>
+      <w:bookmarkEnd w:id="43"/>
       <w:r>
         <w:rPr/>
         <w:t>14.3. Incidentes cargados</w:t>
@@ -17395,8 +17720,8 @@
         <w:pStyle w:val="Heading2"/>
         <w:rPr/>
       </w:pPr>
-      <w:bookmarkStart w:id="43" w:name="__RefHeading___Toc3233_1774759734"/>
-      <w:bookmarkEnd w:id="43"/>
+      <w:bookmarkStart w:id="44" w:name="__RefHeading___Toc3283_3652871108"/>
+      <w:bookmarkEnd w:id="44"/>
       <w:r>
         <w:rPr/>
         <w:t>14.4. Primeras observaciones</w:t>
@@ -17518,8 +17843,8 @@
         <w:pStyle w:val="Heading2"/>
         <w:rPr/>
       </w:pPr>
-      <w:bookmarkStart w:id="44" w:name="__RefHeading___Toc3235_1774759734"/>
-      <w:bookmarkEnd w:id="44"/>
+      <w:bookmarkStart w:id="45" w:name="__RefHeading___Toc3285_3652871108"/>
+      <w:bookmarkEnd w:id="45"/>
       <w:r>
         <w:rPr/>
         <w:t>14.5. Segunda lista de candidatos (agosto 2024 – hoy)</w:t>
@@ -20167,8 +20492,8 @@
         <w:pStyle w:val="Heading2"/>
         <w:rPr/>
       </w:pPr>
-      <w:bookmarkStart w:id="45" w:name="__RefHeading___Toc3237_1774759734"/>
-      <w:bookmarkEnd w:id="45"/>
+      <w:bookmarkStart w:id="46" w:name="__RefHeading___Toc3287_3652871108"/>
+      <w:bookmarkEnd w:id="46"/>
       <w:r>
         <w:rPr/>
         <w:t>14.6. Metodología de verificación</w:t>
@@ -20790,8 +21115,8 @@
         <w:pStyle w:val="Heading1"/>
         <w:rPr/>
       </w:pPr>
-      <w:bookmarkStart w:id="46" w:name="__RefHeading___Toc3239_1774759734"/>
-      <w:bookmarkEnd w:id="46"/>
+      <w:bookmarkStart w:id="47" w:name="__RefHeading___Toc3289_3652871108"/>
+      <w:bookmarkEnd w:id="47"/>
       <w:r>
         <w:rPr/>
         <w:t>15. Evaluación del modelo</w:t>
@@ -20802,8 +21127,8 @@
         <w:pStyle w:val="Heading2"/>
         <w:rPr/>
       </w:pPr>
-      <w:bookmarkStart w:id="47" w:name="__RefHeading___Toc3241_1774759734"/>
-      <w:bookmarkEnd w:id="47"/>
+      <w:bookmarkStart w:id="48" w:name="__RefHeading___Toc3291_3652871108"/>
+      <w:bookmarkEnd w:id="48"/>
       <w:r>
         <w:rPr/>
         <w:t>15.1. Método</w:t>
@@ -20924,8 +21249,8 @@
         <w:pStyle w:val="Heading2"/>
         <w:rPr/>
       </w:pPr>
-      <w:bookmarkStart w:id="48" w:name="__RefHeading___Toc3243_1774759734"/>
-      <w:bookmarkEnd w:id="48"/>
+      <w:bookmarkStart w:id="49" w:name="__RefHeading___Toc3293_3652871108"/>
+      <w:bookmarkEnd w:id="49"/>
       <w:r>
         <w:rPr/>
         <w:t>15.2. Resultados preliminares</w:t>
@@ -20939,7 +21264,7 @@
       </w:pPr>
       <w:r>
         <w:rPr/>
-        <w:t>Período evaluado: 2023-08-01 a 2026-10-23 (1180 días, 212 días detonantes). Datos al 2026-10-23.</w:t>
+        <w:t>Período evaluado: 2023-08-01 a 2026-10-30 (1187 días, 277 días detonantes). Datos al 2026-10-30.</w:t>
       </w:r>
     </w:p>
     <w:p>
@@ -21170,7 +21495,7 @@
                 <w:sz w:val="19"/>
                 <w:szCs w:val="19"/>
               </w:rPr>
-              <w:t>36.3 %</w:t>
+              <w:t>47.6 %</w:t>
             </w:r>
           </w:p>
         </w:tc>
@@ -21209,7 +21534,7 @@
                 <w:sz w:val="19"/>
                 <w:szCs w:val="19"/>
               </w:rPr>
-              <w:t>razón 0.55</w:t>
+              <w:t>razón 0.42</w:t>
             </w:r>
           </w:p>
         </w:tc>
@@ -21234,21 +21559,21 @@
                 <w:sz w:val="19"/>
                 <w:szCs w:val="19"/>
               </w:rPr>
-              <w:t>4/9 (44.4 %)</w:t>
-            </w:r>
-          </w:p>
-          <w:p>
-            <w:pPr>
-              <w:pStyle w:val="Normal"/>
-              <w:spacing w:before="0" w:after="20"/>
-              <w:rPr/>
-            </w:pPr>
-            <w:r>
-              <w:rPr>
-                <w:sz w:val="19"/>
-                <w:szCs w:val="19"/>
-              </w:rPr>
-              <w:t>razón 1.23</w:t>
+              <w:t>5/9 (55.6 %)</w:t>
+            </w:r>
+          </w:p>
+          <w:p>
+            <w:pPr>
+              <w:pStyle w:val="Normal"/>
+              <w:spacing w:before="0" w:after="20"/>
+              <w:rPr/>
+            </w:pPr>
+            <w:r>
+              <w:rPr>
+                <w:sz w:val="19"/>
+                <w:szCs w:val="19"/>
+              </w:rPr>
+              <w:t>razón 1.17</w:t>
             </w:r>
           </w:p>
         </w:tc>
@@ -21287,7 +21612,7 @@
                 <w:sz w:val="19"/>
                 <w:szCs w:val="19"/>
               </w:rPr>
-              <w:t>razón 1.65</w:t>
+              <w:t>razón 1.26</w:t>
             </w:r>
           </w:p>
         </w:tc>
@@ -21340,7 +21665,7 @@
                 <w:sz w:val="19"/>
                 <w:szCs w:val="19"/>
               </w:rPr>
-              <w:t>47.7 %</w:t>
+              <w:t>63.2 %</w:t>
             </w:r>
           </w:p>
         </w:tc>
@@ -21379,7 +21704,7 @@
                 <w:sz w:val="19"/>
                 <w:szCs w:val="19"/>
               </w:rPr>
-              <w:t>razón 1.26</w:t>
+              <w:t>razón 0.95</w:t>
             </w:r>
           </w:p>
         </w:tc>
@@ -21404,21 +21729,21 @@
                 <w:sz w:val="19"/>
                 <w:szCs w:val="19"/>
               </w:rPr>
-              <w:t>5/9 (55.6 %)</w:t>
-            </w:r>
-          </w:p>
-          <w:p>
-            <w:pPr>
-              <w:pStyle w:val="Normal"/>
-              <w:spacing w:before="0" w:after="20"/>
-              <w:rPr/>
-            </w:pPr>
-            <w:r>
-              <w:rPr>
-                <w:sz w:val="19"/>
-                <w:szCs w:val="19"/>
-              </w:rPr>
-              <w:t>razón 1.16</w:t>
+              <w:t>6/9 (66.7 %)</w:t>
+            </w:r>
+          </w:p>
+          <w:p>
+            <w:pPr>
+              <w:pStyle w:val="Normal"/>
+              <w:spacing w:before="0" w:after="20"/>
+              <w:rPr/>
+            </w:pPr>
+            <w:r>
+              <w:rPr>
+                <w:sz w:val="19"/>
+                <w:szCs w:val="19"/>
+              </w:rPr>
+              <w:t>razón 1.06</w:t>
             </w:r>
           </w:p>
         </w:tc>
@@ -21457,7 +21782,7 @@
                 <w:sz w:val="19"/>
                 <w:szCs w:val="19"/>
               </w:rPr>
-              <w:t>razón 1.26</w:t>
+              <w:t>razón 0.95</w:t>
             </w:r>
           </w:p>
         </w:tc>
@@ -21510,7 +21835,7 @@
                 <w:sz w:val="19"/>
                 <w:szCs w:val="19"/>
               </w:rPr>
-              <w:t>56.6 %</w:t>
+              <w:t>75.3 %</w:t>
             </w:r>
           </w:p>
         </w:tc>
@@ -21549,7 +21874,7 @@
                 <w:sz w:val="19"/>
                 <w:szCs w:val="19"/>
               </w:rPr>
-              <w:t>razón 1.41</w:t>
+              <w:t>razón 1.06</w:t>
             </w:r>
           </w:p>
         </w:tc>
@@ -21574,21 +21899,21 @@
                 <w:sz w:val="19"/>
                 <w:szCs w:val="19"/>
               </w:rPr>
-              <w:t>6/9 (66.7 %)</w:t>
-            </w:r>
-          </w:p>
-          <w:p>
-            <w:pPr>
-              <w:pStyle w:val="Normal"/>
-              <w:spacing w:before="0" w:after="20"/>
-              <w:rPr/>
-            </w:pPr>
-            <w:r>
-              <w:rPr>
-                <w:sz w:val="19"/>
-                <w:szCs w:val="19"/>
-              </w:rPr>
-              <w:t>razón 1.18</w:t>
+              <w:t>7/9 (77.8 %)</w:t>
+            </w:r>
+          </w:p>
+          <w:p>
+            <w:pPr>
+              <w:pStyle w:val="Normal"/>
+              <w:spacing w:before="0" w:after="20"/>
+              <w:rPr/>
+            </w:pPr>
+            <w:r>
+              <w:rPr>
+                <w:sz w:val="19"/>
+                <w:szCs w:val="19"/>
+              </w:rPr>
+              <w:t>razón 1.03</w:t>
             </w:r>
           </w:p>
         </w:tc>
@@ -21627,7 +21952,7 @@
                 <w:sz w:val="19"/>
                 <w:szCs w:val="19"/>
               </w:rPr>
-              <w:t>razón 1.41</w:t>
+              <w:t>razón 1.06</w:t>
             </w:r>
           </w:p>
         </w:tc>
@@ -21680,7 +22005,7 @@
                 <w:sz w:val="19"/>
                 <w:szCs w:val="19"/>
               </w:rPr>
-              <w:t>61.2 %</w:t>
+              <w:t>80.5 %</w:t>
             </w:r>
           </w:p>
         </w:tc>
@@ -21719,7 +22044,7 @@
                 <w:sz w:val="19"/>
                 <w:szCs w:val="19"/>
               </w:rPr>
-              <w:t>razón 1.63</w:t>
+              <w:t>razón 1.24</w:t>
             </w:r>
           </w:p>
         </w:tc>
@@ -21744,21 +22069,21 @@
                 <w:sz w:val="19"/>
                 <w:szCs w:val="19"/>
               </w:rPr>
-              <w:t>6/9 (66.7 %)</w:t>
-            </w:r>
-          </w:p>
-          <w:p>
-            <w:pPr>
-              <w:pStyle w:val="Normal"/>
-              <w:spacing w:before="0" w:after="20"/>
-              <w:rPr/>
-            </w:pPr>
-            <w:r>
-              <w:rPr>
-                <w:sz w:val="19"/>
-                <w:szCs w:val="19"/>
-              </w:rPr>
-              <w:t>razón 1.09</w:t>
+              <w:t>7/9 (77.8 %)</w:t>
+            </w:r>
+          </w:p>
+          <w:p>
+            <w:pPr>
+              <w:pStyle w:val="Normal"/>
+              <w:spacing w:before="0" w:after="20"/>
+              <w:rPr/>
+            </w:pPr>
+            <w:r>
+              <w:rPr>
+                <w:sz w:val="19"/>
+                <w:szCs w:val="19"/>
+              </w:rPr>
+              <w:t>razón 0.97</w:t>
             </w:r>
           </w:p>
         </w:tc>
@@ -21783,21 +22108,21 @@
                 <w:sz w:val="19"/>
                 <w:szCs w:val="19"/>
               </w:rPr>
-              <w:t>4/5 (80 %)</w:t>
-            </w:r>
-          </w:p>
-          <w:p>
-            <w:pPr>
-              <w:pStyle w:val="Normal"/>
-              <w:spacing w:before="0" w:after="20"/>
-              <w:rPr/>
-            </w:pPr>
-            <w:r>
-              <w:rPr>
-                <w:sz w:val="19"/>
-                <w:szCs w:val="19"/>
-              </w:rPr>
-              <w:t>razón 1.31</w:t>
+              <w:t>5/5 (100 %)</w:t>
+            </w:r>
+          </w:p>
+          <w:p>
+            <w:pPr>
+              <w:pStyle w:val="Normal"/>
+              <w:spacing w:before="0" w:after="20"/>
+              <w:rPr/>
+            </w:pPr>
+            <w:r>
+              <w:rPr>
+                <w:sz w:val="19"/>
+                <w:szCs w:val="19"/>
+              </w:rPr>
+              <w:t>razón 1.24</w:t>
             </w:r>
           </w:p>
         </w:tc>
@@ -22041,7 +22366,7 @@
                 <w:sz w:val="19"/>
                 <w:szCs w:val="19"/>
               </w:rPr>
-              <w:t>36.3 %</w:t>
+              <w:t>47.6 %</w:t>
             </w:r>
           </w:p>
         </w:tc>
@@ -22119,7 +22444,7 @@
                 <w:sz w:val="19"/>
                 <w:szCs w:val="19"/>
               </w:rPr>
-              <w:t>razón 1.38</w:t>
+              <w:t>razón 1.05</w:t>
             </w:r>
           </w:p>
         </w:tc>
@@ -22158,7 +22483,7 @@
                 <w:sz w:val="19"/>
                 <w:szCs w:val="19"/>
               </w:rPr>
-              <w:t>razón 1.38</w:t>
+              <w:t>razón 1.05</w:t>
             </w:r>
           </w:p>
         </w:tc>
@@ -22211,7 +22536,7 @@
                 <w:sz w:val="19"/>
                 <w:szCs w:val="19"/>
               </w:rPr>
-              <w:t>47.7 %</w:t>
+              <w:t>63.2 %</w:t>
             </w:r>
           </w:p>
         </w:tc>
@@ -22289,7 +22614,7 @@
                 <w:sz w:val="19"/>
                 <w:szCs w:val="19"/>
               </w:rPr>
-              <w:t>razón 1.4</w:t>
+              <w:t>razón 1.06</w:t>
             </w:r>
           </w:p>
         </w:tc>
@@ -22328,7 +22653,7 @@
                 <w:sz w:val="19"/>
                 <w:szCs w:val="19"/>
               </w:rPr>
-              <w:t>razón 1.05</w:t>
+              <w:t>razón 0.79</w:t>
             </w:r>
           </w:p>
         </w:tc>
@@ -22381,7 +22706,7 @@
                 <w:sz w:val="19"/>
                 <w:szCs w:val="19"/>
               </w:rPr>
-              <w:t>56.6 %</w:t>
+              <w:t>75.3 %</w:t>
             </w:r>
           </w:p>
         </w:tc>
@@ -22459,7 +22784,7 @@
                 <w:sz w:val="19"/>
                 <w:szCs w:val="19"/>
               </w:rPr>
-              <w:t>razón 1.47</w:t>
+              <w:t>razón 1.11</w:t>
             </w:r>
           </w:p>
         </w:tc>
@@ -22498,7 +22823,7 @@
                 <w:sz w:val="19"/>
                 <w:szCs w:val="19"/>
               </w:rPr>
-              <w:t>razón 1.32</w:t>
+              <w:t>razón 1</w:t>
             </w:r>
           </w:p>
         </w:tc>
@@ -22551,7 +22876,7 @@
                 <w:sz w:val="19"/>
                 <w:szCs w:val="19"/>
               </w:rPr>
-              <w:t>61.2 %</w:t>
+              <w:t>80.5 %</w:t>
             </w:r>
           </w:p>
         </w:tc>
@@ -22590,7 +22915,7 @@
                 <w:sz w:val="19"/>
                 <w:szCs w:val="19"/>
               </w:rPr>
-              <w:t>razón 1.63</w:t>
+              <w:t>razón 1.24</w:t>
             </w:r>
           </w:p>
         </w:tc>
@@ -22629,7 +22954,7 @@
                 <w:sz w:val="19"/>
                 <w:szCs w:val="19"/>
               </w:rPr>
-              <w:t>razón 1.36</w:t>
+              <w:t>razón 1.04</w:t>
             </w:r>
           </w:p>
         </w:tc>
@@ -22654,21 +22979,21 @@
                 <w:sz w:val="19"/>
                 <w:szCs w:val="19"/>
               </w:rPr>
-              <w:t>3/4 (75 %)</w:t>
-            </w:r>
-          </w:p>
-          <w:p>
-            <w:pPr>
-              <w:pStyle w:val="Normal"/>
-              <w:spacing w:before="0" w:after="20"/>
-              <w:rPr/>
-            </w:pPr>
-            <w:r>
-              <w:rPr>
-                <w:sz w:val="19"/>
-                <w:szCs w:val="19"/>
-              </w:rPr>
-              <w:t>razón 1.23</w:t>
+              <w:t>4/4 (100 %)</w:t>
+            </w:r>
+          </w:p>
+          <w:p>
+            <w:pPr>
+              <w:pStyle w:val="Normal"/>
+              <w:spacing w:before="0" w:after="20"/>
+              <w:rPr/>
+            </w:pPr>
+            <w:r>
+              <w:rPr>
+                <w:sz w:val="19"/>
+                <w:szCs w:val="19"/>
+              </w:rPr>
+              <w:t>razón 1.24</w:t>
             </w:r>
           </w:p>
         </w:tc>
@@ -22912,7 +23237,7 @@
                 <w:sz w:val="19"/>
                 <w:szCs w:val="19"/>
               </w:rPr>
-              <w:t>36.3 %</w:t>
+              <w:t>47.6 %</w:t>
             </w:r>
           </w:p>
         </w:tc>
@@ -22951,7 +23276,7 @@
                 <w:sz w:val="19"/>
                 <w:szCs w:val="19"/>
               </w:rPr>
-              <w:t>razón 0.55</w:t>
+              <w:t>razón 0.42</w:t>
             </w:r>
           </w:p>
         </w:tc>
@@ -22976,21 +23301,21 @@
                 <w:sz w:val="19"/>
                 <w:szCs w:val="19"/>
               </w:rPr>
-              <w:t>3/6 (50 %)</w:t>
-            </w:r>
-          </w:p>
-          <w:p>
-            <w:pPr>
-              <w:pStyle w:val="Normal"/>
-              <w:spacing w:before="0" w:after="20"/>
-              <w:rPr/>
-            </w:pPr>
-            <w:r>
-              <w:rPr>
-                <w:sz w:val="19"/>
-                <w:szCs w:val="19"/>
-              </w:rPr>
-              <w:t>razón 1.38</w:t>
+              <w:t>4/6 (66.7 %)</w:t>
+            </w:r>
+          </w:p>
+          <w:p>
+            <w:pPr>
+              <w:pStyle w:val="Normal"/>
+              <w:spacing w:before="0" w:after="20"/>
+              <w:rPr/>
+            </w:pPr>
+            <w:r>
+              <w:rPr>
+                <w:sz w:val="19"/>
+                <w:szCs w:val="19"/>
+              </w:rPr>
+              <w:t>razón 1.4</w:t>
             </w:r>
           </w:p>
         </w:tc>
@@ -23029,7 +23354,7 @@
                 <w:sz w:val="19"/>
                 <w:szCs w:val="19"/>
               </w:rPr>
-              <w:t>razón 0.92</w:t>
+              <w:t>razón 0.7</w:t>
             </w:r>
           </w:p>
         </w:tc>
@@ -23082,7 +23407,7 @@
                 <w:sz w:val="19"/>
                 <w:szCs w:val="19"/>
               </w:rPr>
-              <w:t>47.7 %</w:t>
+              <w:t>63.2 %</w:t>
             </w:r>
           </w:p>
         </w:tc>
@@ -23121,7 +23446,7 @@
                 <w:sz w:val="19"/>
                 <w:szCs w:val="19"/>
               </w:rPr>
-              <w:t>razón 1.26</w:t>
+              <w:t>razón 0.95</w:t>
             </w:r>
           </w:p>
         </w:tc>
@@ -23146,21 +23471,21 @@
                 <w:sz w:val="19"/>
                 <w:szCs w:val="19"/>
               </w:rPr>
-              <w:t>4/6 (66.7 %)</w:t>
-            </w:r>
-          </w:p>
-          <w:p>
-            <w:pPr>
-              <w:pStyle w:val="Normal"/>
-              <w:spacing w:before="0" w:after="20"/>
-              <w:rPr/>
-            </w:pPr>
-            <w:r>
-              <w:rPr>
-                <w:sz w:val="19"/>
-                <w:szCs w:val="19"/>
-              </w:rPr>
-              <w:t>razón 1.4</w:t>
+              <w:t>5/6 (83.3 %)</w:t>
+            </w:r>
+          </w:p>
+          <w:p>
+            <w:pPr>
+              <w:pStyle w:val="Normal"/>
+              <w:spacing w:before="0" w:after="20"/>
+              <w:rPr/>
+            </w:pPr>
+            <w:r>
+              <w:rPr>
+                <w:sz w:val="19"/>
+                <w:szCs w:val="19"/>
+              </w:rPr>
+              <w:t>razón 1.32</w:t>
             </w:r>
           </w:p>
         </w:tc>
@@ -23199,7 +23524,7 @@
                 <w:sz w:val="19"/>
                 <w:szCs w:val="19"/>
               </w:rPr>
-              <w:t>razón 0.7</w:t>
+              <w:t>razón 0.53</w:t>
             </w:r>
           </w:p>
         </w:tc>
@@ -23252,7 +23577,7 @@
                 <w:sz w:val="19"/>
                 <w:szCs w:val="19"/>
               </w:rPr>
-              <w:t>56.6 %</w:t>
+              <w:t>75.3 %</w:t>
             </w:r>
           </w:p>
         </w:tc>
@@ -23291,7 +23616,7 @@
                 <w:sz w:val="19"/>
                 <w:szCs w:val="19"/>
               </w:rPr>
-              <w:t>razón 1.41</w:t>
+              <w:t>razón 1.06</w:t>
             </w:r>
           </w:p>
         </w:tc>
@@ -23316,21 +23641,21 @@
                 <w:sz w:val="19"/>
                 <w:szCs w:val="19"/>
               </w:rPr>
-              <w:t>4/6 (66.7 %)</w:t>
-            </w:r>
-          </w:p>
-          <w:p>
-            <w:pPr>
-              <w:pStyle w:val="Normal"/>
-              <w:spacing w:before="0" w:after="20"/>
-              <w:rPr/>
-            </w:pPr>
-            <w:r>
-              <w:rPr>
-                <w:sz w:val="19"/>
-                <w:szCs w:val="19"/>
-              </w:rPr>
-              <w:t>razón 1.18</w:t>
+              <w:t>5/6 (83.3 %)</w:t>
+            </w:r>
+          </w:p>
+          <w:p>
+            <w:pPr>
+              <w:pStyle w:val="Normal"/>
+              <w:spacing w:before="0" w:after="20"/>
+              <w:rPr/>
+            </w:pPr>
+            <w:r>
+              <w:rPr>
+                <w:sz w:val="19"/>
+                <w:szCs w:val="19"/>
+              </w:rPr>
+              <w:t>razón 1.11</w:t>
             </w:r>
           </w:p>
         </w:tc>
@@ -23369,7 +23694,7 @@
                 <w:sz w:val="19"/>
                 <w:szCs w:val="19"/>
               </w:rPr>
-              <w:t>razón 1.18</w:t>
+              <w:t>razón 0.89</w:t>
             </w:r>
           </w:p>
         </w:tc>
@@ -23422,7 +23747,7 @@
                 <w:sz w:val="19"/>
                 <w:szCs w:val="19"/>
               </w:rPr>
-              <w:t>61.2 %</w:t>
+              <w:t>80.5 %</w:t>
             </w:r>
           </w:p>
         </w:tc>
@@ -23461,7 +23786,7 @@
                 <w:sz w:val="19"/>
                 <w:szCs w:val="19"/>
               </w:rPr>
-              <w:t>razón 1.63</w:t>
+              <w:t>razón 1.24</w:t>
             </w:r>
           </w:p>
         </w:tc>
@@ -23486,21 +23811,21 @@
                 <w:sz w:val="19"/>
                 <w:szCs w:val="19"/>
               </w:rPr>
-              <w:t>4/6 (66.7 %)</w:t>
-            </w:r>
-          </w:p>
-          <w:p>
-            <w:pPr>
-              <w:pStyle w:val="Normal"/>
-              <w:spacing w:before="0" w:after="20"/>
-              <w:rPr/>
-            </w:pPr>
-            <w:r>
-              <w:rPr>
-                <w:sz w:val="19"/>
-                <w:szCs w:val="19"/>
-              </w:rPr>
-              <w:t>razón 1.09</w:t>
+              <w:t>5/6 (83.3 %)</w:t>
+            </w:r>
+          </w:p>
+          <w:p>
+            <w:pPr>
+              <w:pStyle w:val="Normal"/>
+              <w:spacing w:before="0" w:after="20"/>
+              <w:rPr/>
+            </w:pPr>
+            <w:r>
+              <w:rPr>
+                <w:sz w:val="19"/>
+                <w:szCs w:val="19"/>
+              </w:rPr>
+              <w:t>razón 1.04</w:t>
             </w:r>
           </w:p>
         </w:tc>
@@ -23525,21 +23850,21 @@
                 <w:sz w:val="19"/>
                 <w:szCs w:val="19"/>
               </w:rPr>
-              <w:t>2/3 (66.7 %)</w:t>
-            </w:r>
-          </w:p>
-          <w:p>
-            <w:pPr>
-              <w:pStyle w:val="Normal"/>
-              <w:spacing w:before="0" w:after="20"/>
-              <w:rPr/>
-            </w:pPr>
-            <w:r>
-              <w:rPr>
-                <w:sz w:val="19"/>
-                <w:szCs w:val="19"/>
-              </w:rPr>
-              <w:t>razón 1.09</w:t>
+              <w:t>3/3 (100 %)</w:t>
+            </w:r>
+          </w:p>
+          <w:p>
+            <w:pPr>
+              <w:pStyle w:val="Normal"/>
+              <w:spacing w:before="0" w:after="20"/>
+              <w:rPr/>
+            </w:pPr>
+            <w:r>
+              <w:rPr>
+                <w:sz w:val="19"/>
+                <w:szCs w:val="19"/>
+              </w:rPr>
+              <w:t>razón 1.24</w:t>
             </w:r>
           </w:p>
         </w:tc>
@@ -23637,8 +23962,8 @@
         <w:pStyle w:val="Heading2"/>
         <w:rPr/>
       </w:pPr>
-      <w:bookmarkStart w:id="49" w:name="__RefHeading___Toc3245_1774759734"/>
-      <w:bookmarkEnd w:id="49"/>
+      <w:bookmarkStart w:id="50" w:name="__RefHeading___Toc3295_3652871108"/>
+      <w:bookmarkEnd w:id="50"/>
       <w:r>
         <w:rPr/>
         <w:t>15.3. Lectura de los resultados</w:t>
@@ -24331,8 +24656,8 @@
         <w:pStyle w:val="Heading2"/>
         <w:rPr/>
       </w:pPr>
-      <w:bookmarkStart w:id="50" w:name="__RefHeading___Toc3247_1774759734"/>
-      <w:bookmarkEnd w:id="50"/>
+      <w:bookmarkStart w:id="51" w:name="__RefHeading___Toc3297_3652871108"/>
+      <w:bookmarkEnd w:id="51"/>
       <w:r>
         <w:rPr/>
         <w:t>15.4. Extensión del período hasta la actualidad</w:t>
@@ -24522,8 +24847,8 @@
         <w:pStyle w:val="Heading1"/>
         <w:rPr/>
       </w:pPr>
-      <w:bookmarkStart w:id="51" w:name="__RefHeading___Toc3249_1774759734"/>
-      <w:bookmarkEnd w:id="51"/>
+      <w:bookmarkStart w:id="52" w:name="__RefHeading___Toc3299_3652871108"/>
+      <w:bookmarkEnd w:id="52"/>
       <w:r>
         <w:rPr/>
         <w:t>Anexo A. Bitácora del proyecto</w:t>
@@ -28697,6 +29022,109 @@
           </w:p>
         </w:tc>
       </w:tr>
+      <w:tr>
+        <w:trPr/>
+        <w:tc>
+          <w:tcPr>
+            <w:tcW w:w="1250" w:type="dxa"/>
+            <w:tcBorders>
+              <w:top w:val="single" w:sz="4" w:space="0" w:color="BFBFBF"/>
+              <w:left w:val="single" w:sz="4" w:space="0" w:color="BFBFBF"/>
+              <w:bottom w:val="single" w:sz="4" w:space="0" w:color="BFBFBF"/>
+              <w:right w:val="single" w:sz="4" w:space="0" w:color="BFBFBF"/>
+            </w:tcBorders>
+          </w:tcPr>
+          <w:p>
+            <w:pPr>
+              <w:pStyle w:val="Normal"/>
+              <w:spacing w:before="0" w:after="20"/>
+              <w:rPr/>
+            </w:pPr>
+            <w:r>
+              <w:rPr>
+                <w:sz w:val="19"/>
+                <w:szCs w:val="19"/>
+              </w:rPr>
+              <w:t>30/10/2026</w:t>
+            </w:r>
+          </w:p>
+        </w:tc>
+        <w:tc>
+          <w:tcPr>
+            <w:tcW w:w="1650" w:type="dxa"/>
+            <w:tcBorders>
+              <w:top w:val="single" w:sz="4" w:space="0" w:color="BFBFBF"/>
+              <w:left w:val="single" w:sz="4" w:space="0" w:color="BFBFBF"/>
+              <w:bottom w:val="single" w:sz="4" w:space="0" w:color="BFBFBF"/>
+              <w:right w:val="single" w:sz="4" w:space="0" w:color="BFBFBF"/>
+            </w:tcBorders>
+          </w:tcPr>
+          <w:p>
+            <w:pPr>
+              <w:pStyle w:val="Normal"/>
+              <w:spacing w:before="0" w:after="20"/>
+              <w:rPr/>
+            </w:pPr>
+            <w:r>
+              <w:rPr>
+                <w:sz w:val="19"/>
+                <w:szCs w:val="19"/>
+              </w:rPr>
+              <w:t>Fuentes</w:t>
+            </w:r>
+          </w:p>
+        </w:tc>
+        <w:tc>
+          <w:tcPr>
+            <w:tcW w:w="2299" w:type="dxa"/>
+            <w:tcBorders>
+              <w:top w:val="single" w:sz="4" w:space="0" w:color="BFBFBF"/>
+              <w:left w:val="single" w:sz="4" w:space="0" w:color="BFBFBF"/>
+              <w:bottom w:val="single" w:sz="4" w:space="0" w:color="BFBFBF"/>
+              <w:right w:val="single" w:sz="4" w:space="0" w:color="BFBFBF"/>
+            </w:tcBorders>
+          </w:tcPr>
+          <w:p>
+            <w:pPr>
+              <w:pStyle w:val="Normal"/>
+              <w:spacing w:before="0" w:after="20"/>
+              <w:rPr/>
+            </w:pPr>
+            <w:r>
+              <w:rPr>
+                <w:sz w:val="19"/>
+                <w:szCs w:val="19"/>
+              </w:rPr>
+              <w:t>Monitoreo de los canales públicos de Telegram (camino A)</w:t>
+            </w:r>
+          </w:p>
+        </w:tc>
+        <w:tc>
+          <w:tcPr>
+            <w:tcW w:w="4438" w:type="dxa"/>
+            <w:tcBorders>
+              <w:top w:val="single" w:sz="4" w:space="0" w:color="BFBFBF"/>
+              <w:left w:val="single" w:sz="4" w:space="0" w:color="BFBFBF"/>
+              <w:bottom w:val="single" w:sz="4" w:space="0" w:color="BFBFBF"/>
+              <w:right w:val="single" w:sz="4" w:space="0" w:color="BFBFBF"/>
+            </w:tcBorders>
+          </w:tcPr>
+          <w:p>
+            <w:pPr>
+              <w:pStyle w:val="Normal"/>
+              <w:spacing w:before="0" w:after="20"/>
+              <w:rPr/>
+            </w:pPr>
+            <w:r>
+              <w:rPr>
+                <w:sz w:val="19"/>
+                <w:szCs w:val="19"/>
+              </w:rPr>
+              <w:t>El autor compartió tres espacios de Telegram: el canal de LulzSec Muslims, el de LulzSec Black y un grupo privado. Se decidió leer solo los dos canales públicos desde su vista web (sin cuenta), cada 6 horas. Los mensajes que mencionan a Argentina, un dominio .ar o la bandera y tienen una señal de ataque se toman como reclamos sin verificar y forman un grupo aparte en la evaluación (D34). La prueba real se hace desde GitHub Actions, porque el entorno de desarrollo no tiene acceso a Telegram.</w:t>
+            </w:r>
+          </w:p>
+        </w:tc>
+      </w:tr>
     </w:tbl>
     <w:p>
       <w:pPr>
@@ -28706,8 +29134,8 @@
       <w:r>
         <w:br w:type="page"/>
       </w:r>
-      <w:bookmarkStart w:id="52" w:name="__RefHeading___Toc3251_1774759734"/>
-      <w:bookmarkEnd w:id="52"/>
+      <w:bookmarkStart w:id="53" w:name="__RefHeading___Toc3301_3652871108"/>
+      <w:bookmarkEnd w:id="53"/>
       <w:r>
         <w:rPr/>
         <w:t>Anexo B. Glosario</w:t>

</xml_diff>

<commit_message>
Web: perfil del actor LulzSec Muslims
Nueva sección debajo del semáforo con la ficha del actor, su historial
de ataques contra Argentina (con el hecho clave previo) y el resultado
de la evaluación. Memoria y bitácora actualizadas (versión 0.10).

Co-Authored-By: Claude Opus 5.5 <noreply@anthropic.com>
Claude-Session: https://claude.ai/code/session_012tPJhUqpwZye4C3iuLAtgv
</commit_message>
<xml_diff>
--- a/memoria/Memoria_TFM.docx
+++ b/memoria/Memoria_TFM.docx
@@ -145,7 +145,7 @@
           <w:sz w:val="20"/>
           <w:szCs w:val="20"/>
         </w:rPr>
-        <w:t>Versión 0.9 · 30/10/2026</w:t>
+        <w:t>Versión 0.10 · 31/10/2026</w:t>
       </w:r>
     </w:p>
     <w:p>
@@ -1086,6 +1086,84 @@
                 <w:szCs w:val="19"/>
               </w:rPr>
               <w:t>Telegram como fuente de reclamos (D34); plataforma centrada en LulzSec con los demás actores como comparación (D36); detonantes curados, ventana de 21 días y evaluación por tramos de calibración y validación (D35).</w:t>
+            </w:r>
+          </w:p>
+        </w:tc>
+      </w:tr>
+      <w:tr>
+        <w:trPr/>
+        <w:tc>
+          <w:tcPr>
+            <w:tcW w:w="1099" w:type="dxa"/>
+            <w:tcBorders>
+              <w:top w:val="single" w:sz="4" w:space="0" w:color="BFBFBF"/>
+              <w:left w:val="single" w:sz="4" w:space="0" w:color="BFBFBF"/>
+              <w:bottom w:val="single" w:sz="4" w:space="0" w:color="BFBFBF"/>
+              <w:right w:val="single" w:sz="4" w:space="0" w:color="BFBFBF"/>
+            </w:tcBorders>
+          </w:tcPr>
+          <w:p>
+            <w:pPr>
+              <w:pStyle w:val="Normal"/>
+              <w:spacing w:before="0" w:after="20"/>
+              <w:rPr/>
+            </w:pPr>
+            <w:r>
+              <w:rPr>
+                <w:sz w:val="19"/>
+                <w:szCs w:val="19"/>
+              </w:rPr>
+              <w:t>0.10</w:t>
+            </w:r>
+          </w:p>
+        </w:tc>
+        <w:tc>
+          <w:tcPr>
+            <w:tcW w:w="1401" w:type="dxa"/>
+            <w:tcBorders>
+              <w:top w:val="single" w:sz="4" w:space="0" w:color="BFBFBF"/>
+              <w:left w:val="single" w:sz="4" w:space="0" w:color="BFBFBF"/>
+              <w:bottom w:val="single" w:sz="4" w:space="0" w:color="BFBFBF"/>
+              <w:right w:val="single" w:sz="4" w:space="0" w:color="BFBFBF"/>
+            </w:tcBorders>
+          </w:tcPr>
+          <w:p>
+            <w:pPr>
+              <w:pStyle w:val="Normal"/>
+              <w:spacing w:before="0" w:after="20"/>
+              <w:rPr/>
+            </w:pPr>
+            <w:r>
+              <w:rPr>
+                <w:sz w:val="19"/>
+                <w:szCs w:val="19"/>
+              </w:rPr>
+              <w:t>31/10/2026</w:t>
+            </w:r>
+          </w:p>
+        </w:tc>
+        <w:tc>
+          <w:tcPr>
+            <w:tcW w:w="7138" w:type="dxa"/>
+            <w:tcBorders>
+              <w:top w:val="single" w:sz="4" w:space="0" w:color="BFBFBF"/>
+              <w:left w:val="single" w:sz="4" w:space="0" w:color="BFBFBF"/>
+              <w:bottom w:val="single" w:sz="4" w:space="0" w:color="BFBFBF"/>
+              <w:right w:val="single" w:sz="4" w:space="0" w:color="BFBFBF"/>
+            </w:tcBorders>
+          </w:tcPr>
+          <w:p>
+            <w:pPr>
+              <w:pStyle w:val="Normal"/>
+              <w:spacing w:before="0" w:after="20"/>
+              <w:rPr/>
+            </w:pPr>
+            <w:r>
+              <w:rPr>
+                <w:sz w:val="19"/>
+                <w:szCs w:val="19"/>
+              </w:rPr>
+              <w:t>Perfil del actor LulzSec Muslims en la página web.</w:t>
             </w:r>
           </w:p>
         </w:tc>
@@ -1176,7 +1254,7 @@
             </w:rPr>
             <w:fldChar w:fldCharType="separate"/>
           </w:r>
-          <w:hyperlink w:anchor="__RefHeading___Toc5948_3680603316">
+          <w:hyperlink w:anchor="__RefHeading___Toc6024_1728232176">
             <w:r>
               <w:rPr>
                 <w:rStyle w:val="IndexLink"/>
@@ -1196,7 +1274,7 @@
             </w:tabs>
             <w:rPr/>
           </w:pPr>
-          <w:hyperlink w:anchor="__RefHeading___Toc5950_3680603316">
+          <w:hyperlink w:anchor="__RefHeading___Toc6026_1728232176">
             <w:r>
               <w:rPr>
                 <w:rStyle w:val="IndexLink"/>
@@ -1216,7 +1294,7 @@
             </w:tabs>
             <w:rPr/>
           </w:pPr>
-          <w:hyperlink w:anchor="__RefHeading___Toc5952_3680603316">
+          <w:hyperlink w:anchor="__RefHeading___Toc6028_1728232176">
             <w:r>
               <w:rPr>
                 <w:rStyle w:val="IndexLink"/>
@@ -1236,7 +1314,7 @@
             </w:tabs>
             <w:rPr/>
           </w:pPr>
-          <w:hyperlink w:anchor="__RefHeading___Toc5954_3680603316">
+          <w:hyperlink w:anchor="__RefHeading___Toc6030_1728232176">
             <w:r>
               <w:rPr>
                 <w:rStyle w:val="IndexLink"/>
@@ -1256,7 +1334,7 @@
             </w:tabs>
             <w:rPr/>
           </w:pPr>
-          <w:hyperlink w:anchor="__RefHeading___Toc5956_3680603316">
+          <w:hyperlink w:anchor="__RefHeading___Toc6032_1728232176">
             <w:r>
               <w:rPr>
                 <w:rStyle w:val="IndexLink"/>
@@ -1276,7 +1354,7 @@
             </w:tabs>
             <w:rPr/>
           </w:pPr>
-          <w:hyperlink w:anchor="__RefHeading___Toc5958_3680603316">
+          <w:hyperlink w:anchor="__RefHeading___Toc6034_1728232176">
             <w:r>
               <w:rPr>
                 <w:rStyle w:val="IndexLink"/>
@@ -1296,7 +1374,7 @@
             </w:tabs>
             <w:rPr/>
           </w:pPr>
-          <w:hyperlink w:anchor="__RefHeading___Toc5960_3680603316">
+          <w:hyperlink w:anchor="__RefHeading___Toc6036_1728232176">
             <w:r>
               <w:rPr>
                 <w:rStyle w:val="IndexLink"/>
@@ -1316,7 +1394,7 @@
             </w:tabs>
             <w:rPr/>
           </w:pPr>
-          <w:hyperlink w:anchor="__RefHeading___Toc5962_3680603316">
+          <w:hyperlink w:anchor="__RefHeading___Toc6038_1728232176">
             <w:r>
               <w:rPr>
                 <w:rStyle w:val="IndexLink"/>
@@ -1336,7 +1414,7 @@
             </w:tabs>
             <w:rPr/>
           </w:pPr>
-          <w:hyperlink w:anchor="__RefHeading___Toc5964_3680603316">
+          <w:hyperlink w:anchor="__RefHeading___Toc6040_1728232176">
             <w:r>
               <w:rPr>
                 <w:rStyle w:val="IndexLink"/>
@@ -1356,7 +1434,7 @@
             </w:tabs>
             <w:rPr/>
           </w:pPr>
-          <w:hyperlink w:anchor="__RefHeading___Toc5966_3680603316">
+          <w:hyperlink w:anchor="__RefHeading___Toc6042_1728232176">
             <w:r>
               <w:rPr>
                 <w:rStyle w:val="IndexLink"/>
@@ -1376,7 +1454,7 @@
             </w:tabs>
             <w:rPr/>
           </w:pPr>
-          <w:hyperlink w:anchor="__RefHeading___Toc5968_3680603316">
+          <w:hyperlink w:anchor="__RefHeading___Toc6044_1728232176">
             <w:r>
               <w:rPr>
                 <w:rStyle w:val="IndexLink"/>
@@ -1396,7 +1474,7 @@
             </w:tabs>
             <w:rPr/>
           </w:pPr>
-          <w:hyperlink w:anchor="__RefHeading___Toc5970_3680603316">
+          <w:hyperlink w:anchor="__RefHeading___Toc6046_1728232176">
             <w:r>
               <w:rPr>
                 <w:rStyle w:val="IndexLink"/>
@@ -1416,7 +1494,7 @@
             </w:tabs>
             <w:rPr/>
           </w:pPr>
-          <w:hyperlink w:anchor="__RefHeading___Toc5972_3680603316">
+          <w:hyperlink w:anchor="__RefHeading___Toc6048_1728232176">
             <w:r>
               <w:rPr>
                 <w:rStyle w:val="IndexLink"/>
@@ -1436,7 +1514,7 @@
             </w:tabs>
             <w:rPr/>
           </w:pPr>
-          <w:hyperlink w:anchor="__RefHeading___Toc5974_3680603316">
+          <w:hyperlink w:anchor="__RefHeading___Toc6050_1728232176">
             <w:r>
               <w:rPr>
                 <w:rStyle w:val="IndexLink"/>
@@ -1456,7 +1534,7 @@
             </w:tabs>
             <w:rPr/>
           </w:pPr>
-          <w:hyperlink w:anchor="__RefHeading___Toc5976_3680603316">
+          <w:hyperlink w:anchor="__RefHeading___Toc6052_1728232176">
             <w:r>
               <w:rPr>
                 <w:rStyle w:val="IndexLink"/>
@@ -1476,7 +1554,7 @@
             </w:tabs>
             <w:rPr/>
           </w:pPr>
-          <w:hyperlink w:anchor="__RefHeading___Toc5978_3680603316">
+          <w:hyperlink w:anchor="__RefHeading___Toc6054_1728232176">
             <w:r>
               <w:rPr>
                 <w:rStyle w:val="IndexLink"/>
@@ -1496,7 +1574,7 @@
             </w:tabs>
             <w:rPr/>
           </w:pPr>
-          <w:hyperlink w:anchor="__RefHeading___Toc5980_3680603316">
+          <w:hyperlink w:anchor="__RefHeading___Toc6056_1728232176">
             <w:r>
               <w:rPr>
                 <w:rStyle w:val="IndexLink"/>
@@ -1516,7 +1594,7 @@
             </w:tabs>
             <w:rPr/>
           </w:pPr>
-          <w:hyperlink w:anchor="__RefHeading___Toc5982_3680603316">
+          <w:hyperlink w:anchor="__RefHeading___Toc6058_1728232176">
             <w:r>
               <w:rPr>
                 <w:rStyle w:val="IndexLink"/>
@@ -1536,7 +1614,7 @@
             </w:tabs>
             <w:rPr/>
           </w:pPr>
-          <w:hyperlink w:anchor="__RefHeading___Toc5984_3680603316">
+          <w:hyperlink w:anchor="__RefHeading___Toc6060_1728232176">
             <w:r>
               <w:rPr>
                 <w:rStyle w:val="IndexLink"/>
@@ -1556,7 +1634,7 @@
             </w:tabs>
             <w:rPr/>
           </w:pPr>
-          <w:hyperlink w:anchor="__RefHeading___Toc5986_3680603316">
+          <w:hyperlink w:anchor="__RefHeading___Toc6062_1728232176">
             <w:r>
               <w:rPr>
                 <w:rStyle w:val="IndexLink"/>
@@ -1576,7 +1654,7 @@
             </w:tabs>
             <w:rPr/>
           </w:pPr>
-          <w:hyperlink w:anchor="__RefHeading___Toc5988_3680603316">
+          <w:hyperlink w:anchor="__RefHeading___Toc6064_1728232176">
             <w:r>
               <w:rPr>
                 <w:rStyle w:val="IndexLink"/>
@@ -1596,7 +1674,7 @@
             </w:tabs>
             <w:rPr/>
           </w:pPr>
-          <w:hyperlink w:anchor="__RefHeading___Toc5990_3680603316">
+          <w:hyperlink w:anchor="__RefHeading___Toc6066_1728232176">
             <w:r>
               <w:rPr>
                 <w:rStyle w:val="IndexLink"/>
@@ -1616,7 +1694,7 @@
             </w:tabs>
             <w:rPr/>
           </w:pPr>
-          <w:hyperlink w:anchor="__RefHeading___Toc5992_3680603316">
+          <w:hyperlink w:anchor="__RefHeading___Toc6068_1728232176">
             <w:r>
               <w:rPr>
                 <w:rStyle w:val="IndexLink"/>
@@ -1636,7 +1714,7 @@
             </w:tabs>
             <w:rPr/>
           </w:pPr>
-          <w:hyperlink w:anchor="__RefHeading___Toc5994_3680603316">
+          <w:hyperlink w:anchor="__RefHeading___Toc6070_1728232176">
             <w:r>
               <w:rPr>
                 <w:rStyle w:val="IndexLink"/>
@@ -1656,7 +1734,7 @@
             </w:tabs>
             <w:rPr/>
           </w:pPr>
-          <w:hyperlink w:anchor="__RefHeading___Toc5996_3680603316">
+          <w:hyperlink w:anchor="__RefHeading___Toc6072_1728232176">
             <w:r>
               <w:rPr>
                 <w:rStyle w:val="IndexLink"/>
@@ -1676,7 +1754,7 @@
             </w:tabs>
             <w:rPr/>
           </w:pPr>
-          <w:hyperlink w:anchor="__RefHeading___Toc5998_3680603316">
+          <w:hyperlink w:anchor="__RefHeading___Toc6074_1728232176">
             <w:r>
               <w:rPr>
                 <w:rStyle w:val="IndexLink"/>
@@ -1696,7 +1774,7 @@
             </w:tabs>
             <w:rPr/>
           </w:pPr>
-          <w:hyperlink w:anchor="__RefHeading___Toc6000_3680603316">
+          <w:hyperlink w:anchor="__RefHeading___Toc6076_1728232176">
             <w:r>
               <w:rPr>
                 <w:rStyle w:val="IndexLink"/>
@@ -1716,14 +1794,14 @@
             </w:tabs>
             <w:rPr/>
           </w:pPr>
-          <w:hyperlink w:anchor="__RefHeading___Toc6002_3680603316">
+          <w:hyperlink w:anchor="__RefHeading___Toc6078_1728232176">
             <w:r>
               <w:rPr>
                 <w:rStyle w:val="IndexLink"/>
               </w:rPr>
               <w:t>9. Automatización y puesta en marcha</w:t>
               <w:tab/>
-              <w:t>19</w:t>
+              <w:t>20</w:t>
             </w:r>
           </w:hyperlink>
         </w:p>
@@ -1736,14 +1814,14 @@
             </w:tabs>
             <w:rPr/>
           </w:pPr>
-          <w:hyperlink w:anchor="__RefHeading___Toc6004_3680603316">
+          <w:hyperlink w:anchor="__RefHeading___Toc6080_1728232176">
             <w:r>
               <w:rPr>
                 <w:rStyle w:val="IndexLink"/>
               </w:rPr>
               <w:t>9.1. Workflows de GitHub Actions</w:t>
               <w:tab/>
-              <w:t>19</w:t>
+              <w:t>20</w:t>
             </w:r>
           </w:hyperlink>
         </w:p>
@@ -1756,14 +1834,14 @@
             </w:tabs>
             <w:rPr/>
           </w:pPr>
-          <w:hyperlink w:anchor="__RefHeading___Toc6006_3680603316">
+          <w:hyperlink w:anchor="__RefHeading___Toc6082_1728232176">
             <w:r>
               <w:rPr>
                 <w:rStyle w:val="IndexLink"/>
               </w:rPr>
               <w:t>9.2. Configuración realizada por el autor</w:t>
               <w:tab/>
-              <w:t>19</w:t>
+              <w:t>20</w:t>
             </w:r>
           </w:hyperlink>
         </w:p>
@@ -1776,7 +1854,7 @@
             </w:tabs>
             <w:rPr/>
           </w:pPr>
-          <w:hyperlink w:anchor="__RefHeading___Toc6008_3680603316">
+          <w:hyperlink w:anchor="__RefHeading___Toc6084_1728232176">
             <w:r>
               <w:rPr>
                 <w:rStyle w:val="IndexLink"/>
@@ -1796,14 +1874,14 @@
             </w:tabs>
             <w:rPr/>
           </w:pPr>
-          <w:hyperlink w:anchor="__RefHeading___Toc6010_3680603316">
+          <w:hyperlink w:anchor="__RefHeading___Toc6086_1728232176">
             <w:r>
               <w:rPr>
                 <w:rStyle w:val="IndexLink"/>
               </w:rPr>
               <w:t>10. Pruebas y verificación</w:t>
               <w:tab/>
-              <w:t>21</w:t>
+              <w:t>22</w:t>
             </w:r>
           </w:hyperlink>
         </w:p>
@@ -1816,14 +1894,14 @@
             </w:tabs>
             <w:rPr/>
           </w:pPr>
-          <w:hyperlink w:anchor="__RefHeading___Toc6012_3680603316">
+          <w:hyperlink w:anchor="__RefHeading___Toc6088_1728232176">
             <w:r>
               <w:rPr>
                 <w:rStyle w:val="IndexLink"/>
               </w:rPr>
               <w:t>10.1. Pruebas automáticas</w:t>
               <w:tab/>
-              <w:t>21</w:t>
+              <w:t>22</w:t>
             </w:r>
           </w:hyperlink>
         </w:p>
@@ -1836,14 +1914,14 @@
             </w:tabs>
             <w:rPr/>
           </w:pPr>
-          <w:hyperlink w:anchor="__RefHeading___Toc6014_3680603316">
+          <w:hyperlink w:anchor="__RefHeading___Toc6090_1728232176">
             <w:r>
               <w:rPr>
                 <w:rStyle w:val="IndexLink"/>
               </w:rPr>
               <w:t>10.2. Verificaciones con datos reales</w:t>
               <w:tab/>
-              <w:t>21</w:t>
+              <w:t>22</w:t>
             </w:r>
           </w:hyperlink>
         </w:p>
@@ -1856,14 +1934,14 @@
             </w:tabs>
             <w:rPr/>
           </w:pPr>
-          <w:hyperlink w:anchor="__RefHeading___Toc6016_3680603316">
+          <w:hyperlink w:anchor="__RefHeading___Toc6092_1728232176">
             <w:r>
               <w:rPr>
                 <w:rStyle w:val="IndexLink"/>
               </w:rPr>
               <w:t>11. Problemas encontrados y soluciones</w:t>
               <w:tab/>
-              <w:t>22</w:t>
+              <w:t>23</w:t>
             </w:r>
           </w:hyperlink>
         </w:p>
@@ -1876,14 +1954,14 @@
             </w:tabs>
             <w:rPr/>
           </w:pPr>
-          <w:hyperlink w:anchor="__RefHeading___Toc6018_3680603316">
+          <w:hyperlink w:anchor="__RefHeading___Toc6094_1728232176">
             <w:r>
               <w:rPr>
                 <w:rStyle w:val="IndexLink"/>
               </w:rPr>
               <w:t>12. Decisiones técnicas</w:t>
               <w:tab/>
-              <w:t>23</w:t>
+              <w:t>24</w:t>
             </w:r>
           </w:hyperlink>
         </w:p>
@@ -1896,14 +1974,14 @@
             </w:tabs>
             <w:rPr/>
           </w:pPr>
-          <w:hyperlink w:anchor="__RefHeading___Toc6020_3680603316">
+          <w:hyperlink w:anchor="__RefHeading___Toc6096_1728232176">
             <w:r>
               <w:rPr>
                 <w:rStyle w:val="IndexLink"/>
               </w:rPr>
               <w:t>13. Estado actual y próximos pasos</w:t>
               <w:tab/>
-              <w:t>24</w:t>
+              <w:t>25</w:t>
             </w:r>
           </w:hyperlink>
         </w:p>
@@ -1916,14 +1994,14 @@
             </w:tabs>
             <w:rPr/>
           </w:pPr>
-          <w:hyperlink w:anchor="__RefHeading___Toc6022_3680603316">
+          <w:hyperlink w:anchor="__RefHeading___Toc6098_1728232176">
             <w:r>
               <w:rPr>
                 <w:rStyle w:val="IndexLink"/>
               </w:rPr>
               <w:t>13.1. Estado</w:t>
               <w:tab/>
-              <w:t>24</w:t>
+              <w:t>25</w:t>
             </w:r>
           </w:hyperlink>
         </w:p>
@@ -1936,14 +2014,14 @@
             </w:tabs>
             <w:rPr/>
           </w:pPr>
-          <w:hyperlink w:anchor="__RefHeading___Toc6024_3680603316">
+          <w:hyperlink w:anchor="__RefHeading___Toc6100_1728232176">
             <w:r>
               <w:rPr>
                 <w:rStyle w:val="IndexLink"/>
               </w:rPr>
               <w:t>13.2. Tareas pendientes del autor</w:t>
               <w:tab/>
-              <w:t>24</w:t>
+              <w:t>25</w:t>
             </w:r>
           </w:hyperlink>
         </w:p>
@@ -1956,14 +2034,14 @@
             </w:tabs>
             <w:rPr/>
           </w:pPr>
-          <w:hyperlink w:anchor="__RefHeading___Toc6026_3680603316">
+          <w:hyperlink w:anchor="__RefHeading___Toc6102_1728232176">
             <w:r>
               <w:rPr>
                 <w:rStyle w:val="IndexLink"/>
               </w:rPr>
               <w:t>13.3. Próximos pasos propuestos</w:t>
               <w:tab/>
-              <w:t>24</w:t>
+              <w:t>25</w:t>
             </w:r>
           </w:hyperlink>
         </w:p>
@@ -1976,14 +2054,14 @@
             </w:tabs>
             <w:rPr/>
           </w:pPr>
-          <w:hyperlink w:anchor="__RefHeading___Toc6028_3680603316">
+          <w:hyperlink w:anchor="__RefHeading___Toc6104_1728232176">
             <w:r>
               <w:rPr>
                 <w:rStyle w:val="IndexLink"/>
               </w:rPr>
               <w:t>14. Búsqueda de incidentes y diseño de la evaluación</w:t>
               <w:tab/>
-              <w:t>25</w:t>
+              <w:t>26</w:t>
             </w:r>
           </w:hyperlink>
         </w:p>
@@ -1996,14 +2074,14 @@
             </w:tabs>
             <w:rPr/>
           </w:pPr>
-          <w:hyperlink w:anchor="__RefHeading___Toc6030_3680603316">
+          <w:hyperlink w:anchor="__RefHeading___Toc6106_1728232176">
             <w:r>
               <w:rPr>
                 <w:rStyle w:val="IndexLink"/>
               </w:rPr>
               <w:t>14.1. Por qué hace falta cargar incidentes</w:t>
               <w:tab/>
-              <w:t>25</w:t>
+              <w:t>26</w:t>
             </w:r>
           </w:hyperlink>
         </w:p>
@@ -2016,14 +2094,14 @@
             </w:tabs>
             <w:rPr/>
           </w:pPr>
-          <w:hyperlink w:anchor="__RefHeading___Toc6032_3680603316">
+          <w:hyperlink w:anchor="__RefHeading___Toc6108_1728232176">
             <w:r>
               <w:rPr>
                 <w:rStyle w:val="IndexLink"/>
               </w:rPr>
               <w:t>14.2. Grupo de comparación</w:t>
               <w:tab/>
-              <w:t>25</w:t>
+              <w:t>26</w:t>
             </w:r>
           </w:hyperlink>
         </w:p>
@@ -2036,14 +2114,14 @@
             </w:tabs>
             <w:rPr/>
           </w:pPr>
-          <w:hyperlink w:anchor="__RefHeading___Toc6034_3680603316">
+          <w:hyperlink w:anchor="__RefHeading___Toc6110_1728232176">
             <w:r>
               <w:rPr>
                 <w:rStyle w:val="IndexLink"/>
               </w:rPr>
               <w:t>14.3. Incidentes cargados</w:t>
               <w:tab/>
-              <w:t>25</w:t>
+              <w:t>26</w:t>
             </w:r>
           </w:hyperlink>
         </w:p>
@@ -2056,14 +2134,14 @@
             </w:tabs>
             <w:rPr/>
           </w:pPr>
-          <w:hyperlink w:anchor="__RefHeading___Toc6036_3680603316">
+          <w:hyperlink w:anchor="__RefHeading___Toc6112_1728232176">
             <w:r>
               <w:rPr>
                 <w:rStyle w:val="IndexLink"/>
               </w:rPr>
               <w:t>14.4. Primeras observaciones</w:t>
               <w:tab/>
-              <w:t>26</w:t>
+              <w:t>27</w:t>
             </w:r>
           </w:hyperlink>
         </w:p>
@@ -2076,14 +2154,14 @@
             </w:tabs>
             <w:rPr/>
           </w:pPr>
-          <w:hyperlink w:anchor="__RefHeading___Toc6038_3680603316">
+          <w:hyperlink w:anchor="__RefHeading___Toc6114_1728232176">
             <w:r>
               <w:rPr>
                 <w:rStyle w:val="IndexLink"/>
               </w:rPr>
               <w:t>14.5. Segunda lista de candidatos (agosto 2024 – hoy)</w:t>
               <w:tab/>
-              <w:t>26</w:t>
+              <w:t>27</w:t>
             </w:r>
           </w:hyperlink>
         </w:p>
@@ -2096,14 +2174,14 @@
             </w:tabs>
             <w:rPr/>
           </w:pPr>
-          <w:hyperlink w:anchor="__RefHeading___Toc6040_3680603316">
+          <w:hyperlink w:anchor="__RefHeading___Toc6116_1728232176">
             <w:r>
               <w:rPr>
                 <w:rStyle w:val="IndexLink"/>
               </w:rPr>
               <w:t>14.6. Metodología de verificación</w:t>
               <w:tab/>
-              <w:t>37</w:t>
+              <w:t>38</w:t>
             </w:r>
           </w:hyperlink>
         </w:p>
@@ -2116,14 +2194,14 @@
             </w:tabs>
             <w:rPr/>
           </w:pPr>
-          <w:hyperlink w:anchor="__RefHeading___Toc6042_3680603316">
+          <w:hyperlink w:anchor="__RefHeading___Toc6118_1728232176">
             <w:r>
               <w:rPr>
                 <w:rStyle w:val="IndexLink"/>
               </w:rPr>
               <w:t>15. Evaluación del modelo</w:t>
               <w:tab/>
-              <w:t>39</w:t>
+              <w:t>40</w:t>
             </w:r>
           </w:hyperlink>
         </w:p>
@@ -2136,14 +2214,14 @@
             </w:tabs>
             <w:rPr/>
           </w:pPr>
-          <w:hyperlink w:anchor="__RefHeading___Toc6044_3680603316">
+          <w:hyperlink w:anchor="__RefHeading___Toc6120_1728232176">
             <w:r>
               <w:rPr>
                 <w:rStyle w:val="IndexLink"/>
               </w:rPr>
               <w:t>15.1. Método</w:t>
               <w:tab/>
-              <w:t>39</w:t>
+              <w:t>40</w:t>
             </w:r>
           </w:hyperlink>
         </w:p>
@@ -2156,14 +2234,14 @@
             </w:tabs>
             <w:rPr/>
           </w:pPr>
-          <w:hyperlink w:anchor="__RefHeading___Toc6046_3680603316">
+          <w:hyperlink w:anchor="__RefHeading___Toc6122_1728232176">
             <w:r>
               <w:rPr>
                 <w:rStyle w:val="IndexLink"/>
               </w:rPr>
               <w:t>15.2. Resultados preliminares</w:t>
               <w:tab/>
-              <w:t>39</w:t>
+              <w:t>40</w:t>
             </w:r>
           </w:hyperlink>
         </w:p>
@@ -2176,14 +2254,14 @@
             </w:tabs>
             <w:rPr/>
           </w:pPr>
-          <w:hyperlink w:anchor="__RefHeading___Toc6048_3680603316">
+          <w:hyperlink w:anchor="__RefHeading___Toc6124_1728232176">
             <w:r>
               <w:rPr>
                 <w:rStyle w:val="IndexLink"/>
               </w:rPr>
               <w:t>15.3. Lectura de los resultados</w:t>
               <w:tab/>
-              <w:t>41</w:t>
+              <w:t>42</w:t>
             </w:r>
           </w:hyperlink>
         </w:p>
@@ -2196,14 +2274,14 @@
             </w:tabs>
             <w:rPr/>
           </w:pPr>
-          <w:hyperlink w:anchor="__RefHeading___Toc6050_3680603316">
+          <w:hyperlink w:anchor="__RefHeading___Toc6126_1728232176">
             <w:r>
               <w:rPr>
                 <w:rStyle w:val="IndexLink"/>
               </w:rPr>
               <w:t>15.5. Detonantes curados: antes y después</w:t>
               <w:tab/>
-              <w:t>42</w:t>
+              <w:t>43</w:t>
             </w:r>
           </w:hyperlink>
         </w:p>
@@ -2216,14 +2294,14 @@
             </w:tabs>
             <w:rPr/>
           </w:pPr>
-          <w:hyperlink w:anchor="__RefHeading___Toc6052_3680603316">
+          <w:hyperlink w:anchor="__RefHeading___Toc6128_1728232176">
             <w:r>
               <w:rPr>
                 <w:rStyle w:val="IndexLink"/>
               </w:rPr>
               <w:t>15.4. Extensión del período hasta la actualidad</w:t>
               <w:tab/>
-              <w:t>43</w:t>
+              <w:t>44</w:t>
             </w:r>
           </w:hyperlink>
         </w:p>
@@ -2236,14 +2314,14 @@
             </w:tabs>
             <w:rPr/>
           </w:pPr>
-          <w:hyperlink w:anchor="__RefHeading___Toc6054_3680603316">
+          <w:hyperlink w:anchor="__RefHeading___Toc6130_1728232176">
             <w:r>
               <w:rPr>
                 <w:rStyle w:val="IndexLink"/>
               </w:rPr>
               <w:t>Anexo A. Bitácora del proyecto</w:t>
               <w:tab/>
-              <w:t>45</w:t>
+              <w:t>46</w:t>
             </w:r>
           </w:hyperlink>
         </w:p>
@@ -2256,14 +2334,14 @@
             </w:tabs>
             <w:rPr/>
           </w:pPr>
-          <w:hyperlink w:anchor="__RefHeading___Toc6056_3680603316">
+          <w:hyperlink w:anchor="__RefHeading___Toc6132_1728232176">
             <w:r>
               <w:rPr>
                 <w:rStyle w:val="IndexLink"/>
               </w:rPr>
               <w:t>Anexo B. Glosario</w:t>
               <w:tab/>
-              <w:t>50</w:t>
+              <w:t>51</w:t>
             </w:r>
           </w:hyperlink>
           <w:r>
@@ -2278,6 +2356,10 @@
     <w:p>
       <w:pPr>
         <w:pStyle w:val="Normal"/>
+        <w:widowControl/>
+        <w:bidi w:val="0"/>
+        <w:spacing w:before="0" w:after="0"/>
+        <w:jc w:val="left"/>
         <w:rPr/>
       </w:pPr>
       <w:r>
@@ -2292,7 +2374,7 @@
         <w:pStyle w:val="Heading1"/>
         <w:rPr/>
       </w:pPr>
-      <w:bookmarkStart w:id="0" w:name="__RefHeading___Toc5948_3680603316"/>
+      <w:bookmarkStart w:id="0" w:name="__RefHeading___Toc6024_1728232176"/>
       <w:bookmarkEnd w:id="0"/>
       <w:r>
         <w:rPr/>
@@ -2304,7 +2386,7 @@
         <w:pStyle w:val="Heading2"/>
         <w:rPr/>
       </w:pPr>
-      <w:bookmarkStart w:id="1" w:name="__RefHeading___Toc5950_3680603316"/>
+      <w:bookmarkStart w:id="1" w:name="__RefHeading___Toc6026_1728232176"/>
       <w:bookmarkEnd w:id="1"/>
       <w:r>
         <w:rPr/>
@@ -2360,7 +2442,7 @@
         <w:pStyle w:val="Heading2"/>
         <w:rPr/>
       </w:pPr>
-      <w:bookmarkStart w:id="2" w:name="__RefHeading___Toc5952_3680603316"/>
+      <w:bookmarkStart w:id="2" w:name="__RefHeading___Toc6028_1728232176"/>
       <w:bookmarkEnd w:id="2"/>
       <w:r>
         <w:rPr/>
@@ -2462,7 +2544,7 @@
         <w:pStyle w:val="Heading2"/>
         <w:rPr/>
       </w:pPr>
-      <w:bookmarkStart w:id="3" w:name="__RefHeading___Toc5954_3680603316"/>
+      <w:bookmarkStart w:id="3" w:name="__RefHeading___Toc6030_1728232176"/>
       <w:bookmarkEnd w:id="3"/>
       <w:r>
         <w:rPr/>
@@ -2499,7 +2581,7 @@
         <w:pStyle w:val="Heading1"/>
         <w:rPr/>
       </w:pPr>
-      <w:bookmarkStart w:id="4" w:name="__RefHeading___Toc5956_3680603316"/>
+      <w:bookmarkStart w:id="4" w:name="__RefHeading___Toc6032_1728232176"/>
       <w:bookmarkEnd w:id="4"/>
       <w:r>
         <w:rPr/>
@@ -2511,7 +2593,7 @@
         <w:pStyle w:val="Heading2"/>
         <w:rPr/>
       </w:pPr>
-      <w:bookmarkStart w:id="5" w:name="__RefHeading___Toc5958_3680603316"/>
+      <w:bookmarkStart w:id="5" w:name="__RefHeading___Toc6034_1728232176"/>
       <w:bookmarkEnd w:id="5"/>
       <w:r>
         <w:rPr/>
@@ -2545,7 +2627,7 @@
         <w:pStyle w:val="Heading2"/>
         <w:rPr/>
       </w:pPr>
-      <w:bookmarkStart w:id="6" w:name="__RefHeading___Toc5960_3680603316"/>
+      <w:bookmarkStart w:id="6" w:name="__RefHeading___Toc6036_1728232176"/>
       <w:bookmarkEnd w:id="6"/>
       <w:r>
         <w:rPr/>
@@ -2809,7 +2891,7 @@
         <w:pStyle w:val="Heading2"/>
         <w:rPr/>
       </w:pPr>
-      <w:bookmarkStart w:id="7" w:name="__RefHeading___Toc5962_3680603316"/>
+      <w:bookmarkStart w:id="7" w:name="__RefHeading___Toc6038_1728232176"/>
       <w:bookmarkEnd w:id="7"/>
       <w:r>
         <w:rPr/>
@@ -3223,7 +3305,7 @@
       <w:r>
         <w:br w:type="page"/>
       </w:r>
-      <w:bookmarkStart w:id="8" w:name="__RefHeading___Toc5964_3680603316"/>
+      <w:bookmarkStart w:id="8" w:name="__RefHeading___Toc6040_1728232176"/>
       <w:bookmarkEnd w:id="8"/>
       <w:r>
         <w:rPr/>
@@ -3807,7 +3889,7 @@
       <w:r>
         <w:br w:type="page"/>
       </w:r>
-      <w:bookmarkStart w:id="9" w:name="__RefHeading___Toc5966_3680603316"/>
+      <w:bookmarkStart w:id="9" w:name="__RefHeading___Toc6042_1728232176"/>
       <w:bookmarkEnd w:id="9"/>
       <w:r>
         <w:rPr/>
@@ -4041,7 +4123,7 @@
         <w:pStyle w:val="Heading2"/>
         <w:rPr/>
       </w:pPr>
-      <w:bookmarkStart w:id="10" w:name="__RefHeading___Toc5968_3680603316"/>
+      <w:bookmarkStart w:id="10" w:name="__RefHeading___Toc6044_1728232176"/>
       <w:bookmarkEnd w:id="10"/>
       <w:r>
         <w:rPr/>
@@ -4348,7 +4430,7 @@
         <w:pStyle w:val="Heading1"/>
         <w:rPr/>
       </w:pPr>
-      <w:bookmarkStart w:id="11" w:name="__RefHeading___Toc5970_3680603316"/>
+      <w:bookmarkStart w:id="11" w:name="__RefHeading___Toc6046_1728232176"/>
       <w:bookmarkEnd w:id="11"/>
       <w:r>
         <w:rPr/>
@@ -4360,7 +4442,7 @@
         <w:pStyle w:val="Heading2"/>
         <w:rPr/>
       </w:pPr>
-      <w:bookmarkStart w:id="12" w:name="__RefHeading___Toc5972_3680603316"/>
+      <w:bookmarkStart w:id="12" w:name="__RefHeading___Toc6048_1728232176"/>
       <w:bookmarkEnd w:id="12"/>
       <w:r>
         <w:rPr/>
@@ -5228,7 +5310,7 @@
         <w:pStyle w:val="Heading2"/>
         <w:rPr/>
       </w:pPr>
-      <w:bookmarkStart w:id="13" w:name="__RefHeading___Toc5974_3680603316"/>
+      <w:bookmarkStart w:id="13" w:name="__RefHeading___Toc6050_1728232176"/>
       <w:bookmarkEnd w:id="13"/>
       <w:r>
         <w:rPr/>
@@ -5406,7 +5488,7 @@
         <w:pStyle w:val="Heading2"/>
         <w:rPr/>
       </w:pPr>
-      <w:bookmarkStart w:id="14" w:name="__RefHeading___Toc5976_3680603316"/>
+      <w:bookmarkStart w:id="14" w:name="__RefHeading___Toc6052_1728232176"/>
       <w:bookmarkEnd w:id="14"/>
       <w:r>
         <w:rPr/>
@@ -5529,7 +5611,7 @@
         <w:pStyle w:val="Heading2"/>
         <w:rPr/>
       </w:pPr>
-      <w:bookmarkStart w:id="15" w:name="__RefHeading___Toc5978_3680603316"/>
+      <w:bookmarkStart w:id="15" w:name="__RefHeading___Toc6054_1728232176"/>
       <w:bookmarkEnd w:id="15"/>
       <w:r>
         <w:rPr/>
@@ -6019,7 +6101,7 @@
         <w:pStyle w:val="Heading2"/>
         <w:rPr/>
       </w:pPr>
-      <w:bookmarkStart w:id="16" w:name="__RefHeading___Toc5980_3680603316"/>
+      <w:bookmarkStart w:id="16" w:name="__RefHeading___Toc6056_1728232176"/>
       <w:bookmarkEnd w:id="16"/>
       <w:r>
         <w:rPr/>
@@ -7014,7 +7096,7 @@
         <w:pStyle w:val="Heading1"/>
         <w:rPr/>
       </w:pPr>
-      <w:bookmarkStart w:id="17" w:name="__RefHeading___Toc5982_3680603316"/>
+      <w:bookmarkStart w:id="17" w:name="__RefHeading___Toc6058_1728232176"/>
       <w:bookmarkEnd w:id="17"/>
       <w:r>
         <w:rPr/>
@@ -7026,7 +7108,7 @@
         <w:pStyle w:val="Heading2"/>
         <w:rPr/>
       </w:pPr>
-      <w:bookmarkStart w:id="18" w:name="__RefHeading___Toc5984_3680603316"/>
+      <w:bookmarkStart w:id="18" w:name="__RefHeading___Toc6060_1728232176"/>
       <w:bookmarkEnd w:id="18"/>
       <w:r>
         <w:rPr/>
@@ -7301,7 +7383,7 @@
         <w:pStyle w:val="Heading2"/>
         <w:rPr/>
       </w:pPr>
-      <w:bookmarkStart w:id="19" w:name="__RefHeading___Toc5986_3680603316"/>
+      <w:bookmarkStart w:id="19" w:name="__RefHeading___Toc6062_1728232176"/>
       <w:bookmarkEnd w:id="19"/>
       <w:r>
         <w:rPr/>
@@ -7425,7 +7507,7 @@
         <w:pStyle w:val="Heading2"/>
         <w:rPr/>
       </w:pPr>
-      <w:bookmarkStart w:id="20" w:name="__RefHeading___Toc5988_3680603316"/>
+      <w:bookmarkStart w:id="20" w:name="__RefHeading___Toc6064_1728232176"/>
       <w:bookmarkEnd w:id="20"/>
       <w:r>
         <w:rPr/>
@@ -7931,7 +8013,7 @@
       <w:r>
         <w:br w:type="page"/>
       </w:r>
-      <w:bookmarkStart w:id="21" w:name="__RefHeading___Toc5990_3680603316"/>
+      <w:bookmarkStart w:id="21" w:name="__RefHeading___Toc6066_1728232176"/>
       <w:bookmarkEnd w:id="21"/>
       <w:r>
         <w:rPr/>
@@ -7943,7 +8025,7 @@
         <w:pStyle w:val="Heading2"/>
         <w:rPr/>
       </w:pPr>
-      <w:bookmarkStart w:id="22" w:name="__RefHeading___Toc5992_3680603316"/>
+      <w:bookmarkStart w:id="22" w:name="__RefHeading___Toc6068_1728232176"/>
       <w:bookmarkEnd w:id="22"/>
       <w:r>
         <w:rPr/>
@@ -8224,7 +8306,7 @@
         <w:pStyle w:val="Heading2"/>
         <w:rPr/>
       </w:pPr>
-      <w:bookmarkStart w:id="23" w:name="__RefHeading___Toc5994_3680603316"/>
+      <w:bookmarkStart w:id="23" w:name="__RefHeading___Toc6070_1728232176"/>
       <w:bookmarkEnd w:id="23"/>
       <w:r>
         <w:rPr/>
@@ -8758,7 +8840,7 @@
         <w:pStyle w:val="Heading2"/>
         <w:rPr/>
       </w:pPr>
-      <w:bookmarkStart w:id="24" w:name="__RefHeading___Toc5996_3680603316"/>
+      <w:bookmarkStart w:id="24" w:name="__RefHeading___Toc6072_1728232176"/>
       <w:bookmarkEnd w:id="24"/>
       <w:r>
         <w:rPr/>
@@ -9274,7 +9356,7 @@
       <w:r>
         <w:br w:type="page"/>
       </w:r>
-      <w:bookmarkStart w:id="25" w:name="__RefHeading___Toc5998_3680603316"/>
+      <w:bookmarkStart w:id="25" w:name="__RefHeading___Toc6074_1728232176"/>
       <w:bookmarkEnd w:id="25"/>
       <w:r>
         <w:rPr/>
@@ -9374,7 +9456,7 @@
         <w:pStyle w:val="Heading2"/>
         <w:rPr/>
       </w:pPr>
-      <w:bookmarkStart w:id="26" w:name="__RefHeading___Toc6000_3680603316"/>
+      <w:bookmarkStart w:id="26" w:name="__RefHeading___Toc6076_1728232176"/>
       <w:bookmarkEnd w:id="26"/>
       <w:r>
         <w:rPr/>
@@ -9418,6 +9500,105 @@
           <w:b/>
           <w:bCs/>
         </w:rPr>
+        <w:t>Perfil del actor:</w:t>
+      </w:r>
+      <w:r>
+        <w:rPr/>
+        <w:t xml:space="preserve"> ficha de LulzSec Muslims (desde el 31/10/2026) con quién es, motivación declarada, objetivos en Argentina y técnicas MITRE ATT&amp;CK. Incluye el historial de ataques contra Argentina, generado desde los incidentes cargados, con el hecho clave previo y los días transcurridos; el resultado de la evaluación con la ventana del semáforo; y las limitaciones y el método de recolección.</w:t>
+      </w:r>
+    </w:p>
+    <w:p>
+      <w:pPr>
+        <w:pStyle w:val="Normal"/>
+        <w:keepNext w:val="true"/>
+        <w:spacing w:before="120" w:after="60"/>
+        <w:jc w:val="center"/>
+        <w:rPr/>
+      </w:pPr>
+      <w:r>
+        <w:rPr/>
+        <w:drawing>
+          <wp:inline distT="0" distB="0" distL="0" distR="0">
+            <wp:extent cx="5715000" cy="3362325"/>
+            <wp:effectExtent l="0" t="0" r="0" b="0"/>
+            <wp:docPr id="3" name="web_perfil_actor.png" descr="Figura 3&#10;Sección «Perfil del actor» (31/10/2026): 3 de los 4 ataques de LulzSec Muslims ocurrieron dentro de los 21 días posteriores a un hecho clave."/>
+            <wp:cNvGraphicFramePr>
+              <a:graphicFrameLocks xmlns:a="http://schemas.openxmlformats.org/drawingml/2006/main" noChangeAspect="1"/>
+            </wp:cNvGraphicFramePr>
+            <a:graphic xmlns:a="http://schemas.openxmlformats.org/drawingml/2006/main">
+              <a:graphicData uri="http://schemas.openxmlformats.org/drawingml/2006/picture">
+                <pic:pic xmlns:pic="http://schemas.openxmlformats.org/drawingml/2006/picture">
+                  <pic:nvPicPr>
+                    <pic:cNvPr id="3" name="web_perfil_actor.png" descr="Figura 3&#10;Sección «Perfil del actor» (31/10/2026): 3 de los 4 ataques de LulzSec Muslims ocurrieron dentro de los 21 días posteriores a un hecho clave."/>
+                    <pic:cNvPicPr>
+                      <a:picLocks noChangeAspect="1" noChangeArrowheads="1"/>
+                    </pic:cNvPicPr>
+                  </pic:nvPicPr>
+                  <pic:blipFill>
+                    <a:blip r:embed="rId4"/>
+                    <a:stretch>
+                      <a:fillRect/>
+                    </a:stretch>
+                  </pic:blipFill>
+                  <pic:spPr bwMode="auto">
+                    <a:xfrm>
+                      <a:off x="0" y="0"/>
+                      <a:ext cx="5715000" cy="3362325"/>
+                    </a:xfrm>
+                    <a:prstGeom prst="rect">
+                      <a:avLst/>
+                    </a:prstGeom>
+                  </pic:spPr>
+                </pic:pic>
+              </a:graphicData>
+            </a:graphic>
+          </wp:inline>
+        </w:drawing>
+      </w:r>
+    </w:p>
+    <w:p>
+      <w:pPr>
+        <w:pStyle w:val="Normal"/>
+        <w:spacing w:before="0" w:after="200"/>
+        <w:jc w:val="center"/>
+        <w:rPr/>
+      </w:pPr>
+      <w:r>
+        <w:rPr>
+          <w:b/>
+          <w:bCs/>
+          <w:color w:val="52514E"/>
+          <w:sz w:val="18"/>
+          <w:szCs w:val="18"/>
+        </w:rPr>
+        <w:t xml:space="preserve">Figura 3. </w:t>
+      </w:r>
+      <w:r>
+        <w:rPr>
+          <w:i/>
+          <w:iCs/>
+          <w:color w:val="52514E"/>
+          <w:sz w:val="18"/>
+          <w:szCs w:val="18"/>
+        </w:rPr>
+        <w:t>Sección «Perfil del actor» (31/10/2026): 3 de los 4 ataques de LulzSec Muslims ocurrieron dentro de los 21 días posteriores a un hecho clave.</w:t>
+      </w:r>
+    </w:p>
+    <w:p>
+      <w:pPr>
+        <w:pStyle w:val="ListParagraph"/>
+        <w:numPr>
+          <w:ilvl w:val="0"/>
+          <w:numId w:val="3"/>
+        </w:numPr>
+        <w:spacing w:before="0" w:after="60"/>
+        <w:rPr/>
+      </w:pPr>
+      <w:r>
+        <w:rPr>
+          <w:b/>
+          <w:bCs/>
+        </w:rPr>
         <w:t>Línea de tiempo:</w:t>
       </w:r>
       <w:r>
@@ -9538,7 +9719,7 @@
           <wp:inline distT="0" distB="0" distL="0" distR="0">
             <wp:extent cx="4953000" cy="6429375"/>
             <wp:effectExtent l="0" t="0" r="0" b="0"/>
-            <wp:docPr id="3" name="web_historico.png" descr="Figura 3&#10;Modo histórico del caso de estudio con los 8 hechos clave. Todavía sin ataques cargados: 6 alertas amarillas y ninguna roja."/>
+            <wp:docPr id="4" name="web_historico.png" descr="Figura 4&#10;Modo histórico del caso de estudio con los 8 hechos clave. Todavía sin ataques cargados: 6 alertas amarillas y ninguna roja."/>
             <wp:cNvGraphicFramePr>
               <a:graphicFrameLocks xmlns:a="http://schemas.openxmlformats.org/drawingml/2006/main" noChangeAspect="1"/>
             </wp:cNvGraphicFramePr>
@@ -9546,13 +9727,13 @@
               <a:graphicData uri="http://schemas.openxmlformats.org/drawingml/2006/picture">
                 <pic:pic xmlns:pic="http://schemas.openxmlformats.org/drawingml/2006/picture">
                   <pic:nvPicPr>
-                    <pic:cNvPr id="3" name="web_historico.png" descr="Figura 3&#10;Modo histórico del caso de estudio con los 8 hechos clave. Todavía sin ataques cargados: 6 alertas amarillas y ninguna roja."/>
+                    <pic:cNvPr id="4" name="web_historico.png" descr="Figura 4&#10;Modo histórico del caso de estudio con los 8 hechos clave. Todavía sin ataques cargados: 6 alertas amarillas y ninguna roja."/>
                     <pic:cNvPicPr>
                       <a:picLocks noChangeAspect="1" noChangeArrowheads="1"/>
                     </pic:cNvPicPr>
                   </pic:nvPicPr>
                   <pic:blipFill>
-                    <a:blip r:embed="rId4"/>
+                    <a:blip r:embed="rId5"/>
                     <a:stretch>
                       <a:fillRect/>
                     </a:stretch>
@@ -9588,7 +9769,7 @@
           <w:sz w:val="18"/>
           <w:szCs w:val="18"/>
         </w:rPr>
-        <w:t xml:space="preserve">Figura 3. </w:t>
+        <w:t xml:space="preserve">Figura 4. </w:t>
       </w:r>
       <w:r>
         <w:rPr>
@@ -9615,7 +9796,7 @@
           <wp:inline distT="0" distB="0" distL="0" distR="0">
             <wp:extent cx="5715000" cy="600075"/>
             <wp:effectExtent l="0" t="0" r="0" b="0"/>
-            <wp:docPr id="4" name="web_alertas_info.png" descr="Figura 4&#10;Alerta informativa real detectada automáticamente: el ciberataque a la Asociación del Fútbol Argentino (fuente: WeLiveSecurity)."/>
+            <wp:docPr id="5" name="web_alertas_info.png" descr="Figura 5&#10;Alerta informativa real detectada automáticamente: el ciberataque a la Asociación del Fútbol Argentino (fuente: WeLiveSecurity)."/>
             <wp:cNvGraphicFramePr>
               <a:graphicFrameLocks xmlns:a="http://schemas.openxmlformats.org/drawingml/2006/main" noChangeAspect="1"/>
             </wp:cNvGraphicFramePr>
@@ -9623,13 +9804,13 @@
               <a:graphicData uri="http://schemas.openxmlformats.org/drawingml/2006/picture">
                 <pic:pic xmlns:pic="http://schemas.openxmlformats.org/drawingml/2006/picture">
                   <pic:nvPicPr>
-                    <pic:cNvPr id="4" name="web_alertas_info.png" descr="Figura 4&#10;Alerta informativa real detectada automáticamente: el ciberataque a la Asociación del Fútbol Argentino (fuente: WeLiveSecurity)."/>
+                    <pic:cNvPr id="5" name="web_alertas_info.png" descr="Figura 5&#10;Alerta informativa real detectada automáticamente: el ciberataque a la Asociación del Fútbol Argentino (fuente: WeLiveSecurity)."/>
                     <pic:cNvPicPr>
                       <a:picLocks noChangeAspect="1" noChangeArrowheads="1"/>
                     </pic:cNvPicPr>
                   </pic:nvPicPr>
                   <pic:blipFill>
-                    <a:blip r:embed="rId5"/>
+                    <a:blip r:embed="rId6"/>
                     <a:stretch>
                       <a:fillRect/>
                     </a:stretch>
@@ -9665,7 +9846,7 @@
           <w:sz w:val="18"/>
           <w:szCs w:val="18"/>
         </w:rPr>
-        <w:t xml:space="preserve">Figura 4. </w:t>
+        <w:t xml:space="preserve">Figura 5. </w:t>
       </w:r>
       <w:r>
         <w:rPr>
@@ -9692,7 +9873,7 @@
           <wp:inline distT="0" distB="0" distL="0" distR="0">
             <wp:extent cx="5715000" cy="3886200"/>
             <wp:effectExtent l="0" t="0" r="0" b="0"/>
-            <wp:docPr id="5" name="web_fuentes.png" descr="Figura 5&#10;Diagnóstico de fuentes de la última revisión y explicación de la metodología, visibles en la propia página."/>
+            <wp:docPr id="6" name="web_fuentes.png" descr="Figura 6&#10;Diagnóstico de fuentes de la última revisión y explicación de la metodología, visibles en la propia página."/>
             <wp:cNvGraphicFramePr>
               <a:graphicFrameLocks xmlns:a="http://schemas.openxmlformats.org/drawingml/2006/main" noChangeAspect="1"/>
             </wp:cNvGraphicFramePr>
@@ -9700,13 +9881,13 @@
               <a:graphicData uri="http://schemas.openxmlformats.org/drawingml/2006/picture">
                 <pic:pic xmlns:pic="http://schemas.openxmlformats.org/drawingml/2006/picture">
                   <pic:nvPicPr>
-                    <pic:cNvPr id="5" name="web_fuentes.png" descr="Figura 5&#10;Diagnóstico de fuentes de la última revisión y explicación de la metodología, visibles en la propia página."/>
+                    <pic:cNvPr id="6" name="web_fuentes.png" descr="Figura 6&#10;Diagnóstico de fuentes de la última revisión y explicación de la metodología, visibles en la propia página."/>
                     <pic:cNvPicPr>
                       <a:picLocks noChangeAspect="1" noChangeArrowheads="1"/>
                     </pic:cNvPicPr>
                   </pic:nvPicPr>
                   <pic:blipFill>
-                    <a:blip r:embed="rId6"/>
+                    <a:blip r:embed="rId7"/>
                     <a:stretch>
                       <a:fillRect/>
                     </a:stretch>
@@ -9742,7 +9923,7 @@
           <w:sz w:val="18"/>
           <w:szCs w:val="18"/>
         </w:rPr>
-        <w:t xml:space="preserve">Figura 5. </w:t>
+        <w:t xml:space="preserve">Figura 6. </w:t>
       </w:r>
       <w:r>
         <w:rPr>
@@ -9769,7 +9950,7 @@
           <wp:inline distT="0" distB="0" distL="0" distR="0">
             <wp:extent cx="2476500" cy="5362575"/>
             <wp:effectExtent l="0" t="0" r="0" b="0"/>
-            <wp:docPr id="6" name="web_movil.png" descr="Figura 6&#10;Vista en celular."/>
+            <wp:docPr id="7" name="web_movil.png" descr="Figura 7&#10;Vista en celular."/>
             <wp:cNvGraphicFramePr>
               <a:graphicFrameLocks xmlns:a="http://schemas.openxmlformats.org/drawingml/2006/main" noChangeAspect="1"/>
             </wp:cNvGraphicFramePr>
@@ -9777,13 +9958,13 @@
               <a:graphicData uri="http://schemas.openxmlformats.org/drawingml/2006/picture">
                 <pic:pic xmlns:pic="http://schemas.openxmlformats.org/drawingml/2006/picture">
                   <pic:nvPicPr>
-                    <pic:cNvPr id="6" name="web_movil.png" descr="Figura 6&#10;Vista en celular."/>
+                    <pic:cNvPr id="7" name="web_movil.png" descr="Figura 7&#10;Vista en celular."/>
                     <pic:cNvPicPr>
                       <a:picLocks noChangeAspect="1" noChangeArrowheads="1"/>
                     </pic:cNvPicPr>
                   </pic:nvPicPr>
                   <pic:blipFill>
-                    <a:blip r:embed="rId7"/>
+                    <a:blip r:embed="rId8"/>
                     <a:stretch>
                       <a:fillRect/>
                     </a:stretch>
@@ -9819,7 +10000,7 @@
           <w:sz w:val="18"/>
           <w:szCs w:val="18"/>
         </w:rPr>
-        <w:t xml:space="preserve">Figura 6. </w:t>
+        <w:t xml:space="preserve">Figura 7. </w:t>
       </w:r>
       <w:r>
         <w:rPr>
@@ -9840,7 +10021,7 @@
         <w:pStyle w:val="Heading1"/>
         <w:rPr/>
       </w:pPr>
-      <w:bookmarkStart w:id="27" w:name="__RefHeading___Toc6002_3680603316"/>
+      <w:bookmarkStart w:id="27" w:name="__RefHeading___Toc6078_1728232176"/>
       <w:bookmarkEnd w:id="27"/>
       <w:r>
         <w:rPr/>
@@ -9852,7 +10033,7 @@
         <w:pStyle w:val="Heading2"/>
         <w:rPr/>
       </w:pPr>
-      <w:bookmarkStart w:id="28" w:name="__RefHeading___Toc6004_3680603316"/>
+      <w:bookmarkStart w:id="28" w:name="__RefHeading___Toc6080_1728232176"/>
       <w:bookmarkEnd w:id="28"/>
       <w:r>
         <w:rPr/>
@@ -10209,7 +10390,7 @@
         <w:pStyle w:val="Heading2"/>
         <w:rPr/>
       </w:pPr>
-      <w:bookmarkStart w:id="29" w:name="__RefHeading___Toc6006_3680603316"/>
+      <w:bookmarkStart w:id="29" w:name="__RefHeading___Toc6082_1728232176"/>
       <w:bookmarkEnd w:id="29"/>
       <w:r>
         <w:rPr/>
@@ -10352,7 +10533,7 @@
           <wp:inline distT="0" distB="0" distL="0" distR="0">
             <wp:extent cx="5715000" cy="2809875"/>
             <wp:effectExtent l="0" t="0" r="0" b="0"/>
-            <wp:docPr id="7" name="github_pages_origen.png" descr="Figura 7&#10;Configuración de GitHub Pages antes del cambio (origen «Deploy from a branch»)."/>
+            <wp:docPr id="8" name="github_pages_origen.png" descr="Figura 8&#10;Configuración de GitHub Pages antes del cambio (origen «Deploy from a branch»)."/>
             <wp:cNvGraphicFramePr>
               <a:graphicFrameLocks xmlns:a="http://schemas.openxmlformats.org/drawingml/2006/main" noChangeAspect="1"/>
             </wp:cNvGraphicFramePr>
@@ -10360,13 +10541,13 @@
               <a:graphicData uri="http://schemas.openxmlformats.org/drawingml/2006/picture">
                 <pic:pic xmlns:pic="http://schemas.openxmlformats.org/drawingml/2006/picture">
                   <pic:nvPicPr>
-                    <pic:cNvPr id="7" name="github_pages_origen.png" descr="Figura 7&#10;Configuración de GitHub Pages antes del cambio (origen «Deploy from a branch»)."/>
+                    <pic:cNvPr id="8" name="github_pages_origen.png" descr="Figura 8&#10;Configuración de GitHub Pages antes del cambio (origen «Deploy from a branch»)."/>
                     <pic:cNvPicPr>
                       <a:picLocks noChangeAspect="1" noChangeArrowheads="1"/>
                     </pic:cNvPicPr>
                   </pic:nvPicPr>
                   <pic:blipFill>
-                    <a:blip r:embed="rId8"/>
+                    <a:blip r:embed="rId9"/>
                     <a:stretch>
                       <a:fillRect/>
                     </a:stretch>
@@ -10402,7 +10583,7 @@
           <w:sz w:val="18"/>
           <w:szCs w:val="18"/>
         </w:rPr>
-        <w:t xml:space="preserve">Figura 7. </w:t>
+        <w:t xml:space="preserve">Figura 8. </w:t>
       </w:r>
       <w:r>
         <w:rPr>
@@ -10429,7 +10610,7 @@
           <wp:inline distT="0" distB="0" distL="0" distR="0">
             <wp:extent cx="5715000" cy="1419225"/>
             <wp:effectExtent l="0" t="0" r="0" b="0"/>
-            <wp:docPr id="8" name="github_pages_menu.png" descr="Figura 8&#10;Selección del origen «GitHub Actions» para GitHub Pages."/>
+            <wp:docPr id="9" name="github_pages_menu.png" descr="Figura 9&#10;Selección del origen «GitHub Actions» para GitHub Pages."/>
             <wp:cNvGraphicFramePr>
               <a:graphicFrameLocks xmlns:a="http://schemas.openxmlformats.org/drawingml/2006/main" noChangeAspect="1"/>
             </wp:cNvGraphicFramePr>
@@ -10437,13 +10618,13 @@
               <a:graphicData uri="http://schemas.openxmlformats.org/drawingml/2006/picture">
                 <pic:pic xmlns:pic="http://schemas.openxmlformats.org/drawingml/2006/picture">
                   <pic:nvPicPr>
-                    <pic:cNvPr id="8" name="github_pages_menu.png" descr="Figura 8&#10;Selección del origen «GitHub Actions» para GitHub Pages."/>
+                    <pic:cNvPr id="9" name="github_pages_menu.png" descr="Figura 9&#10;Selección del origen «GitHub Actions» para GitHub Pages."/>
                     <pic:cNvPicPr>
                       <a:picLocks noChangeAspect="1" noChangeArrowheads="1"/>
                     </pic:cNvPicPr>
                   </pic:nvPicPr>
                   <pic:blipFill>
-                    <a:blip r:embed="rId9"/>
+                    <a:blip r:embed="rId10"/>
                     <a:stretch>
                       <a:fillRect/>
                     </a:stretch>
@@ -10479,7 +10660,7 @@
           <w:sz w:val="18"/>
           <w:szCs w:val="18"/>
         </w:rPr>
-        <w:t xml:space="preserve">Figura 8. </w:t>
+        <w:t xml:space="preserve">Figura 9. </w:t>
       </w:r>
       <w:r>
         <w:rPr>
@@ -10497,7 +10678,7 @@
         <w:pStyle w:val="Heading2"/>
         <w:rPr/>
       </w:pPr>
-      <w:bookmarkStart w:id="30" w:name="__RefHeading___Toc6008_3680603316"/>
+      <w:bookmarkStart w:id="30" w:name="__RefHeading___Toc6084_1728232176"/>
       <w:bookmarkEnd w:id="30"/>
       <w:r>
         <w:rPr/>
@@ -10552,7 +10733,7 @@
           <wp:inline distT="0" distB="0" distL="0" distR="0">
             <wp:extent cx="5715000" cy="2562225"/>
             <wp:effectExtent l="0" t="0" r="0" b="0"/>
-            <wp:docPr id="9" name="pull_request.png" descr="Figura 9&#10;Pull Request #1 en GitHub (interfaz traducida automáticamente al español por el navegador)."/>
+            <wp:docPr id="10" name="pull_request.png" descr="Figura 10&#10;Pull Request #1 en GitHub (interfaz traducida automáticamente al español por el navegador)."/>
             <wp:cNvGraphicFramePr>
               <a:graphicFrameLocks xmlns:a="http://schemas.openxmlformats.org/drawingml/2006/main" noChangeAspect="1"/>
             </wp:cNvGraphicFramePr>
@@ -10560,13 +10741,13 @@
               <a:graphicData uri="http://schemas.openxmlformats.org/drawingml/2006/picture">
                 <pic:pic xmlns:pic="http://schemas.openxmlformats.org/drawingml/2006/picture">
                   <pic:nvPicPr>
-                    <pic:cNvPr id="9" name="pull_request.png" descr="Figura 9&#10;Pull Request #1 en GitHub (interfaz traducida automáticamente al español por el navegador)."/>
+                    <pic:cNvPr id="10" name="pull_request.png" descr="Figura 10&#10;Pull Request #1 en GitHub (interfaz traducida automáticamente al español por el navegador)."/>
                     <pic:cNvPicPr>
                       <a:picLocks noChangeAspect="1" noChangeArrowheads="1"/>
                     </pic:cNvPicPr>
                   </pic:nvPicPr>
                   <pic:blipFill>
-                    <a:blip r:embed="rId10"/>
+                    <a:blip r:embed="rId11"/>
                     <a:stretch>
                       <a:fillRect/>
                     </a:stretch>
@@ -10602,7 +10783,7 @@
           <w:sz w:val="18"/>
           <w:szCs w:val="18"/>
         </w:rPr>
-        <w:t xml:space="preserve">Figura 9. </w:t>
+        <w:t xml:space="preserve">Figura 10. </w:t>
       </w:r>
       <w:r>
         <w:rPr>
@@ -10629,7 +10810,7 @@
           <wp:inline distT="0" distB="0" distL="0" distR="0">
             <wp:extent cx="5715000" cy="2952750"/>
             <wp:effectExtent l="0" t="0" r="0" b="0"/>
-            <wp:docPr id="10" name="pull_request_fusion.png" descr="Figura 10&#10;Fusión del Pull Request: se mantiene la opción «Crear una confirmación de fusión»."/>
+            <wp:docPr id="11" name="pull_request_fusion.png" descr="Figura 11&#10;Fusión del Pull Request: se mantiene la opción «Crear una confirmación de fusión»."/>
             <wp:cNvGraphicFramePr>
               <a:graphicFrameLocks xmlns:a="http://schemas.openxmlformats.org/drawingml/2006/main" noChangeAspect="1"/>
             </wp:cNvGraphicFramePr>
@@ -10637,13 +10818,13 @@
               <a:graphicData uri="http://schemas.openxmlformats.org/drawingml/2006/picture">
                 <pic:pic xmlns:pic="http://schemas.openxmlformats.org/drawingml/2006/picture">
                   <pic:nvPicPr>
-                    <pic:cNvPr id="10" name="pull_request_fusion.png" descr="Figura 10&#10;Fusión del Pull Request: se mantiene la opción «Crear una confirmación de fusión»."/>
+                    <pic:cNvPr id="11" name="pull_request_fusion.png" descr="Figura 11&#10;Fusión del Pull Request: se mantiene la opción «Crear una confirmación de fusión»."/>
                     <pic:cNvPicPr>
                       <a:picLocks noChangeAspect="1" noChangeArrowheads="1"/>
                     </pic:cNvPicPr>
                   </pic:nvPicPr>
                   <pic:blipFill>
-                    <a:blip r:embed="rId11"/>
+                    <a:blip r:embed="rId12"/>
                     <a:stretch>
                       <a:fillRect/>
                     </a:stretch>
@@ -10679,7 +10860,7 @@
           <w:sz w:val="18"/>
           <w:szCs w:val="18"/>
         </w:rPr>
-        <w:t xml:space="preserve">Figura 10. </w:t>
+        <w:t xml:space="preserve">Figura 11. </w:t>
       </w:r>
       <w:r>
         <w:rPr>
@@ -10700,7 +10881,7 @@
         <w:pStyle w:val="Heading1"/>
         <w:rPr/>
       </w:pPr>
-      <w:bookmarkStart w:id="31" w:name="__RefHeading___Toc6010_3680603316"/>
+      <w:bookmarkStart w:id="31" w:name="__RefHeading___Toc6086_1728232176"/>
       <w:bookmarkEnd w:id="31"/>
       <w:r>
         <w:rPr/>
@@ -10712,7 +10893,7 @@
         <w:pStyle w:val="Heading2"/>
         <w:rPr/>
       </w:pPr>
-      <w:bookmarkStart w:id="32" w:name="__RefHeading___Toc6012_3680603316"/>
+      <w:bookmarkStart w:id="32" w:name="__RefHeading___Toc6088_1728232176"/>
       <w:bookmarkEnd w:id="32"/>
       <w:r>
         <w:rPr/>
@@ -11676,7 +11857,7 @@
         <w:pStyle w:val="Heading2"/>
         <w:rPr/>
       </w:pPr>
-      <w:bookmarkStart w:id="33" w:name="__RefHeading___Toc6014_3680603316"/>
+      <w:bookmarkStart w:id="33" w:name="__RefHeading___Toc6090_1728232176"/>
       <w:bookmarkEnd w:id="33"/>
       <w:r>
         <w:rPr/>
@@ -12270,7 +12451,7 @@
       <w:r>
         <w:br w:type="page"/>
       </w:r>
-      <w:bookmarkStart w:id="34" w:name="__RefHeading___Toc6016_3680603316"/>
+      <w:bookmarkStart w:id="34" w:name="__RefHeading___Toc6092_1728232176"/>
       <w:bookmarkEnd w:id="34"/>
       <w:r>
         <w:rPr/>
@@ -13098,7 +13279,7 @@
       <w:r>
         <w:br w:type="page"/>
       </w:r>
-      <w:bookmarkStart w:id="35" w:name="__RefHeading___Toc6018_3680603316"/>
+      <w:bookmarkStart w:id="35" w:name="__RefHeading___Toc6094_1728232176"/>
       <w:bookmarkEnd w:id="35"/>
       <w:r>
         <w:rPr/>
@@ -15431,7 +15612,7 @@
       <w:r>
         <w:br w:type="page"/>
       </w:r>
-      <w:bookmarkStart w:id="36" w:name="__RefHeading___Toc6020_3680603316"/>
+      <w:bookmarkStart w:id="36" w:name="__RefHeading___Toc6096_1728232176"/>
       <w:bookmarkEnd w:id="36"/>
       <w:r>
         <w:rPr/>
@@ -15443,7 +15624,7 @@
         <w:pStyle w:val="Heading2"/>
         <w:rPr/>
       </w:pPr>
-      <w:bookmarkStart w:id="37" w:name="__RefHeading___Toc6022_3680603316"/>
+      <w:bookmarkStart w:id="37" w:name="__RefHeading___Toc6098_1728232176"/>
       <w:bookmarkEnd w:id="37"/>
       <w:r>
         <w:rPr/>
@@ -15519,7 +15700,7 @@
         <w:pStyle w:val="Heading2"/>
         <w:rPr/>
       </w:pPr>
-      <w:bookmarkStart w:id="38" w:name="__RefHeading___Toc6024_3680603316"/>
+      <w:bookmarkStart w:id="38" w:name="__RefHeading___Toc6100_1728232176"/>
       <w:bookmarkEnd w:id="38"/>
       <w:r>
         <w:rPr/>
@@ -15704,7 +15885,7 @@
         <w:pStyle w:val="Heading2"/>
         <w:rPr/>
       </w:pPr>
-      <w:bookmarkStart w:id="39" w:name="__RefHeading___Toc6026_3680603316"/>
+      <w:bookmarkStart w:id="39" w:name="__RefHeading___Toc6102_1728232176"/>
       <w:bookmarkEnd w:id="39"/>
       <w:r>
         <w:rPr/>
@@ -15785,7 +15966,7 @@
         <w:pStyle w:val="Heading1"/>
         <w:rPr/>
       </w:pPr>
-      <w:bookmarkStart w:id="40" w:name="__RefHeading___Toc6028_3680603316"/>
+      <w:bookmarkStart w:id="40" w:name="__RefHeading___Toc6104_1728232176"/>
       <w:bookmarkEnd w:id="40"/>
       <w:r>
         <w:rPr/>
@@ -15797,7 +15978,7 @@
         <w:pStyle w:val="Heading2"/>
         <w:rPr/>
       </w:pPr>
-      <w:bookmarkStart w:id="41" w:name="__RefHeading___Toc6030_3680603316"/>
+      <w:bookmarkStart w:id="41" w:name="__RefHeading___Toc6106_1728232176"/>
       <w:bookmarkEnd w:id="41"/>
       <w:r>
         <w:rPr/>
@@ -15820,7 +16001,7 @@
         <w:pStyle w:val="Heading2"/>
         <w:rPr/>
       </w:pPr>
-      <w:bookmarkStart w:id="42" w:name="__RefHeading___Toc6032_3680603316"/>
+      <w:bookmarkStart w:id="42" w:name="__RefHeading___Toc6108_1728232176"/>
       <w:bookmarkEnd w:id="42"/>
       <w:r>
         <w:rPr/>
@@ -15932,7 +16113,7 @@
         <w:pStyle w:val="Heading2"/>
         <w:rPr/>
       </w:pPr>
-      <w:bookmarkStart w:id="43" w:name="__RefHeading___Toc6034_3680603316"/>
+      <w:bookmarkStart w:id="43" w:name="__RefHeading___Toc6110_1728232176"/>
       <w:bookmarkEnd w:id="43"/>
       <w:r>
         <w:rPr/>
@@ -18212,7 +18393,7 @@
         <w:pStyle w:val="Heading2"/>
         <w:rPr/>
       </w:pPr>
-      <w:bookmarkStart w:id="44" w:name="__RefHeading___Toc6036_3680603316"/>
+      <w:bookmarkStart w:id="44" w:name="__RefHeading___Toc6112_1728232176"/>
       <w:bookmarkEnd w:id="44"/>
       <w:r>
         <w:rPr/>
@@ -18335,7 +18516,7 @@
         <w:pStyle w:val="Heading2"/>
         <w:rPr/>
       </w:pPr>
-      <w:bookmarkStart w:id="45" w:name="__RefHeading___Toc6038_3680603316"/>
+      <w:bookmarkStart w:id="45" w:name="__RefHeading___Toc6114_1728232176"/>
       <w:bookmarkEnd w:id="45"/>
       <w:r>
         <w:rPr/>
@@ -18357,7 +18538,7 @@
           <w:b/>
           <w:bCs/>
         </w:rPr>
-        <w:t>269 hechos clave</w:t>
+        <w:t>275 hechos clave</w:t>
       </w:r>
       <w:r>
         <w:rPr/>
@@ -38464,6 +38645,450 @@
                 <w:szCs w:val="19"/>
               </w:rPr>
               <w:t>Milei en el aniversario de la DAIA :  Mientras otros gobiernos pactaban con Irán , nosotros pactamos con Israel</w:t>
+            </w:r>
+          </w:p>
+        </w:tc>
+        <w:tc>
+          <w:tcPr>
+            <w:tcW w:w="1301" w:type="dxa"/>
+            <w:tcBorders>
+              <w:top w:val="single" w:sz="4" w:space="0" w:color="BFBFBF"/>
+              <w:left w:val="single" w:sz="4" w:space="0" w:color="BFBFBF"/>
+              <w:bottom w:val="single" w:sz="4" w:space="0" w:color="BFBFBF"/>
+              <w:right w:val="single" w:sz="4" w:space="0" w:color="BFBFBF"/>
+            </w:tcBorders>
+          </w:tcPr>
+          <w:p>
+            <w:pPr>
+              <w:pStyle w:val="Normal"/>
+              <w:spacing w:before="0" w:after="20"/>
+              <w:rPr/>
+            </w:pPr>
+            <w:r>
+              <w:rPr/>
+            </w:r>
+          </w:p>
+        </w:tc>
+      </w:tr>
+      <w:tr>
+        <w:trPr/>
+        <w:tc>
+          <w:tcPr>
+            <w:tcW w:w="1300" w:type="dxa"/>
+            <w:tcBorders>
+              <w:top w:val="single" w:sz="4" w:space="0" w:color="BFBFBF"/>
+              <w:left w:val="single" w:sz="4" w:space="0" w:color="BFBFBF"/>
+              <w:bottom w:val="single" w:sz="4" w:space="0" w:color="BFBFBF"/>
+              <w:right w:val="single" w:sz="4" w:space="0" w:color="BFBFBF"/>
+            </w:tcBorders>
+          </w:tcPr>
+          <w:p>
+            <w:pPr>
+              <w:pStyle w:val="Normal"/>
+              <w:spacing w:before="0" w:after="20"/>
+              <w:rPr/>
+            </w:pPr>
+            <w:r>
+              <w:rPr>
+                <w:sz w:val="19"/>
+                <w:szCs w:val="19"/>
+              </w:rPr>
+              <w:t>2025-12-31</w:t>
+            </w:r>
+          </w:p>
+        </w:tc>
+        <w:tc>
+          <w:tcPr>
+            <w:tcW w:w="7037" w:type="dxa"/>
+            <w:tcBorders>
+              <w:top w:val="single" w:sz="4" w:space="0" w:color="BFBFBF"/>
+              <w:left w:val="single" w:sz="4" w:space="0" w:color="BFBFBF"/>
+              <w:bottom w:val="single" w:sz="4" w:space="0" w:color="BFBFBF"/>
+              <w:right w:val="single" w:sz="4" w:space="0" w:color="BFBFBF"/>
+            </w:tcBorders>
+          </w:tcPr>
+          <w:p>
+            <w:pPr>
+              <w:pStyle w:val="Normal"/>
+              <w:spacing w:before="0" w:after="20"/>
+              <w:rPr/>
+            </w:pPr>
+            <w:r>
+              <w:rPr>
+                <w:sz w:val="19"/>
+                <w:szCs w:val="19"/>
+              </w:rPr>
+              <w:t>Ahmad Vahidi , implicado en el atentado a la AMIA , fue nombrado comandante adjunto de la Guardia Revolucionaria de Irán</w:t>
+            </w:r>
+          </w:p>
+        </w:tc>
+        <w:tc>
+          <w:tcPr>
+            <w:tcW w:w="1301" w:type="dxa"/>
+            <w:tcBorders>
+              <w:top w:val="single" w:sz="4" w:space="0" w:color="BFBFBF"/>
+              <w:left w:val="single" w:sz="4" w:space="0" w:color="BFBFBF"/>
+              <w:bottom w:val="single" w:sz="4" w:space="0" w:color="BFBFBF"/>
+              <w:right w:val="single" w:sz="4" w:space="0" w:color="BFBFBF"/>
+            </w:tcBorders>
+          </w:tcPr>
+          <w:p>
+            <w:pPr>
+              <w:pStyle w:val="Normal"/>
+              <w:spacing w:before="0" w:after="20"/>
+              <w:rPr/>
+            </w:pPr>
+            <w:r>
+              <w:rPr/>
+            </w:r>
+          </w:p>
+        </w:tc>
+      </w:tr>
+      <w:tr>
+        <w:trPr/>
+        <w:tc>
+          <w:tcPr>
+            <w:tcW w:w="1300" w:type="dxa"/>
+            <w:tcBorders>
+              <w:top w:val="single" w:sz="4" w:space="0" w:color="BFBFBF"/>
+              <w:left w:val="single" w:sz="4" w:space="0" w:color="BFBFBF"/>
+              <w:bottom w:val="single" w:sz="4" w:space="0" w:color="BFBFBF"/>
+              <w:right w:val="single" w:sz="4" w:space="0" w:color="BFBFBF"/>
+            </w:tcBorders>
+          </w:tcPr>
+          <w:p>
+            <w:pPr>
+              <w:pStyle w:val="Normal"/>
+              <w:spacing w:before="0" w:after="20"/>
+              <w:rPr/>
+            </w:pPr>
+            <w:r>
+              <w:rPr>
+                <w:sz w:val="19"/>
+                <w:szCs w:val="19"/>
+              </w:rPr>
+              <w:t>2026-01-02</w:t>
+            </w:r>
+          </w:p>
+        </w:tc>
+        <w:tc>
+          <w:tcPr>
+            <w:tcW w:w="7037" w:type="dxa"/>
+            <w:tcBorders>
+              <w:top w:val="single" w:sz="4" w:space="0" w:color="BFBFBF"/>
+              <w:left w:val="single" w:sz="4" w:space="0" w:color="BFBFBF"/>
+              <w:bottom w:val="single" w:sz="4" w:space="0" w:color="BFBFBF"/>
+              <w:right w:val="single" w:sz="4" w:space="0" w:color="BFBFBF"/>
+            </w:tcBorders>
+          </w:tcPr>
+          <w:p>
+            <w:pPr>
+              <w:pStyle w:val="Normal"/>
+              <w:spacing w:before="0" w:after="20"/>
+              <w:rPr/>
+            </w:pPr>
+            <w:r>
+              <w:rPr>
+                <w:sz w:val="19"/>
+                <w:szCs w:val="19"/>
+              </w:rPr>
+              <w:t>El Gobierno argentino recomendó no viajar a Irán por la crisis en el país</w:t>
+            </w:r>
+          </w:p>
+        </w:tc>
+        <w:tc>
+          <w:tcPr>
+            <w:tcW w:w="1301" w:type="dxa"/>
+            <w:tcBorders>
+              <w:top w:val="single" w:sz="4" w:space="0" w:color="BFBFBF"/>
+              <w:left w:val="single" w:sz="4" w:space="0" w:color="BFBFBF"/>
+              <w:bottom w:val="single" w:sz="4" w:space="0" w:color="BFBFBF"/>
+              <w:right w:val="single" w:sz="4" w:space="0" w:color="BFBFBF"/>
+            </w:tcBorders>
+          </w:tcPr>
+          <w:p>
+            <w:pPr>
+              <w:pStyle w:val="Normal"/>
+              <w:spacing w:before="0" w:after="20"/>
+              <w:rPr/>
+            </w:pPr>
+            <w:r>
+              <w:rPr/>
+            </w:r>
+          </w:p>
+        </w:tc>
+      </w:tr>
+      <w:tr>
+        <w:trPr/>
+        <w:tc>
+          <w:tcPr>
+            <w:tcW w:w="1300" w:type="dxa"/>
+            <w:tcBorders>
+              <w:top w:val="single" w:sz="4" w:space="0" w:color="BFBFBF"/>
+              <w:left w:val="single" w:sz="4" w:space="0" w:color="BFBFBF"/>
+              <w:bottom w:val="single" w:sz="4" w:space="0" w:color="BFBFBF"/>
+              <w:right w:val="single" w:sz="4" w:space="0" w:color="BFBFBF"/>
+            </w:tcBorders>
+          </w:tcPr>
+          <w:p>
+            <w:pPr>
+              <w:pStyle w:val="Normal"/>
+              <w:spacing w:before="0" w:after="20"/>
+              <w:rPr/>
+            </w:pPr>
+            <w:r>
+              <w:rPr>
+                <w:sz w:val="19"/>
+                <w:szCs w:val="19"/>
+              </w:rPr>
+              <w:t>2026-01-03</w:t>
+            </w:r>
+          </w:p>
+        </w:tc>
+        <w:tc>
+          <w:tcPr>
+            <w:tcW w:w="7037" w:type="dxa"/>
+            <w:tcBorders>
+              <w:top w:val="single" w:sz="4" w:space="0" w:color="BFBFBF"/>
+              <w:left w:val="single" w:sz="4" w:space="0" w:color="BFBFBF"/>
+              <w:bottom w:val="single" w:sz="4" w:space="0" w:color="BFBFBF"/>
+              <w:right w:val="single" w:sz="4" w:space="0" w:color="BFBFBF"/>
+            </w:tcBorders>
+          </w:tcPr>
+          <w:p>
+            <w:pPr>
+              <w:pStyle w:val="Normal"/>
+              <w:spacing w:before="0" w:after="20"/>
+              <w:rPr/>
+            </w:pPr>
+            <w:r>
+              <w:rPr>
+                <w:sz w:val="19"/>
+                <w:szCs w:val="19"/>
+              </w:rPr>
+              <w:t>Venezuela : Iran And Russia Condemn  unlawful U . S . Aggression , Milei Hails Forward March Of Liberty</w:t>
+            </w:r>
+          </w:p>
+        </w:tc>
+        <w:tc>
+          <w:tcPr>
+            <w:tcW w:w="1301" w:type="dxa"/>
+            <w:tcBorders>
+              <w:top w:val="single" w:sz="4" w:space="0" w:color="BFBFBF"/>
+              <w:left w:val="single" w:sz="4" w:space="0" w:color="BFBFBF"/>
+              <w:bottom w:val="single" w:sz="4" w:space="0" w:color="BFBFBF"/>
+              <w:right w:val="single" w:sz="4" w:space="0" w:color="BFBFBF"/>
+            </w:tcBorders>
+          </w:tcPr>
+          <w:p>
+            <w:pPr>
+              <w:pStyle w:val="Normal"/>
+              <w:spacing w:before="0" w:after="20"/>
+              <w:rPr/>
+            </w:pPr>
+            <w:r>
+              <w:rPr/>
+            </w:r>
+          </w:p>
+        </w:tc>
+      </w:tr>
+      <w:tr>
+        <w:trPr/>
+        <w:tc>
+          <w:tcPr>
+            <w:tcW w:w="1300" w:type="dxa"/>
+            <w:tcBorders>
+              <w:top w:val="single" w:sz="4" w:space="0" w:color="BFBFBF"/>
+              <w:left w:val="single" w:sz="4" w:space="0" w:color="BFBFBF"/>
+              <w:bottom w:val="single" w:sz="4" w:space="0" w:color="BFBFBF"/>
+              <w:right w:val="single" w:sz="4" w:space="0" w:color="BFBFBF"/>
+            </w:tcBorders>
+          </w:tcPr>
+          <w:p>
+            <w:pPr>
+              <w:pStyle w:val="Normal"/>
+              <w:spacing w:before="0" w:after="20"/>
+              <w:rPr/>
+            </w:pPr>
+            <w:r>
+              <w:rPr>
+                <w:sz w:val="19"/>
+                <w:szCs w:val="19"/>
+              </w:rPr>
+              <w:t>2026-01-18</w:t>
+            </w:r>
+          </w:p>
+        </w:tc>
+        <w:tc>
+          <w:tcPr>
+            <w:tcW w:w="7037" w:type="dxa"/>
+            <w:tcBorders>
+              <w:top w:val="single" w:sz="4" w:space="0" w:color="BFBFBF"/>
+              <w:left w:val="single" w:sz="4" w:space="0" w:color="BFBFBF"/>
+              <w:bottom w:val="single" w:sz="4" w:space="0" w:color="BFBFBF"/>
+              <w:right w:val="single" w:sz="4" w:space="0" w:color="BFBFBF"/>
+            </w:tcBorders>
+          </w:tcPr>
+          <w:p>
+            <w:pPr>
+              <w:pStyle w:val="Normal"/>
+              <w:spacing w:before="0" w:after="20"/>
+              <w:rPr/>
+            </w:pPr>
+            <w:r>
+              <w:rPr>
+                <w:sz w:val="19"/>
+                <w:szCs w:val="19"/>
+              </w:rPr>
+              <w:t>Irán rechazó que la Argentina haya declarado grupo terrorista a la Fuerza Quds</w:t>
+            </w:r>
+          </w:p>
+        </w:tc>
+        <w:tc>
+          <w:tcPr>
+            <w:tcW w:w="1301" w:type="dxa"/>
+            <w:tcBorders>
+              <w:top w:val="single" w:sz="4" w:space="0" w:color="BFBFBF"/>
+              <w:left w:val="single" w:sz="4" w:space="0" w:color="BFBFBF"/>
+              <w:bottom w:val="single" w:sz="4" w:space="0" w:color="BFBFBF"/>
+              <w:right w:val="single" w:sz="4" w:space="0" w:color="BFBFBF"/>
+            </w:tcBorders>
+          </w:tcPr>
+          <w:p>
+            <w:pPr>
+              <w:pStyle w:val="Normal"/>
+              <w:spacing w:before="0" w:after="20"/>
+              <w:rPr/>
+            </w:pPr>
+            <w:r>
+              <w:rPr/>
+            </w:r>
+          </w:p>
+        </w:tc>
+      </w:tr>
+      <w:tr>
+        <w:trPr/>
+        <w:tc>
+          <w:tcPr>
+            <w:tcW w:w="1300" w:type="dxa"/>
+            <w:tcBorders>
+              <w:top w:val="single" w:sz="4" w:space="0" w:color="BFBFBF"/>
+              <w:left w:val="single" w:sz="4" w:space="0" w:color="BFBFBF"/>
+              <w:bottom w:val="single" w:sz="4" w:space="0" w:color="BFBFBF"/>
+              <w:right w:val="single" w:sz="4" w:space="0" w:color="BFBFBF"/>
+            </w:tcBorders>
+          </w:tcPr>
+          <w:p>
+            <w:pPr>
+              <w:pStyle w:val="Normal"/>
+              <w:spacing w:before="0" w:after="20"/>
+              <w:rPr/>
+            </w:pPr>
+            <w:r>
+              <w:rPr>
+                <w:sz w:val="19"/>
+                <w:szCs w:val="19"/>
+              </w:rPr>
+              <w:t>2026-01-19</w:t>
+            </w:r>
+          </w:p>
+        </w:tc>
+        <w:tc>
+          <w:tcPr>
+            <w:tcW w:w="7037" w:type="dxa"/>
+            <w:tcBorders>
+              <w:top w:val="single" w:sz="4" w:space="0" w:color="BFBFBF"/>
+              <w:left w:val="single" w:sz="4" w:space="0" w:color="BFBFBF"/>
+              <w:bottom w:val="single" w:sz="4" w:space="0" w:color="BFBFBF"/>
+              <w:right w:val="single" w:sz="4" w:space="0" w:color="BFBFBF"/>
+            </w:tcBorders>
+          </w:tcPr>
+          <w:p>
+            <w:pPr>
+              <w:pStyle w:val="Normal"/>
+              <w:spacing w:before="0" w:after="20"/>
+              <w:rPr/>
+            </w:pPr>
+            <w:r>
+              <w:rPr>
+                <w:sz w:val="19"/>
+                <w:szCs w:val="19"/>
+              </w:rPr>
+              <w:t>La AMIA y la DAIA homenajearon al fiscal Nisman en el 11° aniversario de su muerte</w:t>
+            </w:r>
+          </w:p>
+        </w:tc>
+        <w:tc>
+          <w:tcPr>
+            <w:tcW w:w="1301" w:type="dxa"/>
+            <w:tcBorders>
+              <w:top w:val="single" w:sz="4" w:space="0" w:color="BFBFBF"/>
+              <w:left w:val="single" w:sz="4" w:space="0" w:color="BFBFBF"/>
+              <w:bottom w:val="single" w:sz="4" w:space="0" w:color="BFBFBF"/>
+              <w:right w:val="single" w:sz="4" w:space="0" w:color="BFBFBF"/>
+            </w:tcBorders>
+          </w:tcPr>
+          <w:p>
+            <w:pPr>
+              <w:pStyle w:val="Normal"/>
+              <w:spacing w:before="0" w:after="20"/>
+              <w:rPr/>
+            </w:pPr>
+            <w:r>
+              <w:rPr/>
+            </w:r>
+          </w:p>
+        </w:tc>
+      </w:tr>
+      <w:tr>
+        <w:trPr/>
+        <w:tc>
+          <w:tcPr>
+            <w:tcW w:w="1300" w:type="dxa"/>
+            <w:tcBorders>
+              <w:top w:val="single" w:sz="4" w:space="0" w:color="BFBFBF"/>
+              <w:left w:val="single" w:sz="4" w:space="0" w:color="BFBFBF"/>
+              <w:bottom w:val="single" w:sz="4" w:space="0" w:color="BFBFBF"/>
+              <w:right w:val="single" w:sz="4" w:space="0" w:color="BFBFBF"/>
+            </w:tcBorders>
+          </w:tcPr>
+          <w:p>
+            <w:pPr>
+              <w:pStyle w:val="Normal"/>
+              <w:spacing w:before="0" w:after="20"/>
+              <w:rPr/>
+            </w:pPr>
+            <w:r>
+              <w:rPr>
+                <w:sz w:val="19"/>
+                <w:szCs w:val="19"/>
+              </w:rPr>
+              <w:t>2026-01-20</w:t>
+            </w:r>
+          </w:p>
+        </w:tc>
+        <w:tc>
+          <w:tcPr>
+            <w:tcW w:w="7037" w:type="dxa"/>
+            <w:tcBorders>
+              <w:top w:val="single" w:sz="4" w:space="0" w:color="BFBFBF"/>
+              <w:left w:val="single" w:sz="4" w:space="0" w:color="BFBFBF"/>
+              <w:bottom w:val="single" w:sz="4" w:space="0" w:color="BFBFBF"/>
+              <w:right w:val="single" w:sz="4" w:space="0" w:color="BFBFBF"/>
+            </w:tcBorders>
+          </w:tcPr>
+          <w:p>
+            <w:pPr>
+              <w:pStyle w:val="Normal"/>
+              <w:spacing w:before="0" w:after="20"/>
+              <w:rPr/>
+            </w:pPr>
+            <w:r>
+              <w:rPr>
+                <w:sz w:val="19"/>
+                <w:szCs w:val="19"/>
+              </w:rPr>
+              <w:t>Tensión diplomática entre Argentina e Irán tras la inclusión de la Fuerza Quds en el registro antiterrorista</w:t>
             </w:r>
           </w:p>
         </w:tc>
@@ -40319,7 +40944,7 @@
         <w:pStyle w:val="Heading2"/>
         <w:rPr/>
       </w:pPr>
-      <w:bookmarkStart w:id="46" w:name="__RefHeading___Toc6040_3680603316"/>
+      <w:bookmarkStart w:id="46" w:name="__RefHeading___Toc6116_1728232176"/>
       <w:bookmarkEnd w:id="46"/>
       <w:r>
         <w:rPr/>
@@ -40942,7 +41567,7 @@
         <w:pStyle w:val="Heading1"/>
         <w:rPr/>
       </w:pPr>
-      <w:bookmarkStart w:id="47" w:name="__RefHeading___Toc6042_3680603316"/>
+      <w:bookmarkStart w:id="47" w:name="__RefHeading___Toc6118_1728232176"/>
       <w:bookmarkEnd w:id="47"/>
       <w:r>
         <w:rPr/>
@@ -40954,7 +41579,7 @@
         <w:pStyle w:val="Heading2"/>
         <w:rPr/>
       </w:pPr>
-      <w:bookmarkStart w:id="48" w:name="__RefHeading___Toc6044_3680603316"/>
+      <w:bookmarkStart w:id="48" w:name="__RefHeading___Toc6120_1728232176"/>
       <w:bookmarkEnd w:id="48"/>
       <w:r>
         <w:rPr/>
@@ -41109,7 +41734,7 @@
         <w:pStyle w:val="Heading2"/>
         <w:rPr/>
       </w:pPr>
-      <w:bookmarkStart w:id="49" w:name="__RefHeading___Toc6046_3680603316"/>
+      <w:bookmarkStart w:id="49" w:name="__RefHeading___Toc6122_1728232176"/>
       <w:bookmarkEnd w:id="49"/>
       <w:r>
         <w:rPr/>
@@ -41124,7 +41749,7 @@
       </w:pPr>
       <w:r>
         <w:rPr/>
-        <w:t>Período evaluado: 2023-08-01 a 2026-10-30 (1187 días, 16 días detonantes). Datos al 2026-10-30.</w:t>
+        <w:t>Período evaluado: 2023-08-01 a 2026-10-31 (1188 días, 16 días detonantes). Datos al 2026-10-31.</w:t>
       </w:r>
     </w:p>
     <w:p>
@@ -42012,7 +42637,7 @@
                 <w:sz w:val="19"/>
                 <w:szCs w:val="19"/>
               </w:rPr>
-              <w:t>23.2 %</w:t>
+              <w:t>23.1 %</w:t>
             </w:r>
           </w:p>
         </w:tc>
@@ -43236,7 +43861,7 @@
                 <w:sz w:val="19"/>
                 <w:szCs w:val="19"/>
               </w:rPr>
-              <w:t>23.2 %</w:t>
+              <w:t>23.1 %</w:t>
             </w:r>
           </w:p>
         </w:tc>
@@ -44474,7 +45099,7 @@
                 <w:sz w:val="19"/>
                 <w:szCs w:val="19"/>
               </w:rPr>
-              <w:t>23.2 %</w:t>
+              <w:t>23.1 %</w:t>
             </w:r>
           </w:p>
         </w:tc>
@@ -44869,7 +45494,7 @@
           <wp:inline distT="0" distB="0" distL="0" distR="0">
             <wp:extent cx="5715000" cy="5667375"/>
             <wp:effectExtent l="0" t="0" r="0" b="0"/>
-            <wp:docPr id="11" name="web_evaluacion.png" descr="Figura 11&#10;Sección «Evaluación del modelo» en la página (30/10/2026): LulzSec como grupo foco, los demás actores como comparación y la tabla «antes y después» de los detonantes curados."/>
+            <wp:docPr id="12" name="web_evaluacion.png" descr="Figura 12&#10;Sección «Evaluación del modelo» en la página (30/10/2026): LulzSec como grupo foco, los demás actores como comparación y la tabla «antes y después» de los detonantes curados."/>
             <wp:cNvGraphicFramePr>
               <a:graphicFrameLocks xmlns:a="http://schemas.openxmlformats.org/drawingml/2006/main" noChangeAspect="1"/>
             </wp:cNvGraphicFramePr>
@@ -44877,13 +45502,13 @@
               <a:graphicData uri="http://schemas.openxmlformats.org/drawingml/2006/picture">
                 <pic:pic xmlns:pic="http://schemas.openxmlformats.org/drawingml/2006/picture">
                   <pic:nvPicPr>
-                    <pic:cNvPr id="11" name="web_evaluacion.png" descr="Figura 11&#10;Sección «Evaluación del modelo» en la página (30/10/2026): LulzSec como grupo foco, los demás actores como comparación y la tabla «antes y después» de los detonantes curados."/>
+                    <pic:cNvPr id="12" name="web_evaluacion.png" descr="Figura 12&#10;Sección «Evaluación del modelo» en la página (30/10/2026): LulzSec como grupo foco, los demás actores como comparación y la tabla «antes y después» de los detonantes curados."/>
                     <pic:cNvPicPr>
                       <a:picLocks noChangeAspect="1" noChangeArrowheads="1"/>
                     </pic:cNvPicPr>
                   </pic:nvPicPr>
                   <pic:blipFill>
-                    <a:blip r:embed="rId12"/>
+                    <a:blip r:embed="rId13"/>
                     <a:stretch>
                       <a:fillRect/>
                     </a:stretch>
@@ -44919,7 +45544,7 @@
           <w:sz w:val="18"/>
           <w:szCs w:val="18"/>
         </w:rPr>
-        <w:t xml:space="preserve">Figura 11. </w:t>
+        <w:t xml:space="preserve">Figura 12. </w:t>
       </w:r>
       <w:r>
         <w:rPr>
@@ -44937,7 +45562,7 @@
         <w:pStyle w:val="Heading2"/>
         <w:rPr/>
       </w:pPr>
-      <w:bookmarkStart w:id="50" w:name="__RefHeading___Toc6048_3680603316"/>
+      <w:bookmarkStart w:id="50" w:name="__RefHeading___Toc6124_1728232176"/>
       <w:bookmarkEnd w:id="50"/>
       <w:r>
         <w:rPr/>
@@ -45837,7 +46462,7 @@
         <w:pStyle w:val="Heading2"/>
         <w:rPr/>
       </w:pPr>
-      <w:bookmarkStart w:id="51" w:name="__RefHeading___Toc6050_3680603316"/>
+      <w:bookmarkStart w:id="51" w:name="__RefHeading___Toc6126_1728232176"/>
       <w:bookmarkEnd w:id="51"/>
       <w:r>
         <w:rPr/>
@@ -45917,7 +46542,7 @@
       </w:pPr>
       <w:r>
         <w:rPr/>
-        <w:t>Total (2023-08-01 a 2026-10-30) · días detonantes: 277 automáticos → 16 curados</w:t>
+        <w:t>Total (2023-08-01 a 2026-10-31) · días detonantes: 283 automáticos → 16 curados</w:t>
       </w:r>
     </w:p>
     <w:tbl>
@@ -46198,7 +46823,7 @@
                 <w:sz w:val="19"/>
                 <w:szCs w:val="19"/>
               </w:rPr>
-              <w:t>47.6 %</w:t>
+              <w:t>48.4 %</w:t>
             </w:r>
           </w:p>
         </w:tc>
@@ -46223,7 +46848,7 @@
                 <w:sz w:val="19"/>
                 <w:szCs w:val="19"/>
               </w:rPr>
-              <w:t>1/4 · 0.53</w:t>
+              <w:t>1/4 · 0.52</w:t>
             </w:r>
           </w:p>
         </w:tc>
@@ -46248,7 +46873,7 @@
                 <w:sz w:val="19"/>
                 <w:szCs w:val="19"/>
               </w:rPr>
-              <w:t>4/6 · 1.4</w:t>
+              <w:t>4/6 · 1.38</w:t>
             </w:r>
           </w:p>
         </w:tc>
@@ -46376,7 +47001,7 @@
                 <w:sz w:val="19"/>
                 <w:szCs w:val="19"/>
               </w:rPr>
-              <w:t>63.2 %</w:t>
+              <w:t>64.3 %</w:t>
             </w:r>
           </w:p>
         </w:tc>
@@ -46401,7 +47026,7 @@
                 <w:sz w:val="19"/>
                 <w:szCs w:val="19"/>
               </w:rPr>
-              <w:t>3/4 · 1.19</w:t>
+              <w:t>3/4 · 1.17</w:t>
             </w:r>
           </w:p>
         </w:tc>
@@ -46426,7 +47051,7 @@
                 <w:sz w:val="19"/>
                 <w:szCs w:val="19"/>
               </w:rPr>
-              <w:t>5/6 · 1.32</w:t>
+              <w:t>5/6 · 1.3</w:t>
             </w:r>
           </w:p>
         </w:tc>
@@ -46554,7 +47179,7 @@
                 <w:sz w:val="19"/>
                 <w:szCs w:val="19"/>
               </w:rPr>
-              <w:t>75.3 %</w:t>
+              <w:t>76.9 %</w:t>
             </w:r>
           </w:p>
         </w:tc>
@@ -46579,7 +47204,7 @@
                 <w:sz w:val="19"/>
                 <w:szCs w:val="19"/>
               </w:rPr>
-              <w:t>4/4 · 1.33</w:t>
+              <w:t>4/4 · 1.3</w:t>
             </w:r>
           </w:p>
         </w:tc>
@@ -46604,7 +47229,7 @@
                 <w:sz w:val="19"/>
                 <w:szCs w:val="19"/>
               </w:rPr>
-              <w:t>5/6 · 1.11</w:t>
+              <w:t>5/6 · 1.08</w:t>
             </w:r>
           </w:p>
         </w:tc>
@@ -46732,7 +47357,7 @@
                 <w:sz w:val="19"/>
                 <w:szCs w:val="19"/>
               </w:rPr>
-              <w:t>80.5 %</w:t>
+              <w:t>82.1 %</w:t>
             </w:r>
           </w:p>
         </w:tc>
@@ -46757,7 +47382,7 @@
                 <w:sz w:val="19"/>
                 <w:szCs w:val="19"/>
               </w:rPr>
-              <w:t>4/4 · 1.24</w:t>
+              <w:t>4/4 · 1.22</w:t>
             </w:r>
           </w:p>
         </w:tc>
@@ -46782,7 +47407,7 @@
                 <w:sz w:val="19"/>
                 <w:szCs w:val="19"/>
               </w:rPr>
-              <w:t>5/6 · 1.04</w:t>
+              <w:t>5/6 · 1.02</w:t>
             </w:r>
           </w:p>
         </w:tc>
@@ -46807,7 +47432,7 @@
                 <w:sz w:val="19"/>
                 <w:szCs w:val="19"/>
               </w:rPr>
-              <w:t>23.2 %</w:t>
+              <w:t>23.1 %</w:t>
             </w:r>
           </w:p>
         </w:tc>
@@ -46910,7 +47535,7 @@
                 <w:sz w:val="19"/>
                 <w:szCs w:val="19"/>
               </w:rPr>
-              <w:t>83.1 %</w:t>
+              <w:t>84.6 %</w:t>
             </w:r>
           </w:p>
         </w:tc>
@@ -46935,7 +47560,7 @@
                 <w:sz w:val="19"/>
                 <w:szCs w:val="19"/>
               </w:rPr>
-              <w:t>4/4 · 1.2</w:t>
+              <w:t>4/4 · 1.18</w:t>
             </w:r>
           </w:p>
         </w:tc>
@@ -46960,7 +47585,7 @@
                 <w:sz w:val="19"/>
                 <w:szCs w:val="19"/>
               </w:rPr>
-              <w:t>5/6 · 1</w:t>
+              <w:t>5/6 · 0.99</w:t>
             </w:r>
           </w:p>
         </w:tc>
@@ -48199,7 +48824,7 @@
       </w:pPr>
       <w:r>
         <w:rPr/>
-        <w:t>Validación (2025-01-01 a 2026-10-30) · días detonantes: 92 automáticos → 8 curados</w:t>
+        <w:t>Validación (2025-01-01 a 2026-10-31) · días detonantes: 98 automáticos → 8 curados</w:t>
       </w:r>
     </w:p>
     <w:tbl>
@@ -48480,7 +49105,7 @@
                 <w:sz w:val="19"/>
                 <w:szCs w:val="19"/>
               </w:rPr>
-              <w:t>32.5 %</w:t>
+              <w:t>33.9 %</w:t>
             </w:r>
           </w:p>
         </w:tc>
@@ -48530,7 +49155,7 @@
                 <w:sz w:val="19"/>
                 <w:szCs w:val="19"/>
               </w:rPr>
-              <w:t>1/2 · 1.54</w:t>
+              <w:t>1/2 · 1.47</w:t>
             </w:r>
           </w:p>
         </w:tc>
@@ -48658,7 +49283,7 @@
                 <w:sz w:val="19"/>
                 <w:szCs w:val="19"/>
               </w:rPr>
-              <w:t>47.5 %</w:t>
+              <w:t>49.5 %</w:t>
             </w:r>
           </w:p>
         </w:tc>
@@ -48708,7 +49333,7 @@
                 <w:sz w:val="19"/>
                 <w:szCs w:val="19"/>
               </w:rPr>
-              <w:t>2/2 · 2.11</w:t>
+              <w:t>2/2 · 2.02</w:t>
             </w:r>
           </w:p>
         </w:tc>
@@ -48783,7 +49408,7 @@
                 <w:sz w:val="19"/>
                 <w:szCs w:val="19"/>
               </w:rPr>
-              <w:t>1/2 · 5.22</w:t>
+              <w:t>1/2 · 5.23</w:t>
             </w:r>
           </w:p>
         </w:tc>
@@ -48836,7 +49461,7 @@
                 <w:sz w:val="19"/>
                 <w:szCs w:val="19"/>
               </w:rPr>
-              <w:t>61.4 %</w:t>
+              <w:t>64.3 %</w:t>
             </w:r>
           </w:p>
         </w:tc>
@@ -48886,7 +49511,7 @@
                 <w:sz w:val="19"/>
                 <w:szCs w:val="19"/>
               </w:rPr>
-              <w:t>2/2 · 1.63</w:t>
+              <w:t>2/2 · 1.56</w:t>
             </w:r>
           </w:p>
         </w:tc>
@@ -48911,7 +49536,7 @@
                 <w:sz w:val="19"/>
                 <w:szCs w:val="19"/>
               </w:rPr>
-              <w:t>16.5 %</w:t>
+              <w:t>16.4 %</w:t>
             </w:r>
           </w:p>
         </w:tc>
@@ -49014,7 +49639,7 @@
                 <w:sz w:val="19"/>
                 <w:szCs w:val="19"/>
               </w:rPr>
-              <w:t>68.1 %</w:t>
+              <w:t>71 %</w:t>
             </w:r>
           </w:p>
         </w:tc>
@@ -49064,7 +49689,7 @@
                 <w:sz w:val="19"/>
                 <w:szCs w:val="19"/>
               </w:rPr>
-              <w:t>2/2 · 1.47</w:t>
+              <w:t>2/2 · 1.41</w:t>
             </w:r>
           </w:p>
         </w:tc>
@@ -49089,7 +49714,7 @@
                 <w:sz w:val="19"/>
                 <w:szCs w:val="19"/>
               </w:rPr>
-              <w:t>20.4 %</w:t>
+              <w:t>20.3 %</w:t>
             </w:r>
           </w:p>
         </w:tc>
@@ -49192,7 +49817,7 @@
                 <w:sz w:val="19"/>
                 <w:szCs w:val="19"/>
               </w:rPr>
-              <w:t>72.2 %</w:t>
+              <w:t>74.9 %</w:t>
             </w:r>
           </w:p>
         </w:tc>
@@ -49242,7 +49867,7 @@
                 <w:sz w:val="19"/>
                 <w:szCs w:val="19"/>
               </w:rPr>
-              <w:t>2/2 · 1.39</w:t>
+              <w:t>2/2 · 1.34</w:t>
             </w:r>
           </w:p>
         </w:tc>
@@ -49468,7 +50093,7 @@
         <w:pStyle w:val="Heading2"/>
         <w:rPr/>
       </w:pPr>
-      <w:bookmarkStart w:id="52" w:name="__RefHeading___Toc6052_3680603316"/>
+      <w:bookmarkStart w:id="52" w:name="__RefHeading___Toc6128_1728232176"/>
       <w:bookmarkEnd w:id="52"/>
       <w:r>
         <w:rPr/>
@@ -49511,7 +50136,7 @@
           <wp:inline distT="0" distB="0" distL="0" distR="0">
             <wp:extent cx="5715000" cy="4019550"/>
             <wp:effectExtent l="0" t="0" r="0" b="0"/>
-            <wp:docPr id="12" name="web_periodo_completo.png" descr="Figura 12&#10;Vista del período completo (agosto 2023 – hoy) con los incidentes cargados y la descarga de GDELT todavía en curso."/>
+            <wp:docPr id="13" name="web_periodo_completo.png" descr="Figura 13&#10;Vista del período completo (agosto 2023 – hoy) con los incidentes cargados y la descarga de GDELT todavía en curso."/>
             <wp:cNvGraphicFramePr>
               <a:graphicFrameLocks xmlns:a="http://schemas.openxmlformats.org/drawingml/2006/main" noChangeAspect="1"/>
             </wp:cNvGraphicFramePr>
@@ -49519,13 +50144,13 @@
               <a:graphicData uri="http://schemas.openxmlformats.org/drawingml/2006/picture">
                 <pic:pic xmlns:pic="http://schemas.openxmlformats.org/drawingml/2006/picture">
                   <pic:nvPicPr>
-                    <pic:cNvPr id="12" name="web_periodo_completo.png" descr="Figura 12&#10;Vista del período completo (agosto 2023 – hoy) con los incidentes cargados y la descarga de GDELT todavía en curso."/>
+                    <pic:cNvPr id="13" name="web_periodo_completo.png" descr="Figura 13&#10;Vista del período completo (agosto 2023 – hoy) con los incidentes cargados y la descarga de GDELT todavía en curso."/>
                     <pic:cNvPicPr>
                       <a:picLocks noChangeAspect="1" noChangeArrowheads="1"/>
                     </pic:cNvPicPr>
                   </pic:nvPicPr>
                   <pic:blipFill>
-                    <a:blip r:embed="rId13"/>
+                    <a:blip r:embed="rId14"/>
                     <a:stretch>
                       <a:fillRect/>
                     </a:stretch>
@@ -49561,7 +50186,7 @@
           <w:sz w:val="18"/>
           <w:szCs w:val="18"/>
         </w:rPr>
-        <w:t xml:space="preserve">Figura 12. </w:t>
+        <w:t xml:space="preserve">Figura 13. </w:t>
       </w:r>
       <w:r>
         <w:rPr>
@@ -49588,7 +50213,7 @@
           <wp:inline distT="0" distB="0" distL="0" distR="0">
             <wp:extent cx="5715000" cy="1704975"/>
             <wp:effectExtent l="0" t="0" r="0" b="0"/>
-            <wp:docPr id="13" name="web_linea_caso.png" descr="Figura 13&#10;Línea de tiempo del caso de estudio (ago 2023 – jul 2024): ventanas amarillas, períodos en rojo e incidentes cargados (rombos)."/>
+            <wp:docPr id="14" name="web_linea_caso.png" descr="Figura 14&#10;Línea de tiempo del caso de estudio (ago 2023 – jul 2024): ventanas amarillas, períodos en rojo e incidentes cargados (rombos)."/>
             <wp:cNvGraphicFramePr>
               <a:graphicFrameLocks xmlns:a="http://schemas.openxmlformats.org/drawingml/2006/main" noChangeAspect="1"/>
             </wp:cNvGraphicFramePr>
@@ -49596,13 +50221,13 @@
               <a:graphicData uri="http://schemas.openxmlformats.org/drawingml/2006/picture">
                 <pic:pic xmlns:pic="http://schemas.openxmlformats.org/drawingml/2006/picture">
                   <pic:nvPicPr>
-                    <pic:cNvPr id="13" name="web_linea_caso.png" descr="Figura 13&#10;Línea de tiempo del caso de estudio (ago 2023 – jul 2024): ventanas amarillas, períodos en rojo e incidentes cargados (rombos)."/>
+                    <pic:cNvPr id="14" name="web_linea_caso.png" descr="Figura 14&#10;Línea de tiempo del caso de estudio (ago 2023 – jul 2024): ventanas amarillas, períodos en rojo e incidentes cargados (rombos)."/>
                     <pic:cNvPicPr>
                       <a:picLocks noChangeAspect="1" noChangeArrowheads="1"/>
                     </pic:cNvPicPr>
                   </pic:nvPicPr>
                   <pic:blipFill>
-                    <a:blip r:embed="rId14"/>
+                    <a:blip r:embed="rId15"/>
                     <a:stretch>
                       <a:fillRect/>
                     </a:stretch>
@@ -49638,7 +50263,7 @@
           <w:sz w:val="18"/>
           <w:szCs w:val="18"/>
         </w:rPr>
-        <w:t xml:space="preserve">Figura 13. </w:t>
+        <w:t xml:space="preserve">Figura 14. </w:t>
       </w:r>
       <w:r>
         <w:rPr>
@@ -49659,7 +50284,7 @@
         <w:pStyle w:val="Heading1"/>
         <w:rPr/>
       </w:pPr>
-      <w:bookmarkStart w:id="53" w:name="__RefHeading___Toc6054_3680603316"/>
+      <w:bookmarkStart w:id="53" w:name="__RefHeading___Toc6130_1728232176"/>
       <w:bookmarkEnd w:id="53"/>
       <w:r>
         <w:rPr/>
@@ -54349,6 +54974,109 @@
           </w:p>
         </w:tc>
       </w:tr>
+      <w:tr>
+        <w:trPr/>
+        <w:tc>
+          <w:tcPr>
+            <w:tcW w:w="1250" w:type="dxa"/>
+            <w:tcBorders>
+              <w:top w:val="single" w:sz="4" w:space="0" w:color="BFBFBF"/>
+              <w:left w:val="single" w:sz="4" w:space="0" w:color="BFBFBF"/>
+              <w:bottom w:val="single" w:sz="4" w:space="0" w:color="BFBFBF"/>
+              <w:right w:val="single" w:sz="4" w:space="0" w:color="BFBFBF"/>
+            </w:tcBorders>
+          </w:tcPr>
+          <w:p>
+            <w:pPr>
+              <w:pStyle w:val="Normal"/>
+              <w:spacing w:before="0" w:after="20"/>
+              <w:rPr/>
+            </w:pPr>
+            <w:r>
+              <w:rPr>
+                <w:sz w:val="19"/>
+                <w:szCs w:val="19"/>
+              </w:rPr>
+              <w:t>31/10/2026</w:t>
+            </w:r>
+          </w:p>
+        </w:tc>
+        <w:tc>
+          <w:tcPr>
+            <w:tcW w:w="1650" w:type="dxa"/>
+            <w:tcBorders>
+              <w:top w:val="single" w:sz="4" w:space="0" w:color="BFBFBF"/>
+              <w:left w:val="single" w:sz="4" w:space="0" w:color="BFBFBF"/>
+              <w:bottom w:val="single" w:sz="4" w:space="0" w:color="BFBFBF"/>
+              <w:right w:val="single" w:sz="4" w:space="0" w:color="BFBFBF"/>
+            </w:tcBorders>
+          </w:tcPr>
+          <w:p>
+            <w:pPr>
+              <w:pStyle w:val="Normal"/>
+              <w:spacing w:before="0" w:after="20"/>
+              <w:rPr/>
+            </w:pPr>
+            <w:r>
+              <w:rPr>
+                <w:sz w:val="19"/>
+                <w:szCs w:val="19"/>
+              </w:rPr>
+              <w:t>Web</w:t>
+            </w:r>
+          </w:p>
+        </w:tc>
+        <w:tc>
+          <w:tcPr>
+            <w:tcW w:w="2299" w:type="dxa"/>
+            <w:tcBorders>
+              <w:top w:val="single" w:sz="4" w:space="0" w:color="BFBFBF"/>
+              <w:left w:val="single" w:sz="4" w:space="0" w:color="BFBFBF"/>
+              <w:bottom w:val="single" w:sz="4" w:space="0" w:color="BFBFBF"/>
+              <w:right w:val="single" w:sz="4" w:space="0" w:color="BFBFBF"/>
+            </w:tcBorders>
+          </w:tcPr>
+          <w:p>
+            <w:pPr>
+              <w:pStyle w:val="Normal"/>
+              <w:spacing w:before="0" w:after="20"/>
+              <w:rPr/>
+            </w:pPr>
+            <w:r>
+              <w:rPr>
+                <w:sz w:val="19"/>
+                <w:szCs w:val="19"/>
+              </w:rPr>
+              <w:t>Perfil del actor: LulzSec Muslims</w:t>
+            </w:r>
+          </w:p>
+        </w:tc>
+        <w:tc>
+          <w:tcPr>
+            <w:tcW w:w="4438" w:type="dxa"/>
+            <w:tcBorders>
+              <w:top w:val="single" w:sz="4" w:space="0" w:color="BFBFBF"/>
+              <w:left w:val="single" w:sz="4" w:space="0" w:color="BFBFBF"/>
+              <w:bottom w:val="single" w:sz="4" w:space="0" w:color="BFBFBF"/>
+              <w:right w:val="single" w:sz="4" w:space="0" w:color="BFBFBF"/>
+            </w:tcBorders>
+          </w:tcPr>
+          <w:p>
+            <w:pPr>
+              <w:pStyle w:val="Normal"/>
+              <w:spacing w:before="0" w:after="20"/>
+              <w:rPr/>
+            </w:pPr>
+            <w:r>
+              <w:rPr>
+                <w:sz w:val="19"/>
+                <w:szCs w:val="19"/>
+              </w:rPr>
+              <w:t>Nueva sección de la página, debajo del semáforo, con la ficha del actor: quién es, motivación, objetivos en Argentina, técnicas MITRE (T1213, T1567, T1491.002, T1485), historial de sus 4 ataques con el hecho clave previo y los días transcurridos, el resultado de la evaluación con la ventana del semáforo (3 de 4 dentro, razón 3,24) y las limitaciones. El historial y el resultado se calculan desde datos.json.</w:t>
+            </w:r>
+          </w:p>
+        </w:tc>
+      </w:tr>
     </w:tbl>
     <w:p>
       <w:pPr>
@@ -54358,7 +55086,7 @@
       <w:r>
         <w:br w:type="page"/>
       </w:r>
-      <w:bookmarkStart w:id="54" w:name="__RefHeading___Toc6056_3680603316"/>
+      <w:bookmarkStart w:id="54" w:name="__RefHeading___Toc6132_1728232176"/>
       <w:bookmarkEnd w:id="54"/>
       <w:r>
         <w:rPr/>
@@ -55613,12 +56341,12 @@
       </w:tr>
     </w:tbl>
     <w:sectPr>
-      <w:headerReference w:type="even" r:id="rId15"/>
-      <w:headerReference w:type="default" r:id="rId16"/>
-      <w:headerReference w:type="first" r:id="rId17"/>
-      <w:footerReference w:type="even" r:id="rId18"/>
-      <w:footerReference w:type="default" r:id="rId19"/>
-      <w:footerReference w:type="first" r:id="rId20"/>
+      <w:headerReference w:type="even" r:id="rId16"/>
+      <w:headerReference w:type="default" r:id="rId17"/>
+      <w:headerReference w:type="first" r:id="rId18"/>
+      <w:footerReference w:type="even" r:id="rId19"/>
+      <w:footerReference w:type="default" r:id="rId20"/>
+      <w:footerReference w:type="first" r:id="rId21"/>
       <w:type w:val="nextPage"/>
       <w:pgSz w:w="11906" w:h="16838"/>
       <w:pgMar w:left="1134" w:right="1134" w:gutter="0" w:header="708" w:top="1134" w:footer="708" w:bottom="1134"/>
@@ -55675,7 +56403,7 @@
     </w:r>
     <w:r>
       <w:rPr/>
-      <w:t>50</w:t>
+      <w:t>51</w:t>
     </w:r>
     <w:r>
       <w:rPr/>
@@ -55687,7 +56415,7 @@
         <w:sz w:val="16"/>
         <w:szCs w:val="16"/>
       </w:rPr>
-      <w:t xml:space="preserve"> · Versión 0.9 (30/10/2026)</w:t>
+      <w:t xml:space="preserve"> · Versión 0.10 (31/10/2026)</w:t>
     </w:r>
   </w:p>
 </w:ftr>
@@ -55723,7 +56451,7 @@
     </w:r>
     <w:r>
       <w:rPr/>
-      <w:t>50</w:t>
+      <w:t>51</w:t>
     </w:r>
     <w:r>
       <w:rPr/>
@@ -55735,7 +56463,7 @@
         <w:sz w:val="16"/>
         <w:szCs w:val="16"/>
       </w:rPr>
-      <w:t xml:space="preserve"> · Versión 0.9 (30/10/2026)</w:t>
+      <w:t xml:space="preserve"> · Versión 0.10 (31/10/2026)</w:t>
     </w:r>
   </w:p>
 </w:ftr>
@@ -56781,7 +57509,7 @@
       </w:pPr>
     </w:pPrDefault>
   </w:docDefaults>
-  <w:style w:type="paragraph" w:styleId="Normal">
+  <w:style w:type="paragraph" w:styleId="Normal" w:default="1">
     <w:name w:val="Normal"/>
     <w:qFormat/>
     <w:pPr>
@@ -56801,7 +57529,8 @@
   </w:style>
   <w:style w:type="paragraph" w:styleId="Heading1">
     <w:name w:val="Heading 1"/>
-    <w:basedOn w:val="Heading"/>
+    <w:basedOn w:val="Normal"/>
+    <w:next w:val="Normal"/>
     <w:qFormat/>
     <w:pPr>
       <w:spacing w:before="240" w:after="200"/>
@@ -56818,7 +57547,8 @@
   </w:style>
   <w:style w:type="paragraph" w:styleId="Heading2">
     <w:name w:val="Heading 2"/>
-    <w:basedOn w:val="Heading"/>
+    <w:basedOn w:val="Normal"/>
+    <w:next w:val="Normal"/>
     <w:qFormat/>
     <w:pPr>
       <w:spacing w:before="280" w:after="120"/>
@@ -56835,7 +57565,8 @@
   </w:style>
   <w:style w:type="paragraph" w:styleId="Heading3">
     <w:name w:val="Heading 3"/>
-    <w:basedOn w:val="Heading"/>
+    <w:basedOn w:val="Normal"/>
+    <w:next w:val="Normal"/>
     <w:qFormat/>
     <w:pPr>
       <w:spacing w:before="200" w:after="100"/>
@@ -56851,7 +57582,8 @@
   </w:style>
   <w:style w:type="paragraph" w:styleId="Heading4">
     <w:name w:val="Heading 4"/>
-    <w:basedOn w:val="Heading"/>
+    <w:basedOn w:val="Normal"/>
+    <w:next w:val="Normal"/>
     <w:qFormat/>
     <w:pPr/>
     <w:rPr>
@@ -56862,7 +57594,8 @@
   </w:style>
   <w:style w:type="paragraph" w:styleId="Heading5">
     <w:name w:val="Heading 5"/>
-    <w:basedOn w:val="Heading"/>
+    <w:basedOn w:val="Normal"/>
+    <w:next w:val="Normal"/>
     <w:qFormat/>
     <w:pPr/>
     <w:rPr>
@@ -56871,7 +57604,8 @@
   </w:style>
   <w:style w:type="paragraph" w:styleId="Heading6">
     <w:name w:val="Heading 6"/>
-    <w:basedOn w:val="Heading"/>
+    <w:basedOn w:val="Normal"/>
+    <w:next w:val="Normal"/>
     <w:qFormat/>
     <w:pPr/>
     <w:rPr>
@@ -56958,7 +57692,7 @@
       <w:spacing w:before="240" w:after="120"/>
     </w:pPr>
     <w:rPr>
-      <w:rFonts w:ascii="Liberation Sans" w:hAnsi="Liberation Sans" w:eastAsia="WenQuanYi Zen Hei" w:cs="FreeSans"/>
+      <w:rFonts w:ascii="Liberation Sans" w:hAnsi="Liberation Sans" w:eastAsia="Noto Sans CJK SC" w:cs="FreeSans"/>
       <w:sz w:val="28"/>
       <w:szCs w:val="28"/>
     </w:rPr>
@@ -57008,7 +57742,8 @@
   </w:style>
   <w:style w:type="paragraph" w:styleId="Title">
     <w:name w:val="Title"/>
-    <w:basedOn w:val="Heading"/>
+    <w:basedOn w:val="Normal"/>
+    <w:next w:val="Normal"/>
     <w:qFormat/>
     <w:pPr/>
     <w:rPr>
@@ -57018,41 +57753,21 @@
   </w:style>
   <w:style w:type="paragraph" w:styleId="StrongEmphasis">
     <w:name w:val="Strong Emphasis"/>
+    <w:basedOn w:val="Normal"/>
+    <w:next w:val="Normal"/>
     <w:qFormat/>
-    <w:pPr>
-      <w:widowControl/>
-      <w:bidi w:val="0"/>
-      <w:spacing w:before="0" w:after="0"/>
-      <w:jc w:val="left"/>
-    </w:pPr>
+    <w:pPr/>
     <w:rPr>
-      <w:rFonts w:ascii="Calibri" w:hAnsi="Calibri" w:eastAsia="Calibri" w:cs="Calibri"/>
       <w:b/>
       <w:bCs/>
-      <w:color w:val="auto"/>
-      <w:kern w:val="0"/>
-      <w:sz w:val="22"/>
-      <w:szCs w:val="22"/>
-      <w:lang w:val="en-US" w:eastAsia="zh-CN" w:bidi="hi-IN"/>
     </w:rPr>
   </w:style>
   <w:style w:type="paragraph" w:styleId="ListParagraph">
     <w:name w:val="List Paragraph"/>
+    <w:basedOn w:val="Normal"/>
     <w:qFormat/>
-    <w:pPr>
-      <w:widowControl/>
-      <w:bidi w:val="0"/>
-      <w:spacing w:before="0" w:after="0"/>
-      <w:jc w:val="left"/>
-    </w:pPr>
-    <w:rPr>
-      <w:rFonts w:ascii="Calibri" w:hAnsi="Calibri" w:eastAsia="Calibri" w:cs="Calibri"/>
-      <w:color w:val="auto"/>
-      <w:kern w:val="0"/>
-      <w:sz w:val="22"/>
-      <w:szCs w:val="22"/>
-      <w:lang w:val="en-US" w:eastAsia="zh-CN" w:bidi="hi-IN"/>
-    </w:rPr>
+    <w:pPr/>
+    <w:rPr/>
   </w:style>
   <w:style w:type="paragraph" w:styleId="FootnoteText">
     <w:name w:val="Footnote Text"/>
@@ -57131,9 +57846,9 @@
 </file>
 
 <file path=word/theme/theme1.xml><?xml version="1.0" encoding="utf-8"?>
-<a:theme xmlns:a="http://schemas.openxmlformats.org/drawingml/2006/main" xmlns:r="http://schemas.openxmlformats.org/officeDocument/2006/relationships" name="Office">
+<a:theme xmlns:a="http://schemas.openxmlformats.org/drawingml/2006/main" xmlns:r="http://schemas.openxmlformats.org/officeDocument/2006/relationships" name="Office Theme">
   <a:themeElements>
-    <a:clrScheme name="LibreOffice">
+    <a:clrScheme name="Office">
       <a:dk1>
         <a:srgbClr val="000000"/>
       </a:dk1>
@@ -57141,46 +57856,46 @@
         <a:srgbClr val="ffffff"/>
       </a:lt1>
       <a:dk2>
-        <a:srgbClr val="000000"/>
+        <a:srgbClr val="44546a"/>
       </a:dk2>
       <a:lt2>
-        <a:srgbClr val="ffffff"/>
+        <a:srgbClr val="e7e6e6"/>
       </a:lt2>
       <a:accent1>
-        <a:srgbClr val="18a303"/>
+        <a:srgbClr val="4472c4"/>
       </a:accent1>
       <a:accent2>
-        <a:srgbClr val="0369a3"/>
+        <a:srgbClr val="ed7d31"/>
       </a:accent2>
       <a:accent3>
-        <a:srgbClr val="a33e03"/>
+        <a:srgbClr val="a5a5a5"/>
       </a:accent3>
       <a:accent4>
-        <a:srgbClr val="8e03a3"/>
+        <a:srgbClr val="ffc000"/>
       </a:accent4>
       <a:accent5>
-        <a:srgbClr val="c99c00"/>
+        <a:srgbClr val="5b9bd5"/>
       </a:accent5>
       <a:accent6>
-        <a:srgbClr val="c9211e"/>
+        <a:srgbClr val="70ad47"/>
       </a:accent6>
       <a:hlink>
-        <a:srgbClr val="0000ee"/>
+        <a:srgbClr val="0563c1"/>
       </a:hlink>
       <a:folHlink>
-        <a:srgbClr val="551a8b"/>
+        <a:srgbClr val="954f72"/>
       </a:folHlink>
     </a:clrScheme>
     <a:fontScheme name="Office">
       <a:majorFont>
-        <a:latin typeface="Arial" pitchFamily="0" charset="1"/>
-        <a:ea typeface="DejaVu Sans" pitchFamily="0" charset="1"/>
-        <a:cs typeface="DejaVu Sans" pitchFamily="0" charset="1"/>
+        <a:latin typeface="Calibri Light" panose="020F0302020204030204" pitchFamily="0" charset="1"/>
+        <a:ea typeface=""/>
+        <a:cs typeface=""/>
       </a:majorFont>
       <a:minorFont>
-        <a:latin typeface="Arial" pitchFamily="0" charset="1"/>
-        <a:ea typeface="DejaVu Sans" pitchFamily="0" charset="1"/>
-        <a:cs typeface="DejaVu Sans" pitchFamily="0" charset="1"/>
+        <a:latin typeface="Calibri" panose="020F0502020204030204" pitchFamily="0" charset="1"/>
+        <a:ea typeface=""/>
+        <a:cs typeface=""/>
       </a:minorFont>
     </a:fontScheme>
     <a:fmtScheme>
@@ -57188,25 +57903,67 @@
         <a:solidFill>
           <a:schemeClr val="phClr"/>
         </a:solidFill>
-        <a:solidFill>
-          <a:schemeClr val="phClr"/>
-        </a:solidFill>
-        <a:solidFill>
-          <a:schemeClr val="phClr"/>
-        </a:solidFill>
+        <a:gradFill>
+          <a:gsLst>
+            <a:gs pos="0">
+              <a:schemeClr val="phClr">
+                <a:lumMod val="110000"/>
+                <a:tint val="67000"/>
+              </a:schemeClr>
+            </a:gs>
+            <a:gs pos="50000">
+              <a:schemeClr val="phClr">
+                <a:lumMod val="105000"/>
+                <a:tint val="73000"/>
+              </a:schemeClr>
+            </a:gs>
+            <a:gs pos="100000">
+              <a:schemeClr val="phClr">
+                <a:lumMod val="105000"/>
+                <a:tint val="81000"/>
+              </a:schemeClr>
+            </a:gs>
+          </a:gsLst>
+          <a:lin ang="5400000" scaled="0"/>
+          <a:tileRect l="0" t="0" r="0" b="0"/>
+        </a:gradFill>
+        <a:gradFill>
+          <a:gsLst>
+            <a:gs pos="0">
+              <a:schemeClr val="phClr">
+                <a:lumMod val="102000"/>
+                <a:tint val="94000"/>
+              </a:schemeClr>
+            </a:gs>
+            <a:gs pos="50000">
+              <a:schemeClr val="phClr">
+                <a:lumMod val="100000"/>
+                <a:shade val="100000"/>
+              </a:schemeClr>
+            </a:gs>
+            <a:gs pos="100000">
+              <a:schemeClr val="phClr">
+                <a:lumMod val="99000"/>
+                <a:shade val="78000"/>
+              </a:schemeClr>
+            </a:gs>
+          </a:gsLst>
+          <a:lin ang="5400000" scaled="0"/>
+          <a:tileRect l="0" t="0" r="0" b="0"/>
+        </a:gradFill>
       </a:fillStyleLst>
       <a:lnStyleLst>
         <a:ln w="6350" cap="flat" cmpd="sng" algn="ctr">
           <a:prstDash val="solid"/>
-          <a:miter/>
+          <a:miter lim="800000"/>
         </a:ln>
-        <a:ln w="6350" cap="flat" cmpd="sng" algn="ctr">
+        <a:ln w="12700" cap="flat" cmpd="sng" algn="ctr">
           <a:prstDash val="solid"/>
-          <a:miter/>
+          <a:miter lim="800000"/>
         </a:ln>
-        <a:ln w="6350" cap="flat" cmpd="sng" algn="ctr">
+        <a:ln w="19050" cap="flat" cmpd="sng" algn="ctr">
           <a:prstDash val="solid"/>
-          <a:miter/>
+          <a:miter lim="800000"/>
         </a:ln>
       </a:lnStyleLst>
       <a:effectStyleLst>
@@ -57225,11 +57982,35 @@
           <a:schemeClr val="phClr"/>
         </a:solidFill>
         <a:solidFill>
-          <a:schemeClr val="phClr"/>
+          <a:schemeClr val="phClr">
+            <a:tint val="95000"/>
+          </a:schemeClr>
         </a:solidFill>
-        <a:solidFill>
-          <a:schemeClr val="phClr"/>
-        </a:solidFill>
+        <a:gradFill>
+          <a:gsLst>
+            <a:gs pos="0">
+              <a:schemeClr val="phClr">
+                <a:tint val="93000"/>
+                <a:shade val="98000"/>
+                <a:lumMod val="102000"/>
+              </a:schemeClr>
+            </a:gs>
+            <a:gs pos="50000">
+              <a:schemeClr val="phClr">
+                <a:tint val="98000"/>
+                <a:shade val="90000"/>
+                <a:lumMod val="103000"/>
+              </a:schemeClr>
+            </a:gs>
+            <a:gs pos="100000">
+              <a:schemeClr val="phClr">
+                <a:shade val="63000"/>
+              </a:schemeClr>
+            </a:gs>
+          </a:gsLst>
+          <a:lin ang="5400000" scaled="0"/>
+          <a:tileRect l="0" t="0" r="0" b="0"/>
+        </a:gradFill>
       </a:bgFillStyleLst>
     </a:fmtScheme>
   </a:themeElements>

</xml_diff>